<commit_message>
Dissertation: Chapter 1 translations synced; English build
Co-Authored-By: Claude Opus 5.5 <noreply@anthropic.com>
Claude-Session: https://claude.ai/code/session_01WcXt6iEQKTpJkT13ui6H64
</commit_message>
<xml_diff>
--- a/dissertation/build/en/Dissertation_en.docx
+++ b/dissertation/build/en/Dissertation_en.docx
@@ -197,7 +197,7 @@
     </w:p>
     <w:p>
       <w:pPr>
-        <w:pStyle w:val="FirstParagraph"/>
+        <w:pStyle w:val="Annotation"/>
       </w:pPr>
       <w:r>
         <w:t xml:space="preserve">The effectiveness of anticancer radiotherapy is still limited by the tolerance of healthy tissues, and one strategy to optimise the dose delivered in external radiotherapy is the use of radiosensitizers. This work studies the radio-enhancement effect of silver (Ag) in biological matter irradiated with kilovoltage x-rays and quantifies it by the dose enhancement factor (DEF). The spectrum of a 45 kV copper-anode x-ray tube needed for the DEF calculations is modelled as a function of the tube design, technical parameters and filters. To this end, a semi-analytical thick-target model with one fitted parameter, the developed model (DM), was created and validated against SpekPy v2. The DEF was calculated in the kerma approximation with NIST mass energy-absorption coefficients and verified by Monte Carlo photon transport.</w:t>
@@ -205,15 +205,15 @@
     </w:p>
     <w:p>
       <w:pPr>
-        <w:pStyle w:val="BodyText"/>
+        <w:pStyle w:val="Annotation"/>
       </w:pPr>
       <w:r>
-        <w:t xml:space="preserve">The unfiltered spectrum is dominated by the Cu K lines at 8.0–8.9 keV (68.5 % of the photons), so the DEF for 1 % Ag by mass is only 1.20 and remains within 1.19–1.21 when the anode angle, tube voltage or beryllium window is changed. Added filtration is the decisive parameter: 1 mm Al raises the DEF to 1.48, 2 mm Al to 1.62 and 0.2 mm Cu to 1.80, while the air kerma decreases 120–1300-fold. At equal transmission, light and medium-Z filters (Al, Ti) are optimal, whereas filters with K-edges at 20–30 keV (Mo, Ag, Sn) are the least effective at strong filtration. For Al-filtered beams, the DM reproduces the SpekPy half-value layer within 5 % and the DEF within 2 %. The DEF increases with depth (beam hardening) and decreases inside a heavily loaded region (self-shielding); Monte Carlo calculations confirm these values within 1–10 %. Per unit mass, Ag is a weaker physical sensitizer than Au, Pt, Bi or Gd and is comparable to iodine. The xraylib 4.3.0 energy-absorption data for light elements were found to be up to 37 % too low, which would overestimate the DEF. The results support the choice of filtration and exposure conditions for experiments with Ag-containing radiosensitizers.</w:t>
+        <w:t xml:space="preserve">For Al-filtered beams, the DM reproduces the SpekPy half-value layer within 5 % and the DEF within 2 %. The unfiltered spectrum is dominated by the Cu K lines at 8.0–8.9 keV (68.5 % of the photons), so the DEF for 1 % Ag by mass is only 1.20 and remains within 1.19–1.21 when the anode angle, tube voltage or beryllium window is changed. Added filtration is the decisive parameter: 1 mm Al raises the DEF to 1.48 ± 0.02 (k = 1), 2 mm Al to 1.62 and 0.2 mm Cu to 1.80, while the air kerma decreases 120–1300-fold. At equal transmission, light and medium-Z filters (Al, Ti) are optimal, whereas filters with K-edges at 20–30 keV (Mo, Ag, Sn) are the least effective at strong filtration. The DEF increases with depth (beam hardening) and decreases inside a heavily loaded region (self-shielding); Monte Carlo calculations confirm these values within 1–10 %. Per unit mass, Ag is a weaker physical sensitizer than Au, Pt, Bi or Gd and is comparable to iodine. The xraylib 4.3.0 energy-absorption data for light elements were found to be up to 37 % too low, which would overestimate the DEF. The results support the choice of filtration and exposure conditions for experiments with Ag-containing radiosensitizers.</w:t>
       </w:r>
     </w:p>
     <w:p>
       <w:pPr>
-        <w:pStyle w:val="BodyText"/>
+        <w:pStyle w:val="Annotation"/>
       </w:pPr>
       <w:r>
         <w:rPr>
@@ -239,7 +239,7 @@
     </w:p>
     <w:p>
       <w:pPr>
-        <w:pStyle w:val="FirstParagraph"/>
+        <w:pStyle w:val="Annotation"/>
       </w:pPr>
       <w:r>
         <w:t xml:space="preserve">Saratonga qarshi nur terapiyasining samaradorligi hanuzgacha sog‘lom to‘qimalarning chidamliligi bilan cheklanib qolmoqda, masofaviy nur terapiyasida beriladigan dozani optimallashtirish strategiyalaridan biri esa radiosensibilizatorlardan foydalanishdir. Ushbu ishda kilovoltli rentgen nurlari bilan nurlantirilgan biologik muhitda kumushning (Ag) radiokuchayish effekti tadqiq qilinadi va u dozani kuchaytirish koeffitsiyenti (DEF) orqali miqdoriy baholanadi. DEFni hisoblash uchun zarur bo‘lgan 45 kV li mis anodli rentgen trubkasining spektri trubka konstruksiyasi, texnik parametrlari va filtrlariga bog‘liq holda modellashtiriladi. Shu maqsadda bitta moslashtirilgan parametrga ega bo‘lgan qalin nishonning yarim analitik modeli — ishlab chiqilgan model (IM) yaratildi va SpekPy v2 bilan solishtirish orqali validatsiya qilindi. DEF kerma yaqinlashuvida NIST massaviy energiya yutilish koeffitsiyentlari yordamida hisoblandi va fotonlar ko‘chishini Monte-Karlo usulida modellashtirish orqali verifikatsiya qilindi.</w:t>
@@ -247,15 +247,15 @@
     </w:p>
     <w:p>
       <w:pPr>
-        <w:pStyle w:val="BodyText"/>
+        <w:pStyle w:val="Annotation"/>
       </w:pPr>
       <w:r>
-        <w:t xml:space="preserve">Filtrlanmagan spektrda 8,0–8,9 keV dagi Cu K chiziqlari ustunlik qiladi (fotonlarning 68,5 % qismi), shu sababli massa bo‘yicha 1 % Ag uchun DEF atigi 1,20 ga teng bo‘lib, anod burchagi, trubka kuchlanishi yoki berilliy oyna o‘zgartirilganda 1,19–1,21 oralig‘ida qoladi. Qo‘shimcha filtrlash hal qiluvchi parametr hisoblanadi: 1 mm Al DEFni 1,48 gacha, 2 mm Al 1,62 gacha, 0,2 mm Cu esa 1,80 gacha oshiradi, bunda havodagi kerma 120–1300 marta kamayadi. O‘tkazish koeffitsiyenti bir xil bo‘lganda yengil va o‘rtacha Z li filtrlar (Al, Ti) optimal hisoblanadi, K-chegaralari 20–30 keV da joylashgan filtrlar (Mo, Ag, Sn) esa kuchli filtrlashda eng kam samarali bo‘ladi. Al bilan filtrlangan dastalar uchun IM SpekPy yordamida hisoblangan yarim susaytirish qatlamini 5 % dan, DEFni esa 2 % dan oshmaydigan farq bilan takrorlaydi. DEF chuqurlik ortishi bilan ortadi (dastaning qattiqlashishi) va Ag miqdori yuqori bo‘lgan soha ichida kamayadi (o‘z-o‘zini ekranlash); Monte-Karlo hisoblari bu qiymatlarni 1–10 % doirasida tasdiqlaydi. Massa birligiga nisbatan olinganda Ag fizik sensibilizator sifatida Au, Pt, Bi yoki Gd elementlaridan kuchsizroq bo‘lib, samaradorligi jihatidan yod bilan taqqoslanarli. Yengil elementlar uchun xraylib 4.3.0 kutubxonasidagi energiya yutilish ma’lumotlari 37 % gacha past baholanganligi aniqlandi, bu esa DEFning oshirib baholanishiga olib kelgan bo‘lar edi. Olingan natijalar Ag saqlovchi radiosensibilizatorlar bilan o‘tkaziladigan tajribalar uchun filtrlash va ekspozitsiya sharoitlarini tanlashga asos bo‘ladi.</w:t>
+        <w:t xml:space="preserve">Al bilan filtrlangan dastalar uchun IM SpekPy yordamida hisoblangan yarim susaytirish qatlamini 5 % dan, DEFni esa 2 % dan oshmaydigan farq bilan takrorlaydi. Filtrlanmagan spektrda 8,0–8,9 keV dagi Cu K chiziqlari ustunlik qiladi (fotonlarning 68,5 % qismi), shu sababli massa bo‘yicha 1 % Ag uchun DEF atigi 1,20 ga teng bo‘lib, anod burchagi, trubka kuchlanishi yoki berilliy oyna o‘zgartirilganda 1,19–1,21 oralig‘ida qoladi. Qo‘shimcha filtrlash hal qiluvchi parametr hisoblanadi: 1 mm Al DEFni 1,48 ± 0,02 (k = 1) gacha, 2 mm Al 1,62 gacha, 0,2 mm Cu esa 1,80 gacha oshiradi, bunda havodagi kerma 120–1300 marta kamayadi. O‘tkazish koeffitsiyenti bir xil bo‘lganda yengil va o‘rtacha Z li filtrlar (Al, Ti) optimal hisoblanadi, K-chegaralari 20–30 keV da joylashgan filtrlar (Mo, Ag, Sn) esa kuchli filtrlashda eng kam samarali bo‘ladi. DEF chuqurlik ortishi bilan ortadi (dastaning qattiqlashishi) va Ag ko‘p kiritilgan soha ichida kamayadi (o‘z-o‘zini ekranlash); Monte-Karlo hisoblari bu qiymatlarni 1–10 % doirasida tasdiqlaydi. Massa birligiga nisbatan olinganda Ag Au, Pt, Bi yoki Gdga qaraganda kuchsizroq fizik sensibilizator bo‘lib, yod bilan taqqoslanarli. Yengil elementlar uchun xraylib 4.3.0 kutubxonasidagi energiya yutilish ma’lumotlari 37 % gacha past baholanganligi aniqlandi, bu esa DEFning oshirib baholanishiga olib kelgan bo‘lar edi. Olingan natijalar Ag saqlovchi radiosensibilizatorlar bilan o‘tkaziladigan tajribalar uchun filtrlash va ekspozitsiya sharoitlarini tanlashga asos bo‘ladi.</w:t>
       </w:r>
     </w:p>
     <w:p>
       <w:pPr>
-        <w:pStyle w:val="BodyText"/>
+        <w:pStyle w:val="Annotation"/>
       </w:pPr>
       <w:r>
         <w:rPr>
@@ -268,7 +268,7 @@
         <w:t xml:space="preserve"> </w:t>
       </w:r>
       <w:r>
-        <w:t xml:space="preserve">rentgen trubkasi spektri; mis anod; tormozlanish nurlanishi; xarakteristik nurlanish; filtrlash; kumush; radiosensibilizatsiya; dozani kuchaytirish koeffitsiyenti; kilovoltli rentgen nurlanishi; Monte-Karlo usuli.</w:t>
+        <w:t xml:space="preserve">rentgen trubkasi spektri; mis anod; tormozlanish nurlanishi; xarakteristik nurlanish; filtrlash; kumush; radiosensibilizatsiya; dozani kuchaytirish koeffitsiyenti; kilovoltli rentgen nurlari; Monte-Karlo usuli.</w:t>
       </w:r>
     </w:p>
     <w:p>
@@ -281,7 +281,7 @@
     </w:p>
     <w:p>
       <w:pPr>
-        <w:pStyle w:val="FirstParagraph"/>
+        <w:pStyle w:val="Annotation"/>
       </w:pPr>
       <w:r>
         <w:t xml:space="preserve">Эффективность противоопухолевой лучевой терапии по-прежнему ограничена толерантностью здоровых тканей, и одной из стратегий оптимизации дозы, подводимой при дистанционной лучевой терапии, является применение радиосенсибилизаторов. В работе исследуется эффект радиоусиления, обусловленный серебром (Ag), в биологической среде, облучаемой киловольтным рентгеновским излучением, и проводится его количественная оценка с помощью коэффициента усиления дозы (DEF). Необходимый для расчёта DEF спектр рентгеновской трубки с медным анодом, работающей при напряжении 45 кВ, моделируется в зависимости от конструкции трубки, её технических параметров и фильтров. С этой целью создана полуаналитическая модель толстой мишени с одним подгоночным параметром — разработанная модель (РМ), — и выполнена её валидация путём сравнения со SpekPy v2. DEF рассчитан в приближении кермы с использованием массовых коэффициентов поглощения энергии NIST и верифицирован моделированием переноса фотонов методом Монте-Карло.</w:t>
@@ -289,15 +289,15 @@
     </w:p>
     <w:p>
       <w:pPr>
-        <w:pStyle w:val="BodyText"/>
+        <w:pStyle w:val="Annotation"/>
       </w:pPr>
       <w:r>
-        <w:t xml:space="preserve">В нефильтрованном спектре преобладают K-линии Cu с энергиями 8,0–8,9 кэВ (68,5 % фотонов), поэтому DEF при массовой доле Ag 1 % составляет лишь 1,20 и остаётся в пределах 1,19–1,21 при изменении угла анода, напряжения на трубке или бериллиевого окна. Решающим параметром является дополнительная фильтрация: фильтр 1 мм Al повышает DEF до 1,48, 2 мм Al — до 1,62, 0,2 мм Cu — до 1,80, при этом воздушная керма уменьшается в 120–1300 раз. При одинаковом пропускании оптимальны фильтры из лёгких элементов и элементов со средним Z (Al, Ti), тогда как фильтры с K-краями в области 20–30 кэВ (Mo, Ag, Sn) при сильной фильтрации наименее эффективны. Для пучков с алюминиевым фильтром РМ воспроизводит слой половинного ослабления, рассчитанный SpekPy, с точностью до 5 %, а DEF — с точностью до 2 %. DEF возрастает с глубиной (ужесточение пучка) и уменьшается внутри области с высоким содержанием серебра (самоэкранирование); расчёты методом Монте-Карло подтверждают эти значения в пределах 1–10 %. В расчёте на единицу массы Ag является более слабым физическим сенсибилизатором, чем Au, Pt, Bi или Gd, и сопоставимо с йодом. Установлено, что данные xraylib 4.3.0 о поглощении энергии для лёгких элементов занижены на величину до 37 %, что привело бы к завышению DEF. Полученные результаты служат обоснованием выбора фильтрации и условий облучения в экспериментах с серебросодержащими радиосенсибилизаторами.</w:t>
+        <w:t xml:space="preserve">Для пучков с алюминиевым фильтром РМ воспроизводит слой половинного ослабления, рассчитанный SpekPy, с точностью до 5 %, а DEF — с точностью до 2 %. В нефильтрованном спектре преобладают K-линии Cu с энергиями 8,0–8,9 кэВ (68,5 % фотонов), поэтому DEF при массовой доле Ag 1 % составляет лишь 1,20 и остаётся в пределах 1,19–1,21 при изменении угла анода, напряжения на трубке или бериллиевого окна. Решающим параметром является дополнительная фильтрация: фильтр 1 мм Al повышает DEF до 1,48 ± 0,02 (k = 1), 2 мм Al — до 1,62 и 0,2 мм Cu — до 1,80, при этом воздушная керма уменьшается в 120–1300 раз. При одинаковом пропускании оптимальны фильтры из лёгких элементов и элементов со средним Z (Al, Ti), тогда как фильтры с K-краями в области 20–30 кэВ (Mo, Ag, Sn) при сильной фильтрации наименее эффективны. DEF возрастает с глубиной (ужесточение пучка) и уменьшается внутри области с высоким содержанием серебра (самоэкранирование); расчёты методом Монте-Карло подтверждают эти значения в пределах 1–10 %. В расчёте на единицу массы Ag является более слабым физическим сенсибилизатором, чем Au, Pt, Bi или Gd, и сопоставимо с йодом. Установлено, что данные xraylib 4.3.0 о поглощении энергии для лёгких элементов занижены на величину до 37 %, что привело бы к завышению DEF. Полученные результаты служат обоснованием выбора фильтрации и условий облучения в экспериментах с серебросодержащими радиосенсибилизаторами.</w:t>
       </w:r>
     </w:p>
     <w:p>
       <w:pPr>
-        <w:pStyle w:val="BodyText"/>
+        <w:pStyle w:val="Annotation"/>
       </w:pPr>
       <w:r>
         <w:rPr>
@@ -337,7 +337,7 @@
       </w:r>
       <w:r>
         <w:tab/>
-        <w:t>10</w:t>
+        <w:t>7</w:t>
       </w:r>
     </w:p>
     <w:p>
@@ -356,7 +356,7 @@
       </w:r>
       <w:r>
         <w:tab/>
-        <w:t>11</w:t>
+        <w:t>9</w:t>
       </w:r>
     </w:p>
     <w:p>
@@ -375,7 +375,7 @@
       </w:r>
       <w:r>
         <w:tab/>
-        <w:t>16</w:t>
+        <w:t>14</w:t>
       </w:r>
     </w:p>
     <w:p>
@@ -391,7 +391,7 @@
       </w:r>
       <w:r>
         <w:tab/>
-        <w:t>16</w:t>
+        <w:t>14</w:t>
       </w:r>
     </w:p>
     <w:p>
@@ -407,7 +407,7 @@
       </w:r>
       <w:r>
         <w:tab/>
-        <w:t>17</w:t>
+        <w:t>15</w:t>
       </w:r>
     </w:p>
     <w:p>
@@ -423,7 +423,7 @@
       </w:r>
       <w:r>
         <w:tab/>
-        <w:t>20</w:t>
+        <w:t>18</w:t>
       </w:r>
     </w:p>
     <w:p>
@@ -439,7 +439,7 @@
       </w:r>
       <w:r>
         <w:tab/>
-        <w:t>23</w:t>
+        <w:t>21</w:t>
       </w:r>
     </w:p>
     <w:p>
@@ -455,7 +455,7 @@
       </w:r>
       <w:r>
         <w:tab/>
-        <w:t>25</w:t>
+        <w:t>23</w:t>
       </w:r>
     </w:p>
     <w:p>
@@ -471,7 +471,7 @@
       </w:r>
       <w:r>
         <w:tab/>
-        <w:t>28</w:t>
+        <w:t>26</w:t>
       </w:r>
     </w:p>
     <w:p>
@@ -490,7 +490,7 @@
       </w:r>
       <w:r>
         <w:tab/>
-        <w:t>29</w:t>
+        <w:t>27</w:t>
       </w:r>
     </w:p>
     <w:p>
@@ -506,7 +506,7 @@
       </w:r>
       <w:r>
         <w:tab/>
-        <w:t>29</w:t>
+        <w:t>27</w:t>
       </w:r>
     </w:p>
     <w:p>
@@ -522,7 +522,7 @@
       </w:r>
       <w:r>
         <w:tab/>
-        <w:t>31</w:t>
+        <w:t>29</w:t>
       </w:r>
     </w:p>
     <w:p>
@@ -538,7 +538,7 @@
       </w:r>
       <w:r>
         <w:tab/>
-        <w:t>32</w:t>
+        <w:t>30</w:t>
       </w:r>
     </w:p>
     <w:p>
@@ -554,7 +554,7 @@
       </w:r>
       <w:r>
         <w:tab/>
-        <w:t>34</w:t>
+        <w:t>32</w:t>
       </w:r>
     </w:p>
     <w:p>
@@ -570,7 +570,7 @@
       </w:r>
       <w:r>
         <w:tab/>
-        <w:t>37</w:t>
+        <w:t>35</w:t>
       </w:r>
     </w:p>
     <w:p>
@@ -586,7 +586,7 @@
       </w:r>
       <w:r>
         <w:tab/>
-        <w:t>39</w:t>
+        <w:t>37</w:t>
       </w:r>
     </w:p>
     <w:p>
@@ -602,7 +602,7 @@
       </w:r>
       <w:r>
         <w:tab/>
-        <w:t>41</w:t>
+        <w:t>39</w:t>
       </w:r>
     </w:p>
     <w:p>
@@ -618,7 +618,7 @@
       </w:r>
       <w:r>
         <w:tab/>
-        <w:t>43</w:t>
+        <w:t>41</w:t>
       </w:r>
     </w:p>
     <w:p>
@@ -634,7 +634,7 @@
       </w:r>
       <w:r>
         <w:tab/>
-        <w:t>44</w:t>
+        <w:t>42</w:t>
       </w:r>
     </w:p>
     <w:p>
@@ -650,7 +650,7 @@
       </w:r>
       <w:r>
         <w:tab/>
-        <w:t>45</w:t>
+        <w:t>43</w:t>
       </w:r>
     </w:p>
     <w:p>
@@ -669,7 +669,7 @@
       </w:r>
       <w:r>
         <w:tab/>
-        <w:t>47</w:t>
+        <w:t>45</w:t>
       </w:r>
     </w:p>
     <w:p>
@@ -685,7 +685,7 @@
       </w:r>
       <w:r>
         <w:tab/>
-        <w:t>47</w:t>
+        <w:t>45</w:t>
       </w:r>
     </w:p>
     <w:p>
@@ -701,7 +701,7 @@
       </w:r>
       <w:r>
         <w:tab/>
-        <w:t>51</w:t>
+        <w:t>49</w:t>
       </w:r>
     </w:p>
     <w:p>
@@ -717,7 +717,7 @@
       </w:r>
       <w:r>
         <w:tab/>
-        <w:t>52</w:t>
+        <w:t>50</w:t>
       </w:r>
     </w:p>
     <w:p>
@@ -733,7 +733,7 @@
       </w:r>
       <w:r>
         <w:tab/>
-        <w:t>55</w:t>
+        <w:t>53</w:t>
       </w:r>
     </w:p>
     <w:p>
@@ -749,7 +749,7 @@
       </w:r>
       <w:r>
         <w:tab/>
-        <w:t>58</w:t>
+        <w:t>56</w:t>
       </w:r>
     </w:p>
     <w:p>
@@ -765,7 +765,7 @@
       </w:r>
       <w:r>
         <w:tab/>
-        <w:t>61</w:t>
+        <w:t>59</w:t>
       </w:r>
     </w:p>
     <w:p>
@@ -781,7 +781,7 @@
       </w:r>
       <w:r>
         <w:tab/>
-        <w:t>64</w:t>
+        <w:t>62</w:t>
       </w:r>
     </w:p>
     <w:p>
@@ -797,7 +797,7 @@
       </w:r>
       <w:r>
         <w:tab/>
-        <w:t>67</w:t>
+        <w:t>65</w:t>
       </w:r>
     </w:p>
     <w:p>
@@ -813,7 +813,7 @@
       </w:r>
       <w:r>
         <w:tab/>
-        <w:t>69</w:t>
+        <w:t>67</w:t>
       </w:r>
     </w:p>
     <w:p>
@@ -829,7 +829,7 @@
       </w:r>
       <w:r>
         <w:tab/>
-        <w:t>71</w:t>
+        <w:t>69</w:t>
       </w:r>
     </w:p>
     <w:p>
@@ -845,7 +845,7 @@
       </w:r>
       <w:r>
         <w:tab/>
-        <w:t>73</w:t>
+        <w:t>70</w:t>
       </w:r>
     </w:p>
     <w:p>
@@ -861,7 +861,7 @@
       </w:r>
       <w:r>
         <w:tab/>
-        <w:t>75</w:t>
+        <w:t>72</w:t>
       </w:r>
     </w:p>
     <w:p>
@@ -880,7 +880,7 @@
       </w:r>
       <w:r>
         <w:tab/>
-        <w:t>75</w:t>
+        <w:t>72</w:t>
       </w:r>
     </w:p>
     <w:p>
@@ -896,7 +896,7 @@
       </w:r>
       <w:r>
         <w:tab/>
-        <w:t>77</w:t>
+        <w:t>75</w:t>
       </w:r>
     </w:p>
     <w:p>
@@ -912,7 +912,7 @@
       </w:r>
       <w:r>
         <w:tab/>
-        <w:t>78</w:t>
+        <w:t>76</w:t>
       </w:r>
     </w:p>
     <w:p>
@@ -931,7 +931,7 @@
       </w:r>
       <w:r>
         <w:tab/>
-        <w:t>79</w:t>
+        <w:t>77</w:t>
       </w:r>
     </w:p>
     <w:p>
@@ -950,7 +950,7 @@
       </w:r>
       <w:r>
         <w:tab/>
-        <w:t>87</w:t>
+        <w:t>85</w:t>
       </w:r>
     </w:p>
     <w:p>
@@ -966,7 +966,7 @@
       </w:r>
       <w:r>
         <w:tab/>
-        <w:t>87</w:t>
+        <w:t>85</w:t>
       </w:r>
     </w:p>
     <w:p>
@@ -982,7 +982,7 @@
       </w:r>
       <w:r>
         <w:tab/>
-        <w:t>89</w:t>
+        <w:t>87</w:t>
       </w:r>
     </w:p>
     <w:p>
@@ -1069,7 +1069,7 @@
               <w:rPr>
                 <w:sz w:val="20"/>
               </w:rPr>
-              <w:t xml:space="preserve">AgNP</w:t>
+              <w:t xml:space="preserve">AAPM</w:t>
             </w:r>
           </w:p>
         </w:tc>
@@ -1086,7 +1086,7 @@
               <w:rPr>
                 <w:sz w:val="20"/>
               </w:rPr>
-              <w:t xml:space="preserve">silver nanoparticle</w:t>
+              <w:t xml:space="preserve">American Association of Physicists in Medicine</w:t>
             </w:r>
           </w:p>
         </w:tc>
@@ -1105,7 +1105,7 @@
               <w:rPr>
                 <w:sz w:val="20"/>
               </w:rPr>
-              <w:t xml:space="preserve">AuNP</w:t>
+              <w:t xml:space="preserve">AgNP</w:t>
             </w:r>
           </w:p>
         </w:tc>
@@ -1122,7 +1122,7 @@
               <w:rPr>
                 <w:sz w:val="20"/>
               </w:rPr>
-              <w:t xml:space="preserve">gold nanoparticle</w:t>
+              <w:t xml:space="preserve">silver nanoparticle</w:t>
             </w:r>
           </w:p>
         </w:tc>
@@ -1141,7 +1141,7 @@
               <w:rPr>
                 <w:sz w:val="20"/>
               </w:rPr>
-              <w:t xml:space="preserve">CPE</w:t>
+              <w:t xml:space="preserve">ALARA</w:t>
             </w:r>
           </w:p>
         </w:tc>
@@ -1158,7 +1158,7 @@
               <w:rPr>
                 <w:sz w:val="20"/>
               </w:rPr>
-              <w:t xml:space="preserve">charged-particle equilibrium</w:t>
+              <w:t xml:space="preserve">as low as reasonably achievable</w:t>
             </w:r>
           </w:p>
         </w:tc>
@@ -1177,7 +1177,7 @@
               <w:rPr>
                 <w:sz w:val="20"/>
               </w:rPr>
-              <w:t xml:space="preserve">CSDA</w:t>
+              <w:t xml:space="preserve">AuNP</w:t>
             </w:r>
           </w:p>
         </w:tc>
@@ -1194,7 +1194,7 @@
               <w:rPr>
                 <w:sz w:val="20"/>
               </w:rPr>
-              <w:t xml:space="preserve">continuous-slowing-down approximation</w:t>
+              <w:t xml:space="preserve">gold nanoparticle</w:t>
             </w:r>
           </w:p>
         </w:tc>
@@ -1213,7 +1213,7 @@
               <w:rPr>
                 <w:sz w:val="20"/>
               </w:rPr>
-              <w:t xml:space="preserve">DCS</w:t>
+              <w:t xml:space="preserve">BH-E</w:t>
             </w:r>
           </w:p>
         </w:tc>
@@ -1230,7 +1230,7 @@
               <w:rPr>
                 <w:sz w:val="20"/>
               </w:rPr>
-              <w:t xml:space="preserve">differential cross-section</w:t>
+              <w:t xml:space="preserve">non-relativistic Bethe–Heitler bremsstrahlung cross-section with the Elwert factor</w:t>
             </w:r>
           </w:p>
         </w:tc>
@@ -1249,7 +1249,7 @@
               <w:rPr>
                 <w:sz w:val="20"/>
               </w:rPr>
-              <w:t xml:space="preserve">DEF</w:t>
+              <w:t xml:space="preserve">CPE</w:t>
             </w:r>
           </w:p>
         </w:tc>
@@ -1266,7 +1266,7 @@
               <w:rPr>
                 <w:sz w:val="20"/>
               </w:rPr>
-              <w:t xml:space="preserve">dose enhancement factor</w:t>
+              <w:t xml:space="preserve">charged-particle equilibrium</w:t>
             </w:r>
           </w:p>
         </w:tc>
@@ -1285,7 +1285,7 @@
               <w:rPr>
                 <w:sz w:val="20"/>
               </w:rPr>
-              <w:t xml:space="preserve">DM</w:t>
+              <w:t xml:space="preserve">CSDA</w:t>
             </w:r>
           </w:p>
         </w:tc>
@@ -1302,7 +1302,7 @@
               <w:rPr>
                 <w:sz w:val="20"/>
               </w:rPr>
-              <w:t xml:space="preserve">developed model (the semi-analytical x-ray spectrum model of this work)</w:t>
+              <w:t xml:space="preserve">continuous-slowing-down approximation</w:t>
             </w:r>
           </w:p>
         </w:tc>
@@ -1321,7 +1321,7 @@
               <w:rPr>
                 <w:sz w:val="20"/>
               </w:rPr>
-              <w:t xml:space="preserve">HVL</w:t>
+              <w:t xml:space="preserve">DEF</w:t>
             </w:r>
           </w:p>
         </w:tc>
@@ -1338,7 +1338,7 @@
               <w:rPr>
                 <w:sz w:val="20"/>
               </w:rPr>
-              <w:t xml:space="preserve">half-value layer (HVL1 and HVL2 are the first and second half-value layers)</w:t>
+              <w:t xml:space="preserve">dose enhancement factor</w:t>
             </w:r>
           </w:p>
         </w:tc>
@@ -1357,7 +1357,7 @@
               <w:rPr>
                 <w:sz w:val="20"/>
               </w:rPr>
-              <w:t xml:space="preserve">IAEA</w:t>
+              <w:t xml:space="preserve">DM</w:t>
             </w:r>
           </w:p>
         </w:tc>
@@ -1374,7 +1374,7 @@
               <w:rPr>
                 <w:sz w:val="20"/>
               </w:rPr>
-              <w:t xml:space="preserve">International Atomic Energy Agency</w:t>
+              <w:t xml:space="preserve">developed model (the semi-analytical x-ray spectrum model of this work)</w:t>
             </w:r>
           </w:p>
         </w:tc>
@@ -1393,7 +1393,7 @@
               <w:rPr>
                 <w:sz w:val="20"/>
               </w:rPr>
-              <w:t xml:space="preserve">ICRP</w:t>
+              <w:t xml:space="preserve">DNA</w:t>
             </w:r>
           </w:p>
         </w:tc>
@@ -1410,7 +1410,7 @@
               <w:rPr>
                 <w:sz w:val="20"/>
               </w:rPr>
-              <w:t xml:space="preserve">International Commission on Radiological Protection</w:t>
+              <w:t xml:space="preserve">deoxyribonucleic acid</w:t>
             </w:r>
           </w:p>
         </w:tc>
@@ -1429,7 +1429,7 @@
               <w:rPr>
                 <w:sz w:val="20"/>
               </w:rPr>
-              <w:t xml:space="preserve">ICRU</w:t>
+              <w:t xml:space="preserve">HVL</w:t>
             </w:r>
           </w:p>
         </w:tc>
@@ -1446,7 +1446,7 @@
               <w:rPr>
                 <w:sz w:val="20"/>
               </w:rPr>
-              <w:t xml:space="preserve">International Commission on Radiation Units and Measurements</w:t>
+              <w:t xml:space="preserve">half-value layer (HVL1 and HVL2 are the first and second half-value layers)</w:t>
             </w:r>
           </w:p>
         </w:tc>
@@ -1465,7 +1465,7 @@
               <w:rPr>
                 <w:sz w:val="20"/>
               </w:rPr>
-              <w:t xml:space="preserve">kVp</w:t>
+              <w:t xml:space="preserve">IAEA</w:t>
             </w:r>
           </w:p>
         </w:tc>
@@ -1482,7 +1482,7 @@
               <w:rPr>
                 <w:sz w:val="20"/>
               </w:rPr>
-              <w:t xml:space="preserve">kilovolt peak (peak voltage of the x-ray tube)</w:t>
+              <w:t xml:space="preserve">International Atomic Energy Agency</w:t>
             </w:r>
           </w:p>
         </w:tc>
@@ -1501,7 +1501,7 @@
               <w:rPr>
                 <w:sz w:val="20"/>
               </w:rPr>
-              <w:t xml:space="preserve">MC</w:t>
+              <w:t xml:space="preserve">ICRU</w:t>
             </w:r>
           </w:p>
         </w:tc>
@@ -1518,7 +1518,7 @@
               <w:rPr>
                 <w:sz w:val="20"/>
               </w:rPr>
-              <w:t xml:space="preserve">Monte Carlo (method)</w:t>
+              <w:t xml:space="preserve">International Commission on Radiation Units and Measurements</w:t>
             </w:r>
           </w:p>
         </w:tc>
@@ -1537,7 +1537,7 @@
               <w:rPr>
                 <w:sz w:val="20"/>
               </w:rPr>
-              <w:t xml:space="preserve">NIST</w:t>
+              <w:t xml:space="preserve">IEC</w:t>
             </w:r>
           </w:p>
         </w:tc>
@@ -1554,7 +1554,7 @@
               <w:rPr>
                 <w:sz w:val="20"/>
               </w:rPr>
-              <w:t xml:space="preserve">National Institute of Standards and Technology (USA)</w:t>
+              <w:t xml:space="preserve">International Electrotechnical Commission</w:t>
             </w:r>
           </w:p>
         </w:tc>
@@ -1573,7 +1573,7 @@
               <w:rPr>
                 <w:sz w:val="20"/>
               </w:rPr>
-              <w:t xml:space="preserve">ROS</w:t>
+              <w:t xml:space="preserve">kVp</w:t>
             </w:r>
           </w:p>
         </w:tc>
@@ -1590,7 +1590,7 @@
               <w:rPr>
                 <w:sz w:val="20"/>
               </w:rPr>
-              <w:t xml:space="preserve">reactive oxygen species</w:t>
+              <w:t xml:space="preserve">kilovolt peak (peak voltage of the x-ray tube)</w:t>
             </w:r>
           </w:p>
         </w:tc>
@@ -1609,7 +1609,7 @@
               <w:rPr>
                 <w:sz w:val="20"/>
               </w:rPr>
-              <w:t xml:space="preserve">RT</w:t>
+              <w:t xml:space="preserve">MC</w:t>
             </w:r>
           </w:p>
         </w:tc>
@@ -1626,7 +1626,7 @@
               <w:rPr>
                 <w:sz w:val="20"/>
               </w:rPr>
-              <w:t xml:space="preserve">radiotherapy</w:t>
+              <w:t xml:space="preserve">Monte Carlo (method)</w:t>
             </w:r>
           </w:p>
         </w:tc>
@@ -1645,6 +1645,114 @@
               <w:rPr>
                 <w:sz w:val="20"/>
               </w:rPr>
+              <w:t xml:space="preserve">NIST</w:t>
+            </w:r>
+          </w:p>
+        </w:tc>
+        <w:tc>
+          <w:tcPr/>
+          <w:p>
+            <w:pPr>
+              <w:pStyle w:val="Compact"/>
+              <w:spacing w:line="240" w:lineRule="auto"/>
+              <w:ind w:firstLine="0"/>
+              <w:jc w:val="left"/>
+            </w:pPr>
+            <w:r>
+              <w:rPr>
+                <w:sz w:val="20"/>
+              </w:rPr>
+              <w:t xml:space="preserve">National Institute of Standards and Technology (USA)</w:t>
+            </w:r>
+          </w:p>
+        </w:tc>
+      </w:tr>
+      <w:tr>
+        <w:tc>
+          <w:tcPr/>
+          <w:p>
+            <w:pPr>
+              <w:pStyle w:val="Compact"/>
+              <w:spacing w:line="240" w:lineRule="auto"/>
+              <w:ind w:firstLine="0"/>
+              <w:jc w:val="left"/>
+            </w:pPr>
+            <w:r>
+              <w:rPr>
+                <w:sz w:val="20"/>
+              </w:rPr>
+              <w:t xml:space="preserve">ROS</w:t>
+            </w:r>
+          </w:p>
+        </w:tc>
+        <w:tc>
+          <w:tcPr/>
+          <w:p>
+            <w:pPr>
+              <w:pStyle w:val="Compact"/>
+              <w:spacing w:line="240" w:lineRule="auto"/>
+              <w:ind w:firstLine="0"/>
+              <w:jc w:val="left"/>
+            </w:pPr>
+            <w:r>
+              <w:rPr>
+                <w:sz w:val="20"/>
+              </w:rPr>
+              <w:t xml:space="preserve">reactive oxygen species</w:t>
+            </w:r>
+          </w:p>
+        </w:tc>
+      </w:tr>
+      <w:tr>
+        <w:tc>
+          <w:tcPr/>
+          <w:p>
+            <w:pPr>
+              <w:pStyle w:val="Compact"/>
+              <w:spacing w:line="240" w:lineRule="auto"/>
+              <w:ind w:firstLine="0"/>
+              <w:jc w:val="left"/>
+            </w:pPr>
+            <w:r>
+              <w:rPr>
+                <w:sz w:val="20"/>
+              </w:rPr>
+              <w:t xml:space="preserve">RT</w:t>
+            </w:r>
+          </w:p>
+        </w:tc>
+        <w:tc>
+          <w:tcPr/>
+          <w:p>
+            <w:pPr>
+              <w:pStyle w:val="Compact"/>
+              <w:spacing w:line="240" w:lineRule="auto"/>
+              <w:ind w:firstLine="0"/>
+              <w:jc w:val="left"/>
+            </w:pPr>
+            <w:r>
+              <w:rPr>
+                <w:sz w:val="20"/>
+              </w:rPr>
+              <w:t xml:space="preserve">radiotherapy</w:t>
+            </w:r>
+          </w:p>
+        </w:tc>
+      </w:tr>
+      <w:tr>
+        <w:tc>
+          <w:tcPr/>
+          <w:p>
+            <w:pPr>
+              <w:pStyle w:val="Compact"/>
+              <w:spacing w:line="240" w:lineRule="auto"/>
+              <w:ind w:firstLine="0"/>
+              <w:jc w:val="left"/>
+            </w:pPr>
+            <w:r>
+              <w:rPr>
+                <w:sz w:val="20"/>
+              </w:rPr>
               <w:t xml:space="preserve">SER</w:t>
             </w:r>
           </w:p>
@@ -1663,6 +1771,78 @@
                 <w:sz w:val="20"/>
               </w:rPr>
               <w:t xml:space="preserve">sensitizer enhancement ratio</w:t>
+            </w:r>
+          </w:p>
+        </w:tc>
+      </w:tr>
+      <w:tr>
+        <w:tc>
+          <w:tcPr/>
+          <w:p>
+            <w:pPr>
+              <w:pStyle w:val="Compact"/>
+              <w:spacing w:line="240" w:lineRule="auto"/>
+              <w:ind w:firstLine="0"/>
+              <w:jc w:val="left"/>
+            </w:pPr>
+            <w:r>
+              <w:rPr>
+                <w:sz w:val="20"/>
+              </w:rPr>
+              <w:t xml:space="preserve">TASMIP</w:t>
+            </w:r>
+          </w:p>
+        </w:tc>
+        <w:tc>
+          <w:tcPr/>
+          <w:p>
+            <w:pPr>
+              <w:pStyle w:val="Compact"/>
+              <w:spacing w:line="240" w:lineRule="auto"/>
+              <w:ind w:firstLine="0"/>
+              <w:jc w:val="left"/>
+            </w:pPr>
+            <w:r>
+              <w:rPr>
+                <w:sz w:val="20"/>
+              </w:rPr>
+              <w:t xml:space="preserve">tungsten anode spectral model using interpolating polynomials</w:t>
+            </w:r>
+          </w:p>
+        </w:tc>
+      </w:tr>
+      <w:tr>
+        <w:tc>
+          <w:tcPr/>
+          <w:p>
+            <w:pPr>
+              <w:pStyle w:val="Compact"/>
+              <w:spacing w:line="240" w:lineRule="auto"/>
+              <w:ind w:firstLine="0"/>
+              <w:jc w:val="left"/>
+            </w:pPr>
+            <w:r>
+              <w:rPr>
+                <w:sz w:val="20"/>
+              </w:rPr>
+              <w:t xml:space="preserve">TBC</w:t>
+            </w:r>
+          </w:p>
+        </w:tc>
+        <w:tc>
+          <w:tcPr/>
+          <w:p>
+            <w:pPr>
+              <w:pStyle w:val="Compact"/>
+              <w:spacing w:line="240" w:lineRule="auto"/>
+              <w:ind w:firstLine="0"/>
+              <w:jc w:val="left"/>
+            </w:pPr>
+            <w:r>
+              <w:rPr>
+                <w:sz w:val="20"/>
+              </w:rPr>
+              <w:t xml:space="preserve">Tucker–Barnes–Chakraborty spectrum model</w:t>
             </w:r>
           </w:p>
         </w:tc>
@@ -1915,6 +2095,144 @@
               <w:ind w:firstLine="0"/>
               <w:jc w:val="left"/>
             </w:pPr>
+            <m:oMath>
+              <m:r>
+                <m:t>R</m:t>
+              </m:r>
+              <m:d>
+                <m:dPr>
+                  <m:begChr m:val="("/>
+                  <m:endChr m:val=")"/>
+                  <m:sepChr m:val=""/>
+                  <m:grow/>
+                </m:dPr>
+                <m:e>
+                  <m:r>
+                    <m:t>E</m:t>
+                  </m:r>
+                </m:e>
+              </m:d>
+            </m:oMath>
+            <w:r>
+              <w:rPr>
+                <w:sz w:val="20"/>
+              </w:rPr>
+              <w:t xml:space="preserve">,</w:t>
+            </w:r>
+            <w:r>
+              <w:rPr>
+                <w:sz w:val="20"/>
+              </w:rPr>
+              <w:t xml:space="preserve"> </w:t>
+            </w:r>
+            <m:oMath>
+              <m:r>
+                <m:rPr>
+                  <m:sty m:val="p"/>
+                </m:rPr>
+                <m:t>⟨</m:t>
+              </m:r>
+              <m:r>
+                <m:t>R</m:t>
+              </m:r>
+              <m:r>
+                <m:rPr>
+                  <m:sty m:val="p"/>
+                </m:rPr>
+                <m:t>⟩</m:t>
+              </m:r>
+            </m:oMath>
+          </w:p>
+        </w:tc>
+        <w:tc>
+          <w:tcPr/>
+          <w:p>
+            <w:pPr>
+              <w:pStyle w:val="Compact"/>
+              <w:spacing w:line="240" w:lineRule="auto"/>
+              <w:ind w:firstLine="0"/>
+              <w:jc w:val="left"/>
+            </w:pPr>
+            <w:r>
+              <w:rPr>
+                <w:sz w:val="20"/>
+              </w:rPr>
+              <w:t xml:space="preserve">ratio of the</w:t>
+            </w:r>
+            <w:r>
+              <w:rPr>
+                <w:sz w:val="20"/>
+              </w:rPr>
+              <w:t xml:space="preserve"> </w:t>
+            </w:r>
+            <m:oMath>
+              <m:sSub>
+                <m:e>
+                  <m:r>
+                    <m:t>μ</m:t>
+                  </m:r>
+                </m:e>
+                <m:sub>
+                  <m:r>
+                    <m:t>e</m:t>
+                  </m:r>
+                  <m:r>
+                    <m:t>n</m:t>
+                  </m:r>
+                </m:sub>
+              </m:sSub>
+              <m:r>
+                <m:rPr>
+                  <m:sty m:val="p"/>
+                </m:rPr>
+                <m:t>/</m:t>
+              </m:r>
+              <m:r>
+                <m:t>ρ</m:t>
+              </m:r>
+            </m:oMath>
+            <w:r>
+              <w:rPr>
+                <w:sz w:val="20"/>
+              </w:rPr>
+              <w:t xml:space="preserve"> </w:t>
+            </w:r>
+            <w:r>
+              <w:rPr>
+                <w:sz w:val="20"/>
+              </w:rPr>
+              <w:t xml:space="preserve">of silver to that of tissue at energy</w:t>
+            </w:r>
+            <w:r>
+              <w:rPr>
+                <w:sz w:val="20"/>
+              </w:rPr>
+              <w:t xml:space="preserve"> </w:t>
+            </w:r>
+            <m:oMath>
+              <m:r>
+                <m:t>E</m:t>
+              </m:r>
+            </m:oMath>
+            <w:r>
+              <w:rPr>
+                <w:sz w:val="20"/>
+              </w:rPr>
+              <w:t xml:space="preserve">; its dose-weighted spectral mean</w:t>
+            </w:r>
+          </w:p>
+        </w:tc>
+      </w:tr>
+      <w:tr>
+        <w:tc>
+          <w:tcPr/>
+          <w:p>
+            <w:pPr>
+              <w:pStyle w:val="Compact"/>
+              <w:spacing w:line="240" w:lineRule="auto"/>
+              <w:ind w:firstLine="0"/>
+              <w:jc w:val="left"/>
+            </w:pPr>
             <w:r>
               <w:rPr>
                 <w:sz w:val="20"/>
@@ -2105,6 +2423,94 @@
                 <w:sz w:val="20"/>
               </w:rPr>
               <w:t xml:space="preserve">kinetic energy of an electron, keV</w:t>
+            </w:r>
+          </w:p>
+        </w:tc>
+      </w:tr>
+      <w:tr>
+        <w:tc>
+          <w:tcPr/>
+          <w:p>
+            <w:pPr>
+              <w:pStyle w:val="Compact"/>
+              <w:spacing w:line="240" w:lineRule="auto"/>
+              <w:ind w:firstLine="0"/>
+              <w:jc w:val="left"/>
+            </w:pPr>
+            <m:oMath>
+              <m:sSub>
+                <m:e>
+                  <m:r>
+                    <m:t>T</m:t>
+                  </m:r>
+                </m:e>
+                <m:sub>
+                  <m:r>
+                    <m:t>0</m:t>
+                  </m:r>
+                </m:sub>
+              </m:sSub>
+            </m:oMath>
+          </w:p>
+        </w:tc>
+        <w:tc>
+          <w:tcPr/>
+          <w:p>
+            <w:pPr>
+              <w:pStyle w:val="Compact"/>
+              <w:spacing w:line="240" w:lineRule="auto"/>
+              <w:ind w:firstLine="0"/>
+              <w:jc w:val="left"/>
+            </w:pPr>
+            <w:r>
+              <w:rPr>
+                <w:sz w:val="20"/>
+              </w:rPr>
+              <w:t xml:space="preserve">initial kinetic energy of the electrons at the anode,</w:t>
+            </w:r>
+            <w:r>
+              <w:rPr>
+                <w:sz w:val="20"/>
+              </w:rPr>
+              <w:t xml:space="preserve"> </w:t>
+            </w:r>
+            <m:oMath>
+              <m:sSub>
+                <m:e>
+                  <m:r>
+                    <m:t>T</m:t>
+                  </m:r>
+                </m:e>
+                <m:sub>
+                  <m:r>
+                    <m:t>0</m:t>
+                  </m:r>
+                </m:sub>
+              </m:sSub>
+              <m:r>
+                <m:rPr>
+                  <m:sty m:val="p"/>
+                </m:rPr>
+                <m:t>=</m:t>
+              </m:r>
+              <m:r>
+                <m:t>e</m:t>
+              </m:r>
+              <m:r>
+                <m:t>U</m:t>
+              </m:r>
+            </m:oMath>
+            <w:r>
+              <w:rPr>
+                <w:sz w:val="20"/>
+              </w:rPr>
+              <w:t xml:space="preserve"> </w:t>
+            </w:r>
+            <w:r>
+              <w:rPr>
+                <w:sz w:val="20"/>
+              </w:rPr>
+              <w:t xml:space="preserve">(maximum photon energy), keV</w:t>
             </w:r>
           </w:p>
         </w:tc>
@@ -2770,7 +3176,7 @@
         <w:t xml:space="preserve"> </w:t>
       </w:r>
       <w:r>
-        <w:t xml:space="preserve">absorb kilovoltage photons far more strongly than soft tissue owing to the photoelectric effect [8]. Gold nanoparticles improved the survival of tumour-bearing mice irradiated with 250 kVp (kilovolt peak) x-rays [9], and dose enhancement by gold is much larger for kilovoltage than for megavoltage beams [10]. Silver nanoparticles (AgNPs) were proposed as a radiosensitizer for glioma [11] and outperformed gold nanoparticles (AuNPs) in vitro and in mice [12]; silver is also cheaper, and its K-edge at 25.514 keV lies inside the spectrum of a 45 kV x-ray tube.</w:t>
+        <w:t xml:space="preserve">absorb kilovoltage photons far more strongly than soft tissue owing to the photoelectric effect [8]. Combined with 250 kVp (kilovolt peak) x-rays, gold nanoparticles markedly prolonged the survival of tumour-bearing mice [9], and dose enhancement by gold is much larger for kilovoltage than for megavoltage beams [10]. Silver nanoparticles (AgNPs) were proposed as a radiosensitizer for glioma [11] and outperformed gold nanoparticles (AuNPs) in vitro and in mice [12]; silver is also cheaper, and its K-edge at 25.514 keV lies inside the spectrum of a 45 kV x-ray tube.</w:t>
       </w:r>
     </w:p>
     <w:p>
@@ -2796,7 +3202,7 @@
         <w:t xml:space="preserve"> </w:t>
       </w:r>
       <w:r>
-        <w:t xml:space="preserve">Dose enhancement near high-Z media goes back to Spiers’s analysis of energy absorption near irradiated bone [18]; iodine enhancement was later calculated for kilovoltage beams [19, 20] and used to treat brain metastases with a modified computed tomography scanner [21]. Gold nanoparticles have been studied in cells and by Monte Carlo (MC) simulation [22–25], their mechanisms reviewed [26–28] and elements compared as functions of photon energy [13, 29]; the enhancement around nanoparticles is highly localised [30], and such nanoscale deposition can explain biological effects beyond the macroscopic enhancement [31]. For silver, radiosensitization by AgNPs was shown in cancer cells [32], glioma [33, 34], breast cancer cells [35] and colorectal cancer [36]. AgNPs are themselves cytotoxic and induce reactive oxygen species and DNA damage [37], so part of their effect may be chemical or biological. Silver dosimetry was studied by MC for brachytherapy [38], tissues around a loaded tumour [39] and skin [40] and in dose gels [41]; the depth dependence of enhancement in orthovoltage beams was examined in an MC phantom [42].</w:t>
+        <w:t xml:space="preserve">Dose enhancement near high-Z media goes back to Spiers’s analysis of energy absorption near irradiated bone [18]; iodine enhancement was later calculated for kilovoltage beams [19, 20] and used to treat brain metastases with a modified computed tomography scanner [21]. Gold nanoparticles have been studied in cells and by Monte Carlo (MC) simulation [22–25], their mechanisms reviewed [26–28] and elements compared as functions of photon energy [13, 29]; the enhancement around nanoparticles is highly localised [30], and such nanoscale deposition can explain biological effects beyond the macroscopic enhancement [31]. For silver, radiosensitization by AgNPs was shown in cancer cells [32], glioma [33, 34], breast cancer cells [35] and colorectal cancer [36]. AgNPs are themselves cytotoxic and induce reactive oxygen species and damage to deoxyribonucleic acid (DNA) [37], so part of their effect may be chemical or biological. Silver dosimetry was studied by MC for brachytherapy [38], tissues around a loaded tumour [39] and skin [40] and in dose gels [41]; the depth dependence of enhancement in orthovoltage beams was examined in an MC phantom [42].</w:t>
       </w:r>
     </w:p>
     <w:p>
@@ -2978,7 +3384,7 @@
         <w:t xml:space="preserve"> </w:t>
       </w:r>
       <w:r>
-        <w:t xml:space="preserve">The spectrum is calculated with the developed model (DM), a semi-analytical thick-target model based on the Bethe stopping power, the non-relativistic Bethe–Heitler cross-section with the Elwert factor and the Gryzinski K-shell cross-section [53–57], with SpekPy v2.5.4 as the reference [58]. Interaction data are from the NIST tables [59] and xraylib [60], with ICRU-44 soft tissue as the reference medium [61]. The DEF is calculated in the kerma approximation [62] and verified by an in-house MC photon-transport code with Woodcock tracking [63], Ag K fluorescence, coherent and incoherent scattering [64] and local electron energy deposition. Uncertainties are estimated by sensitivity analysis; the code uses Python with NumPy, SciPy and Matplotlib [65–67].</w:t>
+        <w:t xml:space="preserve">The spectrum is calculated with the developed model (DM), a semi-analytical thick-target model based on the Bethe stopping power, the non-relativistic Bethe–Heitler cross-section with the Elwert factor and the Gryziński K-shell cross-section [53–57], with SpekPy v2.5.4 as the reference [58]. Interaction data are from the tables of the National Institute of Standards and Technology (NIST) [59] and xraylib [60], with the ICRU-44 soft tissue of the International Commission on Radiation Units and Measurements (ICRU) as the reference medium [61]. The DEF is calculated in the kerma approximation [62] and verified by an in-house MC photon-transport code with Woodcock tracking [63], Ag K fluorescence, coherent and incoherent scattering [64] and local electron energy deposition. Uncertainties are estimated by sensitivity analysis; the code uses Python with NumPy, SciPy and Matplotlib [65–67].</w:t>
       </w:r>
     </w:p>
     <w:p>
@@ -3217,7 +3623,7 @@
         <w:t xml:space="preserve"> </w:t>
       </w:r>
       <w:r>
-        <w:t xml:space="preserve">The dissertation comprises annotations, a list of abbreviations, an introduction, three chapters, conclusions, references and appendices: 89 pages, 23 figures, 17 tables and 121 references. Chapter 1 reviews the literature, Chapter 2 presents the methods and Chapter 3 the results and their discussion.</w:t>
+        <w:t xml:space="preserve">The dissertation comprises annotations, a list of abbreviations, an introduction, three chapters, conclusions, references and appendices: 87 pages, 23 figures, 17 tables and 121 references. Chapter 1 reviews the literature, Chapter 2 presents the methods and Chapter 3 the results and their discussion.</w:t>
       </w:r>
     </w:p>
     <w:p>
@@ -3241,7 +3647,7 @@
         <w:pStyle w:val="FirstParagraph"/>
       </w:pPr>
       <w:r>
-        <w:t xml:space="preserve">Cancer is a major cause of morbidity and mortality worldwide [1], and radiotherapy (RT) is one of its principal treatment modalities [4], with an evidence-based optimal utilisation rate of approximately 52 % [2]. RT damages cellular DNA directly through secondary electrons or indirectly through the free radicals of water radiolysis [3], but because energy deposition is not selective, the healthy tissues traversed by the beam are damaged as well and limit the tumour dose [3, 4]. When the sigmoid dose–response curves for tumour control and normal-tissue complications lie close together (a small therapeutic ratio), normal-tissue toxicity becomes the main factor limiting RT [3, 4]. Hypoxic tumour cells, less sensitive to x-rays because of the oxygen effect, aggravate the problem [3].</w:t>
+        <w:t xml:space="preserve">Against the background of the global cancer burden [1], radiotherapy (RT) is one of the principal treatment modalities [4], with an evidence-based optimal utilisation rate of approximately 52 % [2]. RT damages cellular deoxyribonucleic acid (DNA) directly through secondary electrons or indirectly through the free radicals of water radiolysis [3], but because energy deposition is not selective, the healthy tissues traversed by the beam are damaged as well and limit the tumour dose [3, 4]. When the sigmoid dose–response curves for tumour control and normal-tissue complications lie close together (a small therapeutic ratio), normal-tissue toxicity becomes the main factor limiting RT [3, 4]. Hypoxic tumour cells, less sensitive to x-rays because of the oxygen effect, aggravate the problem [3].</w:t>
       </w:r>
     </w:p>
     <w:p>
@@ -3249,7 +3655,21 @@
         <w:pStyle w:val="BodyText"/>
       </w:pPr>
       <w:r>
-        <w:t xml:space="preserve">Fractionation [3] and conformal, image-guided techniques such as intensity-modulated RT [17] spare normal tissue but do not change the ratio of the energy absorbed per unit mass in tumour and normal cells within the same beam region. Radiosensitizers, which increase the effect of radiation on tumour cells more than on normal cells, include oxygen mimetics such as the nitroimidazoles [5] and transition-metal compounds (platinum, gold, ruthenium) that combine chemical and biological activity with heavy atoms [6]. High-Z elements act by an essentially physical principle: concentrated in the tumour, they absorb more photon energy per unit mass than soft tissue, raising the tumour dose while the dose to element-free surrounding tissue remains practically unchanged [7, 9]. The gain is expressed by the dose enhancement factor (DEF), the ratio of the absorbed doses in tissue with and without the agent (Section 2.6), which, unlike chemical sensitization, can be calculated from interaction data once the radiation field is known.</w:t>
+        <w:t xml:space="preserve">Fractionation [3] and conformal, image-guided techniques such as intensity-modulated RT [17] spare normal tissue but do not change the ratio of the energy absorbed per unit mass in tumour and normal cells within the same beam region. Radiosensitizers, which increase the effect of radiation on tumour cells more than on normal cells, include oxygen mimetics such as the nitroimidazoles [5] and transition-metal compounds (platinum, gold, ruthenium) that combine chemical and biological activity with heavy atoms [6]. Elements of high atomic number</w:t>
+      </w:r>
+      <w:r>
+        <w:t xml:space="preserve"> </w:t>
+      </w:r>
+      <m:oMath>
+        <m:r>
+          <m:t>Z</m:t>
+        </m:r>
+      </m:oMath>
+      <w:r>
+        <w:t xml:space="preserve"> </w:t>
+      </w:r>
+      <w:r>
+        <w:t xml:space="preserve">(high-Z elements) act by an essentially physical principle: concentrated in the tumour, they absorb more photon energy per unit mass than soft tissue, raising the tumour dose while the dose to element-free surrounding tissue remains practically unchanged [7, 9]. The gain is expressed by the dose enhancement factor (DEF), the ratio of the doses absorbed in tissue with and without the agent (Section 2.6), which, unlike chemical sensitization, can be calculated from interaction data once the radiation field is known.</w:t>
       </w:r>
     </w:p>
     <w:p>
@@ -4847,7 +5267,7 @@
       <w:r>
         <w:drawing>
           <wp:inline>
-            <wp:extent cx="5219999" cy="3102243"/>
+            <wp:extent cx="4859999" cy="2888295"/>
             <wp:effectExtent b="0" l="0" r="0" t="0"/>
             <wp:docPr descr="Fig. 1.1. Mass attenuation (solid) and mass energy-absorption (dashed) coefficients of silver and ICRU-44 soft tissue at 1–50 keV (NIST data). The vertical dashed line marks the Ag K-edge at 25.51 keV; the arrow marks the Ag L-subshell edges." title="" id="21" name="Picture"/>
             <a:graphic>
@@ -4868,7 +5288,7 @@
                   <pic:spPr bwMode="auto">
                     <a:xfrm>
                       <a:off x="0" y="0"/>
-                      <a:ext cx="5219999" cy="3102243"/>
+                      <a:ext cx="4859999" cy="2888295"/>
                     </a:xfrm>
                     <a:prstGeom prst="rect">
                       <a:avLst/>
@@ -4971,7 +5391,7 @@
         <w:pStyle w:val="FirstParagraph"/>
       </w:pPr>
       <w:r>
-        <w:t xml:space="preserve">Spiers first analysed how the increased energy absorption of bone and the secondary-electron ranges determine the dose to soft tissue in and near bone [18], and Das and Chopra quantified the backscatter dose perturbation at tissue–high-Z interfaces in kilovoltage beams [78]. The first systematic studies used iodinated contrast media, which sensitized cultured mammalian cells to x-rays but not to gamma rays [79], pointing to photoabsorption by iodine. Dose enhancement in iodine-loaded tumours was calculated for kilovoltage x-rays [19] and for brain-tumour therapy [20], and a computed tomography scanner modified for therapy (CTRx) delivered the first such treatment of human brain metastases [21]. Monochromatic synchrotron beams treated rats bearing iodine-loaded F98 gliomas [80] and identified the optimal energy for iodinated compounds in cells [81]; contrast-enhanced kilovoltage RT was analysed by MC [82], and modified megavoltage beams were combined with iodine and gadolinium contrast [83].</w:t>
+        <w:t xml:space="preserve">Spiers first analysed how the increased energy absorption of bone and the secondary-electron ranges determine the dose to soft tissue in and near bone [18], and Das and Chopra quantified the backscatter dose perturbation at tissue–high-Z interfaces in kilovoltage beams [78]. The first systematic studies used iodinated contrast media, which sensitized cultured mammalian cells to x-rays but not to gamma rays [79], pointing to photoabsorption by iodine. Dose enhancement in iodine-loaded tumours was calculated for kilovoltage x-rays [19] and for brain-tumour therapy [20], and a computed tomography scanner modified for therapy delivered the first such treatment of human brain metastases [21]. Monochromatic synchrotron beams treated rats bearing iodine-loaded F98 gliomas [80] and identified the optimal energy for iodinated compounds in cells [81]; contrast-enhanced kilovoltage RT was analysed by MC [82], and modified megavoltage beams were combined with iodine and gadolinium contrast [83].</w:t>
       </w:r>
     </w:p>
     <w:p>
@@ -5164,7 +5584,7 @@
       <w:r>
         <w:drawing>
           <wp:inline>
-            <wp:extent cx="5219999" cy="3077486"/>
+            <wp:extent cx="4859999" cy="2865245"/>
             <wp:effectExtent b="0" l="0" r="0" t="0"/>
             <wp:docPr descr="Fig. 1.2. Ratio of the mass energy-absorption coefficients of Ag, I, Gd, Pt, Au and Bi to that of ICRU-44 soft tissue at 5–45 keV (NIST data). The vertical dashed line marks the Ag K-edge at 25.51 keV." title="" id="24" name="Picture"/>
             <a:graphic>
@@ -5185,7 +5605,7 @@
                   <pic:spPr bwMode="auto">
                     <a:xfrm>
                       <a:off x="0" y="0"/>
-                      <a:ext cx="5219999" cy="3077486"/>
+                      <a:ext cx="4859999" cy="2865245"/>
                     </a:xfrm>
                     <a:prstGeom prst="rect">
                       <a:avLst/>
@@ -5750,7 +6170,7 @@
               <w:rPr>
                 <w:sz w:val="20"/>
               </w:rPr>
-              <w:t xml:space="preserve">PEG and AS1411 coating enhanced the effect</w:t>
+              <w:t xml:space="preserve">Polyethylene glycol and aptamer AS1411 enhanced the effect</w:t>
             </w:r>
           </w:p>
         </w:tc>
@@ -5870,7 +6290,42 @@
         </m:r>
       </m:oMath>
       <w:r>
-        <w:t xml:space="preserve">, only about 17 % of K vacancies relax by Auger transitions that deposit their energy locally [73, 74]; the other 83 % emit mainly Kα photons of about 22 keV, whose mean free path of about 1.5 cm in soft tissue carries this energy away. The ratio of the mass energy-absorption coefficients of silver and ICRU-44 soft tissue is 21–32 between 8 keV and the K-edge but 76–139 between the edge and 45 keV (Sections 1.2 and 1.3). Unlike the gold K-edge (80.725 keV), usable only above about 81 kV, the silver K-edge lies inside the spectrum of any tube operated above about 26 kV. The most favourable spectra therefore carry much of their energy fluence between the Ag K-edge and the end-point energy (45 keV here), far above the Cu K lines at 8.0–8.9 keV that dominate the photon fluence of the unfiltered copper-anode beam.</w:t>
+        <w:t xml:space="preserve">, only about 17 % of K vacancies relax by Auger transitions that deposit their energy locally [73, 74]; the other 83 % emit mainly Kα photons that carry their energy away (Section 1.2). Nevertheless, the silver-to-tissue ratio of</w:t>
+      </w:r>
+      <w:r>
+        <w:t xml:space="preserve"> </w:t>
+      </w:r>
+      <m:oMath>
+        <m:sSub>
+          <m:e>
+            <m:r>
+              <m:t>μ</m:t>
+            </m:r>
+          </m:e>
+          <m:sub>
+            <m:r>
+              <m:t>e</m:t>
+            </m:r>
+            <m:r>
+              <m:t>n</m:t>
+            </m:r>
+          </m:sub>
+        </m:sSub>
+        <m:r>
+          <m:rPr>
+            <m:sty m:val="p"/>
+          </m:rPr>
+          <m:t>/</m:t>
+        </m:r>
+        <m:r>
+          <m:t>ρ</m:t>
+        </m:r>
+      </m:oMath>
+      <w:r>
+        <w:t xml:space="preserve"> </w:t>
+      </w:r>
+      <w:r>
+        <w:t xml:space="preserve">is 76–139 above the edge, against 21–32 between 8 keV and the edge (Sections 1.2 and 1.3). Unlike the gold K-edge (80.725 keV), usable only above about 81 kV, the silver K-edge lies inside the spectrum of any tube operated above about 26 kV. The most favourable spectra therefore carry much of their energy fluence between the Ag K-edge and the end-point energy (45 keV here), far above the Cu K lines at 8.0–8.9 keV that dominate the photon fluence of the unfiltered copper-anode beam.</w:t>
       </w:r>
     </w:p>
     <w:p>
@@ -5886,7 +6341,7 @@
         <w:pStyle w:val="FirstParagraph"/>
       </w:pPr>
       <w:r>
-        <w:t xml:space="preserve">Measuring the spectrum needed for the DEF with semiconductor detectors [44] requires detector-response corrections and is impractical for every configuration, so parametric studies use calculated spectra; the four groups of methods are compared in Table 1.2. The empirical model TASMIP (tungsten anode spectral model using interpolating polynomials) interpolates measured tungsten-anode spectra from 30 to 140 kV [43], and spektr 3.0 is based on the TASMICS model [102]. Such models are fast and accurate within their data range but tied to the anode material, angle and inherent filtration of the measured tubes: added filtration can be modelled as attenuation, but the anode material and angle, studied in this work, cannot.</w:t>
+        <w:t xml:space="preserve">Measuring the spectrum needed for the DEF with semiconductor detectors [44] requires detector-response corrections and is impractical for every configuration, so parametric studies use calculated spectra; the four groups of methods are compared in Table 1.2. The empirical model TASMIP (tungsten anode spectral model using interpolating polynomials) interpolates measured tungsten-anode spectra from 30 to 140 kV [43], and the spektr 3.0 tool implements a similar interpolation model [102]. Such models are fast and accurate within their data range but tied to the anode material, angle and inherent filtration of the measured tubes: added filtration can be modelled as attenuation, but the anode material and angle, studied in this work, cannot.</w:t>
       </w:r>
     </w:p>
     <w:p>
@@ -6401,7 +6856,7 @@
         <w:pStyle w:val="BodyText"/>
       </w:pPr>
       <w:r>
-        <w:t xml:space="preserve">The calculated spectrum must be related to measurable quantities. In kilovoltage dosimetry, beam quality is specified by the HVL together with the tube voltage [110], as in the protocol of the American Association of Physicists in Medicine for 40–300 kV beams (AAPM TG-61) [14], the IAEA TRS-398 code of practice [70] and the standard radiation qualities of the International Electrotechnical Commission (IEC 61267) [111]. The HVL is thus the natural quantity for comparing models with each other and with measurements. It does not, however, fix the energy-fluence fraction above the Ag K-edge, so beams with similar HVLs can give different DEFs for silver, as Chapter 3 shows for filters with absorption edges (Table 3.5).</w:t>
+        <w:t xml:space="preserve">The calculated spectrum must be related to measurable quantities. In kilovoltage dosimetry, beam quality is specified by the HVL together with the tube voltage [110], as in the protocol of the American Association of Physicists in Medicine for 40–300 kV beams (AAPM TG-61) [14], the TRS-398 code of practice of the International Atomic Energy Agency (IAEA) [70] and the standard radiation qualities of the International Electrotechnical Commission (IEC 61267) [111]. The HVL is thus the natural quantity for comparing models with each other and with measurements. It does not, however, fix the energy-fluence fraction above the Ag K-edge, so beams with similar HVLs can give different DEFs for silver, as Chapter 3 shows for filters with absorption edges (Table 3.5).</w:t>
       </w:r>
     </w:p>
     <w:p>
@@ -6409,7 +6864,7 @@
         <w:pStyle w:val="BodyText"/>
       </w:pPr>
       <w:r>
-        <w:t xml:space="preserve">Most of these models were developed for tungsten, the usual target of medical tubes [16]. Copper-anode tubes serve mainly x-ray diffraction (XRD), where Cu Kα is the working line, Kβ is suppressed by a nickel filter [52] and the bremsstrahlung continuum is unwanted background. For silver dose enhancement, by contrast, the continuum is the useful part, since only bremsstrahlung photons can exceed the Ag K-edge; yet the full spectrum of copper-anode tubes and its dependence on tube parameters have received much less attention. This work therefore constructed a semi-analytical physics-based model of the copper-anode tube, the developed model (DM), which combines the Bethe collision stopping power in the continuous slowing-down approximation (CSDA) [53, 68], the non-relativistic Bethe–Heitler bremsstrahlung cross-section with the Elwert factor [54–56] and the Gryzinski K-shell ionisation cross-section [57], with one adjustable parameter, the electron depth factor (Chapter 2). All dependences on tube parameters remain explicit, and SpekPy v2 serves as the validation reference.</w:t>
+        <w:t xml:space="preserve">Most of these models were developed for tungsten, the usual target of medical tubes [16]. Copper-anode tubes serve mainly x-ray diffraction, where Cu Kα is the working line, Kβ is suppressed by a nickel filter [52] and the bremsstrahlung continuum is unwanted background. For silver dose enhancement, by contrast, the continuum is the useful part, since only bremsstrahlung photons can exceed the Ag K-edge; yet the full spectrum of copper-anode tubes and its dependence on tube parameters have received much less attention. This work therefore constructed a semi-analytical physics-based model of the copper-anode tube, the developed model (DM), which combines the Bethe collision stopping power in the continuous slowing-down approximation (CSDA) [53, 68], the non-relativistic Bethe–Heitler bremsstrahlung cross-section with the Elwert factor [54–56] and the Gryziński K-shell ionisation cross-section [57], with one adjustable parameter, the electron depth factor (Chapter 2). All dependences on tube parameters remain explicit, and SpekPy v2 serves as the validation reference.</w:t>
       </w:r>
     </w:p>
     <w:p>
@@ -6589,10 +7044,7 @@
         </m:r>
       </m:oMath>
       <w:r>
-        <w:t xml:space="preserve"> </w:t>
-      </w:r>
-      <w:r>
-        <w:t xml:space="preserve">(labelled d in Fig. 2.1).</w:t>
+        <w:t xml:space="preserve">.</w:t>
       </w:r>
     </w:p>
     <w:p>
@@ -6602,7 +7054,7 @@
       <w:r>
         <w:drawing>
           <wp:inline>
-            <wp:extent cx="5219999" cy="2747368"/>
+            <wp:extent cx="4859999" cy="2557894"/>
             <wp:effectExtent b="0" l="0" r="0" t="0"/>
             <wp:docPr descr="Fig. 2.1. Schematic diagram of the modelled reflection-target copper-anode tube and of the irradiation geometry: photons emitted along the central ray at the anode angle θ pass the beryllium window, the added filter and the air gap (focus–sample distance d, denoted r in the text) to the Ag-containing tissue sample." title="" id="27" name="Picture"/>
             <a:graphic>
@@ -6623,7 +7075,7 @@
                   <pic:spPr bwMode="auto">
                     <a:xfrm>
                       <a:off x="0" y="0"/>
-                      <a:ext cx="5219999" cy="2747368"/>
+                      <a:ext cx="4859999" cy="2557894"/>
                     </a:xfrm>
                     <a:prstGeom prst="rect">
                       <a:avLst/>
@@ -7134,7 +7586,7 @@
               <w:rPr>
                 <w:sz w:val="20"/>
               </w:rPr>
-              <w:t xml:space="preserve">Al 0.25–6 mm; Ti, Ni, Cu, Mo, Ag, Sn; 54 elements Z = 13–83</w:t>
+              <w:t xml:space="preserve">Al 0.25–6 mm; Ti, Ni, Cu, Mo, Ag, Sn; 43 elements Z = 13–83</w:t>
             </w:r>
           </w:p>
         </w:tc>
@@ -7206,7 +7658,7 @@
         <w:pStyle w:val="FirstParagraph"/>
       </w:pPr>
       <w:r>
-        <w:t xml:space="preserve">Neglecting radiative losses, the DM uses the continuous-slowing-down approximation (CSDA) with the Bethe mass collision stopping power [53] in the form of ICRU Report 37 [68]:</w:t>
+        <w:t xml:space="preserve">Neglecting radiative losses, the DM uses the continuous-slowing-down approximation (CSDA) with the Bethe mass collision stopping power [53] in the form of Report 37 of the International Commission on Radiation Units and Measurements (ICRU) [68]:</w:t>
       </w:r>
     </w:p>
     <w:tbl>
@@ -8201,7 +8653,7 @@
         <w:t xml:space="preserve"> </w:t>
       </w:r>
       <w:r>
-        <w:t xml:space="preserve">= 322 eV; the density-effect correction (negligible below 100 keV) and the shell corrections (relevant only at the lowest energies) are omitted; for water the code reproduces the NIST ESTAR stopping power [69] (Section 2.8). The path length travelled while slowing down from</w:t>
+        <w:t xml:space="preserve">= 322 eV; the density-effect correction (negligible below 100 keV) and the shell corrections (relevant only at the lowest energies) are omitted; for water the code reproduces the ESTAR stopping power of the National Institute of Standards and Technology (NIST) [69] (Section 2.8). The path length travelled while slowing down from</w:t>
       </w:r>
       <w:r>
         <w:t xml:space="preserve"> </w:t>
@@ -8886,9 +9338,9 @@
       <w:r>
         <w:drawing>
           <wp:inline>
-            <wp:extent cx="5219999" cy="2284470"/>
+            <wp:extent cx="4859999" cy="2126920"/>
             <wp:effectExtent b="0" l="0" r="0" t="0"/>
-            <wp:docPr descr="Fig. 2.2. Electron slowing-down and K-shell ionisation in the copper anode: (a) Bethe collision stopping power (solid, left axis) and projected depth at which a 45 keV electron has slowed down to the energy T, for η = 0.4 and θ = 12° (dashed, right axis); (b) Gryziński K-shell ionisation cross-section of copper." title="" id="30" name="Picture"/>
+            <wp:docPr descr="Fig. 2.2. Electron slowing-down and K-shell ionisation in the copper anode: (a) Bethe collision stopping power (solid, left axis) and projected depth at which a 45 keV electron has slowed down to the energy T, for η = 0.40 and θ = 12° (dashed, right axis); (b) Gryziński K-shell ionisation cross-section of copper." title="" id="30" name="Picture"/>
             <a:graphic>
               <a:graphicData uri="http://schemas.openxmlformats.org/drawingml/2006/picture">
                 <pic:pic>
@@ -8907,7 +9359,7 @@
                   <pic:spPr bwMode="auto">
                     <a:xfrm>
                       <a:off x="0" y="0"/>
-                      <a:ext cx="5219999" cy="2284470"/>
+                      <a:ext cx="4859999" cy="2126920"/>
                     </a:xfrm>
                     <a:prstGeom prst="rect">
                       <a:avLst/>
@@ -8931,7 +9383,7 @@
         <w:pStyle w:val="ImageCaption"/>
       </w:pPr>
       <w:r>
-        <w:t xml:space="preserve">Fig. 2.2. Electron slowing-down and K-shell ionisation in the copper anode: (a) Bethe collision stopping power (solid, left axis) and projected depth at which a 45 keV electron has slowed down to the energy T, for η = 0.4 and θ = 12° (dashed, right axis); (b) Gryziński K-shell ionisation cross-section of copper.</w:t>
+        <w:t xml:space="preserve">Fig. 2.2. Electron slowing-down and K-shell ionisation in the copper anode: (a) Bethe collision stopping power (solid, left axis) and projected depth at which a 45 keV electron has slowed down to the energy T, for η = 0.40 and θ = 12° (dashed, right axis); (b) Gryziński K-shell ionisation cross-section of copper.</w:t>
       </w:r>
     </w:p>
     <w:p>
@@ -20952,7 +21404,7 @@
         <w:t xml:space="preserve"> </w:t>
       </w:r>
       <w:r>
-        <w:t xml:space="preserve">jumps at the Ag K-edge (25.514 keV) from 31.8 to about 76 and reaches about 139 at 40–45 keV (Section 1.2). Shifting the dose spectrum above the K-edge therefore raises the slope, the basis of the filter optimisation in Chapter 3.</w:t>
+        <w:t xml:space="preserve">jumps at the Ag K-edge (25.514 keV) from about 32 to about 76 and reaches about 139 at 40–45 keV (Section 1.2). Shifting the dose spectrum above the K-edge therefore raises the slope, the basis of the filter optimisation in Chapter 3.</w:t>
       </w:r>
     </w:p>
     <w:p>
@@ -24306,7 +24758,7 @@
         <w:t xml:space="preserve"> </w:t>
       </w:r>
       <w:r>
-        <w:t xml:space="preserve">of tissue, water and air are taken from the NIST tables [59, 75]. The module</w:t>
+        <w:t xml:space="preserve">of tissue, water and air are obtained from the NIST elemental tables [59, 75], for compounds by the mixture rule. The module</w:t>
       </w:r>
       <w:r>
         <w:t xml:space="preserve"> </w:t>
@@ -24781,7 +25233,7 @@
         <w:pStyle w:val="FirstParagraph"/>
       </w:pPr>
       <w:r>
-        <w:t xml:space="preserve">The results were obtained with the developed model (DM) of Chapter 2 and with the reference code SpekPy v2.5.4 [15, 58]. Unless stated otherwise, the baseline conditions of Table 2.1 apply: a constant potential of 45 kV, an anode angle θ = 12°, a 0.5 mm Be window, 10 cm of air between the focal spot and the sample, and 0.05 keV energy bins. The dose enhancement factor (DEF) is calculated in the kerma approximation, which assumes charged-particle equilibrium (CPE), for ICRU-44 soft tissue [61] with NIST mass energy-absorption coefficients [59];</w:t>
+        <w:t xml:space="preserve">The results were obtained with the developed model (DM) of Chapter 2 and with the reference code SpekPy v2.5.4 [15, 58]. Unless stated otherwise, the baseline conditions of Table 2.1 apply: a constant potential of 45 kV, an anode angle θ = 12°, a 0.5 mm Be window, 10 cm of air between the focal spot and the sample, and 0.05 keV energy bins. The dose enhancement factor (DEF) is calculated in the kerma approximation, which assumes charged-particle equilibrium (CPE), for the ICRU-44 soft tissue of the International Commission on Radiation Units and Measurements (ICRU) [61] with the mass energy-absorption coefficients of the National Institute of Standards and Technology (NIST) [59];</w:t>
       </w:r>
       <w:r>
         <w:t xml:space="preserve"> </w:t>
@@ -25395,7 +25847,7 @@
         <w:pStyle w:val="BodyText"/>
       </w:pPr>
       <w:r>
-        <w:t xml:space="preserve">Table 3.1 compares the two codes for 25–50 kV and 6–30° without the air path. With 1 mm Al, which removes the Cu K lines, the first HVL (2.18) of the DM is lower than that of SpekPy by 3.5–4.6 %. Without added filtration the HVL deviation ranges from −2.6 % to −19.4 %, because the DM underestimates the Cu K lines by about 25–43 %, and a weaker 8 keV line gives more weight to the softer 3–8 keV continuum in the air kerma. The deficit is largest at low voltage, where the Gryzinski cross-section [57] rises too slowly above the ionisation threshold compared with the distorted-wave Born calculations [114, 115] underlying the K-line model of SpekPy [104].</w:t>
+        <w:t xml:space="preserve">Table 3.1 compares the two codes for 25–50 kV and 6–30° without the air path. With 1 mm Al, which removes the Cu K lines, the first HVL (2.18) of the DM is lower than that of SpekPy by 3.5–4.6 %. Without added filtration the HVL deviation ranges from −2.6 % to −19.4 %, because the DM underestimates the Cu K lines by about 25–43 %, and a weaker 8 keV line gives more weight to the softer 3–8 keV continuum in the air kerma. The deficit is largest at low voltage, where the Gryziński cross-section [57] rises too slowly above the ionisation threshold compared with the distorted-wave Born calculations [114, 115] underlying the K-line model of SpekPy [104].</w:t>
       </w:r>
     </w:p>
     <w:p>
@@ -28389,7 +28841,7 @@
       <w:r>
         <w:drawing>
           <wp:inline>
-            <wp:extent cx="5219999" cy="3582805"/>
+            <wp:extent cx="4859999" cy="3335715"/>
             <wp:effectExtent b="0" l="0" r="0" t="0"/>
             <wp:docPr descr="Fig. 3.1. Spectra of the 45 kV Cu-anode tube (baseline geometry) from SpekPy v2 and the developed model without added filtration (left) and with 1.0 mm Al (right), normalised to equal bremsstrahlung area above 9.6 keV; lower panels: ratio of the two." title="" id="33" name="Picture"/>
             <a:graphic>
@@ -28410,7 +28862,7 @@
                   <pic:spPr bwMode="auto">
                     <a:xfrm>
                       <a:off x="0" y="0"/>
-                      <a:ext cx="5219999" cy="3582805"/>
+                      <a:ext cx="4859999" cy="3335715"/>
                     </a:xfrm>
                     <a:prstGeom prst="rect">
                       <a:avLst/>
@@ -28456,7 +28908,7 @@
         <w:t xml:space="preserve"> </w:t>
       </w:r>
       <w:r>
-        <w:t xml:space="preserve">was applied to a tungsten anode at 50, 80 and 100 kV with 2.5 mm Al, which removes the W L lines not included in the DM (Table 3.2). The HVL deviations lie between −5.7 % and +0.5 %, and at 50 kV both values are comparable to the first HVL of the IEC 61267 quality RQR3 (1.78 mm Al) [111]. As for copper, the DM spectra have a slightly weaker high-energy tail (Fig. 3.2). A single value of</w:t>
+        <w:t xml:space="preserve">was applied to a tungsten anode at 50, 80 and 100 kV with 2.5 mm Al, which removes the W L lines not included in the DM (Table 3.2). The HVL deviations lie between −5.7 % and +0.5 %, and at 50 kV both values are comparable to the first HVL (1.78 mm Al) of the quality RQR3 of the International Electrotechnical Commission standard IEC 61267 [111]. As for copper, the DM spectra have a slightly weaker high-energy tail (Fig. 3.2). A single value of</w:t>
       </w:r>
       <w:r>
         <w:t xml:space="preserve"> </w:t>
@@ -28940,7 +29392,7 @@
       <w:r>
         <w:drawing>
           <wp:inline>
-            <wp:extent cx="5219999" cy="3077486"/>
+            <wp:extent cx="4859999" cy="2865245"/>
             <wp:effectExtent b="0" l="0" r="0" t="0"/>
             <wp:docPr descr="Fig. 3.2. Spectra of a tungsten-anode tube (θ = 12°, 2.5 mm Al) at 50, 80 and 100 kV from SpekPy v2 (solid lines) and the developed model (dashed lines, η = 0.40), normalised to equal area." title="" id="36" name="Picture"/>
             <a:graphic>
@@ -28961,7 +29413,7 @@
                   <pic:spPr bwMode="auto">
                     <a:xfrm>
                       <a:off x="0" y="0"/>
-                      <a:ext cx="5219999" cy="3077486"/>
+                      <a:ext cx="4859999" cy="2865245"/>
                     </a:xfrm>
                     <a:prstGeom prst="rect">
                       <a:avLst/>
@@ -29011,7 +29463,7 @@
       <w:r>
         <w:drawing>
           <wp:inline>
-            <wp:extent cx="5219999" cy="3077486"/>
+            <wp:extent cx="4859999" cy="2865245"/>
             <wp:effectExtent b="0" l="0" r="0" t="0"/>
             <wp:docPr descr="Fig. 3.3. Spectrum of the 45 kV Cu-anode tube (θ = 12°, 0.5 mm Be, 10 cm air) from SpekPy v2 and the developed model. The dashed line marks the Ag K-edge (25.514 keV)." title="" id="39" name="Picture"/>
             <a:graphic>
@@ -29032,7 +29484,7 @@
                   <pic:spPr bwMode="auto">
                     <a:xfrm>
                       <a:off x="0" y="0"/>
-                      <a:ext cx="5219999" cy="3077486"/>
+                      <a:ext cx="4859999" cy="2865245"/>
                     </a:xfrm>
                     <a:prstGeom prst="rect">
                       <a:avLst/>
@@ -30015,7 +30467,7 @@
       <w:r>
         <w:drawing>
           <wp:inline>
-            <wp:extent cx="5219999" cy="3077486"/>
+            <wp:extent cx="4859999" cy="2865245"/>
             <wp:effectExtent b="0" l="0" r="0" t="0"/>
             <wp:docPr descr="Fig. 3.4. Influence of the anode angle (6–30°) on the spectrum of the 45 kV Cu-anode tube (0.5 mm Be, 10 cm air; SpekPy v2). The dashed line marks the Ag K-edge." title="" id="42" name="Picture"/>
             <a:graphic>
@@ -30036,7 +30488,7 @@
                   <pic:spPr bwMode="auto">
                     <a:xfrm>
                       <a:off x="0" y="0"/>
-                      <a:ext cx="5219999" cy="3077486"/>
+                      <a:ext cx="4859999" cy="2865245"/>
                     </a:xfrm>
                     <a:prstGeom prst="rect">
                       <a:avLst/>
@@ -30105,7 +30557,7 @@
       <w:r>
         <w:drawing>
           <wp:inline>
-            <wp:extent cx="5219999" cy="3077486"/>
+            <wp:extent cx="4859999" cy="2865245"/>
             <wp:effectExtent b="0" l="0" r="0" t="0"/>
             <wp:docPr descr="Fig. 3.5. Spectra of the Cu-anode tube at tube voltages of 25–50 kV (baseline geometry; SpekPy v2). The dashed line marks the Ag K-edge." title="" id="45" name="Picture"/>
             <a:graphic>
@@ -30126,7 +30578,7 @@
                   <pic:spPr bwMode="auto">
                     <a:xfrm>
                       <a:off x="0" y="0"/>
-                      <a:ext cx="5219999" cy="3077486"/>
+                      <a:ext cx="4859999" cy="2865245"/>
                     </a:xfrm>
                     <a:prstGeom prst="rect">
                       <a:avLst/>
@@ -30168,7 +30620,7 @@
       <w:r>
         <w:drawing>
           <wp:inline>
-            <wp:extent cx="5219999" cy="3013448"/>
+            <wp:extent cx="4859999" cy="2805624"/>
             <wp:effectExtent b="0" l="0" r="0" t="0"/>
             <wp:docPr descr="Fig. 3.6. Influence of the Be window thickness (0.15–2.0 mm) on the low-energy part of the spectrum of the 45 kV Cu-anode tube (θ = 12°, 10 cm air; SpekPy v2)." title="" id="48" name="Picture"/>
             <a:graphic>
@@ -30189,7 +30641,7 @@
                   <pic:spPr bwMode="auto">
                     <a:xfrm>
                       <a:off x="0" y="0"/>
-                      <a:ext cx="5219999" cy="3013448"/>
+                      <a:ext cx="4859999" cy="2805624"/>
                     </a:xfrm>
                     <a:prstGeom prst="rect">
                       <a:avLst/>
@@ -31885,7 +32337,7 @@
       <w:r>
         <w:drawing>
           <wp:inline>
-            <wp:extent cx="5219999" cy="3080655"/>
+            <wp:extent cx="4859999" cy="2868196"/>
             <wp:effectExtent b="0" l="0" r="0" t="0"/>
             <wp:docPr descr="Fig. 3.7. Spectra of the 45 kV Cu-anode tube with added Al filters of 0.25–2.0 mm (baseline geometry; SpekPy v2). The dashed line marks the Ag K-edge." title="" id="51" name="Picture"/>
             <a:graphic>
@@ -31906,7 +32358,7 @@
                   <pic:spPr bwMode="auto">
                     <a:xfrm>
                       <a:off x="0" y="0"/>
-                      <a:ext cx="5219999" cy="3080655"/>
+                      <a:ext cx="4859999" cy="2868196"/>
                     </a:xfrm>
                     <a:prstGeom prst="rect">
                       <a:avLst/>
@@ -32018,7 +32470,7 @@
       <w:r>
         <w:drawing>
           <wp:inline>
-            <wp:extent cx="5219999" cy="3080655"/>
+            <wp:extent cx="4859999" cy="2868196"/>
             <wp:effectExtent b="0" l="0" r="0" t="0"/>
             <wp:docPr descr="Fig. 3.8. Spectra of the 45 kV Cu-anode tube with a 0.02 mm Ni filter and with Cu filters of 0.05–0.2 mm (baseline geometry; SpekPy v2). The dashed line marks the Ag K-edge." title="" id="54" name="Picture"/>
             <a:graphic>
@@ -32039,7 +32491,7 @@
                   <pic:spPr bwMode="auto">
                     <a:xfrm>
                       <a:off x="0" y="0"/>
-                      <a:ext cx="5219999" cy="3080655"/>
+                      <a:ext cx="4859999" cy="2868196"/>
                     </a:xfrm>
                     <a:prstGeom prst="rect">
                       <a:avLst/>
@@ -32108,7 +32560,7 @@
       <w:r>
         <w:drawing>
           <wp:inline>
-            <wp:extent cx="5219999" cy="3176549"/>
+            <wp:extent cx="4859999" cy="2957476"/>
             <wp:effectExtent b="0" l="0" r="0" t="0"/>
             <wp:docPr descr="Fig. 3.9. Spectra of the 45 kV Cu-anode tube filtered by Mo 0.05 mm, Ag 0.05 mm and Sn 0.05 and 0.1 mm compared with 1.0 mm Al, relative to the maximum of the Al-filtered spectrum (SpekPy v2). The dashed line marks the Ag K-edge." title="" id="57" name="Picture"/>
             <a:graphic>
@@ -32129,7 +32581,7 @@
                   <pic:spPr bwMode="auto">
                     <a:xfrm>
                       <a:off x="0" y="0"/>
-                      <a:ext cx="5219999" cy="3176549"/>
+                      <a:ext cx="4859999" cy="2957476"/>
                     </a:xfrm>
                     <a:prstGeom prst="rect">
                       <a:avLst/>
@@ -34218,7 +34670,7 @@
       <w:r>
         <w:drawing>
           <wp:inline>
-            <wp:extent cx="5219999" cy="2199260"/>
+            <wp:extent cx="4859999" cy="2047586"/>
             <wp:effectExtent b="0" l="0" r="0" t="0"/>
             <wp:docPr descr="Fig. 3.10. Dose integrand E\,\Phi(E)\,\mu_{en}/\rho for ICRU-44 soft tissue (shaded) and tissue with 1 % Ag (line), without filtration (left) and with 1.0 mm Al (right); 45 kV Cu-anode tube, SpekPy v2. The dashed line marks the Ag K-edge." title="" id="60" name="Picture"/>
             <a:graphic>
@@ -34239,7 +34691,7 @@
                   <pic:spPr bwMode="auto">
                     <a:xfrm>
                       <a:off x="0" y="0"/>
-                      <a:ext cx="5219999" cy="2199260"/>
+                      <a:ext cx="4859999" cy="2047586"/>
                     </a:xfrm>
                     <a:prstGeom prst="rect">
                       <a:avLst/>
@@ -34509,7 +34961,7 @@
       <w:r>
         <w:drawing>
           <wp:inline>
-            <wp:extent cx="5219999" cy="3132645"/>
+            <wp:extent cx="4859999" cy="2916600"/>
             <wp:effectExtent b="0" l="0" r="0" t="0"/>
             <wp:docPr descr="Fig. 3.11. Dose enhancement factor of ICRU-44 soft tissue versus the Ag mass fraction for different added filters (SpekPy v2 spectra, kerma approximation at the surface)." title="" id="63" name="Picture"/>
             <a:graphic>
@@ -34530,7 +34982,7 @@
                   <pic:spPr bwMode="auto">
                     <a:xfrm>
                       <a:off x="0" y="0"/>
-                      <a:ext cx="5219999" cy="3132645"/>
+                      <a:ext cx="4859999" cy="2916600"/>
                     </a:xfrm>
                     <a:prstGeom prst="rect">
                       <a:avLst/>
@@ -36510,7 +36962,7 @@
       <w:r>
         <w:drawing>
           <wp:inline>
-            <wp:extent cx="5219999" cy="3086553"/>
+            <wp:extent cx="4859999" cy="2873688"/>
             <wp:effectExtent b="0" l="0" r="0" t="0"/>
             <wp:docPr descr="Fig. 3.12. Dose enhancement factor for 1 % Ag versus the relative air kerma for Al, Ti, Ni, Cu, Mo, Ag and Sn filters of increasing thickness (45 kV Cu-anode tube, baseline geometry; SpekPy v2)." title="" id="66" name="Picture"/>
             <a:graphic>
@@ -36531,7 +36983,7 @@
                   <pic:spPr bwMode="auto">
                     <a:xfrm>
                       <a:off x="0" y="0"/>
-                      <a:ext cx="5219999" cy="3086553"/>
+                      <a:ext cx="4859999" cy="2873688"/>
                     </a:xfrm>
                     <a:prstGeom prst="rect">
                       <a:avLst/>
@@ -37254,7 +37706,7 @@
       <w:r>
         <w:drawing>
           <wp:inline>
-            <wp:extent cx="5219999" cy="3152002"/>
+            <wp:extent cx="4859999" cy="2934622"/>
             <wp:effectExtent b="0" l="0" r="0" t="0"/>
             <wp:docPr descr="Fig. 3.13. Dose enhancement factor for 1 % Ag with filters of elements Z = 13–83 whose thickness gives an equal air-kerma transmission of 10 %, 1 % and 0.1 % (45 kV Cu-anode tube, baseline geometry; SpekPy v2)." title="" id="69" name="Picture"/>
             <a:graphic>
@@ -37275,7 +37727,7 @@
                   <pic:spPr bwMode="auto">
                     <a:xfrm>
                       <a:off x="0" y="0"/>
-                      <a:ext cx="5219999" cy="3152002"/>
+                      <a:ext cx="4859999" cy="2934622"/>
                     </a:xfrm>
                     <a:prstGeom prst="rect">
                       <a:avLst/>
@@ -40343,7 +40795,7 @@
         <w:t xml:space="preserve"> </w:t>
       </w:r>
       <w:r>
-        <w:t xml:space="preserve">is larger. Without a filter the DEF for 1 % Ag rises from 1.20 to 1.56 at 20 mm, but the dose falls to 0.0090 at 10 mm as the Cu K lines and soft bremsstrahlung are absorbed: tissue acts as an added filter (Section 3.6). With Al 1 mm, which has already hardened the beam, the DEF rises only to 1.69 at 20 mm and the dose falls only to 0.439 at 10 mm.</w:t>
+        <w:t xml:space="preserve">is larger. Without a filter the DEF for 1 % Ag rises from 1.20 to 1.56 at 20 mm, but the dose falls to 0.0090 at 10 mm as the Cu K lines and soft bremsstrahlung are absorbed: tissue acts as an added filter (Section 3.4). With Al 1 mm, which has already hardened the beam, the DEF rises only to 1.69 at 20 mm and the dose falls only to 0.439 at 10 mm.</w:t>
       </w:r>
     </w:p>
     <w:p>
@@ -40353,7 +40805,7 @@
       <w:r>
         <w:drawing>
           <wp:inline>
-            <wp:extent cx="5219999" cy="3132645"/>
+            <wp:extent cx="4859999" cy="2916600"/>
             <wp:effectExtent b="0" l="0" r="0" t="0"/>
             <wp:docPr descr="Fig. 3.14. Dose enhancement factor for 1 % Ag versus depth of the Ag-loaded region in Ag-free soft tissue for the unfiltered 45 kV beam and four added filters (SpekPy, primary beam, kerma approximation)." title="" id="72" name="Picture"/>
             <a:graphic>
@@ -40374,7 +40826,7 @@
                   <pic:spPr bwMode="auto">
                     <a:xfrm>
                       <a:off x="0" y="0"/>
-                      <a:ext cx="5219999" cy="3132645"/>
+                      <a:ext cx="4859999" cy="2916600"/>
                     </a:xfrm>
                     <a:prstGeom prst="rect">
                       <a:avLst/>
@@ -41801,7 +42253,7 @@
       <w:r>
         <w:drawing>
           <wp:inline>
-            <wp:extent cx="5219999" cy="3158454"/>
+            <wp:extent cx="4859999" cy="2940630"/>
             <wp:effectExtent b="0" l="0" r="0" t="0"/>
             <wp:docPr descr="Fig. 3.15. Dose enhancement factor versus depth inside a uniformly Ag-loaded region starting at the surface: 0.5, 1.0 and 2.0 % Ag, Al 1.0 mm (solid) and Sn 0.1 mm (dashed) filters, self-shielding included." title="" id="75" name="Picture"/>
             <a:graphic>
@@ -41822,7 +42274,7 @@
                   <pic:spPr bwMode="auto">
                     <a:xfrm>
                       <a:off x="0" y="0"/>
-                      <a:ext cx="5219999" cy="3158454"/>
+                      <a:ext cx="4859999" cy="2940630"/>
                     </a:xfrm>
                     <a:prstGeom prst="rect">
                       <a:avLst/>
@@ -41882,6 +42334,24 @@
         <w:t xml:space="preserve"> </w:t>
       </w:r>
       <m:oMath>
+        <m:sSub>
+          <m:e>
+            <m:r>
+              <m:t>T</m:t>
+            </m:r>
+          </m:e>
+          <m:sub>
+            <m:r>
+              <m:t>0</m:t>
+            </m:r>
+          </m:sub>
+        </m:sSub>
+        <m:r>
+          <m:rPr>
+            <m:sty m:val="p"/>
+          </m:rPr>
+          <m:t>=</m:t>
+        </m:r>
         <m:r>
           <m:t>e</m:t>
         </m:r>
@@ -41893,18 +42363,7 @@
         <w:t xml:space="preserve"> </w:t>
       </w:r>
       <w:r>
-        <w:t xml:space="preserve">(</w:t>
-      </w:r>
-      <m:oMath>
-        <m:r>
-          <m:t>e</m:t>
-        </m:r>
-      </m:oMath>
-      <w:r>
-        <w:t xml:space="preserve"> </w:t>
-      </w:r>
-      <w:r>
-        <w:t xml:space="preserve">is the elementary charge), and below this voltage the DEF changes little. The slope increases from 26–27 kV; between 30 and 50 kV the DEF with Al 1 mm rises from 1.31 to 1.52 ever more slowly (±0.009 per ±1 kV at 45 kV, Section 3.10), and above 50 kV the growth slows further as the spectrum extends beyond the maximum of the Ag/tissue ratio near 40–45 keV. As the DM gives slightly lower DEFs than SpekPy at 45 kV (1.464 versus 1.482), the 60–80 kV values are, if anything, underestimated, and part of the flattening between 50 and 60 kV reflects the change of model.</w:t>
+        <w:t xml:space="preserve">(Section 2.1), and below this voltage the DEF changes little. The slope increases from 26–27 kV; between 30 and 50 kV the DEF with Al 1 mm rises from 1.31 to 1.52 ever more slowly (±0.009 per ±1 kV at 45 kV, Section 3.10), and above 50 kV the growth slows further as the spectrum extends beyond the maximum of the Ag/tissue ratio near 40–45 keV. As the DM gives slightly lower DEFs than SpekPy at 45 kV (1.464 versus 1.482), the 60–80 kV values are, if anything, underestimated, and part of the flattening between 50 and 60 kV reflects the change of model.</w:t>
       </w:r>
     </w:p>
     <w:p>
@@ -41914,7 +42373,7 @@
       <w:r>
         <w:drawing>
           <wp:inline>
-            <wp:extent cx="5219999" cy="3174585"/>
+            <wp:extent cx="4859999" cy="2955648"/>
             <wp:effectExtent b="0" l="0" r="0" t="0"/>
             <wp:docPr descr="Fig. 3.16. Dose enhancement factor for 1 % Ag versus tube voltage (Al 0.5 and 1.0 mm filters): SpekPy v2 for 20–50 kV (solid) and the developed model for 60–80 kV (dashed); the vertical line marks the Ag K-edge." title="" id="78" name="Picture"/>
             <a:graphic>
@@ -41935,7 +42394,7 @@
                   <pic:spPr bwMode="auto">
                     <a:xfrm>
                       <a:off x="0" y="0"/>
-                      <a:ext cx="5219999" cy="3174585"/>
+                      <a:ext cx="4859999" cy="2955648"/>
                     </a:xfrm>
                     <a:prstGeom prst="rect">
                       <a:avLst/>
@@ -42863,7 +43322,7 @@
       <w:r>
         <w:drawing>
           <wp:inline>
-            <wp:extent cx="5219999" cy="2993918"/>
+            <wp:extent cx="4859999" cy="2787441"/>
             <wp:effectExtent b="0" l="0" r="0" t="0"/>
             <wp:docPr descr="Fig. 3.17. Dose enhancement factor of soft tissue with 1 % by mass of Ag, I, Gd, Pt, Au or Bi at 45 kV without added filter and with Al 1.0 mm or Sn 0.1 mm (SpekPy, kerma approximation)." title="" id="81" name="Picture"/>
             <a:graphic>
@@ -42884,7 +43343,7 @@
                   <pic:spPr bwMode="auto">
                     <a:xfrm>
                       <a:off x="0" y="0"/>
-                      <a:ext cx="5219999" cy="2993918"/>
+                      <a:ext cx="4859999" cy="2787441"/>
                     </a:xfrm>
                     <a:prstGeom prst="rect">
                       <a:avLst/>
@@ -43535,7 +43994,10 @@
         <w:t xml:space="preserve"> </w:t>
       </w:r>
       <w:r>
-        <w:t xml:space="preserve">of Ag, escapes. Both assumptions were tested with the Monte Carlo (MC) code of Section 2.7: a laterally infinite 30 mm slab of ICRU-44 tissue with 1 % Ag in a 10 mm layer at 2–12 mm depth was irradiated by a broad parallel beam with the unfiltered and Al 1 mm-filtered SpekPy spectra (</w:t>
+        <w:t xml:space="preserve">of Ag, escapes. Both assumptions were tested with the Monte Carlo (MC) code and slab geometry of Section 2.7 (1 % Ag in a 10 mm layer at 2–12 mm depth; unfiltered and Al 1 mm-filtered SpekPy spectra;</w:t>
+      </w:r>
+      <w:r>
+        <w:t xml:space="preserve"> </w:t>
       </w:r>
       <m:oMath>
         <m:r>
@@ -43564,7 +44026,7 @@
         <w:t xml:space="preserve"> </w:t>
       </w:r>
       <w:r>
-        <w:t xml:space="preserve">histories in 5 batches). The reference is the primary-beam kerma model for the same geometry, including attenuation by Ag.</w:t>
+        <w:t xml:space="preserve">histories in five batches). The reference is the primary-beam kerma model for the same geometry, including attenuation by Ag.</w:t>
       </w:r>
     </w:p>
     <w:p>
@@ -43582,7 +44044,7 @@
       <w:r>
         <w:drawing>
           <wp:inline>
-            <wp:extent cx="5219999" cy="2283210"/>
+            <wp:extent cx="4859999" cy="2125747"/>
             <wp:effectExtent b="0" l="0" r="0" t="0"/>
             <wp:docPr descr="Fig. 3.18. Depth profiles of the dose enhancement factor with a 10 mm layer of 1 % Ag at 2–12 mm (grey band) in soft tissue, unfiltered (left) and Al 1.0 mm (right): Monte Carlo (solid, ±2 standard errors shaded) and the analytical kerma model (dashed)." title="" id="84" name="Picture"/>
             <a:graphic>
@@ -43603,7 +44065,7 @@
                   <pic:spPr bwMode="auto">
                     <a:xfrm>
                       <a:off x="0" y="0"/>
-                      <a:ext cx="5219999" cy="2283210"/>
+                      <a:ext cx="4859999" cy="2125747"/>
                     </a:xfrm>
                     <a:prstGeom prst="rect">
                       <a:avLst/>
@@ -44526,7 +44988,7 @@
       <w:r>
         <w:drawing>
           <wp:inline>
-            <wp:extent cx="5219999" cy="2261592"/>
+            <wp:extent cx="4859999" cy="2105620"/>
             <wp:effectExtent b="0" l="0" r="0" t="0"/>
             <wp:docPr descr="Fig. 3.19. Sensitivity of the dose enhancement factor (1 % Ag, Al 1.0 mm, DEF = 1.482) to the input parameters at the two limits of each variation. Spectrum model: DM versus SpekPy; reference medium: ICRU four-component tissue (larger change) and water; η: relative to the DM value." title="" id="87" name="Picture"/>
             <a:graphic>
@@ -44547,7 +45009,7 @@
                   <pic:spPr bwMode="auto">
                     <a:xfrm>
                       <a:off x="0" y="0"/>
-                      <a:ext cx="5219999" cy="2261592"/>
+                      <a:ext cx="4859999" cy="2105620"/>
                     </a:xfrm>
                     <a:prstGeom prst="rect">
                       <a:avLst/>
@@ -45764,7 +46226,7 @@
         <w:pStyle w:val="BodyText"/>
       </w:pPr>
       <w:r>
-        <w:t xml:space="preserve">MC studies of silver address AgNPs implanted in a brain tumour during brachytherapy [38], the effect of tumour dose enhancement by AgNPs on surrounding healthy tissues [39] and Ag versus Au nanoparticles in layered skin geometries [40]. Their conditions differ, allowing only a qualitative comparison: the dose reduction to about 0.80 behind the loaded layer bears on the healthy-tissue doses of [39], and the per-mass DEFs of Au and Ag (2.16 versus 1.48 with Al 1 mm) on the comparison in [40]. Measurements in AgNP-enriched dose gels [41] could test the calculated DEF if the beam spectrum is specified.</w:t>
+        <w:t xml:space="preserve">The MC studies of silver reviewed in Section 1.4 used brain-tumour brachytherapy [38], tumour–healthy-tissue [39] and layered-skin [40] geometries, allowing only a qualitative comparison: the dose reduction to about 0.80 behind the loaded layer bears on the healthy-tissue doses of [39], and the per-mass DEFs of Au and Ag (2.16 versus 1.48 with Al 1 mm) on the comparison in [40]. Measurements in AgNP-enriched dose gels [41] could test the calculated DEF if the beam spectrum is specified.</w:t>
       </w:r>
     </w:p>
     <w:p>
@@ -45772,7 +46234,7 @@
         <w:pStyle w:val="BodyText"/>
       </w:pPr>
       <w:r>
-        <w:t xml:space="preserve">A larger discrepancy arises with radiobiology. AgNPs reportedly sensitize cancer cells to ionising radiation [32], act as radiosensitizers for glioma [11] and outperformed AuNPs in U251 glioma cells in vitro and in an intracranial mouse model [12]. Such effects are quantified by the sensitizer enhancement ratio (SER), the ratio of doses giving equal effect without and with the sensitizer, which, unlike the DEF, reflects all mechanisms [3]. Macroscopic physics predicts the opposite Ag–Au ranking at equal mass fraction and little enhancement at low loading (DEF 1.048 for 0.1 % Ag with Al 1 mm). Although the biological effect also depends on radiation quality, concentration and cellular localisation, the reported radiosensitization by AgNPs, especially their advantage over AuNPs, is unlikely to result from macroscopic dose enhancement alone. Two mechanisms may explain it: AgNPs cause ROS formation, DNA damage, cell-cycle arrest and impaired mitochondrial function in human cells [37], and the dose enhancement around gold nanoparticles is highly localised [30], nanoscale energy deposition explaining effects beyond the macroscopic enhancement [31]. The macroscopic DEF is thus only the physical baseline of a radio-enhancement with chemical and biological stages [7].</w:t>
+        <w:t xml:space="preserve">A larger discrepancy arises with radiobiology. AgNPs reportedly sensitize cancer cells to ionising radiation [32], act as radiosensitizers for glioma [11] and outperformed AuNPs in U251 glioma cells in vitro and in an intracranial mouse model [12]. Such effects are quantified by the sensitizer enhancement ratio (SER), the ratio of doses giving equal effect without and with the sensitizer, which, unlike the DEF, reflects all mechanisms [3]. Macroscopic physics predicts the opposite Ag–Au ranking at equal mass fraction and little enhancement at low loading (DEF 1.048 for 0.1 % Ag with Al 1 mm). Although the biological effect also depends on radiation quality, concentration and cellular localisation, the reported radiosensitization by AgNPs, especially their advantage over AuNPs, is unlikely to result from macroscopic dose enhancement alone. Two mechanisms may explain it: AgNPs cause ROS formation, damage to deoxyribonucleic acid (DNA), cell-cycle arrest and impaired mitochondrial function in human cells [37], and the dose enhancement around gold nanoparticles is highly localised [30], nanoscale energy deposition explaining effects beyond the macroscopic enhancement [31]. The macroscopic DEF is thus only the physical baseline of a radio-enhancement with chemical and biological stages [7].</w:t>
       </w:r>
     </w:p>
     <w:p>
@@ -45828,7 +46290,7 @@
         </m:r>
       </m:oMath>
       <w:r>
-        <w:t xml:space="preserve">) agrees with SpekPy for Al-filtered beams within −4.6 to −3.5 % in HVL and 1–2 % in DEF but underestimates the Cu K lines by 25–43 %.</w:t>
+        <w:t xml:space="preserve">) agrees with SpekPy for Al-filtered beams within −3.5 to −4.6 % in HVL and 2 % in DEF but underestimates the Cu K lines by 25–43 %.</w:t>
       </w:r>
     </w:p>
     <w:p>
@@ -45876,7 +46338,7 @@
         <w:pStyle w:val="Compact"/>
       </w:pPr>
       <w:r>
-        <w:t xml:space="preserve">The DEF rises with tube voltage, most steeply once photons above the Ag K-edge appear (above about 27 kV); per unit mass, Ag is a weaker physical sensitizer than Gd, Pt, Au and Bi and comparable to iodine.</w:t>
+        <w:t xml:space="preserve">MC confirms the analytical model within 1–10 % (MC higher owing to fluorescence reabsorption and scatter) and shows a dose reduction to about 0.80 behind the loaded layer.</w:t>
       </w:r>
     </w:p>
     <w:p>
@@ -45888,7 +46350,7 @@
         <w:pStyle w:val="Compact"/>
       </w:pPr>
       <w:r>
-        <w:t xml:space="preserve">MC confirms the analytical model within 1–10 % (MC higher owing to fluorescence reabsorption and scatter) and shows a dose reduction to about 0.80 behind the loaded layer.</w:t>
+        <w:t xml:space="preserve">The DEF rises with tube voltage, most steeply once photons above the Ag K-edge appear (above about 26–27 kV); per unit mass, Ag is a weaker physical sensitizer than Gd, Pt, Au and Bi and comparable to iodine.</w:t>
       </w:r>
     </w:p>
     <w:p>
@@ -45978,7 +46440,7 @@
         </m:r>
       </m:oMath>
       <w:r>
-        <w:t xml:space="preserve">, was fitted to the SpekPy v2 bremsstrahlung shape at 45 kV (root-mean-square deviation 2.46 %). Without refitting, the DM reproduces the half-value layer (HVL) of 1 mm Al-filtered beams at 25–50 kV and 6–30° anode angles within −3.5 to −4.6 %; it underestimates the Cu K lines by 25–43 % and overestimates the air kerma by 8–42 %, yet its DEFs with Al filters agree with SpekPy within 1–2 %.</w:t>
+        <w:t xml:space="preserve">, was fitted to the SpekPy v2 bremsstrahlung shape at 45 kV (root-mean-square deviation 2.46 %). Without refitting, the DM reproduces the half-value layer (HVL) of 1 mm Al-filtered beams at 25–50 kV and 6–30° anode angles within −3.5 to −4.6 %; it underestimates the Cu K lines by 25–43 % and overestimates the air kerma by 8–42 %, yet its DEFs with Al filters agree with SpekPy within 2 %.</w:t>
       </w:r>
     </w:p>
     <w:p>
@@ -47253,15 +47715,24 @@
         <w:t xml:space="preserve"> </w:t>
       </w:r>
       <w:r>
-        <w:t xml:space="preserve">is the Gryziński K-shell ionisation cross-section (2.9) for the overvoltage</w:t>
+        <w:t xml:space="preserve">is the Gryziński K-shell ionisation cross-section (2.9) for the overvoltage ratio</w:t>
       </w:r>
       <w:r>
         <w:t xml:space="preserve"> </w:t>
       </w:r>
       <m:oMath>
-        <m:r>
-          <m:t>U</m:t>
-        </m:r>
+        <m:sSub>
+          <m:e>
+            <m:r>
+              <m:t>U</m:t>
+            </m:r>
+          </m:e>
+          <m:sub>
+            <m:r>
+              <m:t>K</m:t>
+            </m:r>
+          </m:sub>
+        </m:sSub>
         <m:r>
           <m:rPr>
             <m:sty m:val="p"/>
@@ -47291,7 +47762,22 @@
         </m:sSub>
       </m:oMath>
       <w:r>
-        <w:t xml:space="preserve">.</w:t>
+        <w:t xml:space="preserve"> </w:t>
+      </w:r>
+      <w:r>
+        <w:t xml:space="preserve">(variable</w:t>
+      </w:r>
+      <w:r>
+        <w:t xml:space="preserve"> </w:t>
+      </w:r>
+      <w:r>
+        <w:rPr>
+          <w:rStyle w:val="VerbatimChar"/>
+        </w:rPr>
+        <w:t xml:space="preserve">U</w:t>
+      </w:r>
+      <w:r>
+        <w:t xml:space="preserve">).</w:t>
       </w:r>
     </w:p>
     <w:p>
@@ -51913,6 +52399,24 @@
       <w:lang w:val="en-GB"/>
     </w:rPr>
   </w:style>
+  <w:style w:customStyle="1" w:styleId="Annotation" w:type="paragraph">
+    <w:name w:val="Annotation"/>
+    <w:basedOn w:val="Normal"/>
+    <w:pPr>
+      <w:keepNext w:val="0"/>
+      <w:widowControl/>
+      <w:spacing w:after="60" w:before="0" w:line="276" w:lineRule="auto"/>
+      <w:ind w:firstLine="567" w:left="0"/>
+      <w:jc w:val="both"/>
+    </w:pPr>
+    <w:rPr>
+      <w:rFonts w:ascii="Times New Roman" w:cs="Times New Roman" w:eastAsia="Times New Roman" w:hAnsi="Times New Roman"/>
+      <w:i w:val="0"/>
+      <w:color w:val="000000"/>
+      <w:sz w:val="24"/>
+      <w:lang w:val="en-GB"/>
+    </w:rPr>
+  </w:style>
   <w:style w:customStyle="1" w:styleId="TOCLine1" w:type="paragraph">
     <w:name w:val="TOCLine1"/>
     <w:basedOn w:val="Normal"/>

</xml_diff>

<commit_message>
Rebuild English volume (84 pages)
Co-Authored-By: Claude Opus 5.5 <noreply@anthropic.com>
Claude-Session: https://claude.ai/code/session_01WcXt6iEQKTpJkT13ui6H64
</commit_message>
<xml_diff>
--- a/dissertation/build/en/Dissertation_en.docx
+++ b/dissertation/build/en/Dissertation_en.docx
@@ -208,7 +208,7 @@
         <w:pStyle w:val="Annotation"/>
       </w:pPr>
       <w:r>
-        <w:t xml:space="preserve">For Al-filtered beams, the DM reproduces the SpekPy half-value layer within 5 % and the DEF within 2 %. The unfiltered spectrum is dominated by the Cu K lines at 8.0–8.9 keV (68.5 % of the photons), so the DEF for 1 % Ag by mass is only 1.20 and remains within 1.19–1.21 when the anode angle, tube voltage or beryllium window is changed. Added filtration is the decisive parameter: 1 mm Al raises the DEF to 1.48 ± 0.02 (k = 1), 2 mm Al to 1.62 and 0.2 mm Cu to 1.80, while the air kerma decreases 120–1300-fold. At equal transmission, light and medium-Z filters (Al, Ti) are optimal, whereas filters with K-edges at 20–30 keV (Mo, Ag, Sn) are the least effective at strong filtration. The DEF increases with depth (beam hardening) and decreases inside a heavily loaded region (self-shielding); Monte Carlo calculations confirm these values within 1–10 %. Per unit mass, Ag is a weaker physical sensitizer than Au, Pt, Bi or Gd and is comparable to iodine. The xraylib 4.3.0 energy-absorption data for light elements were found to be up to 37 % too low, which would overestimate the DEF. The results support the choice of filtration and exposure conditions for experiments with Ag-containing radiosensitizers.</w:t>
+        <w:t xml:space="preserve">For beams filtered with 1 mm Al, the DM reproduces the SpekPy half-value layer within 5 %, and with Al filters the DEF within 2 %. The unfiltered spectrum is dominated by the Cu K lines at 8.0–8.9 keV (68.5 % of the photons), so the DEF for 1 % Ag by mass is only 1.20 and remains within 1.19–1.21 when the anode angle, tube voltage or beryllium window is changed. Added filtration is the decisive parameter: 1 mm Al raises the DEF to 1.48 ± 0.02 (k = 1), 2 mm Al to 1.62 and 0.2 mm Cu to 1.80, while the air kerma decreases 120–1300-fold. At equal transmission, light and medium-Z filters (Al, Ti) are optimal, whereas filters with K-edges at 20–30 keV (Mo, Ag, Sn) are the least effective at strong filtration. The DEF increases with depth (beam hardening) and decreases inside a heavily loaded region (self-shielding); Monte Carlo calculations confirm these values within 1–10 %. Per unit mass, Ag is a weaker physical sensitizer than Au, Pt, Bi or Gd and is comparable to iodine. The xraylib 4.3.0 energy-absorption data for light elements were found to be up to 56 % too low, which would overestimate the DEF. The results support the choice of filtration and exposure conditions for experiments with Ag-containing radiosensitizers.</w:t>
       </w:r>
     </w:p>
     <w:p>
@@ -242,7 +242,7 @@
         <w:pStyle w:val="Annotation"/>
       </w:pPr>
       <w:r>
-        <w:t xml:space="preserve">Saratonga qarshi nur terapiyasining samaradorligi hanuzgacha sog‘lom to‘qimalarning chidamliligi bilan cheklanib qolmoqda, masofaviy nur terapiyasida beriladigan dozani optimallashtirish strategiyalaridan biri esa radiosensibilizatorlardan foydalanishdir. Ushbu ishda kilovoltli rentgen nurlari bilan nurlantirilgan biologik muhitda kumushning (Ag) radiokuchayish effekti tadqiq qilinadi va u dozani kuchaytirish koeffitsiyenti (DEF) orqali miqdoriy baholanadi. DEFni hisoblash uchun zarur bo‘lgan 45 kV li mis anodli rentgen trubkasining spektri trubka konstruksiyasi, texnik parametrlari va filtrlariga bog‘liq holda modellashtiriladi. Shu maqsadda bitta moslashtirilgan parametrga ega bo‘lgan qalin nishonning yarim analitik modeli — ishlab chiqilgan model (IM) yaratildi va SpekPy v2 bilan solishtirish orqali validatsiya qilindi. DEF kerma yaqinlashuvida NIST massaviy energiya yutilish koeffitsiyentlari yordamida hisoblandi va fotonlar ko‘chishini Monte-Karlo usulida modellashtirish orqali verifikatsiya qilindi.</w:t>
+        <w:t xml:space="preserve">Saratonga qarshi nur terapiyasining samaradorligi hanuzgacha sog‘lom to‘qimalarning chidamliligi bilan cheklanib qolmoqda, masofaviy nur terapiyasida beriladigan dozani optimallashtirish strategiyalaridan biri esa radiosensibilizatorlardan foydalanishdir. Ushbu ishda kilovoltli rentgen nurlari bilan nurlantirilgan biologik muhitda kumushning (Ag) radiokuchayish effekti tadqiq qilinadi va u dozani kuchaytirish koeffitsiyenti (DEF) orqali miqdoriy baholanadi. DEFni hisoblash uchun zarur bo‘lgan 45 kV li mis anodli rentgen trubkasining spektri trubka konstruksiyasi, texnik parametrlari va filtrlariga bog‘liq holda modellashtiriladi. Shu maqsadda bitta moslashtirilgan parametrga ega bo‘lgan qalin nishon uchun yarim analitik model — ishlab chiqilgan model (IM) yaratildi va SpekPy v2 bilan solishtirish orqali validatsiya qilindi. DEF kerma yaqinlashuvida NIST massaviy energiya yutilish koeffitsiyentlari yordamida hisoblandi va fotonlar ko‘chishini Monte-Karlo usulida modellashtirish orqali verifikatsiya qilindi.</w:t>
       </w:r>
     </w:p>
     <w:p>
@@ -250,7 +250,7 @@
         <w:pStyle w:val="Annotation"/>
       </w:pPr>
       <w:r>
-        <w:t xml:space="preserve">Al bilan filtrlangan dastalar uchun IM SpekPy yordamida hisoblangan yarim susaytirish qatlamini 5 % dan, DEFni esa 2 % dan oshmaydigan farq bilan takrorlaydi. Filtrlanmagan spektrda 8,0–8,9 keV dagi Cu K chiziqlari ustunlik qiladi (fotonlarning 68,5 % qismi), shu sababli massa bo‘yicha 1 % Ag uchun DEF atigi 1,20 ga teng bo‘lib, anod burchagi, trubka kuchlanishi yoki berilliy oyna o‘zgartirilganda 1,19–1,21 oralig‘ida qoladi. Qo‘shimcha filtrlash hal qiluvchi parametr hisoblanadi: 1 mm Al DEFni 1,48 ± 0,02 (k = 1) gacha, 2 mm Al 1,62 gacha, 0,2 mm Cu esa 1,80 gacha oshiradi, bunda havodagi kerma 120–1300 marta kamayadi. O‘tkazish koeffitsiyenti bir xil bo‘lganda yengil va o‘rtacha Z li filtrlar (Al, Ti) optimal hisoblanadi, K-chegaralari 20–30 keV da joylashgan filtrlar (Mo, Ag, Sn) esa kuchli filtrlashda eng kam samarali bo‘ladi. DEF chuqurlik ortishi bilan ortadi (dastaning qattiqlashishi) va Ag ko‘p kiritilgan soha ichida kamayadi (o‘z-o‘zini ekranlash); Monte-Karlo hisoblari bu qiymatlarni 1–10 % doirasida tasdiqlaydi. Massa birligiga nisbatan olinganda Ag Au, Pt, Bi yoki Gdga qaraganda kuchsizroq fizik sensibilizator bo‘lib, yod bilan taqqoslanarli. Yengil elementlar uchun xraylib 4.3.0 kutubxonasidagi energiya yutilish ma’lumotlari 37 % gacha past baholanganligi aniqlandi, bu esa DEFning oshirib baholanishiga olib kelgan bo‘lar edi. Olingan natijalar Ag saqlovchi radiosensibilizatorlar bilan o‘tkaziladigan tajribalar uchun filtrlash va ekspozitsiya sharoitlarini tanlashga asos bo‘ladi.</w:t>
+        <w:t xml:space="preserve">1 mm Al bilan filtrlangan dastalar uchun IM SpekPy yordamida hisoblangan yarim susaytirish qatlamini 5 % dan oshmaydigan farq bilan, Al filtrlar bilan esa DEFni 2 % dan oshmaydigan farq bilan takrorlaydi. Filtrlanmagan spektrda 8,0–8,9 keV dagi Cu K chiziqlari ustunlik qiladi (fotonlarning 68,5 % qismi), shu sababli massa bo‘yicha 1 % Ag uchun DEF atigi 1,20 ga teng bo‘lib, anod burchagi, trubka kuchlanishi yoki berilliy oyna o‘zgartirilganda 1,19–1,21 oralig‘ida qoladi. Qo‘shimcha filtrlash hal qiluvchi parametr hisoblanadi: 1 mm Al DEFni 1,48 ± 0,02 (k = 1) gacha, 2 mm Al 1,62 gacha, 0,2 mm Cu esa 1,80 gacha oshiradi, bunda havodagi kerma 120–1300 marta kamayadi. O‘tkazish koeffitsiyenti bir xil bo‘lganda yengil va o‘rtacha Z li filtrlar (Al, Ti) optimal hisoblanadi, K-chegaralari 20–30 keV da joylashgan filtrlar (Mo, Ag, Sn) esa kuchli filtrlashda eng kam samarali bo‘ladi. DEF chuqurlik ortishi bilan ortadi (dastaning qattiqlashishi) va Ag ko‘p kiritilgan soha ichida kamayadi (o‘z-o‘zini ekranlash); Monte-Karlo hisoblari bu qiymatlarni 1–10 % doirasida tasdiqlaydi. Massa birligiga nisbatan olinganda Ag Au, Pt, Bi yoki Gdga qaraganda kuchsizroq fizik sensibilizator bo‘lib, yod bilan taqqoslanarli. Yengil elementlar uchun xraylib 4.3.0 kutubxonasidagi energiya yutilish ma’lumotlarining 56 % gacha past baholanganligi aniqlandi, bu esa DEFning oshirib baholanishiga olib kelgan bo‘lar edi. Olingan natijalar Ag saqlovchi radiosensibilizatorlar bilan o‘tkaziladigan tajribalar uchun filtrlash va ekspozitsiya sharoitlarini tanlashga asos bo‘ladi.</w:t>
       </w:r>
     </w:p>
     <w:p>
@@ -284,7 +284,7 @@
         <w:pStyle w:val="Annotation"/>
       </w:pPr>
       <w:r>
-        <w:t xml:space="preserve">Эффективность противоопухолевой лучевой терапии по-прежнему ограничена толерантностью здоровых тканей, и одной из стратегий оптимизации дозы, подводимой при дистанционной лучевой терапии, является применение радиосенсибилизаторов. В работе исследуется эффект радиоусиления, обусловленный серебром (Ag), в биологической среде, облучаемой киловольтным рентгеновским излучением, и проводится его количественная оценка с помощью коэффициента усиления дозы (DEF). Необходимый для расчёта DEF спектр рентгеновской трубки с медным анодом, работающей при напряжении 45 кВ, моделируется в зависимости от конструкции трубки, её технических параметров и фильтров. С этой целью создана полуаналитическая модель толстой мишени с одним подгоночным параметром — разработанная модель (РМ), — и выполнена её валидация путём сравнения со SpekPy v2. DEF рассчитан в приближении кермы с использованием массовых коэффициентов поглощения энергии NIST и верифицирован моделированием переноса фотонов методом Монте-Карло.</w:t>
+        <w:t xml:space="preserve">Эффективность противоопухолевой лучевой терапии по-прежнему ограничена толерантностью здоровых тканей, и одной из стратегий оптимизации дозы, подводимой при дистанционной лучевой терапии, является применение радиосенсибилизаторов. В работе исследуется эффект радиоусиления, обусловленный серебром (Ag), в биологической среде, облучаемой киловольтным рентгеновским излучением, и проводится его количественная оценка с помощью коэффициента усиления дозы (DEF). Необходимый для расчёта DEF спектр рентгеновской трубки с медным анодом, работающей при напряжении 45 кВ, моделируется в зависимости от конструкции трубки, её технических параметров и фильтров. С этой целью создана полуаналитическая модель толстой мишени с одним подгоночным параметром — разработанная модель (РМ) — и выполнена её валидация путём сравнения со SpekPy v2. DEF рассчитан в приближении кермы с использованием массовых коэффициентов поглощения энергии NIST и верифицирован моделированием переноса фотонов методом Монте-Карло.</w:t>
       </w:r>
     </w:p>
     <w:p>
@@ -292,7 +292,7 @@
         <w:pStyle w:val="Annotation"/>
       </w:pPr>
       <w:r>
-        <w:t xml:space="preserve">Для пучков с алюминиевым фильтром РМ воспроизводит слой половинного ослабления, рассчитанный SpekPy, с точностью до 5 %, а DEF — с точностью до 2 %. В нефильтрованном спектре преобладают K-линии Cu с энергиями 8,0–8,9 кэВ (68,5 % фотонов), поэтому DEF при массовой доле Ag 1 % составляет лишь 1,20 и остаётся в пределах 1,19–1,21 при изменении угла анода, напряжения на трубке или бериллиевого окна. Решающим параметром является дополнительная фильтрация: фильтр 1 мм Al повышает DEF до 1,48 ± 0,02 (k = 1), 2 мм Al — до 1,62 и 0,2 мм Cu — до 1,80, при этом воздушная керма уменьшается в 120–1300 раз. При одинаковом пропускании оптимальны фильтры из лёгких элементов и элементов со средним Z (Al, Ti), тогда как фильтры с K-краями в области 20–30 кэВ (Mo, Ag, Sn) при сильной фильтрации наименее эффективны. DEF возрастает с глубиной (ужесточение пучка) и уменьшается внутри области с высоким содержанием серебра (самоэкранирование); расчёты методом Монте-Карло подтверждают эти значения в пределах 1–10 %. В расчёте на единицу массы Ag является более слабым физическим сенсибилизатором, чем Au, Pt, Bi или Gd, и сопоставимо с йодом. Установлено, что данные xraylib 4.3.0 о поглощении энергии для лёгких элементов занижены на величину до 37 %, что привело бы к завышению DEF. Полученные результаты служат обоснованием выбора фильтрации и условий облучения в экспериментах с серебросодержащими радиосенсибилизаторами.</w:t>
+        <w:t xml:space="preserve">Для пучков, отфильтрованных 1 мм Al, РМ воспроизводит слой половинного ослабления, рассчитанный SpekPy, с точностью до 5 %, а для пучков с алюминиевыми фильтрами — DEF с точностью до 2 %. В нефильтрованном спектре преобладают K-линии Cu с энергиями 8,0–8,9 кэВ (68,5 % фотонов), поэтому DEF при массовой доле Ag 1 % составляет лишь 1,20 и остаётся в пределах 1,19–1,21 при изменении угла анода, напряжения на трубке или бериллиевого окна. Решающим параметром является дополнительная фильтрация: фильтр 1 мм Al повышает DEF до 1,48 ± 0,02 (k = 1), 2 мм Al — до 1,62 и 0,2 мм Cu — до 1,80, при этом воздушная керма уменьшается в 120–1300 раз. При одинаковом пропускании оптимальны фильтры из лёгких элементов и элементов со средним Z (Al, Ti), тогда как фильтры с K-краями в области 20–30 кэВ (Mo, Ag, Sn) при сильной фильтрации наименее эффективны. DEF возрастает с глубиной (ужесточение пучка) и уменьшается внутри области с высоким содержанием серебра (самоэкранирование); расчёты методом Монте-Карло подтверждают эти значения в пределах 1–10 %. В расчёте на единицу массы Ag является более слабым физическим сенсибилизатором, чем Au, Pt, Bi или Gd, и сопоставимо с йодом. Установлено, что данные xraylib 4.3.0 о поглощении энергии для лёгких элементов занижены на величину до 56 %, что привело бы к завышению DEF. Полученные результаты служат обоснованием выбора фильтрации и условий облучения в экспериментах с серебросодержащими радиосенсибилизаторами.</w:t>
       </w:r>
     </w:p>
     <w:p>
@@ -337,7 +337,6 @@
       </w:r>
       <w:r>
         <w:tab/>
-        <w:t>7</w:t>
       </w:r>
     </w:p>
     <w:p>
@@ -356,7 +355,6 @@
       </w:r>
       <w:r>
         <w:tab/>
-        <w:t>9</w:t>
       </w:r>
     </w:p>
     <w:p>
@@ -375,7 +373,6 @@
       </w:r>
       <w:r>
         <w:tab/>
-        <w:t>14</w:t>
       </w:r>
     </w:p>
     <w:p>
@@ -391,7 +388,6 @@
       </w:r>
       <w:r>
         <w:tab/>
-        <w:t>14</w:t>
       </w:r>
     </w:p>
     <w:p>
@@ -407,7 +403,6 @@
       </w:r>
       <w:r>
         <w:tab/>
-        <w:t>15</w:t>
       </w:r>
     </w:p>
     <w:p>
@@ -423,7 +418,6 @@
       </w:r>
       <w:r>
         <w:tab/>
-        <w:t>18</w:t>
       </w:r>
     </w:p>
     <w:p>
@@ -439,7 +433,6 @@
       </w:r>
       <w:r>
         <w:tab/>
-        <w:t>21</w:t>
       </w:r>
     </w:p>
     <w:p>
@@ -455,7 +448,6 @@
       </w:r>
       <w:r>
         <w:tab/>
-        <w:t>23</w:t>
       </w:r>
     </w:p>
     <w:p>
@@ -471,7 +463,6 @@
       </w:r>
       <w:r>
         <w:tab/>
-        <w:t>26</w:t>
       </w:r>
     </w:p>
     <w:p>
@@ -490,7 +481,6 @@
       </w:r>
       <w:r>
         <w:tab/>
-        <w:t>27</w:t>
       </w:r>
     </w:p>
     <w:p>
@@ -506,7 +496,6 @@
       </w:r>
       <w:r>
         <w:tab/>
-        <w:t>27</w:t>
       </w:r>
     </w:p>
     <w:p>
@@ -522,7 +511,6 @@
       </w:r>
       <w:r>
         <w:tab/>
-        <w:t>29</w:t>
       </w:r>
     </w:p>
     <w:p>
@@ -538,7 +526,6 @@
       </w:r>
       <w:r>
         <w:tab/>
-        <w:t>30</w:t>
       </w:r>
     </w:p>
     <w:p>
@@ -554,7 +541,6 @@
       </w:r>
       <w:r>
         <w:tab/>
-        <w:t>32</w:t>
       </w:r>
     </w:p>
     <w:p>
@@ -570,7 +556,6 @@
       </w:r>
       <w:r>
         <w:tab/>
-        <w:t>35</w:t>
       </w:r>
     </w:p>
     <w:p>
@@ -586,7 +571,6 @@
       </w:r>
       <w:r>
         <w:tab/>
-        <w:t>37</w:t>
       </w:r>
     </w:p>
     <w:p>
@@ -602,7 +586,6 @@
       </w:r>
       <w:r>
         <w:tab/>
-        <w:t>39</w:t>
       </w:r>
     </w:p>
     <w:p>
@@ -618,7 +601,6 @@
       </w:r>
       <w:r>
         <w:tab/>
-        <w:t>41</w:t>
       </w:r>
     </w:p>
     <w:p>
@@ -634,7 +616,6 @@
       </w:r>
       <w:r>
         <w:tab/>
-        <w:t>42</w:t>
       </w:r>
     </w:p>
     <w:p>
@@ -650,7 +631,6 @@
       </w:r>
       <w:r>
         <w:tab/>
-        <w:t>43</w:t>
       </w:r>
     </w:p>
     <w:p>
@@ -669,7 +649,6 @@
       </w:r>
       <w:r>
         <w:tab/>
-        <w:t>45</w:t>
       </w:r>
     </w:p>
     <w:p>
@@ -685,7 +664,6 @@
       </w:r>
       <w:r>
         <w:tab/>
-        <w:t>45</w:t>
       </w:r>
     </w:p>
     <w:p>
@@ -701,7 +679,6 @@
       </w:r>
       <w:r>
         <w:tab/>
-        <w:t>49</w:t>
       </w:r>
     </w:p>
     <w:p>
@@ -717,7 +694,6 @@
       </w:r>
       <w:r>
         <w:tab/>
-        <w:t>50</w:t>
       </w:r>
     </w:p>
     <w:p>
@@ -733,7 +709,6 @@
       </w:r>
       <w:r>
         <w:tab/>
-        <w:t>53</w:t>
       </w:r>
     </w:p>
     <w:p>
@@ -749,7 +724,6 @@
       </w:r>
       <w:r>
         <w:tab/>
-        <w:t>56</w:t>
       </w:r>
     </w:p>
     <w:p>
@@ -765,7 +739,6 @@
       </w:r>
       <w:r>
         <w:tab/>
-        <w:t>59</w:t>
       </w:r>
     </w:p>
     <w:p>
@@ -781,7 +754,6 @@
       </w:r>
       <w:r>
         <w:tab/>
-        <w:t>62</w:t>
       </w:r>
     </w:p>
     <w:p>
@@ -797,7 +769,6 @@
       </w:r>
       <w:r>
         <w:tab/>
-        <w:t>65</w:t>
       </w:r>
     </w:p>
     <w:p>
@@ -813,7 +784,6 @@
       </w:r>
       <w:r>
         <w:tab/>
-        <w:t>67</w:t>
       </w:r>
     </w:p>
     <w:p>
@@ -829,7 +799,6 @@
       </w:r>
       <w:r>
         <w:tab/>
-        <w:t>69</w:t>
       </w:r>
     </w:p>
     <w:p>
@@ -845,7 +814,6 @@
       </w:r>
       <w:r>
         <w:tab/>
-        <w:t>70</w:t>
       </w:r>
     </w:p>
     <w:p>
@@ -861,7 +829,6 @@
       </w:r>
       <w:r>
         <w:tab/>
-        <w:t>72</w:t>
       </w:r>
     </w:p>
     <w:p>
@@ -880,7 +847,6 @@
       </w:r>
       <w:r>
         <w:tab/>
-        <w:t>72</w:t>
       </w:r>
     </w:p>
     <w:p>
@@ -896,7 +862,6 @@
       </w:r>
       <w:r>
         <w:tab/>
-        <w:t>75</w:t>
       </w:r>
     </w:p>
     <w:p>
@@ -912,7 +877,6 @@
       </w:r>
       <w:r>
         <w:tab/>
-        <w:t>76</w:t>
       </w:r>
     </w:p>
     <w:p>
@@ -931,7 +895,6 @@
       </w:r>
       <w:r>
         <w:tab/>
-        <w:t>77</w:t>
       </w:r>
     </w:p>
     <w:p>
@@ -950,7 +913,6 @@
       </w:r>
       <w:r>
         <w:tab/>
-        <w:t>85</w:t>
       </w:r>
     </w:p>
     <w:p>
@@ -966,7 +928,6 @@
       </w:r>
       <w:r>
         <w:tab/>
-        <w:t>85</w:t>
       </w:r>
     </w:p>
     <w:p>
@@ -982,7 +943,6 @@
       </w:r>
       <w:r>
         <w:tab/>
-        <w:t>87</w:t>
       </w:r>
     </w:p>
     <w:p>
@@ -3104,7 +3064,7 @@
         <w:t xml:space="preserve"> </w:t>
       </w:r>
       <w:r>
-        <w:t xml:space="preserve">Cancer is a major cause of morbidity and mortality worldwide [1], and about half of cancer patients have an indication for radiotherapy [2], whose effectiveness is limited by the tolerance of healthy tissues [3, 4]. The therapeutic window can be widened with radiosensitizers [5], among which heavy-metal compounds and nanoparticles are now studied intensively [6, 7]. Elements of high atomic number</w:t>
+        <w:t xml:space="preserve">Cancer is a major cause of morbidity and mortality worldwide [1], and about half of patients have an indication for radiotherapy [2], whose effectiveness is limited by the tolerance of healthy tissues [3, 4]. The therapeutic window can be widened with radiosensitizers [5], notably heavy-metal compounds and nanoparticles, now studied intensively [6, 7]. Elements of high atomic number</w:t>
       </w:r>
       <w:r>
         <w:t xml:space="preserve"> </w:t>
@@ -3118,7 +3078,7 @@
         <w:t xml:space="preserve"> </w:t>
       </w:r>
       <w:r>
-        <w:t xml:space="preserve">absorb kilovoltage photons far more strongly than soft tissue owing to the photoelectric effect [8]. Combined with 250 kVp (kilovolt peak) x-rays, gold nanoparticles markedly prolonged the survival of tumour-bearing mice [9], and dose enhancement by gold is much larger for kilovoltage than for megavoltage beams [10]. Silver nanoparticles (AgNPs) were proposed as a radiosensitizer for glioma [11] and outperformed gold nanoparticles (AuNPs) in vitro and in mice [12]; silver is also cheaper, and its K-edge at 25.514 keV lies inside the spectrum of a 45 kV x-ray tube.</w:t>
+        <w:t xml:space="preserve">absorb kilovoltage photons far more strongly than soft tissue owing to the photoelectric effect [8]. Combined with 250 kVp (kilovolt peak) x-rays, gold nanoparticles markedly prolonged survival of tumour-bearing mice [9], and dose enhancement by gold is much larger for kilovoltage than for megavoltage beams [10]. Silver nanoparticles (AgNPs) were proposed as a radiosensitizer for glioma [11] and outperformed gold nanoparticles (AuNPs) in vitro and in mice [12]; silver is also cheaper, and its K-edge at 25.514 keV lies inside the spectrum of a 45 kV x-ray tube.</w:t>
       </w:r>
     </w:p>
     <w:p>
@@ -3126,7 +3086,7 @@
         <w:pStyle w:val="BodyText"/>
       </w:pPr>
       <w:r>
-        <w:t xml:space="preserve">The physical effect is quantified by the dose enhancement factor (DEF), the ratio of the absorbed doses in tissue with and without silver. The ratio of the mass energy-absorption coefficients of silver and soft tissue is only 21–32 at 8–25 keV, about 76 at the Ag K-edge and 100–139 at 30–45 keV, so the DEF depends on the fraction of the photon energy fluence above the edge [10, 13]. The tube voltage and half-value layer (HVL) that usually specify kilovoltage beams [14] do not fix the spectrum around the edge, which must therefore be modelled [15]. Unlike tungsten-anode tubes [16, 17], a 45 kV copper-anode tube emits most photons of the unfiltered beam in the Cu K lines at 8.0–8.9 keV, far below the Ag K-edge. Since its spectrum, and hence the DEF, depends on the anode angle, tube voltage, beryllium window and filters, modelling it is a relevant problem of medical physics.</w:t>
+        <w:t xml:space="preserve">The physical effect is quantified by the dose enhancement factor (DEF), the ratio of absorbed doses in tissue with and without silver. The silver-to-tissue ratio of mass energy-absorption coefficients is only 21–32 at 8–25 keV, about 76 at the Ag K-edge and 103–139 at 30–45 keV, so the DEF depends on the fraction of the photon energy fluence above the edge [10, 13]. The tube voltage and half-value layer (HVL) that usually specify kilovoltage beams [14] do not fix the spectrum around the edge, which must therefore be modelled [15]. Unlike tungsten-anode tubes [16, 17], a 45 kV copper-anode tube emits most photons of the unfiltered beam in the Cu K lines at 8.0–8.9 keV, far below the Ag K-edge. Since this spectrum, and hence the DEF, depends on tube design and filtration, modelling it is a relevant problem of medical physics.</w:t>
       </w:r>
     </w:p>
     <w:p>
@@ -3144,7 +3104,7 @@
         <w:t xml:space="preserve"> </w:t>
       </w:r>
       <w:r>
-        <w:t xml:space="preserve">Dose enhancement near high-Z media goes back to Spiers’s analysis of energy absorption near irradiated bone [18]; iodine enhancement was later calculated for kilovoltage beams [19, 20] and used to treat brain metastases with a modified computed tomography scanner [21]. Gold nanoparticles have been studied in cells and by Monte Carlo (MC) simulation [22–25], their mechanisms reviewed [26–28] and elements compared as functions of photon energy [13, 29]; the enhancement around nanoparticles is highly localised [30], and such nanoscale deposition can explain biological effects beyond the macroscopic enhancement [31]. For silver, radiosensitization by AgNPs was shown in cancer cells [32], glioma [33, 34], breast cancer cells [35] and colorectal cancer [36]. AgNPs are themselves cytotoxic and induce reactive oxygen species and damage to deoxyribonucleic acid (DNA) [37], so part of their effect may be chemical or biological. Silver dosimetry was studied by MC for brachytherapy [38], tissues around a loaded tumour [39] and skin [40] and in dose gels [41]; the depth dependence of enhancement in orthovoltage beams was examined in an MC phantom [42].</w:t>
+        <w:t xml:space="preserve">Dose enhancement near high-Z media goes back to Spiers’s analysis of energy absorption near irradiated bone [18]; iodine enhancement was later calculated for kilovoltage beams [19, 20] and used to treat brain metastases with a modified computed tomography scanner [21]. Gold nanoparticles have been studied in cells and by Monte Carlo (MC) simulation [22–25], their mechanisms reviewed [26–28] and elements compared across photon energies [13, 29]; the enhancement around nanoparticles is highly localised [30], which can explain biological effects beyond the macroscopic enhancement [31]. Radiosensitization by AgNPs was shown in cancer cells [32], glioma [33, 34], breast cancer cells [35] and colorectal cancer [36]. AgNPs are themselves cytotoxic and genotoxic, inducing reactive oxygen species [37], so part of their effect may be chemical or biological. Silver dosimetry was studied by MC for brachytherapy [38], tissues around a loaded tumour [39] and skin [40] and in dose gels [41]; depth-dependent enhancement in orthovoltage beams was examined in an MC phantom [42].</w:t>
       </w:r>
     </w:p>
     <w:p>
@@ -3152,7 +3112,7 @@
         <w:pStyle w:val="BodyText"/>
       </w:pPr>
       <w:r>
-        <w:t xml:space="preserve">Spectrum models range from empirical [43] and semi-empirical [44, 45] to deterministic physics-based [46–48] and MC models [49, 50], mostly for tungsten anodes; SpekPy, validated against measurements [51], supports a copper anode in version 2 [15]. Copper-anode tubes serve mainly x-ray diffraction, with a nickel filter isolating Cu Kα [52], whereas silver needs photons above its K-edge. How the design and filtration of such a tube determine its spectrum and the DEF of silver-loaded tissue has therefore not been quantified in the literature reviewed, which motivated this work.</w:t>
+        <w:t xml:space="preserve">Spectrum models range from empirical [43] and semi-empirical [44, 45] to deterministic physics-based [46–48] and MC models [49, 50], mostly for tungsten anodes; SpekPy, validated against measurements [51], supports a copper anode in version 2 [15]. Copper-anode tubes serve mainly x-ray diffraction, with a nickel filter isolating Cu Kα [52], whereas silver needs photons above its K-edge. How the design and filtration of such a tube determine its spectrum and the DEF of silver-loaded tissue has therefore not been quantified in the literature reviewed.</w:t>
       </w:r>
     </w:p>
     <w:p>
@@ -3170,7 +3130,7 @@
         <w:t xml:space="preserve"> </w:t>
       </w:r>
       <w:r>
-        <w:t xml:space="preserve">The aim is to model the spectrum of a 45 kV copper-anode x-ray tube as a function of its design parameters and filtration and, on this basis, to determine the DEF of silver-containing soft tissue and the filtration that maximises it at an acceptable dose rate.</w:t>
+        <w:t xml:space="preserve">The aim is to model the spectrum of a 45 kV copper-anode x-ray tube as a function of its design parameters and filtration and thus to determine the DEF of silver-containing soft tissue and the filtration that maximises it at an acceptable dose rate.</w:t>
       </w:r>
     </w:p>
     <w:p>
@@ -3212,7 +3172,7 @@
         <w:pStyle w:val="Compact"/>
       </w:pPr>
       <w:r>
-        <w:t xml:space="preserve">To develop a semi-analytical thick-target spectrum model of a copper-anode tube including electron slowing-down, bremsstrahlung, direct and bremsstrahlung-induced K radiation and attenuation in the anode, window, air and filters.</w:t>
+        <w:t xml:space="preserve">To develop a semi-analytical thick-target spectrum model of a copper-anode tube including electron slowing-down, bremsstrahlung, direct and bremsstrahlung-induced K radiation, anode self-absorption and filtration.</w:t>
       </w:r>
     </w:p>
     <w:p>
@@ -3260,7 +3220,7 @@
         <w:pStyle w:val="Compact"/>
       </w:pPr>
       <w:r>
-        <w:t xml:space="preserve">To study the depth dependence of the DEF and self-shielding and verify them by an independent MC calculation.</w:t>
+        <w:t xml:space="preserve">To study the depth dependence of the DEF and self-shielding, with independent MC verification.</w:t>
       </w:r>
     </w:p>
     <w:p>
@@ -3272,7 +3232,7 @@
         <w:pStyle w:val="Compact"/>
       </w:pPr>
       <w:r>
-        <w:t xml:space="preserve">To compare silver with other high-Z elements, estimate the DEF uncertainty and formulate recommendations for experiments.</w:t>
+        <w:t xml:space="preserve">To compare silver with other high-Z elements, estimate the DEF uncertainty and formulate experimental recommendations.</w:t>
       </w:r>
     </w:p>
     <w:p>
@@ -3290,7 +3250,7 @@
         <w:t xml:space="preserve"> </w:t>
       </w:r>
       <w:r>
-        <w:t xml:space="preserve">The object is the x-ray radiation of a 45 kV copper-anode tube and its interaction with soft tissue containing silver.</w:t>
+        <w:t xml:space="preserve">The object is the x-ray radiation of a 45 kV copper-anode tube and its interaction with silver-containing soft tissue.</w:t>
       </w:r>
     </w:p>
     <w:p>
@@ -3308,7 +3268,7 @@
         <w:t xml:space="preserve"> </w:t>
       </w:r>
       <w:r>
-        <w:t xml:space="preserve">The subject is the formation of the spectrum, its dependence on tube design and filtration, and the resulting DEF.</w:t>
+        <w:t xml:space="preserve">The subject is spectrum formation, its dependence on tube design and filtration, and the resulting DEF.</w:t>
       </w:r>
     </w:p>
     <w:p>
@@ -3326,7 +3286,7 @@
         <w:t xml:space="preserve"> </w:t>
       </w:r>
       <w:r>
-        <w:t xml:space="preserve">The spectrum is calculated with the developed model (DM), a semi-analytical thick-target model based on the Bethe stopping power, the non-relativistic Bethe–Heitler cross-section with the Elwert factor and the Gryziński K-shell cross-section [53–57], with SpekPy v2.5.4 as the reference [58]. Interaction data are from the tables of the National Institute of Standards and Technology (NIST) [59] and xraylib [60], with the ICRU-44 soft tissue of the International Commission on Radiation Units and Measurements (ICRU) as the reference medium [61]. The DEF is calculated in the kerma approximation [62] and verified by an in-house MC photon-transport code with Woodcock tracking [63], Ag K fluorescence, coherent and incoherent scattering [64] and local electron energy deposition. Uncertainties are estimated by sensitivity analysis; the code uses Python with NumPy, SciPy and Matplotlib [65–67].</w:t>
+        <w:t xml:space="preserve">The spectrum is calculated with the developed model (DM), a semi-analytical thick-target model based on the Bethe stopping power, the non-relativistic Bethe–Heitler cross-section with the Elwert factor and the Gryziński K-shell cross-section [53–57], with SpekPy v2.5.4 as the reference [58]. Interaction data come from the National Institute of Standards and Technology (NIST) tables [59] and xraylib [60], with the ICRU-44 soft tissue of the International Commission on Radiation Units and Measurements (ICRU) as the reference medium [61]. The DEF is calculated in the kerma approximation [62] and verified by an in-house MC photon-transport code with Woodcock tracking [63], Ag K fluorescence, coherent and incoherent scattering [64] and local electron energy deposition. Uncertainties are estimated by sensitivity analysis; the code uses Python with NumPy, SciPy and Matplotlib [65–67].</w:t>
       </w:r>
     </w:p>
     <w:p>
@@ -3344,7 +3304,7 @@
         <w:t xml:space="preserve"> </w:t>
       </w:r>
       <w:r>
-        <w:t xml:space="preserve">The novelty of the work is as follows:</w:t>
+        <w:t xml:space="preserve">The novelty is as follows:</w:t>
       </w:r>
     </w:p>
     <w:p>
@@ -3356,7 +3316,7 @@
         <w:pStyle w:val="Compact"/>
       </w:pPr>
       <w:r>
-        <w:t xml:space="preserve">A semi-analytical spectrum model of a reflection-type copper-anode tube has been developed with a single adjustable parameter, the electron depth factor</w:t>
+        <w:t xml:space="preserve">A semi-analytical spectrum model of a reflection-type copper-anode tube was developed, with one adjustable parameter (the electron depth factor</w:t>
       </w:r>
       <w:r>
         <w:t xml:space="preserve"> </w:t>
@@ -3367,7 +3327,7 @@
         </m:r>
       </m:oMath>
       <w:r>
-        <w:t xml:space="preserve">, and a closed-form description of bremsstrahlung-induced K radiation. With</w:t>
+        <w:t xml:space="preserve">) and a closed-form description of bremsstrahlung-induced K radiation. With</w:t>
       </w:r>
       <w:r>
         <w:t xml:space="preserve"> </w:t>
@@ -3402,7 +3362,7 @@
         <w:pStyle w:val="Compact"/>
       </w:pPr>
       <w:r>
-        <w:t xml:space="preserve">Without added filtration, the DEF for 1 % silver by mass is only 1.20 (1.19–1.21 for anode angles of 6–30°, 25–50 kV and beryllium windows of 0.15–2 mm), because the dose is dominated by the Cu K lines and soft bremsstrahlung. Filtration is decisive: the DEF is 1.48 with 1 mm Al, 1.62 with 2 mm Al and 1.80 with 0.2 mm Cu, at the cost of a 120–1300-fold lower air kerma.</w:t>
+        <w:t xml:space="preserve">Without added filtration, the DEF for 1 % silver by mass is only 1.20 (1.19–1.21 for anode angles of 6–30°, 25–50 kV and beryllium windows of 0.15–2 mm), because Cu K lines and soft bremsstrahlung dominate the dose. Filtration is decisive: the DEF is 1.48 with 1 mm Al, 1.62 with 2 mm Al and 1.80 with 0.2 mm Cu, at the cost of a 120–1300-fold lower air kerma.</w:t>
       </w:r>
     </w:p>
     <w:p>
@@ -3456,7 +3416,7 @@
         <w:t xml:space="preserve"> </w:t>
       </w:r>
       <w:r>
-        <w:t xml:space="preserve">The DM software provides the spectrum, air kerma and beam quality of low-voltage copper-anode tubes for planning radiobiological experiments with silver. For a 45 kV tube, a 1–2 mm aluminium filter (or 0.1–0.3 mm titanium) is recommended; with aluminium, a tissue kerma of 2 Gy at the sample surface (10 cm from the focus, 40 mA) takes about 15–33 s. The CS_Energy function of xraylib 4.3.0 underestimates the mass energy-absorption coefficients of light elements at 15–45 keV by up to 37 % (oxygen at 30 keV), which would overestimate the DEF (1.72 instead of 1.48 for 1 % silver and 1 mm Al), so the NIST tables should be used.</w:t>
+        <w:t xml:space="preserve">The DM software provides the spectrum, air kerma and beam quality of low-voltage copper-anode tubes for planning radiobiological experiments with silver. For a 45 kV tube, a 1–2 mm aluminium filter (or 0.1–0.3 mm titanium) is recommended; with aluminium, a tissue kerma of 2 Gy at the sample surface (10 cm from the focus, 40 mA) takes about 15–33 s. The CS_Energy function of xraylib 4.3.0 underestimates the mass energy-absorption coefficients of light elements at 15–45 keV by up to 56 % (carbon at 15 keV; oxygen by 37 % at 30 keV), which would overestimate the DEF (1.62 instead of 1.48 for 1 % silver and 1 mm Al), so the NIST tables should be used.</w:t>
       </w:r>
     </w:p>
     <w:p>
@@ -3483,7 +3443,7 @@
         <w:t xml:space="preserve">2</w:t>
       </w:r>
       <w:r>
-        <w:t xml:space="preserve">/g) [69], and the DM reproduces the SpekPy HVL for a tungsten anode at 50–100 kV within 6 %. The MC energy-transfer coefficients reproduce the NIST mass energy-absorption coefficients of H, C and O at 20–40 keV within 0.3 %. The sensitivity analysis gives DEF = 1.48 ± 0.02 (coverage factor</w:t>
+        <w:t xml:space="preserve">/g) [69], and the DM reproduces the SpekPy HVL for a tungsten anode at 50–100 kV within 6 %. The MC energy-transfer coefficients reproduce NIST mass energy-absorption coefficients of H, C and O at 20–40 keV within 0.3 %. The sensitivity analysis gives DEF = 1.48 ± 0.02 (coverage factor</w:t>
       </w:r>
       <w:r>
         <w:t xml:space="preserve"> </w:t>
@@ -3557,7 +3517,7 @@
         <w:t xml:space="preserve"> </w:t>
       </w:r>
       <w:r>
-        <w:t xml:space="preserve">The dissertation comprises annotations, a list of abbreviations, an introduction, three chapters, conclusions, references and appendices: 87 pages, 23 figures, 17 tables and 121 references. Chapter 1 reviews the literature, Chapter 2 presents the methods and Chapter 3 the results and their discussion.</w:t>
+        <w:t xml:space="preserve">The dissertation comprises annotations, a list of abbreviations, an introduction, three chapters, conclusions, references and appendices: 90 pages, 0 figures, 0 tables and 121 references. Chapter 1 reviews the literature, Chapter 2 presents the methods and Chapter 3 the results and discussion.</w:t>
       </w:r>
     </w:p>
     <w:p>
@@ -3581,7 +3541,7 @@
         <w:pStyle w:val="FirstParagraph"/>
       </w:pPr>
       <w:r>
-        <w:t xml:space="preserve">Against the background of the global cancer burden [1], radiotherapy (RT) is one of the principal treatment modalities [4], with an evidence-based optimal utilisation rate of approximately 52 % [2]. RT damages cellular deoxyribonucleic acid (DNA) directly through secondary electrons or indirectly through the free radicals of water radiolysis [3], but because energy deposition is not selective, the healthy tissues traversed by the beam are damaged as well and limit the tumour dose [3, 4]. When the sigmoid dose–response curves for tumour control and normal-tissue complications lie close together (a small therapeutic ratio), normal-tissue toxicity becomes the main factor limiting RT [3, 4]. Hypoxic tumour cells, less sensitive to x-rays because of the oxygen effect, aggravate the problem [3].</w:t>
+        <w:t xml:space="preserve">Against the background of the global cancer burden [1], radiotherapy (RT) is one of the principal treatment modalities [4], with an evidence-based optimal utilisation rate of approximately 52 % [2]. RT damages cellular deoxyribonucleic acid (DNA) directly through secondary electrons or indirectly through the free radicals of water radiolysis [3], but energy deposition is not selective, so healthy tissues in the beam are damaged as well. When the sigmoid dose–response curves for tumour control and normal-tissue complications lie close together (a small therapeutic ratio), normal-tissue toxicity becomes the main factor limiting RT [3, 4]. Hypoxic tumour cells, less sensitive to x-rays because of the oxygen effect, aggravate the problem [3].</w:t>
       </w:r>
     </w:p>
     <w:p>
@@ -3589,7 +3549,7 @@
         <w:pStyle w:val="BodyText"/>
       </w:pPr>
       <w:r>
-        <w:t xml:space="preserve">Fractionation [3] and conformal, image-guided techniques such as intensity-modulated RT [17] spare normal tissue but do not change the ratio of the energy absorbed per unit mass in tumour and normal cells within the same beam region. Radiosensitizers, which increase the effect of radiation on tumour cells more than on normal cells, include oxygen mimetics such as the nitroimidazoles [5] and transition-metal compounds (platinum, gold, ruthenium) that combine chemical and biological activity with heavy atoms [6]. Elements of high atomic number</w:t>
+        <w:t xml:space="preserve">Fractionation [3] and conformal, image-guided techniques such as intensity-modulated RT [17] spare normal tissue but do not change the ratio of the energy absorbed per unit mass in tumour and normal cells in the same beam region. Radiosensitizers, which act more on tumour than on normal cells, include oxygen mimetics such as the nitroimidazoles [5] and transition-metal compounds (platinum, gold, ruthenium) combining chemical and biological activity with heavy atoms [6]. Elements of high atomic number</w:t>
       </w:r>
       <w:r>
         <w:t xml:space="preserve"> </w:t>
@@ -3603,7 +3563,7 @@
         <w:t xml:space="preserve"> </w:t>
       </w:r>
       <w:r>
-        <w:t xml:space="preserve">(high-Z elements) act by an essentially physical principle: concentrated in the tumour, they absorb more photon energy per unit mass than soft tissue, raising the tumour dose while the dose to element-free surrounding tissue remains practically unchanged [7, 9]. The gain is expressed by the dose enhancement factor (DEF), the ratio of the doses absorbed in tissue with and without the agent (Section 2.6), which, unlike chemical sensitization, can be calculated from interaction data once the radiation field is known.</w:t>
+        <w:t xml:space="preserve">(high-Z elements) act physically: concentrated in the tumour, they absorb more photon energy per unit mass than soft tissue, raising the tumour dose but not that of element-free surrounding tissue [7, 9]. The gain is expressed by the dose enhancement factor (DEF), the ratio of the doses in tissue with and without the agent (Section 2.6), which, unlike chemical sensitization, can be calculated from interaction data once the radiation field is known.</w:t>
       </w:r>
     </w:p>
     <w:p>
@@ -3611,7 +3571,7 @@
         <w:pStyle w:val="BodyText"/>
       </w:pPr>
       <w:r>
-        <w:t xml:space="preserve">Monte Carlo (MC) calculations for gold nanoparticles showed a much larger macroscopic dose enhancement with kilovoltage than with megavoltage beams [10], because the strongly Z-dependent photoelectric effect dominates only at low energies (Section 1.2). Kilovoltage beams are used in superficial and orthovoltage therapy [17], and their dosimetry protocols specify the beam quality by the half-value layer (HVL) [14, 70]. The DEF of an agent therefore cannot be stated without the x-ray spectrum, which depends on the tube design and filtration; the present work addresses this problem for silver and a 45 kV copper-anode tube.</w:t>
+        <w:t xml:space="preserve">Monte Carlo (MC) calculations for gold nanoparticles showed a much larger macroscopic dose enhancement with kilovoltage than with megavoltage beams [10], because the strongly Z-dependent photoelectric effect dominates only at low energies (Section 1.2). Kilovoltage beams are used in superficial and orthovoltage therapy [17], and their dosimetry protocols specify the beam quality by the half-value layer (HVL) [14, 70]. The DEF therefore cannot be stated without the x-ray spectrum, which depends on the tube design and filtration; this work addresses the problem for silver and a 45 kV copper-anode tube.</w:t>
       </w:r>
     </w:p>
     <w:p>
@@ -4010,7 +3970,7 @@
         <w:t xml:space="preserve"> </w:t>
       </w:r>
       <w:r>
-        <w:t xml:space="preserve">the mass coefficients (cm²/g) of photoelectric absorption, coherent and incoherent scattering. For mixtures such as soft tissue the elemental coefficients are weighted by mass fractions [62], using data tabulated by the National Institute of Standards and Technology (NIST) [59, 72]. In photoabsorption a bound electron, preferentially of the innermost accessible shell, is ejected with the photon energy</w:t>
+        <w:t xml:space="preserve">the mass coefficients (cm²/g) of photoelectric absorption, coherent and incoherent scattering. Mixture coefficients are mass-fraction-weighted sums of elemental ones [62], taken from the National Institute of Standards and Technology (NIST) tables [59, 72]. In photoabsorption a bound electron, preferentially of the innermost accessible shell, is ejected with the photon energy</w:t>
       </w:r>
       <w:r>
         <w:t xml:space="preserve"> </w:t>
@@ -4277,7 +4237,7 @@
         <w:pStyle w:val="BodyText"/>
       </w:pPr>
       <w:r>
-        <w:t xml:space="preserve">In Compton scattering at these energies the photon retains most of its energy [8, 62], and electron binding reduces the Klein–Nishina cross-section at low energies and small angles, as described by the incoherent scattering function</w:t>
+        <w:t xml:space="preserve">In Compton scattering at these energies the photon retains most of its energy [8, 62], and electron binding, described by the incoherent scattering function</w:t>
       </w:r>
       <w:r>
         <w:t xml:space="preserve"> </w:t>
@@ -4306,21 +4266,7 @@
         </m:r>
       </m:oMath>
       <w:r>
-        <w:t xml:space="preserve"> </w:t>
-      </w:r>
-      <w:r>
-        <w:t xml:space="preserve">(</w:t>
-      </w:r>
-      <m:oMath>
-        <m:r>
-          <m:t>x</m:t>
-        </m:r>
-      </m:oMath>
-      <w:r>
-        <w:t xml:space="preserve"> </w:t>
-      </w:r>
-      <w:r>
-        <w:t xml:space="preserve">is the momentum-transfer variable); Rayleigh scattering only deflects the photon and is described by the atomic form factor</w:t>
+        <w:t xml:space="preserve">, reduces the Klein–Nishina cross-section at low energies and small angles; Rayleigh scattering, described by the atomic form factor</w:t>
       </w:r>
       <w:r>
         <w:t xml:space="preserve"> </w:t>
@@ -4352,7 +4298,18 @@
         <w:t xml:space="preserve"> </w:t>
       </w:r>
       <w:r>
-        <w:t xml:space="preserve">[64]. In soft tissue incoherent scattering overtakes photoabsorption in the upper part of the range, whereas in silver photoabsorption dominates throughout [8, 72]. The mass energy-absorption coefficient counts only the energy transferred to charged particles and not re-emitted as bremsstrahlung [62, 75]:</w:t>
+        <w:t xml:space="preserve">(</w:t>
+      </w:r>
+      <m:oMath>
+        <m:r>
+          <m:t>x</m:t>
+        </m:r>
+      </m:oMath>
+      <w:r>
+        <w:t xml:space="preserve"> </w:t>
+      </w:r>
+      <w:r>
+        <w:t xml:space="preserve">is the momentum-transfer variable), only deflects the photon [64]. In soft tissue incoherent scattering overtakes photoabsorption in the upper part of the range, whereas in silver photoabsorption dominates throughout [8, 72]. The mass energy-absorption coefficient, tabulated by NIST from Seltzer’s calculations [59, 75], counts only the energy transferred to charged particles and not re-emitted as bremsstrahlung [62]:</w:t>
       </w:r>
     </w:p>
     <w:tbl>
@@ -4711,42 +4668,7 @@
         <w:t xml:space="preserve"> </w:t>
       </w:r>
       <w:r>
-        <w:t xml:space="preserve">the mean fraction of the secondary-electron kinetic energy converted into bremsstrahlung, negligible here; other symbols are as in (1.1) [62]. The NIST</w:t>
-      </w:r>
-      <w:r>
-        <w:t xml:space="preserve"> </w:t>
-      </w:r>
-      <m:oMath>
-        <m:sSub>
-          <m:e>
-            <m:r>
-              <m:t>μ</m:t>
-            </m:r>
-          </m:e>
-          <m:sub>
-            <m:r>
-              <m:t>e</m:t>
-            </m:r>
-            <m:r>
-              <m:t>n</m:t>
-            </m:r>
-          </m:sub>
-        </m:sSub>
-        <m:r>
-          <m:rPr>
-            <m:sty m:val="p"/>
-          </m:rPr>
-          <m:t>/</m:t>
-        </m:r>
-        <m:r>
-          <m:t>ρ</m:t>
-        </m:r>
-      </m:oMath>
-      <w:r>
-        <w:t xml:space="preserve"> </w:t>
-      </w:r>
-      <w:r>
-        <w:t xml:space="preserve">values used in this work are based on Seltzer’s calculations [59, 75].</w:t>
+        <w:t xml:space="preserve">the mean fraction of the secondary-electron kinetic energy converted into bremsstrahlung, negligible here; other symbols are as in (1.1) [62].</w:t>
       </w:r>
     </w:p>
     <w:p>
@@ -5054,7 +4976,7 @@
         <w:pStyle w:val="BodyText"/>
       </w:pPr>
       <w:r>
-        <w:t xml:space="preserve">Fig. 1.1 compares the coefficients of silver and ICRU-44 soft tissue [61] from the NIST tables [59]. Above the L-edges both coefficients of silver exceed those of tissue by more than an order of magnitude, the ratio of the</w:t>
+        <w:t xml:space="preserve">Fig. 1.1 compares the NIST coefficients [59] of silver and ICRU-44 soft tissue [61]. Above the L-edges both coefficients of silver exceed those of tissue by more than an order of magnitude, the ratio of the</w:t>
       </w:r>
       <w:r>
         <w:t xml:space="preserve"> </w:t>
@@ -5089,7 +5011,7 @@
         <w:t xml:space="preserve"> </w:t>
       </w:r>
       <w:r>
-        <w:t xml:space="preserve">values rising from 21.0 at 8 keV to 31.8 at 25 keV. At the K-edge</w:t>
+        <w:t xml:space="preserve">values rising from 21.1 at 8 keV to 31.9 at 25 keV. At the K-edge</w:t>
       </w:r>
       <w:r>
         <w:t xml:space="preserve"> </w:t>
@@ -5147,7 +5069,7 @@
         <w:t xml:space="preserve"> </w:t>
       </w:r>
       <w:r>
-        <w:t xml:space="preserve">only 2.4-fold (from 8.54 to 20.3 cm²/g). The reason is K-shell fluorescence: the energy of the K x-rays emitted after most K-shell photoabsorptions escapes the interaction site and is excluded from</w:t>
+        <w:t xml:space="preserve">only 2.4-fold (from 8.53 to 20.3 cm²/g). The reason is K-shell fluorescence: after most K-shell photoabsorptions the K x-ray energy escapes the interaction site and is excluded from</w:t>
       </w:r>
       <w:r>
         <w:t xml:space="preserve"> </w:t>
@@ -5191,7 +5113,7 @@
           <wp:inline>
             <wp:extent cx="4859999" cy="2888295"/>
             <wp:effectExtent b="0" l="0" r="0" t="0"/>
-            <wp:docPr descr="Fig. 1.1. Mass attenuation (solid) and mass energy-absorption (dashed) coefficients of silver and ICRU-44 soft tissue at 1–50 keV (NIST data). The vertical dashed line marks the Ag K-edge at 25.51 keV; the arrow marks the Ag L-subshell edges." title="" id="21" name="Picture"/>
+            <wp:docPr descr="Fig. 1.1. Mass attenuation (solid) and mass energy-absorption (dashed) coefficients of silver and ICRU-44 soft tissue at 1–50 keV (NIST data). The vertical dashed line marks the Ag K-edge at 25.51 keV, the arrow the Ag L-subshell edges." title="" id="21" name="Picture"/>
             <a:graphic>
               <a:graphicData uri="http://schemas.openxmlformats.org/drawingml/2006/picture">
                 <pic:pic>
@@ -5234,7 +5156,7 @@
         <w:pStyle w:val="ImageCaption"/>
       </w:pPr>
       <w:r>
-        <w:t xml:space="preserve">Fig. 1.1. Mass attenuation (solid) and mass energy-absorption (dashed) coefficients of silver and ICRU-44 soft tissue at 1–50 keV (NIST data). The vertical dashed line marks the Ag K-edge at 25.51 keV; the arrow marks the Ag L-subshell edges.</w:t>
+        <w:t xml:space="preserve">Fig. 1.1. Mass attenuation (solid) and mass energy-absorption (dashed) coefficients of silver and ICRU-44 soft tissue at 1–50 keV (NIST data). The vertical dashed line marks the Ag K-edge at 25.51 keV, the arrow the Ag L-subshell edges.</w:t>
       </w:r>
     </w:p>
     <w:p>
@@ -5297,7 +5219,7 @@
         </m:r>
       </m:oMath>
       <w:r>
-        <w:t xml:space="preserve">, since the fixed fluorescence energy becomes a smaller fraction of the photon energy, and more slowly than that of tissue. After the jump at the edge from about 32 to about 76, the silver-to-tissue ratio therefore keeps growing, to 102.7 at 30 keV, 120.0 at 35 keV and a maximum of about 139 at 40–45 keV. The fraction of the energy fluence above the Ag K-edge is thus the key beam characteristic for silver, and its determination for a copper-anode tube is a central task of this work.</w:t>
+        <w:t xml:space="preserve">, since the fixed fluorescence energy becomes a smaller fraction of the photon energy, and more slowly than that of tissue. After the jump at the edge from about 32 to about 76, the silver-to-tissue ratio therefore keeps growing, to 102.8 at 30 keV, 120.1 at 35 keV and a maximum of about 139 at 40–45 keV. The fraction of the energy fluence above the Ag K-edge is thus the key beam characteristic for silver.</w:t>
       </w:r>
     </w:p>
     <w:p>
@@ -5313,7 +5235,7 @@
         <w:pStyle w:val="FirstParagraph"/>
       </w:pPr>
       <w:r>
-        <w:t xml:space="preserve">Spiers first analysed how the increased energy absorption of bone and the secondary-electron ranges determine the dose to soft tissue in and near bone [18], and Das and Chopra quantified the backscatter dose perturbation at tissue–high-Z interfaces in kilovoltage beams [78]. The first systematic studies used iodinated contrast media, which sensitized cultured mammalian cells to x-rays but not to gamma rays [79], pointing to photoabsorption by iodine. Dose enhancement in iodine-loaded tumours was calculated for kilovoltage x-rays [19] and for brain-tumour therapy [20], and a computed tomography scanner modified for therapy delivered the first such treatment of human brain metastases [21]. Monochromatic synchrotron beams treated rats bearing iodine-loaded F98 gliomas [80] and identified the optimal energy for iodinated compounds in cells [81]; contrast-enhanced kilovoltage RT was analysed by MC [82], and modified megavoltage beams were combined with iodine and gadolinium contrast [83].</w:t>
+        <w:t xml:space="preserve">Spiers first analysed how increased energy absorption in bone and secondary-electron ranges determine the soft-tissue dose in and near bone [18], and Das and Chopra quantified the backscatter dose perturbation at tissue–high-Z interfaces in kilovoltage beams [78]. Iodinated contrast media, the first agents studied systematically, sensitized cultured mammalian cells to x-rays but not to gamma rays [79], implicating photoabsorption by iodine. Dose enhancement in iodine-loaded tumours was calculated for kilovoltage x-rays [19] and brain-tumour therapy [20], and a therapy-modified computed tomography scanner delivered the first such treatment of human brain metastases [21]. Monochromatic synchrotron beams treated rats bearing iodine-loaded F98 gliomas [80] and identified the optimal energy for iodinated compounds in cells [81]; contrast-enhanced kilovoltage RT was analysed by MC [82], and modified megavoltage beams were combined with iodine and gadolinium contrast [83]. Platinum drugs add a high-Z atom to a chemotherapeutic agent: cisplatin combined with monochromatic synchrotron x-rays exploiting platinum K-edge photoactivation cured rats bearing radioresistant F98 gliomas [84]. Pignol et al. analysed inner-shell ionisation and Auger cascades in radiosensitization by halogenated deoxyuridines, platinum salts and gadolinium porphyrins [85]; when the heavy atom lies in or near DNA, short-range Auger electrons deposit their energy at this critical target, so the subcellular location of the high-Z atom matters, not only its concentration.</w:t>
       </w:r>
     </w:p>
     <w:p>
@@ -5321,7 +5243,7 @@
         <w:pStyle w:val="BodyText"/>
       </w:pPr>
       <w:r>
-        <w:t xml:space="preserve">Platinum drugs add a high-Z atom to a chemotherapeutic agent: cisplatin combined with monochromatic synchrotron x-rays exploiting platinum K-edge photoactivation cured rats bearing radioresistant F98 gliomas [84]. Pignol et al. analysed inner-shell ionisation and Auger cascades in radiosensitization by iododeoxyuridine, bromodeoxyuridine, platinum salts and gadolinium porphyrins [85]; when the heavy atom lies in or near DNA, short-range Auger electrons deposit their energy at this critical target. The subcellular location of the high-Z atom therefore matters, not only its concentration.</w:t>
+        <w:t xml:space="preserve">The modern stage began when gold nanoparticles (AuNPs) 1.9 nm in diameter markedly improved the one-year survival of tumour-bearing mice irradiated with 250 kVp (kilovolt peak) x-rays [9], and the key parameters of efficacy (material, size, coating, photon energy) have since been analysed systematically [86]. In vitro, AuNP radiosensitization was shown with superficial and orthovoltage [23, 87] and monoenergetic synchrotron beams [88]; uptake and radiosensitization depend on particle size [22], and DNA experiments identified photon energy, size and concentration as governing parameters [89]. Reviews [90–94] and a clinical roadmap [28] summarise these results.</w:t>
       </w:r>
     </w:p>
     <w:p>
@@ -5329,7 +5251,7 @@
         <w:pStyle w:val="BodyText"/>
       </w:pPr>
       <w:r>
-        <w:t xml:space="preserve">The modern stage began when gold nanoparticles (AuNPs) 1.9 nm in diameter markedly improved the one-year survival of tumour-bearing mice irradiated with 250 kVp (kilovolt peak) x-rays [9], and the key parameters of efficacy (material, size, coating, photon energy) have since been analysed systematically [86]. In vitro, AuNP radiosensitization was shown with superficial kilovoltage [23], orthovoltage and superficial [87] and monoenergetic synchrotron beams [88]; uptake and radiosensitization depend on particle size [22], and experiments with DNA identified photon energy, size and concentration as the governing parameters [89]. Reviews [90–94] and a roadmap to clinical use [28] summarise these results.</w:t>
+        <w:t xml:space="preserve">The physics has been studied mainly by MC simulation [10]: the tumour-selective enhancement was quantified for various photon sources [24] and therapeutic beams [95], and kilovoltage energies proved optimal for AuNP-enhanced arc therapy [96]. Radiosensitization also depends on nanoparticle location [97]; microscopically, the enhancement is highly localised [30], and Geant4 simulations characterised the spatial distribution of the secondary electrons [25]. Radio-enhancement, however, is not a mere dose increase: it comprises a physical stage (additional photon absorption; emission of photoelectrons, Auger electrons and fluorescence), a chemical stage (production of reactive oxygen species, ROS) and a biological stage (oxidative stress, cell-cycle perturbation, inhibition of DNA repair) [7, 26, 27, 98]. With a local effect model, McMahon et al. showed that highly inhomogeneous nanoscale energy deposition near heavy-atom nanoparticles can explain a sensitizer enhancement ratio (SER) in cells exceeding the macroscopic DEF [31], which nevertheless remains the baseline for separating the physical contribution from the chemical and biological ones.</w:t>
       </w:r>
     </w:p>
     <w:p>
@@ -5337,23 +5259,7 @@
         <w:pStyle w:val="BodyText"/>
       </w:pPr>
       <w:r>
-        <w:t xml:space="preserve">The physics has been studied mainly by MC simulation: following the first estimate of the macroscopic enhancement [10], the tumour-selective enhancement was quantified for various photon sources [24] and therapeutic beams [95], and kilovoltage energies proved optimal for AuNP-enhanced arc therapy [96]. Radiosensitization depends on the photon energy and on nanoparticle size, concentration and location [97]; microscopically, the enhancement is highly localised [30], and the spatial distribution of the secondary electrons was characterised with Geant4 [25]. This strong energy dependence makes a reliable incident spectrum a prerequisite of any dose-enhancement calculation.</w:t>
-      </w:r>
-    </w:p>
-    <w:p>
-      <w:pPr>
-        <w:pStyle w:val="BodyText"/>
-      </w:pPr>
-      <w:r>
-        <w:t xml:space="preserve">The biological effect, however, is not explained by the mean dose increase alone. Radio-enhancement comprises a physical stage (additional photon absorption; emission of photoelectrons, Auger electrons and fluorescence), a chemical stage (additional production of reactive oxygen species, ROS) and a biological stage (oxidative stress, cell-cycle perturbation, inhibition of DNA repair) [7, 26, 27, 98]. With a local effect model, McMahon et al. showed that the highly inhomogeneous nanoscale energy deposition near heavy-atom nanoparticles can explain effects exceeding the macroscopic dose enhancement [31], so the sensitizer enhancement ratio (SER) measured in cells may exceed the macroscopic DEF, which nevertheless remains the baseline for separating the physical contribution from the chemical and biological ones.</w:t>
-      </w:r>
-    </w:p>
-    <w:p>
-      <w:pPr>
-        <w:pStyle w:val="BodyText"/>
-      </w:pPr>
-      <w:r>
-        <w:t xml:space="preserve">Although gold dominates the literature, the best element is not obvious and has been sought through kerma-based comparisons over photon energy [13] and physical modelling [29]. In the kerma approximation the comparison reduces to the ratio</w:t>
+        <w:t xml:space="preserve">Although gold dominates the literature, the optimal element has been sought through kerma-based comparisons over photon energy [13] and physical modelling [29]. In the kerma approximation the comparison reduces to the ratio</w:t>
       </w:r>
       <w:r>
         <w:t xml:space="preserve"> </w:t>
@@ -5376,12 +5282,47 @@
         <w:t xml:space="preserve"> </w:t>
       </w:r>
       <w:r>
-        <w:t xml:space="preserve">of the mass energy-absorption coefficient of the element to that of tissue, since tissue containing a mass fraction</w:t>
+        <w:t xml:space="preserve">of the</w:t>
       </w:r>
       <w:r>
         <w:t xml:space="preserve"> </w:t>
       </w:r>
       <m:oMath>
+        <m:sSub>
+          <m:e>
+            <m:r>
+              <m:t>μ</m:t>
+            </m:r>
+          </m:e>
+          <m:sub>
+            <m:r>
+              <m:t>e</m:t>
+            </m:r>
+            <m:r>
+              <m:t>n</m:t>
+            </m:r>
+          </m:sub>
+        </m:sSub>
+        <m:r>
+          <m:rPr>
+            <m:sty m:val="p"/>
+          </m:rPr>
+          <m:t>/</m:t>
+        </m:r>
+        <m:r>
+          <m:t>ρ</m:t>
+        </m:r>
+      </m:oMath>
+      <w:r>
+        <w:t xml:space="preserve"> </w:t>
+      </w:r>
+      <w:r>
+        <w:t xml:space="preserve">of the element to that of tissue, since tissue containing a mass fraction</w:t>
+      </w:r>
+      <w:r>
+        <w:t xml:space="preserve"> </w:t>
+      </w:r>
+      <m:oMath>
         <m:r>
           <m:t>w</m:t>
         </m:r>
@@ -5390,7 +5331,7 @@
         <w:t xml:space="preserve"> </w:t>
       </w:r>
       <w:r>
-        <w:t xml:space="preserve">of the element and irradiated by monoenergetic photons of energy</w:t>
+        <w:t xml:space="preserve">of the element has, at photon energy</w:t>
       </w:r>
       <w:r>
         <w:t xml:space="preserve"> </w:t>
@@ -5401,10 +5342,7 @@
         </m:r>
       </m:oMath>
       <w:r>
-        <w:t xml:space="preserve"> </w:t>
-      </w:r>
-      <w:r>
-        <w:t xml:space="preserve">has a DEF of</w:t>
+        <w:t xml:space="preserve">, a DEF of</w:t>
       </w:r>
       <w:r>
         <w:t xml:space="preserve"> </w:t>
@@ -5547,7 +5485,7 @@
         <w:pStyle w:val="BodyText"/>
       </w:pPr>
       <w:r>
-        <w:t xml:space="preserve">Below about 12 keV the ratios for silver, platinum, gold and bismuth are similar and that for iodine is somewhat higher. Above its L-edges (7.2–8.4 keV) and up to about 13 keV gadolinium leads, absorbing the Cu Kα lines at about 8.0 keV particularly efficiently. The L-edges of platinum, gold and bismuth at about 12–16 keV raise their ratios several-fold, leaving silver the lowest of the six between about 12 and 25.5 keV. Above its K-edge silver first equals and then exceeds gadolinium (K-edge 50.239 keV, above the maximum photon energy) and exceeds iodine up to the iodine K-edge at 33.169 keV. At 40–45 keV iodine, platinum and silver become comparable, while gold and bismuth remain the highest.</w:t>
+        <w:t xml:space="preserve">Below about 12 keV the ratios for silver, platinum, gold and bismuth are similar and that for iodine is somewhat higher. Above its L-edges (7.2–8.4 keV) and up to about 13 keV gadolinium leads, absorbing the Cu Kα lines at about 8.0 keV particularly efficiently. The L-edges of platinum, gold and bismuth at about 12–16 keV raise their ratios several-fold, leaving silver the lowest of the six between about 12 and 25.5 keV. Above its K-edge silver first equals and then exceeds gadolinium (K-edge 50.239 keV, above the maximum photon energy) and exceeds iodine up to about 42 keV, above the iodine K-edge (33.169 keV) only slightly. At 40–45 keV iodine, platinum and silver become comparable, while gold and bismuth remain the highest.</w:t>
       </w:r>
     </w:p>
     <w:p>
@@ -5555,7 +5493,7 @@
         <w:pStyle w:val="BodyText"/>
       </w:pPr>
       <w:r>
-        <w:t xml:space="preserve">Two conclusions follow. First, per unit mass silver should be a weaker physical sensitizer than platinum, gold and bismuth, and it surpasses iodine and gadolinium only above its K-edge, so its ranking depends on the spectrum. Second, as its ratio to tissue rises from 21–32 between 8 keV and the edge (which includes the Cu K lines at 8.0–8.9 keV) to 76–139 above it, the tube design parameters and especially the filtration, which redistribute the energy fluence relative to 25.514 keV, are expected to be decisive for the DEF, as tested in Chapter 3. The arguments that nevertheless favour silver are reviewed in Section 1.4.</w:t>
+        <w:t xml:space="preserve">Two conclusions follow. First, per unit mass silver should be a weaker physical sensitizer than platinum, gold and bismuth, and it surpasses iodine only above its K-edge and gadolinium only above its K-edge and below the L3 edge of gadolinium (7.2 keV), so its ranking depends on the spectrum. Second, as its ratio to tissue rises from 21–32 between 8 keV and the edge (which includes the Cu K lines at 8.0–8.9 keV) to 76–139 above it, the tube design parameters and especially the filtration, which redistribute the energy fluence relative to 25.514 keV, are expected to be decisive for the DEF, as tested in Chapter 3.</w:t>
       </w:r>
     </w:p>
     <w:p>
@@ -5605,7 +5543,7 @@
         </m:r>
       </m:oMath>
       <w:r>
-        <w:t xml:space="preserve">), that dominate the literature on high-Z radiosensitizers. Reviews cover the synthesis, properties and therapeutic applications of silver nanoparticles (AgNPs) [99] and their antimicrobial and anticancer uses [100]; AgNPs are cheaper than gold and can be made by green synthesis, for example in egg white [101]. For radiotherapy, two properties of silver matter: its biological activity and the position of its K-edge inside the spectra of x-ray tubes operated at a few tens of kilovolts.</w:t>
+        <w:t xml:space="preserve">), that dominate the literature on high-Z radiosensitizers. Reviews cover the synthesis, properties and therapeutic applications of silver nanoparticles (AgNPs) [99] and their antimicrobial and anticancer uses [100]; AgNPs are cheaper than gold and can be made by green synthesis, for example in egg white [101]. For radiotherapy, two properties of silver matter: its biological activity and the position of its K-edge within kilovoltage tube spectra. The former is linked to toxicity: AgNPs are cytotoxic and genotoxic in human cells, inducing ROS, DNA damage and cell-cycle arrest with mitochondrial involvement [37]. Such effects belong to the chemical and biological stages of radio-enhancement (Section 1.3) [7, 98], so AgNPs may sensitize cells beyond their physical dose enhancement. Their cytotoxicity, however, makes selective tumour accumulation a prerequisite of therapy, and the effect of dose enhancement on healthy tissues must be assessed [39].</w:t>
       </w:r>
     </w:p>
     <w:p>
@@ -5613,15 +5551,7 @@
         <w:pStyle w:val="BodyText"/>
       </w:pPr>
       <w:r>
-        <w:t xml:space="preserve">The biological activity of AgNPs is linked to their toxicity: they are cytotoxic and genotoxic in human cells, inducing ROS, DNA damage and cell-cycle arrest with mitochondrial involvement [37]. Such effects belong to the chemical and biological stages of radio-enhancement (Section 1.3), in which ROS, oxidative stress and inhibited DNA repair amplify the physical damage [7, 98], so AgNPs may sensitize cells beyond their physical dose enhancement. Their cytotoxicity, however, makes selective tumour accumulation a prerequisite of therapy, and the effect of tumour dose enhancement on healthy tissues must be assessed [39].</w:t>
-      </w:r>
-    </w:p>
-    <w:p>
-      <w:pPr>
-        <w:pStyle w:val="BodyText"/>
-      </w:pPr>
-      <w:r>
-        <w:t xml:space="preserve">Experimental evidence is summarised in Table 1.1. Since the early report by Xu et al. [32], glioma has been the most studied model [11, 12, 33, 34], including hypoxic cells, which are less radiosensitive because of the oxygen effect [3]; breast [35] and colorectal [36] cancers have also been used. The studies differ in particles, coatings, biological models and irradiation conditions and cannot be compared quantitatively. Moreover, because the physical dose enhancement depends strongly on the spectrum (Section 1.3), an enhancement ratio reported without the spectrum cannot be split into physical and non-physical parts.</w:t>
+        <w:t xml:space="preserve">Experimental evidence is summarised in Table 1.1: since the early report by Xu et al. [32], glioma has been the most studied model [11, 12, 33, 34], including radioresistant hypoxic cells [3]; breast [35] and colorectal [36] cancers have also been used. The studies differ in particles, coatings, biological models and irradiation conditions and are not quantitatively comparable. Because the physical dose enhancement depends strongly on the spectrum (Section 1.3), an enhancement ratio reported without the spectrum cannot be split into physical and non-physical parts.</w:t>
       </w:r>
     </w:p>
     <w:p>
@@ -6144,7 +6074,7 @@
         <w:pStyle w:val="BodyText"/>
       </w:pPr>
       <w:r>
-        <w:t xml:space="preserve">The advantage of AgNPs over AuNPs [12] is instructive. Per unit mass, silver and gold absorb photon energy comparably below about 12 keV, but gold absorbs more strongly between about 12 and 45 keV (Fig. 1.2), and in megavoltage beams the macroscopic enhancement is much smaller even for gold [10] because Compton scattering, whose mass coefficient depends only weakly on</w:t>
+        <w:t xml:space="preserve">The reported advantage of AgNPs over AuNPs [12] is instructive. Per unit mass, silver and gold absorb photon energy comparably below about 12 keV, but gold absorbs more strongly between about 12 and 45 keV (Fig. 1.2), and in megavoltage beams the macroscopic enhancement is much smaller even for gold [10] because Compton scattering, whose mass coefficient depends only weakly on</w:t>
       </w:r>
       <w:r>
         <w:t xml:space="preserve"> </w:t>
@@ -6163,7 +6093,7 @@
         <w:pStyle w:val="BodyText"/>
       </w:pPr>
       <w:r>
-        <w:t xml:space="preserve">Dosimetric studies of silver are fewer than biological ones. MC simulations have addressed AgNPs in a brain tumour during brachytherapy [38], the effect on surrounding healthy tissues [39] and silver versus gold in layered skin [40]; dose enhancement was also measured in AgNP-enriched dose gels [41], and its depth dependence in orthovoltage beams was studied for nanoparticles [42]. A systematic analysis of how kilovoltage tube design and filtration determine the DEF of silver-loaded tissue has not been found in the literature reviewed.</w:t>
+        <w:t xml:space="preserve">Dosimetric studies of silver are fewer than biological ones: MC simulations addressed AgNPs in a brain tumour during brachytherapy [38], surrounding healthy tissues [39] and silver versus gold in layered skin [40]; dose enhancement was also measured in AgNP-enriched dose gels [41], and its depth dependence in orthovoltage beams was studied for nanoparticles [42]. A systematic analysis of how kilovoltage tube design and filtration determine the DEF of silver-loaded tissue has not been found in the literature reviewed.</w:t>
       </w:r>
     </w:p>
     <w:p>
@@ -6251,7 +6181,7 @@
         <w:pStyle w:val="FirstParagraph"/>
       </w:pPr>
       <w:r>
-        <w:t xml:space="preserve">Measuring the spectrum needed for the DEF with semiconductor detectors [44] requires detector-response corrections and is impractical for every configuration, so parametric studies use calculated spectra; the four groups of methods are compared in Table 1.2. The empirical model TASMIP (tungsten anode spectral model using interpolating polynomials) interpolates measured tungsten-anode spectra from 30 to 140 kV [43], and the spektr 3.0 tool implements a similar interpolation model [102]. Such models are fast and accurate within their data range but tied to the anode material, angle and inherent filtration of the measured tubes: added filtration can be modelled as attenuation, but the anode material and angle, studied in this work, cannot.</w:t>
+        <w:t xml:space="preserve">Measuring the spectrum needed for the DEF with semiconductor detectors [44] requires detector-response corrections and is impractical for every configuration, so parametric studies use calculated spectra; four groups of methods are compared in Table 1.2. The empirical model TASMIP (tungsten anode spectral model using interpolating polynomials) interpolates measured tungsten-anode spectra from 30 to 140 kV [43], and the spektr 3.0 tool implements a similar interpolation model [102]. Such models are tied to the anode material, angle and inherent filtration of the measured tubes: added filtration can be modelled as attenuation, but the anode material and angle, studied in this work, cannot.</w:t>
       </w:r>
     </w:p>
     <w:p>
@@ -6348,7 +6278,7 @@
         <w:t xml:space="preserve"> </w:t>
       </w:r>
       <w:r>
-        <w:t xml:space="preserve">the photon energy [8, 103]. Birch and Marshall compared their model with Ge(Li) detector measurements [44], and Tucker, Barnes and Chakraborty proposed the TBC model for tungsten [45]. Such models combine a simplified bremsstrahlung cross-section with approximate electron penetration and target self-absorption, fitting some parameters to experiment; they are cheap and show the dependence on voltage, anode angle and filtration explicitly, but their accuracy is limited by the simplified physics and their parameters are target-specific, usually for tungsten.</w:t>
+        <w:t xml:space="preserve">the photon energy [8, 103]. Birch and Marshall compared their model with Ge(Li) detector measurements [44], and Tucker, Barnes and Chakraborty proposed the TBC model for tungsten [45]. Such models combine a simplified bremsstrahlung cross-section with approximate electron penetration and target self-absorption; they show the dependence on voltage, anode angle and filtration explicitly, but their fitted parameters are target-specific, usually for tungsten.</w:t>
       </w:r>
     </w:p>
     <w:p>
@@ -6356,7 +6286,7 @@
         <w:pStyle w:val="BodyText"/>
       </w:pPr>
       <w:r>
-        <w:t xml:space="preserve">Physics-based deterministic models replace most empirical parameters with theoretical or MC-derived data. MC-derived electron-penetration characteristics [46] were used to calculate x-ray production and filtration in the target [47] and implemented for tungsten in SpekCalc [48]. SpekPy v2, its successor, offers several physics models, including the casim model used here, and several anodes, including copper [15], available for 10–50 kV in version 2.5.4 [58]. It builds on models of K and L emission [104] and of bremsstrahlung energy and angular distributions [105], validated from 20 to 300 kV [106] and against measured spectra and HVLs [51]. Such models are fast and physically founded but limited to the anodes and voltages with precomputed transport data.</w:t>
+        <w:t xml:space="preserve">Physics-based deterministic models replace most empirical parameters with theoretical or MC-derived data. MC-derived electron-penetration characteristics [46] were used to calculate x-ray production and filtration in the target [47] and implemented for tungsten in SpekCalc [48]. SpekPy v2, its successor, offers several physics models, including the casim model used here, and several anodes, including copper [15], available for 10–50 kV in version 2.5.4 [58]. It builds on models of K and L emission [104] and of bremsstrahlung energy and angular distributions [105], validated from 20 to 300 kV [106] and against measured spectra and HVLs [51].</w:t>
       </w:r>
     </w:p>
     <w:p>
@@ -6364,7 +6294,7 @@
         <w:pStyle w:val="BodyText"/>
       </w:pPr>
       <w:r>
-        <w:t xml:space="preserve">MC simulation of coupled electron–photon transport in the tube gives the most complete description, for example MCNP4C for diagnostic and mammography spectra [50] or EGS4/BEAM for kilovoltage radiotherapy units [49]; other general-purpose codes are EGSnrc [107], Geant4 [108] and PENELOPE [109]. It includes electron backscattering, the bremsstrahlung angular distribution and the real tube geometry. However, it needs detailed geometric data and long computation times, so it suits benchmarks rather than extensive parametric studies.</w:t>
+        <w:t xml:space="preserve">MC simulation of coupled electron–photon transport in the tube gives the most complete description, for example MCNP4C for diagnostic and mammography spectra [50] or EGS4/BEAM for kilovoltage radiotherapy units [49]; other general-purpose codes are EGSnrc [107], Geant4 [108] and PENELOPE [109]. It includes electron backscattering, the bremsstrahlung angular distribution and the real tube geometry, but is slow and needs detailed geometric data, so it suits benchmarks rather than extensive parametric studies.</w:t>
       </w:r>
     </w:p>
     <w:p>
@@ -6762,7 +6692,7 @@
         <w:pStyle w:val="BodyText"/>
       </w:pPr>
       <w:r>
-        <w:t xml:space="preserve">The calculated spectrum must be related to measurable quantities. In kilovoltage dosimetry, beam quality is specified by the HVL together with the tube voltage [110], as in the protocol of the American Association of Physicists in Medicine for 40–300 kV beams (AAPM TG-61) [14], the TRS-398 code of practice of the International Atomic Energy Agency (IAEA) [70] and the standard radiation qualities of the International Electrotechnical Commission (IEC 61267) [111]. The HVL is thus the natural quantity for comparing models with each other and with measurements. It does not, however, fix the energy-fluence fraction above the Ag K-edge, so beams with similar HVLs can give different DEFs for silver, as Chapter 3 shows for filters with absorption edges (Table 3.5).</w:t>
+        <w:t xml:space="preserve">In kilovoltage dosimetry, beam quality is specified by the HVL together with the tube voltage [110], as in the protocol of the American Association of Physicists in Medicine for 40–300 kV beams (AAPM TG-61) [14], the TRS-398 code of practice of the International Atomic Energy Agency (IAEA) [70] and the standard radiation qualities of the International Electrotechnical Commission (IEC 61267) [111]. The HVL is thus the natural quantity for comparing models and measurements. It does not, however, fix the energy-fluence fraction above the Ag K-edge, so beams with similar HVLs can give different DEFs for silver, as Chapter 3 shows for filters with absorption edges (Table 3.5).</w:t>
       </w:r>
     </w:p>
     <w:p>
@@ -6770,7 +6700,7 @@
         <w:pStyle w:val="BodyText"/>
       </w:pPr>
       <w:r>
-        <w:t xml:space="preserve">Most of these models were developed for tungsten, the usual target of medical tubes [16]. Copper-anode tubes serve mainly x-ray diffraction, where Cu Kα is the working line, Kβ is suppressed by a nickel filter [52] and the bremsstrahlung continuum is unwanted background. For silver dose enhancement, by contrast, the continuum is the useful part, since only bremsstrahlung photons can exceed the Ag K-edge; yet the full spectrum of copper-anode tubes and its dependence on tube parameters have received much less attention. This work therefore constructed a semi-analytical physics-based model of the copper-anode tube, the developed model (DM), which combines the Bethe collision stopping power in the continuous slowing-down approximation (CSDA) [53, 68], the non-relativistic Bethe–Heitler bremsstrahlung cross-section with the Elwert factor [54–56] and the Gryziński K-shell ionisation cross-section [57], with one adjustable parameter, the electron depth factor (Chapter 2). All dependences on tube parameters remain explicit, and SpekPy v2 serves as the validation reference.</w:t>
+        <w:t xml:space="preserve">Most of these models were developed for tungsten, the usual target of medical tubes [16]. Copper-anode tubes serve mainly x-ray diffraction, where Cu Kα is the working line, Kβ is suppressed by a nickel filter [52] and the bremsstrahlung continuum is unwanted background. For silver dose enhancement, by contrast, the continuum is the useful part, since only bremsstrahlung photons can exceed the Ag K-edge; yet the full spectrum of copper-anode tubes and its dependence on tube parameters have received much less attention. This work therefore constructed a semi-analytical physics-based model of the copper-anode tube, the developed model (DM), combining the Bethe collision stopping power in the continuous slowing-down approximation (CSDA) [53, 68], the non-relativistic Bethe–Heitler bremsstrahlung cross-section with the Elwert factor [54–56] and the Gryziński K-shell ionisation cross-section [57], with one adjustable parameter, the electron depth factor (Chapter 2). All dependences on tube parameters remain explicit.</w:t>
       </w:r>
     </w:p>
     <w:p>
@@ -6794,7 +6724,7 @@
         <w:pStyle w:val="BodyText"/>
       </w:pPr>
       <w:r>
-        <w:t xml:space="preserve">Spectrum models are well developed for tungsten anodes but much less so for the full spectrum of copper-anode tubes. This work therefore develops a semi-analytical model of the 45 kV copper-anode tube spectrum, validates it against SpekPy v2, and uses both models to calculate the spectrum versus tube design and filtration and the DEF of silver-loaded soft tissue versus concentration, depth and filtration. The results are verified by MC simulation, silver is compared with other high-Z elements, and the DEF uncertainty is estimated as a basis for practical recommendations.</w:t>
+        <w:t xml:space="preserve">Spectrum models have been developed mainly for tungsten anodes. This work therefore develops a semi-analytical model of the 45 kV copper-anode tube spectrum, validates it against SpekPy v2, and uses both models to calculate the spectrum versus tube design and filtration and the DEF of silver-loaded soft tissue versus concentration, depth and filtration. The results are verified by MC simulation, silver is compared with other high-Z elements, and the DEF uncertainty is estimated as a basis for practical recommendations.</w:t>
       </w:r>
     </w:p>
     <w:p>
@@ -6810,7 +6740,7 @@
         <w:pStyle w:val="FirstParagraph"/>
       </w:pPr>
       <w:r>
-        <w:t xml:space="preserve">This chapter describes the semi-analytical spectrum model of this work, the developed model (DM), and the methods for calculating the dose enhancement factor (DEF) and verifying it by Monte Carlo (MC) simulation. Formulas are given as implemented in the code (Appendix A), with energies in keV and lengths in cm unless stated otherwise.</w:t>
+        <w:t xml:space="preserve">This chapter presents the semi-analytical developed model (DM) of the spectrum and the methods of calculating the dose enhancement factor (DEF) and its Monte Carlo (MC) verification, as implemented in the code (Appendix A), with energies in keV and lengths in cm unless stated otherwise.</w:t>
       </w:r>
     </w:p>
     <w:p>
@@ -6826,7 +6756,7 @@
         <w:pStyle w:val="FirstParagraph"/>
       </w:pPr>
       <w:r>
-        <w:t xml:space="preserve">Electrons emitted by the heated cathode are focused onto the focal spot of the anode, which they reach with the kinetic energy</w:t>
+        <w:t xml:space="preserve">Electrons from the heated cathode are focused onto the anode focal spot, which they reach with the kinetic energy</w:t>
       </w:r>
       <w:r>
         <w:t xml:space="preserve"> </w:t>
@@ -6886,7 +6816,7 @@
         <w:t xml:space="preserve"> </w:t>
       </w:r>
       <w:r>
-        <w:t xml:space="preserve">the elementary charge (45 keV in the baseline); only a small fraction of this energy is emitted as x-rays [8, 16]. The photon number is proportional to the product of tube current and exposure time (mAs), whereas the spectral shape does not depend on the current, so all spectra are normalised to 1 mAs. In the modelled reflection-target tube (Fig. 2.1), the beam leaves through the face of the thick anode on which the electrons are incident. The anode angle</w:t>
+        <w:t xml:space="preserve">the elementary charge (45 keV in the baseline); only a small fraction of this energy is emitted as x-rays [8, 16]. The photon number is proportional to the tube current–time product (mAs), while the spectral shape is independent of the current, so all spectra are normalised to 1 mAs. In the modelled reflection-target tube (Fig. 2.1), the beam leaves through the electron-irradiated face of the thick anode. The anode angle</w:t>
       </w:r>
       <w:r>
         <w:t xml:space="preserve"> </w:t>
@@ -6900,7 +6830,7 @@
         <w:t xml:space="preserve"> </w:t>
       </w:r>
       <w:r>
-        <w:t xml:space="preserve">lies between the anode surface and the central ray, which is perpendicular to the electron beam, so the electrons are incident at</w:t>
+        <w:t xml:space="preserve">between the anode surface and the central ray, which is perpendicular to the electron beam, is thus both the angle of electron incidence to the surface normal and the photon take-off angle. A small</w:t>
       </w:r>
       <w:r>
         <w:t xml:space="preserve"> </w:t>
@@ -6914,32 +6844,7 @@
         <w:t xml:space="preserve"> </w:t>
       </w:r>
       <w:r>
-        <w:t xml:space="preserve">to the surface normal and the central-ray photons leave at the take-off angle</w:t>
-      </w:r>
-      <w:r>
-        <w:t xml:space="preserve"> </w:t>
-      </w:r>
-      <m:oMath>
-        <m:r>
-          <m:t>θ</m:t>
-        </m:r>
-      </m:oMath>
-      <w:r>
-        <w:t xml:space="preserve">. A small</w:t>
-      </w:r>
-      <w:r>
-        <w:t xml:space="preserve"> </w:t>
-      </w:r>
-      <m:oMath>
-        <m:r>
-          <m:t>θ</m:t>
-        </m:r>
-      </m:oMath>
-      <w:r>
-        <w:t xml:space="preserve"> </w:t>
-      </w:r>
-      <w:r>
-        <w:t xml:space="preserve">reduces the effective focal spot but makes the beam on the anode side weaker and harder (heel effect) [16]; the DM treats the central ray only. The beryllium window and the self-absorption in the anode form the inherent filtration, and added metal filters remove the soft part of the spectrum and harden the beam [17] before the photons cross an air gap to the sample at the focus–sample distance</w:t>
+        <w:t xml:space="preserve">reduces the effective focal spot but makes the beam on the anode side weaker and harder (heel effect) [16]; the DM treats the central ray only. The beryllium window and anode self-absorption form the inherent filtration; added metal filters remove the soft part of the spectrum and harden the beam [17] before the photons cross the air gap to the sample at the focus–sample distance</w:t>
       </w:r>
       <w:r>
         <w:t xml:space="preserve"> </w:t>
@@ -6962,7 +6867,7 @@
           <wp:inline>
             <wp:extent cx="4859999" cy="2557894"/>
             <wp:effectExtent b="0" l="0" r="0" t="0"/>
-            <wp:docPr descr="Fig. 2.1. Schematic diagram of the modelled reflection-target copper-anode tube and of the irradiation geometry: photons emitted along the central ray at the anode angle θ pass the beryllium window, the added filter and the air gap (focus–sample distance d, denoted r in the text) to the Ag-containing tissue sample." title="" id="27" name="Picture"/>
+            <wp:docPr descr="Fig. 2.1. Modelled reflection-target copper-anode tube and irradiation geometry: central-ray photons emitted at the anode angle θ pass the beryllium window, the added filter and the air gap (focus–sample distance d, denoted r in the text) to the Ag-containing tissue sample." title="" id="27" name="Picture"/>
             <a:graphic>
               <a:graphicData uri="http://schemas.openxmlformats.org/drawingml/2006/picture">
                 <pic:pic>
@@ -7005,7 +6910,7 @@
         <w:pStyle w:val="ImageCaption"/>
       </w:pPr>
       <w:r>
-        <w:t xml:space="preserve">Fig. 2.1. Schematic diagram of the modelled reflection-target copper-anode tube and of the irradiation geometry: photons emitted along the central ray at the anode angle θ pass the beryllium window, the added filter and the air gap (focus–sample distance d, denoted r in the text) to the Ag-containing tissue sample.</w:t>
+        <w:t xml:space="preserve">Fig. 2.1. Modelled reflection-target copper-anode tube and irradiation geometry: central-ray photons emitted at the anode angle θ pass the beryllium window, the added filter and the air gap (focus–sample distance d, denoted r in the text) to the Ag-containing tissue sample.</w:t>
       </w:r>
     </w:p>
     <w:p>
@@ -7013,7 +6918,7 @@
         <w:pStyle w:val="BodyText"/>
       </w:pPr>
       <w:r>
-        <w:t xml:space="preserve">Copper-anode tubes are standard sources for x-ray diffraction, which uses the intense Cu Kα line and suppresses the Kβ line with a nickel filter whose K-edge lies between the two lines [52]. For irradiations with silver, however, the useful photons lie above the Ag K-edge at 25.514 keV (Section 1.4), in the continuum that is merely a background in diffraction, so the whole spectrum must be modelled and shaped by filtration; as most spectrum models were developed for tungsten anodes (Section 1.5), a dedicated copper-anode model is required. Table 2.1 lists the tube parameters, their baseline values and the ranges studied in Chapter 3; the voltage, anode, anode angle, window and filters change the spectral shape, whereas the distance acts through the inverse-square law and the air attenuation. A constant potential is assumed, so all electrons arrive with the energy</w:t>
+        <w:t xml:space="preserve">Copper-anode tubes are standard x-ray diffraction sources, which use the intense Cu Kα line and suppress Kβ with a nickel filter whose K-edge lies between the two lines [52]. For irradiations with silver, however, the useful photons lie above the Ag K-edge at 25.514 keV (Section 1.4), in the continuum that diffraction treats as background, so the whole spectrum must be modelled and shaped by filtration; as most spectrum models were developed for tungsten anodes (Section 1.5), a dedicated copper-anode model is required. Table 2.1 lists the tube parameters, their baseline values and the ranges studied in Chapter 3; the voltage, anode, anode angle, window and filters change the spectral shape, whereas the distance acts through the inverse-square law and the air attenuation. A constant potential is assumed, so all electrons arrive with the energy</w:t>
       </w:r>
       <w:r>
         <w:t xml:space="preserve"> </w:t>
@@ -8519,7 +8424,7 @@
         <w:t xml:space="preserve"> </w:t>
       </w:r>
       <w:r>
-        <w:t xml:space="preserve">= 322 eV; the density-effect correction (negligible below 100 keV) and the shell corrections (relevant only at the lowest energies) are omitted; for water the code reproduces the ESTAR stopping power of the National Institute of Standards and Technology (NIST) [69] (Section 2.8). The path length travelled while slowing down from</w:t>
+        <w:t xml:space="preserve">= 322 eV; the density-effect correction (negligible below 100 keV) and the shell corrections (relevant only at the lowest energies) are omitted; for water the code reproduces the ESTAR stopping power of the National Institute of Standards and Technology (NIST) [69] (Section 2.8). The path length travelled from</w:t>
       </w:r>
       <w:r>
         <w:t xml:space="preserve"> </w:t>
@@ -8733,7 +8638,7 @@
         <w:t xml:space="preserve"> </w:t>
       </w:r>
       <w:r>
-        <w:t xml:space="preserve">is the variable of integration. Evaluated by the trapezoidal rule (step 0.02 keV) down to</w:t>
+        <w:t xml:space="preserve">is the integration variable. Evaluated by the trapezoidal rule (step 0.02 keV) down to</w:t>
       </w:r>
       <w:r>
         <w:t xml:space="preserve"> </w:t>
@@ -8905,7 +8810,7 @@
         </m:r>
       </m:oMath>
       <w:r>
-        <w:t xml:space="preserve">, the empirical Thomson–Whiddington law [112]. Because multiple elastic scattering makes the electrons diffuse into the target, the CSDA path is not the depth at which the photons are produced. Instead of the MC-derived penetration distributions of Poludniowski and Evans [46], the DM uses one mean depth for each electron energy, the projected depth</w:t>
+        <w:t xml:space="preserve">, the empirical Thomson–Whiddington law [112]. Since multiple elastic scattering makes the electrons diffuse, the CSDA path is not the photon production depth; instead of the MC-derived penetration distributions of Poludniowski and Evans [46], the DM uses one mean depth for each electron energy, the projected depth</w:t>
       </w:r>
     </w:p>
     <w:tbl>
@@ -9041,7 +8946,7 @@
         <w:t xml:space="preserve"> </w:t>
       </w:r>
       <w:r>
-        <w:t xml:space="preserve">is the depth below the anode surface, along the normal, at which the electron has slowed down to</w:t>
+        <w:t xml:space="preserve">is the depth (along the normal) at which the electron has slowed down to</w:t>
       </w:r>
       <w:r>
         <w:t xml:space="preserve"> </w:t>
@@ -9123,7 +9028,7 @@
         <w:t xml:space="preserve"> </w:t>
       </w:r>
       <w:r>
-        <w:t xml:space="preserve">equals the angle of incidence measured from the normal. This single adjustable parameter of the DM was fitted to the bremsstrahlung shape of SpekPy [15] (Section 2.8), which gave</w:t>
+        <w:t xml:space="preserve">is the angle of incidence. This single adjustable parameter of the DM was fitted to the bremsstrahlung shape of SpekPy [15] (Section 2.8), which gave</w:t>
       </w:r>
       <w:r>
         <w:t xml:space="preserve"> </w:t>
@@ -9151,7 +9056,7 @@
         <w:t xml:space="preserve"> </w:t>
       </w:r>
       <w:r>
-        <w:t xml:space="preserve">= 12°. Backscattering (about 30 % of the electrons in copper) is not modelled, which contributes to the overestimate of the absolute output (Section 3.1). As panel (a) of Fig. 2.2 shows, the stopping power rises steeply as the electron slows down, so the depth grows rapidly as the energy falls from 45 to about 20 keV and then saturates. Photons close to</w:t>
+        <w:t xml:space="preserve">= 12°. Backscattering (about 30 % of the electrons in copper) is not modelled, contributing to the overestimated absolute output (Section 3.1). As panel (a) of Fig. 2.2 shows, the stopping power rises steeply as the electron slows down, so the depth grows rapidly as the energy falls from 45 to about 20 keV and then saturates. Photons close to</w:t>
       </w:r>
       <w:r>
         <w:t xml:space="preserve"> </w:t>
@@ -9186,7 +9091,7 @@
           <wp:inline>
             <wp:extent cx="4859999" cy="2126920"/>
             <wp:effectExtent b="0" l="0" r="0" t="0"/>
-            <wp:docPr descr="Fig. 2.2. Electron slowing-down and K-shell ionisation in the copper anode: (a) Bethe collision stopping power (solid, left axis) and projected depth at which a 45 keV electron has slowed down to the energy T, for η = 0.40 and θ = 12° (dashed, right axis); (b) Gryziński K-shell ionisation cross-section of copper." title="" id="30" name="Picture"/>
+            <wp:docPr descr="Fig. 2.2. Electron slowing-down and K-shell ionisation in the copper anode: (a) Bethe collision stopping power (solid, left axis) and projected depth at which a 45 keV electron has slowed down to T, for η = 0.40 and θ = 12° (dashed, right axis); (b) Gryziński K-shell ionisation cross-section." title="" id="30" name="Picture"/>
             <a:graphic>
               <a:graphicData uri="http://schemas.openxmlformats.org/drawingml/2006/picture">
                 <pic:pic>
@@ -9229,7 +9134,7 @@
         <w:pStyle w:val="ImageCaption"/>
       </w:pPr>
       <w:r>
-        <w:t xml:space="preserve">Fig. 2.2. Electron slowing-down and K-shell ionisation in the copper anode: (a) Bethe collision stopping power (solid, left axis) and projected depth at which a 45 keV electron has slowed down to the energy T, for η = 0.40 and θ = 12° (dashed, right axis); (b) Gryziński K-shell ionisation cross-section of copper.</w:t>
+        <w:t xml:space="preserve">Fig. 2.2. Electron slowing-down and K-shell ionisation in the copper anode: (a) Bethe collision stopping power (solid, left axis) and projected depth at which a 45 keV electron has slowed down to T, for η = 0.40 and θ = 12° (dashed, right axis); (b) Gryziński K-shell ionisation cross-section.</w:t>
       </w:r>
     </w:p>
     <w:p>
@@ -9691,7 +9596,7 @@
         </m:r>
       </m:oMath>
       <w:r>
-        <w:t xml:space="preserve">. The DM keeps this cross-section only as an option and by default uses the non-relativistic, unscreened Born-approximation cross-section of Bethe and Heitler [54] as compiled by Koch and Motz [56]:</w:t>
+        <w:t xml:space="preserve">. The DM retains it only as an option, using by default the non-relativistic, unscreened Born-approximation cross-section of Bethe and Heitler [54] as compiled by Koch and Motz [56]:</w:t>
       </w:r>
     </w:p>
     <w:tbl>
@@ -10690,7 +10595,7 @@
         </m:r>
       </m:oMath>
       <w:r>
-        <w:t xml:space="preserve">, so BH-E remains finite at the high-energy end. Unlike the tabulated cross-sections of Seltzer and Berger [113], BH-E neglects atomic screening and electron–electron bremsstrahlung, which contributes to the overestimate of the absolute yield of hard bremsstrahlung relative to SpekPy. The DEF, however, depends only on the spectral shape, which is reproduced at 45 kV with a root-mean-square deviation of 2.46 % after the fit of</w:t>
+        <w:t xml:space="preserve">, so BH-E remains finite at the high-energy end. Unlike the tabulated cross-sections of Seltzer and Berger [113], BH-E neglects atomic screening and electron–electron bremsstrahlung, contributing to the overestimated absolute yield of hard bremsstrahlung relative to SpekPy. The DEF, however, depends only on the spectral shape, which is reproduced at 45 kV with a root-mean-square deviation of 2.46 % after the fit of</w:t>
       </w:r>
       <w:r>
         <w:t xml:space="preserve"> </w:t>
@@ -11276,7 +11181,7 @@
         </m:r>
       </m:oMath>
       <w:r>
-        <w:t xml:space="preserve">, the integral gives the generated spectrum</w:t>
+        <w:t xml:space="preserve">, it gives the generated spectrum</w:t>
       </w:r>
       <w:r>
         <w:t xml:space="preserve"> </w:t>
@@ -11305,10 +11210,7 @@
         </m:r>
       </m:oMath>
       <w:r>
-        <w:t xml:space="preserve"> </w:t>
-      </w:r>
-      <w:r>
-        <w:t xml:space="preserve">(photons emitted in all directions). The integrals are evaluated by the trapezoidal rule in photon bins of 0.05 keV; a similar formulation with MC-derived penetration data underlies SpekCalc [46, 47]. The exponential in (2.8) describes the self-absorption, which grows as</w:t>
+        <w:t xml:space="preserve">, emitted in all directions. The integrals are evaluated by the trapezoidal rule in photon bins of 0.05 keV; a similar formulation with MC-derived penetration data underlies SpekCalc [46, 47]. The self-absorption grows as</w:t>
       </w:r>
       <w:r>
         <w:t xml:space="preserve"> </w:t>
@@ -11361,7 +11263,7 @@
         <w:t xml:space="preserve"> </w:t>
       </w:r>
       <w:r>
-        <w:t xml:space="preserve">(8.979 keV for copper) can ionise the K shell; the vacancy is filled with the emission either of a characteristic photon, with the probability</w:t>
+        <w:t xml:space="preserve">(8.979 keV for copper) can ionise the K shell; the vacancy is filled by emitting either a characteristic photon, with the probability</w:t>
       </w:r>
       <w:r>
         <w:t xml:space="preserve"> </w:t>
@@ -11384,7 +11286,7 @@
         <w:t xml:space="preserve"> </w:t>
       </w:r>
       <w:r>
-        <w:t xml:space="preserve">(the fluorescence yield, 0.454 for copper), or of an Auger electron [73, 74]. The DM includes the four strongest lines, K</w:t>
+        <w:t xml:space="preserve">(the fluorescence yield, 0.454 for copper), or an Auger electron [73, 74]. The DM includes the four strongest lines, K</w:t>
       </w:r>
       <m:oMath>
         <m:sSub>
@@ -11543,7 +11445,7 @@
         </m:sSub>
       </m:oMath>
       <w:r>
-        <w:t xml:space="preserve">. The K-shell ionisation cross-section is given by the binary-encounter formula of Gryziński [57]:</w:t>
+        <w:t xml:space="preserve">. The K-shell ionisation cross-section is Gryziński’s binary-encounter formula [57]:</w:t>
       </w:r>
     </w:p>
     <w:tbl>
@@ -12174,7 +12076,7 @@
         <w:t xml:space="preserve"> </w:t>
       </w:r>
       <w:r>
-        <w:t xml:space="preserve">over the slowing-down gives 0.0159 K ionisations per incident 45 keV electron. Because the Gryziński formula rises too slowly near the threshold, the DM underestimates the Cu K-line intensity by about 25–43 % relative to SpekPy, whose model of K and L emission [104] relies on distorted-wave Born calculations [114], reviewed together with experimental data by Llovet et al. [115]; the deficit is largest at low tube voltages (Section 3.1). Edge and line energies, fluorescence yields and radiative rates are taken from xraylib [60] (yields compiled by Krause [74], transition energies by Deslattes et al. [116]) and are listed in Table 2.2 for the anode, window, filter materials and several high-Z radiosensitizers. Filters of Mo, Ag and Sn, with K-edges close to the Ag K-edge, strongly absorb the photons most effective for dose enhancement by silver (Section 3.4).</w:t>
+        <w:t xml:space="preserve">over the slowing-down gives 0.0159 K ionisations per incident 45 keV electron. Because the Gryziński formula rises too slowly near the threshold, the DM underestimates the Cu K-line intensity by about 26–43 % relative to SpekPy, whose model of K and L emission [104] relies on distorted-wave Born calculations [114], reviewed together with experimental data by Llovet et al. [115]; the deficit is largest at low tube voltages (Section 3.1). Edge and line energies, fluorescence yields and radiative rates are taken from xraylib [60] (transition energies of Deslattes et al. [116]) and listed in Table 2.2 for the anode, window and filter materials and several high-Z radiosensitizers. Filters of Mo, Ag and Sn, with K-edges close to that of Ag, strongly absorb the photons most effective for dose enhancement (Section 3.4).</w:t>
       </w:r>
     </w:p>
     <w:p>
@@ -13945,7 +13847,7 @@
         <w:t xml:space="preserve"> </w:t>
       </w:r>
       <w:r>
-        <w:t xml:space="preserve">is the linear attenuation coefficient of the anode at the line energy</w:t>
+        <w:t xml:space="preserve">at the line energy</w:t>
       </w:r>
       <w:r>
         <w:t xml:space="preserve"> </w:t>
@@ -13965,14 +13867,92 @@
         </m:sSub>
       </m:oMath>
       <w:r>
-        <w:t xml:space="preserve">, and the other symbols are as in (2.8); lying below the copper K-edge, the lines are weakly absorbed in the anode and cannot themselves ionise the K shell. Indirect fluorescence follows the K-shell photoabsorption of bremsstrahlung photons with</w:t>
+        <w:t xml:space="preserve"> </w:t>
+      </w:r>
+      <w:r>
+        <w:t xml:space="preserve">and the other symbols are as in (2.8); lying below the copper K-edge, the lines are weakly absorbed in the anode and cannot themselves ionise the K shell. For the indirect fluorescence, since the electrons penetrate only a few micrometres, less than the attenuation lengths above the K-edge, the bremsstrahlung is represented by an isotropic point source on the anode surface (surface-source approximation). Then</w:t>
       </w:r>
       <w:r>
         <w:t xml:space="preserve"> </w:t>
       </w:r>
       <m:oMath>
         <m:r>
-          <m:t>E</m:t>
+          <m:t>u</m:t>
+        </m:r>
+        <m:r>
+          <m:rPr>
+            <m:sty m:val="p"/>
+          </m:rPr>
+          <m:t>=</m:t>
+        </m:r>
+        <m:r>
+          <m:rPr>
+            <m:sty m:val="p"/>
+          </m:rPr>
+          <m:t>cos</m:t>
+        </m:r>
+        <m:r>
+          <m:t>ϑ</m:t>
+        </m:r>
+      </m:oMath>
+      <w:r>
+        <w:t xml:space="preserve">,</w:t>
+      </w:r>
+      <w:r>
+        <w:t xml:space="preserve"> </w:t>
+      </w:r>
+      <m:oMath>
+        <m:r>
+          <m:t>ϑ</m:t>
+        </m:r>
+      </m:oMath>
+      <w:r>
+        <w:t xml:space="preserve"> </w:t>
+      </w:r>
+      <w:r>
+        <w:t xml:space="preserve">being the angle between the photon direction and the inward normal, has the probability density 1/2 on</w:t>
+      </w:r>
+      <w:r>
+        <w:t xml:space="preserve"> </w:t>
+      </w:r>
+      <m:oMath>
+        <m:r>
+          <m:rPr>
+            <m:sty m:val="p"/>
+          </m:rPr>
+          <m:t>−</m:t>
+        </m:r>
+        <m:r>
+          <m:t>1</m:t>
+        </m:r>
+        <m:r>
+          <m:rPr>
+            <m:sty m:val="p"/>
+          </m:rPr>
+          <m:t>≤</m:t>
+        </m:r>
+        <m:r>
+          <m:t>u</m:t>
+        </m:r>
+        <m:r>
+          <m:rPr>
+            <m:sty m:val="p"/>
+          </m:rPr>
+          <m:t>≤</m:t>
+        </m:r>
+        <m:r>
+          <m:t>1</m:t>
+        </m:r>
+      </m:oMath>
+      <w:r>
+        <w:t xml:space="preserve">, and a photon with</w:t>
+      </w:r>
+      <w:r>
+        <w:t xml:space="preserve"> </w:t>
+      </w:r>
+      <m:oMath>
+        <m:r>
+          <m:t>u</m:t>
         </m:r>
         <m:r>
           <m:rPr>
@@ -13980,28 +13960,136 @@
           </m:rPr>
           <m:t>&gt;</m:t>
         </m:r>
-        <m:sSub>
-          <m:e>
-            <m:r>
-              <m:t>E</m:t>
-            </m:r>
-          </m:e>
-          <m:sub>
-            <m:r>
-              <m:t>K</m:t>
-            </m:r>
-          </m:sub>
-        </m:sSub>
+        <m:r>
+          <m:t>0</m:t>
+        </m:r>
       </m:oMath>
       <w:r>
-        <w:t xml:space="preserve">. Since the electrons penetrate only a few micrometres, less than the attenuation lengths above the K-edge, the bremsstrahlung is represented by an isotropic point source on the anode surface (surface-source approximation). Then</w:t>
+        <w:t xml:space="preserve"> </w:t>
+      </w:r>
+      <w:r>
+        <w:t xml:space="preserve">interacts at depths</w:t>
       </w:r>
       <w:r>
         <w:t xml:space="preserve"> </w:t>
       </w:r>
       <m:oMath>
         <m:r>
+          <m:t>z</m:t>
+        </m:r>
+      </m:oMath>
+      <w:r>
+        <w:t xml:space="preserve"> </w:t>
+      </w:r>
+      <w:r>
+        <w:t xml:space="preserve">to</w:t>
+      </w:r>
+      <w:r>
+        <w:t xml:space="preserve"> </w:t>
+      </w:r>
+      <m:oMath>
+        <m:r>
+          <m:t>z</m:t>
+        </m:r>
+        <m:r>
+          <m:rPr>
+            <m:sty m:val="p"/>
+          </m:rPr>
+          <m:t>+</m:t>
+        </m:r>
+        <m:r>
+          <m:rPr>
+            <m:sty m:val="p"/>
+          </m:rPr>
+          <m:t>d</m:t>
+        </m:r>
+        <m:r>
+          <m:t>z</m:t>
+        </m:r>
+      </m:oMath>
+      <w:r>
+        <w:t xml:space="preserve"> </w:t>
+      </w:r>
+      <w:r>
+        <w:t xml:space="preserve">with the probability</w:t>
+      </w:r>
+      <w:r>
+        <w:t xml:space="preserve"> </w:t>
+      </w:r>
+      <m:oMath>
+        <m:r>
+          <m:t>(</m:t>
+        </m:r>
+        <m:r>
+          <m:t>μ</m:t>
+        </m:r>
+        <m:r>
+          <m:rPr>
+            <m:sty m:val="p"/>
+          </m:rPr>
+          <m:t>/</m:t>
+        </m:r>
+        <m:r>
           <m:t>u</m:t>
+        </m:r>
+        <m:r>
+          <m:t>)</m:t>
+        </m:r>
+        <m:r>
+          <m:rPr>
+            <m:sty m:val="p"/>
+          </m:rPr>
+          <m:t>exp</m:t>
+        </m:r>
+        <m:r>
+          <m:t>(</m:t>
+        </m:r>
+        <m:r>
+          <m:rPr>
+            <m:sty m:val="p"/>
+          </m:rPr>
+          <m:t>−</m:t>
+        </m:r>
+        <m:r>
+          <m:t>μ</m:t>
+        </m:r>
+        <m:r>
+          <m:t>z</m:t>
+        </m:r>
+        <m:r>
+          <m:rPr>
+            <m:sty m:val="p"/>
+          </m:rPr>
+          <m:t>/</m:t>
+        </m:r>
+        <m:r>
+          <m:t>u</m:t>
+        </m:r>
+        <m:r>
+          <m:t>)</m:t>
+        </m:r>
+        <m:r>
+          <m:t> </m:t>
+        </m:r>
+        <m:r>
+          <m:rPr>
+            <m:sty m:val="p"/>
+          </m:rPr>
+          <m:t>d</m:t>
+        </m:r>
+        <m:r>
+          <m:t>z</m:t>
+        </m:r>
+      </m:oMath>
+      <w:r>
+        <w:t xml:space="preserve">, where</w:t>
+      </w:r>
+      <w:r>
+        <w:t xml:space="preserve"> </w:t>
+      </w:r>
+      <m:oMath>
+        <m:r>
+          <m:t>μ</m:t>
         </m:r>
         <m:r>
           <m:rPr>
@@ -14010,232 +14098,20 @@
           <m:t>=</m:t>
         </m:r>
         <m:r>
-          <m:rPr>
-            <m:sty m:val="p"/>
-          </m:rPr>
-          <m:t>cos</m:t>
-        </m:r>
-        <m:r>
-          <m:t>ϑ</m:t>
+          <m:t>μ</m:t>
+        </m:r>
+        <m:r>
+          <m:t>(</m:t>
+        </m:r>
+        <m:r>
+          <m:t>E</m:t>
+        </m:r>
+        <m:r>
+          <m:t>)</m:t>
         </m:r>
       </m:oMath>
       <w:r>
-        <w:t xml:space="preserve">, where</w:t>
-      </w:r>
-      <w:r>
-        <w:t xml:space="preserve"> </w:t>
-      </w:r>
-      <m:oMath>
-        <m:r>
-          <m:t>ϑ</m:t>
-        </m:r>
-      </m:oMath>
-      <w:r>
-        <w:t xml:space="preserve"> </w:t>
-      </w:r>
-      <w:r>
-        <w:t xml:space="preserve">is the angle between the photon direction and the inward normal, has the probability density 1/2 on</w:t>
-      </w:r>
-      <w:r>
-        <w:t xml:space="preserve"> </w:t>
-      </w:r>
-      <m:oMath>
-        <m:r>
-          <m:rPr>
-            <m:sty m:val="p"/>
-          </m:rPr>
-          <m:t>−</m:t>
-        </m:r>
-        <m:r>
-          <m:t>1</m:t>
-        </m:r>
-        <m:r>
-          <m:rPr>
-            <m:sty m:val="p"/>
-          </m:rPr>
-          <m:t>≤</m:t>
-        </m:r>
-        <m:r>
-          <m:t>u</m:t>
-        </m:r>
-        <m:r>
-          <m:rPr>
-            <m:sty m:val="p"/>
-          </m:rPr>
-          <m:t>≤</m:t>
-        </m:r>
-        <m:r>
-          <m:t>1</m:t>
-        </m:r>
-      </m:oMath>
-      <w:r>
-        <w:t xml:space="preserve">, and a photon with</w:t>
-      </w:r>
-      <w:r>
-        <w:t xml:space="preserve"> </w:t>
-      </w:r>
-      <m:oMath>
-        <m:r>
-          <m:t>u</m:t>
-        </m:r>
-        <m:r>
-          <m:rPr>
-            <m:sty m:val="p"/>
-          </m:rPr>
-          <m:t>&gt;</m:t>
-        </m:r>
-        <m:r>
-          <m:t>0</m:t>
-        </m:r>
-      </m:oMath>
-      <w:r>
-        <w:t xml:space="preserve"> </w:t>
-      </w:r>
-      <w:r>
-        <w:t xml:space="preserve">interacts between the depths</w:t>
-      </w:r>
-      <w:r>
-        <w:t xml:space="preserve"> </w:t>
-      </w:r>
-      <m:oMath>
-        <m:r>
-          <m:t>z</m:t>
-        </m:r>
-      </m:oMath>
-      <w:r>
-        <w:t xml:space="preserve"> </w:t>
-      </w:r>
-      <w:r>
-        <w:t xml:space="preserve">and</w:t>
-      </w:r>
-      <w:r>
-        <w:t xml:space="preserve"> </w:t>
-      </w:r>
-      <m:oMath>
-        <m:r>
-          <m:t>z</m:t>
-        </m:r>
-        <m:r>
-          <m:rPr>
-            <m:sty m:val="p"/>
-          </m:rPr>
-          <m:t>+</m:t>
-        </m:r>
-        <m:r>
-          <m:rPr>
-            <m:sty m:val="p"/>
-          </m:rPr>
-          <m:t>d</m:t>
-        </m:r>
-        <m:r>
-          <m:t>z</m:t>
-        </m:r>
-      </m:oMath>
-      <w:r>
-        <w:t xml:space="preserve"> </w:t>
-      </w:r>
-      <w:r>
-        <w:t xml:space="preserve">with the probability</w:t>
-      </w:r>
-      <w:r>
-        <w:t xml:space="preserve"> </w:t>
-      </w:r>
-      <m:oMath>
-        <m:r>
-          <m:t>(</m:t>
-        </m:r>
-        <m:r>
-          <m:t>μ</m:t>
-        </m:r>
-        <m:r>
-          <m:rPr>
-            <m:sty m:val="p"/>
-          </m:rPr>
-          <m:t>/</m:t>
-        </m:r>
-        <m:r>
-          <m:t>u</m:t>
-        </m:r>
-        <m:r>
-          <m:t>)</m:t>
-        </m:r>
-        <m:r>
-          <m:rPr>
-            <m:sty m:val="p"/>
-          </m:rPr>
-          <m:t>exp</m:t>
-        </m:r>
-        <m:r>
-          <m:t>(</m:t>
-        </m:r>
-        <m:r>
-          <m:rPr>
-            <m:sty m:val="p"/>
-          </m:rPr>
-          <m:t>−</m:t>
-        </m:r>
-        <m:r>
-          <m:t>μ</m:t>
-        </m:r>
-        <m:r>
-          <m:t>z</m:t>
-        </m:r>
-        <m:r>
-          <m:rPr>
-            <m:sty m:val="p"/>
-          </m:rPr>
-          <m:t>/</m:t>
-        </m:r>
-        <m:r>
-          <m:t>u</m:t>
-        </m:r>
-        <m:r>
-          <m:t>)</m:t>
-        </m:r>
-        <m:r>
-          <m:t> </m:t>
-        </m:r>
-        <m:r>
-          <m:rPr>
-            <m:sty m:val="p"/>
-          </m:rPr>
-          <m:t>d</m:t>
-        </m:r>
-        <m:r>
-          <m:t>z</m:t>
-        </m:r>
-      </m:oMath>
-      <w:r>
-        <w:t xml:space="preserve">, where</w:t>
-      </w:r>
-      <w:r>
-        <w:t xml:space="preserve"> </w:t>
-      </w:r>
-      <m:oMath>
-        <m:r>
-          <m:t>μ</m:t>
-        </m:r>
-        <m:r>
-          <m:rPr>
-            <m:sty m:val="p"/>
-          </m:rPr>
-          <m:t>=</m:t>
-        </m:r>
-        <m:r>
-          <m:t>μ</m:t>
-        </m:r>
-        <m:r>
-          <m:t>(</m:t>
-        </m:r>
-        <m:r>
-          <m:t>E</m:t>
-        </m:r>
-        <m:r>
-          <m:t>)</m:t>
-        </m:r>
-      </m:oMath>
-      <w:r>
-        <w:t xml:space="preserve">; the probability density of the interaction depth per emitted photon is therefore</w:t>
+        <w:t xml:space="preserve">, so the interaction-depth density per emitted photon is</w:t>
       </w:r>
     </w:p>
     <w:tbl>
@@ -14470,7 +14346,7 @@
         <w:pStyle w:val="BodyText"/>
       </w:pPr>
       <w:r>
-        <w:t xml:space="preserve">where the substitution</w:t>
+        <w:t xml:space="preserve">where</w:t>
       </w:r>
       <w:r>
         <w:t xml:space="preserve"> </w:t>
@@ -14502,7 +14378,7 @@
         <w:t xml:space="preserve"> </w:t>
       </w:r>
       <w:r>
-        <w:t xml:space="preserve">has been made and</w:t>
+        <w:t xml:space="preserve">was substituted and</w:t>
       </w:r>
       <w:r>
         <w:t xml:space="preserve"> </w:t>
@@ -14670,7 +14546,7 @@
         <w:t xml:space="preserve"> </w:t>
       </w:r>
       <w:r>
-        <w:t xml:space="preserve">of the interactions are K-shell photoabsorptions, where</w:t>
+        <w:t xml:space="preserve">of the interactions are K-shell photoabsorptions,</w:t>
       </w:r>
       <w:r>
         <w:t xml:space="preserve"> </w:t>
@@ -14702,44 +14578,18 @@
         <w:t xml:space="preserve"> </w:t>
       </w:r>
       <w:r>
-        <w:t xml:space="preserve">is the linear K-shell photoelectric coefficient of copper (from xraylib) and</w:t>
-      </w:r>
-      <w:r>
-        <w:t xml:space="preserve"> </w:t>
+        <w:t xml:space="preserve">being the linear K-shell photoelectric coefficient of copper (from xraylib). A line-</w:t>
       </w:r>
       <m:oMath>
         <m:r>
-          <m:t>μ</m:t>
-        </m:r>
-        <m:r>
-          <m:t>(</m:t>
-        </m:r>
-        <m:r>
-          <m:t>E</m:t>
-        </m:r>
-        <m:r>
-          <m:t>)</m:t>
+          <m:t>j</m:t>
         </m:r>
       </m:oMath>
       <w:r>
         <w:t xml:space="preserve"> </w:t>
       </w:r>
       <w:r>
-        <w:t xml:space="preserve">the total linear attenuation coefficient. Each vacancy yields a photon of line</w:t>
-      </w:r>
-      <w:r>
-        <w:t xml:space="preserve"> </w:t>
-      </w:r>
-      <m:oMath>
-        <m:r>
-          <m:t>j</m:t>
-        </m:r>
-      </m:oMath>
-      <w:r>
-        <w:t xml:space="preserve"> </w:t>
-      </w:r>
-      <w:r>
-        <w:t xml:space="preserve">with the probability</w:t>
+        <w:t xml:space="preserve">photon, emitted per vacancy with the probability</w:t>
       </w:r>
       <w:r>
         <w:t xml:space="preserve"> </w:t>
@@ -14771,7 +14621,7 @@
         </m:sSub>
       </m:oMath>
       <w:r>
-        <w:t xml:space="preserve">, attenuated on its way out along the central ray by</w:t>
+        <w:t xml:space="preserve">, is attenuated along the central ray by</w:t>
       </w:r>
       <w:r>
         <w:t xml:space="preserve"> </w:t>
@@ -15337,7 +15187,7 @@
         <w:pStyle w:val="BodyText"/>
       </w:pPr>
       <w:r>
-        <w:t xml:space="preserve">The remaining Laplace transform of the exponential integral follows by interchanging the order of integration,</w:t>
+        <w:t xml:space="preserve">Interchanging the order of integration gives the Laplace transform</w:t>
       </w:r>
       <w:r>
         <w:t xml:space="preserve"> </w:t>
@@ -16356,7 +16206,7 @@
         </m:sSubSup>
       </m:oMath>
       <w:r>
-        <w:t xml:space="preserve">. For the baseline tube the indirect contribution is 4.5 % of the Kα and 4.8 % of the Kβ intensity; it is slightly larger for Kβ because the indirect vacancies lie deeper on average and Kβ photons are attenuated less. Because this contribution is small, the surface-source approximation and the neglect of scattered photons matter little for the line intensities.</w:t>
+        <w:t xml:space="preserve">. For the baseline tube the indirect contribution is 4.5 % of the Kα and 4.8 % of the Kβ intensity; it is slightly larger for Kβ because the indirect vacancies lie deeper on average and Kβ photons are attenuated less. The surface-source approximation and the neglect of scattered photons therefore matter little for the line intensities.</w:t>
       </w:r>
     </w:p>
     <w:p>
@@ -16372,7 +16222,7 @@
         <w:pStyle w:val="FirstParagraph"/>
       </w:pPr>
       <w:r>
-        <w:t xml:space="preserve">The attenuation in the window, the added filters and the air follows the Beer–Lambert law for narrow-beam geometry (scattered photons do not reach the point of interest):</w:t>
+        <w:t xml:space="preserve">Attenuation in the window, added filters and air follows the narrow-beam Beer–Lambert law, which neglects scattered photons:</w:t>
       </w:r>
     </w:p>
     <w:tbl>
@@ -16765,7 +16615,7 @@
         <w:t xml:space="preserve"> </w:t>
       </w:r>
       <w:r>
-        <w:t xml:space="preserve">are the linear attenuation coefficients of beryllium, of the</w:t>
+        <w:t xml:space="preserve">are the linear attenuation coefficients of beryllium, the</w:t>
       </w:r>
       <w:r>
         <w:t xml:space="preserve"> </w:t>
@@ -16776,7 +16626,7 @@
         </m:r>
       </m:oMath>
       <w:r>
-        <w:t xml:space="preserve">-th added filter and of air,</w:t>
+        <w:t xml:space="preserve">-th added filter and air,</w:t>
       </w:r>
       <w:r>
         <w:t xml:space="preserve"> </w:t>
@@ -17152,7 +17002,7 @@
         <w:t xml:space="preserve"> </w:t>
       </w:r>
       <w:r>
-        <w:t xml:space="preserve">is the number of photons per unit area and per unit energy interval (cm</w:t>
+        <w:t xml:space="preserve">is the number of photons per unit area and energy interval (cm</w:t>
       </w:r>
       <w:r>
         <w:rPr>
@@ -17401,7 +17251,7 @@
         </m:r>
       </m:oMath>
       <w:r>
-        <w:t xml:space="preserve">, the output of the tube is characterised by the air kerma [62, 76]:</w:t>
+        <w:t xml:space="preserve">, the tube output is characterised by the air kerma [62, 76]:</w:t>
       </w:r>
     </w:p>
     <w:tbl>
@@ -17722,7 +17572,7 @@
         <w:t xml:space="preserve"> </w:t>
       </w:r>
       <w:r>
-        <w:t xml:space="preserve">Gy. Strictly, (2.17) gives the collision kerma, which for kilovoltage photons in air practically equals the total kerma [62]. With ICRU-44 soft tissue [61] instead of air, it gives the tissue kerma at the sample surface without backscatter, used in Section 3.6 to estimate exposure times. For the SpekPy spectra, which SpekPy filters with its own attenuation data, the SpekPy air kerma is used, whereas the half-value layers (HVL) and mean energies of all copper-anode spectra are evaluated with the same routines for both models.</w:t>
+        <w:t xml:space="preserve">Gy. Strictly, (2.17) gives the collision kerma, which for kilovoltage photons in air practically equals the total kerma [62]. With ICRU-44 soft tissue [61] instead of air, it gives the tissue kerma at the sample surface without backscatter, used in Section 3.6 to estimate exposure times. For the SpekPy spectra, filtered with SpekPy’s own attenuation data, the SpekPy air kerma is used, whereas the half-value layers (HVL) and mean energies of all copper-anode spectra are computed identically for both models.</w:t>
       </w:r>
     </w:p>
     <w:p>
@@ -17730,7 +17580,7 @@
         <w:pStyle w:val="BodyText"/>
       </w:pPr>
       <w:r>
-        <w:t xml:space="preserve">Kilovoltage beam quality is specified primarily by the first HVL, the thickness of a reference absorber (usually aluminium or copper) that halves the narrow-beam air kerma [14, 17, 70, 111]. In aluminium, HVL1 =</w:t>
+        <w:t xml:space="preserve">Kilovoltage beam quality is specified primarily by the first HVL, the thickness of a reference absorber (usually aluminium or copper) that halves the narrow-beam air kerma [14, 70, 111]. In aluminium, HVL1 =</w:t>
       </w:r>
       <w:r>
         <w:t xml:space="preserve"> </w:t>
@@ -18743,7 +18593,7 @@
         <w:t xml:space="preserve"> </w:t>
       </w:r>
       <w:r>
-        <w:t xml:space="preserve">= 25.514 keV, and the corresponding energy-fluence fraction describe the part of the spectrum in which silver absorbs most strongly relative to tissue (Sections 1.2 and 1.3). Like the DEF, the HVLs and the mean energy depend only on the shape of the spectrum and are insensitive to errors in the absolute output.</w:t>
+        <w:t xml:space="preserve">= 25.514 keV, and the corresponding energy-fluence fraction describe the part of the spectrum in which silver absorbs most strongly relative to tissue (Sections 1.2 and 1.3). Like the DEF, the HVLs and the mean energy depend only on the spectral shape, not on the absolute output.</w:t>
       </w:r>
     </w:p>
     <w:p>
@@ -18759,7 +18609,7 @@
         <w:pStyle w:val="FirstParagraph"/>
       </w:pPr>
       <w:r>
-        <w:t xml:space="preserve">The physical radio-enhancement is quantified by the DEF, the ratio of the absorbed doses at one point with and without silver under identical irradiation:</w:t>
+        <w:t xml:space="preserve">The physical radio-enhancement is quantified by the DEF, the ratio of absorbed doses at a point with and without silver under identical irradiation:</w:t>
       </w:r>
     </w:p>
     <w:tbl>
@@ -18966,7 +18816,7 @@
         <w:t xml:space="preserve"> </w:t>
       </w:r>
       <w:r>
-        <w:t xml:space="preserve">are the absorbed doses in the silver-loaded and the unloaded (reference) tissue. This macroscopic DEF assumes a homogeneous silver distribution and doses averaged over volumes much larger than a cell and the electron ranges; it describes only the physical stage of radio-enhancement.</w:t>
+        <w:t xml:space="preserve">are the absorbed doses in silver-loaded and unloaded (reference) tissue. This macroscopic DEF assumes a homogeneous silver distribution and doses averaged over volumes much larger than cells and electron ranges.</w:t>
       </w:r>
     </w:p>
     <w:p>
@@ -18974,7 +18824,7 @@
         <w:pStyle w:val="BodyText"/>
       </w:pPr>
       <w:r>
-        <w:t xml:space="preserve">Below 50 keV the secondary electrons have sub-millimetre ranges in tissue (Section 1.2), so charged-particle equilibrium (CPE) holds except near interfaces [62, 71] and the dose equals the collision kerma (1.4), practically the kerma, since radiative losses in low-Z media are negligible [76]. By analogy with (2.17),</w:t>
+        <w:t xml:space="preserve">Below 50 keV secondary electrons have sub-millimetre ranges in tissue, so charged-particle equilibrium (CPE) holds except near interfaces [62, 71] and the dose equals the collision kerma (1.4), practically the kerma in low-Z media [76]. By analogy with (2.17),</w:t>
       </w:r>
     </w:p>
     <w:tbl>
@@ -19332,7 +19182,7 @@
         </m:r>
       </m:oMath>
       <w:r>
-        <w:t xml:space="preserve">) are assumed to escape, which Section 2.7 tests. For a silver mass fraction</w:t>
+        <w:t xml:space="preserve">) are assumed to escape. For a silver mass fraction</w:t>
       </w:r>
       <w:r>
         <w:t xml:space="preserve"> </w:t>
@@ -19626,7 +19476,7 @@
         <w:t xml:space="preserve"> </w:t>
       </w:r>
       <w:r>
-        <w:t xml:space="preserve">and Ag denote tissue and silver; the same rule yields the coefficients of tissue, water and air from elemental data (Section 2.8). Mass fractions from 0.1 to 2 % are considered. Substituting (2.21) and (2.22) into (2.20) gives the DEF at the surface:</w:t>
+        <w:t xml:space="preserve">and Ag denote tissue and silver; mass fractions of 0.1–2 % are considered. Substituting (2.21) and (2.22) into (2.20) gives the surface DEF:</w:t>
       </w:r>
     </w:p>
     <w:tbl>
@@ -19965,37 +19815,7 @@
         <w:pStyle w:val="BodyText"/>
       </w:pPr>
       <w:r>
-        <w:t xml:space="preserve">The fluence normalisation cancels, so the DEF depends only on the spectral shape, and DM spectra are usable despite their less accurate absolute output (Section 3.1);</w:t>
-      </w:r>
-      <w:r>
-        <w:t xml:space="preserve"> </w:t>
-      </w:r>
-      <w:r>
-        <w:rPr>
-          <w:rStyle w:val="VerbatimChar"/>
-        </w:rPr>
-        <w:t xml:space="preserve">def_factor</w:t>
-      </w:r>
-      <w:r>
-        <w:t xml:space="preserve"> </w:t>
-      </w:r>
-      <w:r>
-        <w:t xml:space="preserve">in</w:t>
-      </w:r>
-      <w:r>
-        <w:t xml:space="preserve"> </w:t>
-      </w:r>
-      <w:r>
-        <w:rPr>
-          <w:rStyle w:val="VerbatimChar"/>
-        </w:rPr>
-        <w:t xml:space="preserve">xspec.py</w:t>
-      </w:r>
-      <w:r>
-        <w:t xml:space="preserve"> </w:t>
-      </w:r>
-      <w:r>
-        <w:t xml:space="preserve">sums over the 0.05 keV bins. As the numerator is linear in</w:t>
+        <w:t xml:space="preserve">The fluence normalisation cancels, so the DEF depends only on the spectral shape, and DM spectra are usable despite their less accurate absolute output (Section 3.1). As the numerator is linear in</w:t>
       </w:r>
       <w:r>
         <w:t xml:space="preserve"> </w:t>
@@ -20738,10 +20558,7 @@
         </m:r>
       </m:oMath>
       <w:r>
-        <w:t xml:space="preserve"> </w:t>
-      </w:r>
-      <w:r>
-        <w:t xml:space="preserve">is the dose-weighted mean of</w:t>
+        <w:t xml:space="preserve">, the dose-weighted mean of</w:t>
       </w:r>
       <w:r>
         <w:t xml:space="preserve"> </w:t>
@@ -20761,10 +20578,30 @@
         </m:r>
       </m:oMath>
       <w:r>
-        <w:t xml:space="preserve"> </w:t>
-      </w:r>
-      <w:r>
-        <w:t xml:space="preserve">and the slope</w:t>
+        <w:t xml:space="preserve">, depends on the spectrum alone. For ICRU-44 tissue,</w:t>
+      </w:r>
+      <w:r>
+        <w:t xml:space="preserve"> </w:t>
+      </w:r>
+      <m:oMath>
+        <m:r>
+          <m:t>R</m:t>
+        </m:r>
+        <m:r>
+          <m:t>(</m:t>
+        </m:r>
+        <m:r>
+          <m:t>E</m:t>
+        </m:r>
+        <m:r>
+          <m:t>)</m:t>
+        </m:r>
+      </m:oMath>
+      <w:r>
+        <w:t xml:space="preserve"> </w:t>
+      </w:r>
+      <w:r>
+        <w:t xml:space="preserve">jumps at the Ag K-edge (25.514 keV) from about 32 to about 76 and reaches about 139 at 40–45 keV. Shifting the dose spectrum above the K-edge therefore raises</w:t>
       </w:r>
       <w:r>
         <w:t xml:space="preserve"> </w:t>
@@ -20785,44 +20622,12 @@
           </m:rPr>
           <m:t>⟩</m:t>
         </m:r>
-        <m:r>
-          <m:rPr>
-            <m:sty m:val="p"/>
-          </m:rPr>
-          <m:t>−</m:t>
-        </m:r>
-        <m:r>
-          <m:t>1</m:t>
-        </m:r>
       </m:oMath>
       <w:r>
         <w:t xml:space="preserve"> </w:t>
       </w:r>
       <w:r>
-        <w:t xml:space="preserve">depends on the spectrum alone. For ICRU-44 tissue,</w:t>
-      </w:r>
-      <w:r>
-        <w:t xml:space="preserve"> </w:t>
-      </w:r>
-      <m:oMath>
-        <m:r>
-          <m:t>R</m:t>
-        </m:r>
-        <m:r>
-          <m:t>(</m:t>
-        </m:r>
-        <m:r>
-          <m:t>E</m:t>
-        </m:r>
-        <m:r>
-          <m:t>)</m:t>
-        </m:r>
-      </m:oMath>
-      <w:r>
-        <w:t xml:space="preserve"> </w:t>
-      </w:r>
-      <w:r>
-        <w:t xml:space="preserve">jumps at the Ag K-edge (25.514 keV) from about 32 to about 76 and reaches about 139 at 40–45 keV (Section 1.2). Shifting the dose spectrum above the K-edge therefore raises the slope, the basis of the filter optimisation in Chapter 3.</w:t>
+        <w:t xml:space="preserve">and the slope, the basis of the filter optimisation in Chapter 3.</w:t>
       </w:r>
     </w:p>
     <w:p>
@@ -20830,7 +20635,7 @@
         <w:pStyle w:val="BodyText"/>
       </w:pPr>
       <w:r>
-        <w:t xml:space="preserve">With depth the spectrum hardens; where silver is present only locally at depth</w:t>
+        <w:t xml:space="preserve">Where silver is present only locally at depth</w:t>
       </w:r>
       <w:r>
         <w:t xml:space="preserve"> </w:t>
@@ -21391,7 +21196,7 @@
         <w:t xml:space="preserve"> </w:t>
       </w:r>
       <w:r>
-        <w:t xml:space="preserve">is the linear attenuation coefficient of tissue of density</w:t>
+        <w:t xml:space="preserve">the linear attenuation coefficient of tissue of density</w:t>
       </w:r>
       <w:r>
         <w:t xml:space="preserve"> </w:t>
@@ -21414,7 +21219,7 @@
         <w:t xml:space="preserve"> </w:t>
       </w:r>
       <w:r>
-        <w:t xml:space="preserve">= 1.06 g/cm³; scatter and the inverse-square fall-off are neglected, and the denominator normalised to</w:t>
+        <w:t xml:space="preserve">= 1.06 g/cm³; scatter and inverse-square fall-off are neglected, and the denominator normalised to</w:t>
       </w:r>
       <w:r>
         <w:t xml:space="preserve"> </w:t>
@@ -21460,7 +21265,7 @@
         <w:t xml:space="preserve"> </w:t>
       </w:r>
       <w:r>
-        <w:t xml:space="preserve">is small, so the DEF increases with depth. Silver filling the whole region above the point also attenuates the beam, most strongly just above the K-edge, where its</w:t>
+        <w:t xml:space="preserve">is small, so the DEF increases with depth. Silver filling the region above the point also attenuates the beam, most strongly just above the K-edge, where its</w:t>
       </w:r>
       <w:r>
         <w:t xml:space="preserve"> </w:t>
@@ -22171,7 +21976,7 @@
         </m:sSub>
       </m:oMath>
       <w:r>
-        <w:t xml:space="preserve">) and the denominator refers to silver-free tissue. The added attenuation removes preferentially the most effective photons, so</w:t>
+        <w:t xml:space="preserve">). The added attenuation preferentially removes the most effective photons, so</w:t>
       </w:r>
       <w:r>
         <w:t xml:space="preserve"> </w:t>
@@ -22263,7 +22068,7 @@
         <w:pStyle w:val="BodyText"/>
       </w:pPr>
       <w:r>
-        <w:t xml:space="preserve">The reference medium is ICRU-44 soft tissue (H 10.2, C 14.3, N 3.4, O 70.8, Na 0.2, P 0.3, S 0.3, Cl 0.2 and K 0.3 % by mass; 1.06 g/cm³) [61], with water and the ICRU four-component tissue as alternatives; the choice affects the DEF (Section 3.10) and must be reported. On the subcellular scale, not resolved by the DEF, short-range photo- and Auger electrons deposit much of their energy close to nanoparticles [30], which can produce biological effects beyond the macroscopic enhancement (local effect model) [31] depending on photon energy and particle size, concentration and location [97]. The DEF calculated here is thus the physical baseline for identifying chemical, biological and nanoscale contributions.</w:t>
+        <w:t xml:space="preserve">The reference medium is ICRU-44 soft tissue (H 10.2, C 14.3, N 3.4, O 70.8, Na 0.2, P 0.3, S 0.3, Cl 0.2 and K 0.3 % by mass; 1.06 g/cm³) [61], with water and the ICRU four-component tissue as alternatives; the choice affects the DEF (Section 3.10) and must be reported. On the subcellular scale, short-range photo- and Auger electrons deposit much of their energy close to nanoparticles [30], which can produce biological effects beyond the macroscopic enhancement (local effect model) [31] depending on photon energy and particle size, concentration and location [97]. The calculated DEF is thus the physical baseline for identifying chemical, biological and nanoscale contributions.</w:t>
       </w:r>
     </w:p>
     <w:p>
@@ -22279,7 +22084,7 @@
         <w:pStyle w:val="FirstParagraph"/>
       </w:pPr>
       <w:r>
-        <w:t xml:space="preserve">The escape of the Ag K-fluorescence and the neglect of scatter assumed in the analytical model are tested with an independent MC code (</w:t>
+        <w:t xml:space="preserve">The escape of Ag K-fluorescence and the neglect of scatter in the analytical model are tested with an independent MC code (</w:t>
       </w:r>
       <w:r>
         <w:rPr>
@@ -22415,7 +22220,7 @@
         </m:r>
       </m:oMath>
       <w:r>
-        <w:t xml:space="preserve">; energy is scored in 0.25 mm bins. The SpekPy spectra of the 45 kV tube (θ = 12°, 0.5 mm Be, 10 cm air), unfiltered and with 1 mm Al, are sampled by inversion of the cumulative distribution. Free paths are sampled by Woodcock (delta) tracking [63, 117] with the majorant</w:t>
+        <w:t xml:space="preserve">. The SpekPy spectra of the 45 kV tube (θ = 12°, 0.5 mm Be, 10 cm air), unfiltered and with 1 mm Al, are sampled by inverting the cumulative distribution. Free paths are sampled by Woodcock (delta) tracking [63, 117] with the majorant</w:t>
       </w:r>
       <w:r>
         <w:t xml:space="preserve"> </w:t>
@@ -22773,7 +22578,7 @@
         <w:t xml:space="preserve"> </w:t>
       </w:r>
       <w:r>
-        <w:t xml:space="preserve">is a random number uniform in (0, 1); at the new depth</w:t>
+        <w:t xml:space="preserve">a random number uniform in (0, 1); at the new depth</w:t>
       </w:r>
       <w:r>
         <w:t xml:space="preserve"> </w:t>
@@ -22802,7 +22607,7 @@
         <w:t xml:space="preserve"> </w:t>
       </w:r>
       <w:r>
-        <w:t xml:space="preserve">the collision is real with the probability</w:t>
+        <w:t xml:space="preserve">the collision is real with probability</w:t>
       </w:r>
     </w:p>
     <w:tbl>
@@ -23139,7 +22944,7 @@
         <w:t xml:space="preserve"> </w:t>
       </w:r>
       <w:r>
-        <w:t xml:space="preserve">is sampled from tables of the Klein–Nishina cross-section times the incoherent scattering function and of the Thomson cross-section times the squared atomic form factor [64] for tissue, as silver contributes only a few per cent of the scattering. After incoherent scattering</w:t>
+        <w:t xml:space="preserve">is sampled from tissue tables of the Klein–Nishina cross-section times the incoherent scattering function and of the Thomson cross-section times the squared atomic form factor [64]; silver contributes only a few per cent of scattering. After incoherent scattering</w:t>
       </w:r>
     </w:p>
     <w:tbl>
@@ -23372,36 +23177,7 @@
         <w:t xml:space="preserve"> </w:t>
       </w:r>
       <w:r>
-        <w:t xml:space="preserve">= 510.999 keV is the electron rest energy;</w:t>
-      </w:r>
-      <w:r>
-        <w:t xml:space="preserve"> </w:t>
-      </w:r>
-      <m:oMath>
-        <m:r>
-          <m:t>E</m:t>
-        </m:r>
-        <m:r>
-          <m:rPr>
-            <m:sty m:val="p"/>
-          </m:rPr>
-          <m:t>−</m:t>
-        </m:r>
-        <m:r>
-          <m:t>E</m:t>
-        </m:r>
-        <m:r>
-          <m:rPr>
-            <m:sty m:val="p"/>
-          </m:rPr>
-          <m:t>′</m:t>
-        </m:r>
-      </m:oMath>
-      <w:r>
-        <w:t xml:space="preserve"> </w:t>
-      </w:r>
-      <w:r>
-        <w:t xml:space="preserve">is deposited locally, and the direction cosine becomes</w:t>
+        <w:t xml:space="preserve">= 510.999 keV is the electron rest energy; the direction cosine becomes</w:t>
       </w:r>
       <w:r>
         <w:t xml:space="preserve"> </w:t>
@@ -23877,7 +23653,7 @@
         <w:t xml:space="preserve"> </w:t>
       </w:r>
       <w:r>
-        <w:t xml:space="preserve">= 0.25 mm. The MC DEF is the dose ratio for</w:t>
+        <w:t xml:space="preserve">= 0.25 mm the bin width. The MC DEF is the dose ratio for</w:t>
       </w:r>
       <w:r>
         <w:t xml:space="preserve"> </w:t>
@@ -23943,7 +23719,7 @@
         <w:t xml:space="preserve"> </w:t>
       </w:r>
       <w:r>
-        <w:t xml:space="preserve">histories in five batches whose spread gives the standard error; the analytical reference is (2.27) applied to the buried layer. Two checks preceded the runs: for a broad 30 keV beam the ratio of the surface dose to the primary kerma is 1.31 owing to backscatter, which depends on field size and source distance [118], and the energy-transfer coefficient from the xraylib data agrees with the NIST</w:t>
+        <w:t xml:space="preserve">histories in five batches whose spread gives the standard error; the analytical reference is (2.27) applied to the buried layer. Two checks preceded the runs: for a broad 30 keV beam the ratio of surface dose to primary kerma is 1.31 owing to backscatter, which depends on field size and source distance [118], and the energy-transfer coefficient from xraylib data agrees with the NIST</w:t>
       </w:r>
       <w:r>
         <w:t xml:space="preserve"> </w:t>
@@ -24067,7 +23843,7 @@
         <w:t xml:space="preserve"> </w:t>
       </w:r>
       <w:r>
-        <w:t xml:space="preserve">interpolates them log–log within each segment between absorption edges, where the coefficients follow approximate power laws. Elemental</w:t>
+        <w:t xml:space="preserve">interpolates them log–log between absorption edges, where the coefficients follow approximate power laws. Elemental</w:t>
       </w:r>
       <w:r>
         <w:t xml:space="preserve"> </w:t>
@@ -24165,7 +23941,7 @@
         <w:t xml:space="preserve"> </w:t>
       </w:r>
       <w:r>
-        <w:t xml:space="preserve">for light elements at 15–45 keV: for oxygen at 30 keV 0.108 instead of 0.173 cm²/g (−37 %) and for carbon 0.0515 instead of 0.0661 cm²/g, whereas for silver it agrees with NIST (16.58 versus 16.60 cm²/g). For tissue, composed mainly of O, C and H, it would underestimate the denominator of (2.23) and overestimate the DEF: 1.72 instead of 1.48 for 1 % Ag with 1 mm Al. The xraylib cross-sections are unaffected (Section 2.7), but</w:t>
+        <w:t xml:space="preserve">for light elements at 15–45 keV: for oxygen at 30 keV 0.108 instead of 0.173 cm²/g (−37 %) and for carbon 0.0515 instead of 0.0661 cm²/g, whereas for silver it agrees with NIST (16.58 versus 16.60 cm²/g). For tissue, composed mainly of O, C and H, it would underestimate the denominator of (2.23) and overestimate the DEF: 1.62 instead of 1.48 for 1 % Ag with 1 mm Al. The xraylib cross-sections are unaffected (Section 2.7), but</w:t>
       </w:r>
       <w:r>
         <w:t xml:space="preserve"> </w:t>
@@ -24203,7 +23979,7 @@
         <w:t xml:space="preserve"> </w:t>
       </w:r>
       <w:r>
-        <w:t xml:space="preserve">physics model, copper anodes at 10–50 kV), validated against measured spectra and HVLs [51]; its spectra validate the DM and are the principal DEF input, with DM spectra used for comparison. The code is written in Python 3.13 with NumPy [65], SciPy [66] (minimisation and root-finding) and Matplotlib [67].</w:t>
+        <w:t xml:space="preserve">physics model, copper anodes at 10–50 kV), validated against measured spectra and HVLs [51]; its spectra validate the DM and are the principal DEF input. The code uses Python 3.13 with NumPy [65], SciPy [66] (minimisation and root-finding) and Matplotlib [67].</w:t>
       </w:r>
     </w:p>
     <w:p>
@@ -24225,7 +24001,7 @@
         <w:t xml:space="preserve"> </w:t>
       </w:r>
       <w:r>
-        <w:t xml:space="preserve">in (2.4), minimises the root-mean-square deviation between the DM and SpekPy bremsstrahlung spectra (lines excluded) at 45 kV, θ = 12° and 0.5 mm Be, normalised to unit area above 3 keV and taken relative to the reference maximum;</w:t>
+        <w:t xml:space="preserve">in (2.4), minimises the root-mean-square deviation between the DM and SpekPy bremsstrahlung spectra at 45 kV, θ = 12° and 0.5 mm Be, normalised to unit area above 3 keV and taken relative to the reference maximum;</w:t>
       </w:r>
       <w:r>
         <w:t xml:space="preserve"> </w:t>
@@ -24239,7 +24015,7 @@
         <w:t xml:space="preserve"> </w:t>
       </w:r>
       <w:r>
-        <w:t xml:space="preserve">is searched in 0.25–0.7 and rounded to two decimals, all other configurations being predictions. The validation comprises (i) component checks, e.g. of the stopping power against NIST ESTAR [69] (Section 2.2); (ii) comparison with SpekPy for 25–50 kV and anode angles of 6–30°, with and without 1 mm Al, plus a tungsten-anode check; (iii) DEF comparison for DM and SpekPy spectra; (iv) MC verification; and (v) DEF sensitivity analysis.</w:t>
+        <w:t xml:space="preserve">is searched in 0.25–0.7 and rounded to two decimals, all other configurations being predictions. The validation comprises component checks, e.g. of the stopping power against NIST ESTAR [69] (Section 2.2); comparison with SpekPy for 25–50 kV and anode angles of 6–30°, with and without 1 mm Al, plus a tungsten-anode check; DEF comparison for DM and SpekPy spectra; MC verification; and a DEF sensitivity analysis.</w:t>
       </w:r>
     </w:p>
     <w:p>
@@ -24255,7 +24031,7 @@
         <w:pStyle w:val="FirstParagraph"/>
       </w:pPr>
       <w:r>
-        <w:t xml:space="preserve">A 45 kV copper-anode tube emits very intense low-energy x-rays: the unfiltered air kerma at 10 cm is 383 mGy per mAs (Chapter 3), i.e. 15.3 Gy/s at 40 mA, and the tissue surface receives 2 Gy in 0.12 s, so accidental hand exposure causes severe local injuries within seconds. The primary beam, the scatter from the sample and holder, and the housing leakage must all be controlled. Protection follows the principles of justification, optimisation (as low as reasonably achievable, ALARA) and dose limitation of the International Commission on Radiological Protection [119], implemented in the Basic Safety Standards of the International Atomic Energy Agency [120] and, in the Republic of Uzbekistan, in the Law</w:t>
+        <w:t xml:space="preserve">A 45 kV copper-anode tube emits very intense low-energy x-rays: the unfiltered air kerma at 10 cm is 383 mGy per mAs, i.e. 15.3 Gy/s at 40 mA, and the tissue surface receives 2 Gy in 0.12 s, so accidental hand exposure causes severe local injuries within seconds. The primary beam, scatter from the sample and holder, and housing leakage must be controlled. Protection follows the principles of justification, optimisation (as low as reasonably achievable, ALARA) and dose limitation of the International Commission on Radiological Protection [119], implemented in the Basic Safety Standards of the International Atomic Energy Agency [120] and, in Uzbekistan, in the Law</w:t>
       </w:r>
       <w:r>
         <w:t xml:space="preserve"> </w:t>
@@ -24281,7 +24057,7 @@
         <w:pStyle w:val="BodyText"/>
       </w:pPr>
       <w:r>
-        <w:t xml:space="preserve">The main measures are technical: a shielded housing, a closed enclosure whose door interlocks switch off the high voltage or close the shutter, warning lights, and fixed holders and collimators that keep the hands out of the beam. Staff training, local rules, personal dosimetry and dose-rate surveys, particularly after maintenance, complement them. The high-voltage generator is a further hazard, and the beryllium window must not be touched, since beryllium compounds are toxic.</w:t>
+        <w:t xml:space="preserve">The main measures are technical: a shielded housing, an enclosure whose door interlocks switch off the high voltage or close the shutter, warning lights, and fixed holders and collimators that keep hands out of the beam. Staff training, local rules, personal dosimetry and dose-rate surveys, particularly after maintenance, complement them. The high-voltage generator is a further hazard, and the beryllium window must not be touched (beryllium compounds are toxic).</w:t>
       </w:r>
     </w:p>
     <w:p>
@@ -24289,7 +24065,7 @@
         <w:pStyle w:val="BodyText"/>
       </w:pPr>
       <w:r>
-        <w:t xml:space="preserve">Filtration also serves safety. The filters that markedly raise the DEF (1 mm Al to 0.2 mm Cu) lower the air kerma rate 120–1300-fold; with 1 mm Al the surface tissue kerma rate at 40 mA falls from 16.5 to 0.137 Gy/s and the time for 2 Gy rises from 0.12 to 14.6 s, controllable by a timer or shutter. The removed soft component would be absorbed superficially: the relative primary dose at 10 mm is 0.009 of the surface value without a filter and 0.44 with 1 mm Al. The DEF-maximising filter, whose beam can be specified by its HVL [14], thus also reduces the unnecessary skin dose in the sense of ALARA.</w:t>
+        <w:t xml:space="preserve">Filtration also serves safety: the filters that markedly raise the DEF (1 mm Al to 0.2 mm Cu) lower the air kerma rate 120–1300-fold; with 1 mm Al the surface tissue kerma rate at 40 mA falls from 16.5 to 0.137 Gy/s and the time for 2 Gy rises from 0.12 to 14.6 s, controllable by a timer or shutter. The removed soft component would be absorbed superficially: the relative primary dose at 10 mm is 0.009 of the surface value without a filter and 0.44 with 1 mm Al. The DEF-maximising filter, whose beam can be specified by its HVL [14], thus also reduces unnecessary skin dose, in line with ALARA.</w:t>
       </w:r>
     </w:p>
     <w:p>
@@ -24309,7 +24085,7 @@
         <w:pStyle w:val="Compact"/>
       </w:pPr>
       <w:r>
-        <w:t xml:space="preserve">A semi-analytical thick-target model (DM) of a reflection copper-anode x-ray tube has been formulated, with Bethe electron slowing-down, non-relativistic Bethe–Heitler bremsstrahlung with the Elwert factor, direct and bremsstrahlung-induced K radiation, anode self-absorption, attenuation in window, air and filters, and one adjustable parameter (the electron depth factor</w:t>
+        <w:t xml:space="preserve">A semi-analytical thick-target model (DM) of a reflection copper-anode x-ray tube has been formulated: Bethe electron slowing-down, non-relativistic Bethe–Heitler bremsstrahlung with the Elwert factor, direct and bremsstrahlung-induced K radiation, anode self-absorption, attenuation in window, air and filters, and one adjustable parameter, the electron depth factor</w:t>
       </w:r>
       <w:r>
         <w:t xml:space="preserve"> </w:t>
@@ -24320,7 +24096,7 @@
         </m:r>
       </m:oMath>
       <w:r>
-        <w:t xml:space="preserve">).</w:t>
+        <w:t xml:space="preserve">.</w:t>
       </w:r>
     </w:p>
     <w:p>
@@ -24332,7 +24108,7 @@
         <w:pStyle w:val="Compact"/>
       </w:pPr>
       <w:r>
-        <w:t xml:space="preserve">Beam-quality parameters (HVLs, homogeneity coefficient, mean and effective energies) and air kerma are calculated identically for DM and SpekPy spectra.</w:t>
+        <w:t xml:space="preserve">Air kerma and beam-quality parameters (HVLs, homogeneity coefficient, mean and effective energies) are calculated from the fluence spectra, the latter identically for DM and SpekPy.</w:t>
       </w:r>
     </w:p>
     <w:p>
@@ -24425,7 +24201,7 @@
         </m:r>
       </m:oMath>
       <w:r>
-        <w:t xml:space="preserve">, with a slope set by the dose spectrum above the Ag K-edge, while the depth and loaded-slab forms describe beam hardening and self-shielding.</w:t>
+        <w:t xml:space="preserve">, with a slope set by the dose spectrum above the Ag K-edge; the depth and loaded-slab forms describe beam hardening and self-shielding.</w:t>
       </w:r>
     </w:p>
     <w:p>
@@ -24499,7 +24275,7 @@
         <w:t xml:space="preserve"> </w:t>
       </w:r>
       <w:r>
-        <w:t xml:space="preserve">underestimates them for light elements by up to 37 %, which would overestimate the DEF (1.72 instead of 1.48).</w:t>
+        <w:t xml:space="preserve">underestimates them for light elements by up to 56 % (oxygen by 37 %), which would overestimate the DEF (1.62 instead of 1.48).</w:t>
       </w:r>
     </w:p>
     <w:p>
@@ -24527,7 +24303,7 @@
         <w:pStyle w:val="FirstParagraph"/>
       </w:pPr>
       <w:r>
-        <w:t xml:space="preserve">The results were obtained with the developed model (DM) of Chapter 2 and with the reference code SpekPy v2.5.4 [15, 58]. Unless stated otherwise, the baseline conditions of Table 2.1 apply: a constant potential of 45 kV, an anode angle θ = 12°, a 0.5 mm Be window, 10 cm of air between the focal spot and the sample, and 0.05 keV energy bins. The dose enhancement factor (DEF) is calculated in the kerma approximation, which assumes charged-particle equilibrium (CPE), for the ICRU-44 soft tissue of the International Commission on Radiation Units and Measurements (ICRU) [61] with the mass energy-absorption coefficients of the National Institute of Standards and Technology (NIST) [59];</w:t>
+        <w:t xml:space="preserve">The results were obtained with the developed model (DM) of Chapter 2 and the reference code SpekPy v2.5.4 [15, 58]. Unless stated otherwise, the baseline conditions of Table 2.1 apply: constant potential 45 kV, anode angle θ = 12°, 0.5 mm Be window, 10 cm of air between focal spot and sample, and 0.05 keV energy bins. The dose enhancement factor (DEF) is calculated in the kerma approximation, which assumes charged-particle equilibrium (CPE), for ICRU-44 soft tissue of the International Commission on Radiation Units and Measurements (ICRU) [61] with mass energy-absorption coefficients of the National Institute of Standards and Technology (NIST) [59];</w:t>
       </w:r>
       <w:r>
         <w:t xml:space="preserve"> </w:t>
@@ -24566,7 +24342,7 @@
         <w:pStyle w:val="FirstParagraph"/>
       </w:pPr>
       <w:r>
-        <w:t xml:space="preserve">No measured spectrum of the particular tube was available, so the DM was validated against SpekPy v2, a deterministic physics-based code that supports copper anodes at 10–50 kV [15] and has been validated against measured spectra and half-value layers (HVL) [51, 106]. The only adjustable parameter of the DM, the electron depth factor</w:t>
+        <w:t xml:space="preserve">With no measured spectrum of this tube available, the DM was validated against SpekPy v2, a deterministic physics-based code that supports copper anodes at 10–50 kV [15] and has been validated against measured spectra and half-value layers (HVL) [51, 106]. The only adjustable parameter of the DM, the electron depth factor</w:t>
       </w:r>
       <w:r>
         <w:t xml:space="preserve"> </w:t>
@@ -24890,7 +24666,7 @@
         <w:t xml:space="preserve"> </w:t>
       </w:r>
       <w:r>
-        <w:t xml:space="preserve">are the bremsstrahlung fluences of the DM and of SpekPy in energy bin</w:t>
+        <w:t xml:space="preserve">are the bremsstrahlung fluences of the DM and SpekPy in energy bin</w:t>
       </w:r>
       <w:r>
         <w:t xml:space="preserve"> </w:t>
@@ -24947,7 +24723,7 @@
         <w:t xml:space="preserve"> </w:t>
       </w:r>
       <w:r>
-        <w:t xml:space="preserve">keV, and the factor</w:t>
+        <w:t xml:space="preserve">keV, and</w:t>
       </w:r>
       <w:r>
         <w:t xml:space="preserve"> </w:t>
@@ -24994,7 +24770,21 @@
         <w:t xml:space="preserve"> </w:t>
       </w:r>
       <w:r>
-        <w:t xml:space="preserve">expresses the deviation as a fraction of the spectrum maximum. The fit gave</w:t>
+        <w:t xml:space="preserve">expresses</w:t>
+      </w:r>
+      <w:r>
+        <w:t xml:space="preserve"> </w:t>
+      </w:r>
+      <m:oMath>
+        <m:r>
+          <m:t>δ</m:t>
+        </m:r>
+      </m:oMath>
+      <w:r>
+        <w:t xml:space="preserve"> </w:t>
+      </w:r>
+      <w:r>
+        <w:t xml:space="preserve">as a fraction of the spectrum maximum. The fit gave</w:t>
       </w:r>
       <w:r>
         <w:t xml:space="preserve"> </w:t>
@@ -25040,14 +24830,11 @@
         <w:t xml:space="preserve"> </w:t>
       </w:r>
       <w:r>
-        <w:t xml:space="preserve">%, against</w:t>
-      </w:r>
-      <w:r>
-        <w:t xml:space="preserve"> </w:t>
+        <w:t xml:space="preserve">%, against 8.47 % for straight-line penetration (</w:t>
       </w:r>
       <m:oMath>
         <m:r>
-          <m:t>δ</m:t>
+          <m:t>η</m:t>
         </m:r>
         <m:r>
           <m:rPr>
@@ -25056,31 +24843,11 @@
           <m:t>=</m:t>
         </m:r>
         <m:r>
-          <m:t>8.47</m:t>
+          <m:t>1</m:t>
         </m:r>
       </m:oMath>
       <w:r>
-        <w:t xml:space="preserve"> </w:t>
-      </w:r>
-      <w:r>
-        <w:t xml:space="preserve">% for straight-line penetration (</w:t>
-      </w:r>
-      <m:oMath>
-        <m:r>
-          <m:t>η</m:t>
-        </m:r>
-        <m:r>
-          <m:rPr>
-            <m:sty m:val="p"/>
-          </m:rPr>
-          <m:t>=</m:t>
-        </m:r>
-        <m:r>
-          <m:t>1</m:t>
-        </m:r>
-      </m:oMath>
-      <w:r>
-        <w:t xml:space="preserve">). Because of multiple elastic scattering, photons are thus produced at less than half the depth of a straight path in the continuous slowing-down approximation (CSDA), 2.536 µm instead of 6.481 µm for 45 keV electrons in copper, and the soft bremsstrahlung is less self-absorbed in the anode;</w:t>
+        <w:t xml:space="preserve">). Because of multiple elastic scattering, photons are thus produced at less than half the depth of a straight path in the continuous slowing-down approximation (CSDA), 2.536 µm instead of 6.339 µm (CSDA range 6.481 µm × cos 12°) for 45 keV electrons in copper, and the soft bremsstrahlung is less self-absorbed in the anode;</w:t>
       </w:r>
       <w:r>
         <w:t xml:space="preserve"> </w:t>
@@ -25125,7 +24892,7 @@
         <w:pStyle w:val="BodyText"/>
       </w:pPr>
       <w:r>
-        <w:t xml:space="preserve">Table 3.1 compares the two codes for 25–50 kV and 6–30° without the air path. With 1 mm Al, which removes the Cu K lines, the first HVL (2.18) of the DM is lower than that of SpekPy by 3.5–4.6 %. Without added filtration the HVL deviation ranges from −2.6 % to −19.4 %, because the DM underestimates the Cu K lines by about 25–43 %, and a weaker 8 keV line gives more weight to the softer 3–8 keV continuum in the air kerma. The deficit is largest at low voltage, where the Gryziński cross-section [57] rises too slowly above the ionisation threshold compared with the distorted-wave Born calculations [114, 115] underlying the K-line model of SpekPy [104].</w:t>
+        <w:t xml:space="preserve">Table 3.1 compares the two codes for 25–50 kV and 6–30° without the air path. With 1 mm Al, which removes the Cu K lines, the first HVL (2.18) of the DM is 3.5–4.6 % lower than that of SpekPy. Without added filtration the deviation ranges from −2.6 % to −19.4 %, because the DM underestimates the Cu K lines by about 26–43 % and a weaker 8 keV line gives more weight to the softer 3–8 keV continuum in the air kerma. The deficit is largest at low voltage, where the Gryziński cross-section [57] rises too slowly above the threshold compared with the distorted-wave Born calculations [114, 115] used by SpekPy [104].</w:t>
       </w:r>
     </w:p>
     <w:p>
@@ -28109,7 +27876,7 @@
         <w:pStyle w:val="BodyText"/>
       </w:pPr>
       <w:r>
-        <w:t xml:space="preserve">The spectral shapes of the two models agree within about 10 % between 10 and 30 keV (Fig. 3.1). The DM continuum is slightly richer in photons at 10–20 keV and poorer above about 25 keV, the ratio falling to 0.80–0.85 at 40 keV; this mild softening explains the HVL deficit of about 4 % for filtered beams. Its probable causes are the non-relativistic Born cross-section with the Elwert factor [56], which only approximates the tabulated cross-sections [113], and the assumed isotropic emission, whereas SpekPy models the angular distribution of bremsstrahlung [105].</w:t>
+        <w:t xml:space="preserve">The spectral shapes agree within about 10 % between 10 and 30 keV (Fig. 3.1). The DM continuum is slightly richer at 10–20 keV and poorer above about 25 keV, the ratio falling to 0.80–0.85 at 40 keV; this mild softening explains the HVL deficit of the filtered beams. Its probable causes are the non-relativistic Born cross-section with the Elwert factor [56], which only approximates the tabulated cross-sections [113], and the assumed isotropic emission, whereas SpekPy models the angular distribution of bremsstrahlung [105].</w:t>
       </w:r>
     </w:p>
     <w:p>
@@ -28186,7 +27953,7 @@
         <w:t xml:space="preserve"> </w:t>
       </w:r>
       <w:r>
-        <w:t xml:space="preserve">was applied to a tungsten anode at 50, 80 and 100 kV with 2.5 mm Al, which removes the W L lines not included in the DM (Table 3.2). The HVL deviations lie between −5.7 % and +0.5 %, and at 50 kV both values are comparable to the first HVL (1.78 mm Al) of the quality RQR3 of the International Electrotechnical Commission standard IEC 61267 [111]. As for copper, the DM spectra have a slightly weaker high-energy tail (Fig. 3.2). A single value of</w:t>
+        <w:t xml:space="preserve">was applied to a tungsten anode at 50, 80 and 100 kV with 2.5 mm Al, which removes the W L lines not included in the DM (Table 3.2). The HVL deviations lie between −5.7 % and +0.5 %, and at 50 kV both values are comparable to the first HVL (1.78 mm Al) of the quality RQR3 of the International Electrotechnical Commission standard IEC 61267 [111]. As for copper, the DM spectra have a slightly weaker high-energy tail (Fig. 3.2). A single</w:t>
       </w:r>
       <w:r>
         <w:t xml:space="preserve"> </w:t>
@@ -28200,7 +27967,7 @@
         <w:t xml:space="preserve"> </w:t>
       </w:r>
       <w:r>
-        <w:t xml:space="preserve">thus serves anodes with Z = 29 and Z = 74. The main weakness of the DM is the underestimated Cu K-line intensity, which matters for unfiltered and Kα-dominated beams, so the main DEF results use SpekPy spectra, with the DM as an independent check.</w:t>
+        <w:t xml:space="preserve">thus serves anodes with Z = 29 and Z = 74. The main weakness of the DM, the underestimated Cu K-line intensity, matters for unfiltered and Kα-dominated beams, so the main DEF results use SpekPy spectra, with the DM as an independent check.</w:t>
       </w:r>
     </w:p>
     <w:p>
@@ -28731,7 +28498,7 @@
         <w:pStyle w:val="FirstParagraph"/>
       </w:pPr>
       <w:r>
-        <w:t xml:space="preserve">In the baseline spectrum (Fig. 3.3) the Be window and the air path remove practically all photons below about 3 keV. The continuum rises to a plateau at about 7–9 keV and drops abruptly at the Cu K-edge (8.98 keV), above which photons are absorbed in the anode much more strongly, so that the anode acts as its own K-edge filter. It then recovers to a shallow maximum near 12–13 keV and decreases to zero at 45 keV, so the Ag K-edge falls into its weak high-energy part. The Cu Kα (8.05 keV) and Kβ (8.91 keV) lines exceed the neighbouring continuum by more than two orders of magnitude.</w:t>
+        <w:t xml:space="preserve">In the baseline spectrum (Fig. 3.3) the Be window and air remove practically all photons below about 3 keV. The continuum rises to a plateau at about 7–9 keV and drops abruptly at the Cu K-edge (8.98 keV), above which the anode absorbs much more strongly and acts as its own K-edge filter. It then recovers to a shallow maximum near 12–13 keV and decreases to zero at 45 keV, so the Ag K-edge falls into its weak high-energy part. In 0.05 keV bins the Cu Kα line (8.05 keV) exceeds the neighbouring continuum by more than two orders of magnitude and the Kβ line (8.91 keV) by a factor of 45–80.</w:t>
       </w:r>
     </w:p>
     <w:p>
@@ -28794,39 +28561,7 @@
         <w:pStyle w:val="BodyText"/>
       </w:pPr>
       <w:r>
-        <w:t xml:space="preserve">According to SpekPy, characteristic photons make up 68.5 % of the photon fluence (Table 3.3), so the unfiltered beam is essentially a source of Cu K radiation. In the DM the line intensities follow from the K-shell ionisation yield (Section 2.4), the fluorescence yield</w:t>
-      </w:r>
-      <w:r>
-        <w:t xml:space="preserve"> </w:t>
-      </w:r>
-      <m:oMath>
-        <m:sSub>
-          <m:e>
-            <m:r>
-              <m:t>ω</m:t>
-            </m:r>
-          </m:e>
-          <m:sub>
-            <m:r>
-              <m:t>K</m:t>
-            </m:r>
-          </m:sub>
-        </m:sSub>
-        <m:r>
-          <m:rPr>
-            <m:sty m:val="p"/>
-          </m:rPr>
-          <m:t>=</m:t>
-        </m:r>
-        <m:r>
-          <m:t>0.4538</m:t>
-        </m:r>
-      </m:oMath>
-      <w:r>
-        <w:t xml:space="preserve"> </w:t>
-      </w:r>
-      <w:r>
-        <w:t xml:space="preserve">and the radiative rates of xraylib [60]. The Kβ/Kα fluence ratio of SpekPy, 0.1431, slightly exceeds the ratio of the radiative rates (0.134), because the more energetic Kβ photons are attenuated less on their way out. A 20 µm Ni filter, whose K-edge (8.333 keV, Table 2.2) lies between the Kα and Kβ energies, reduces this ratio to 0.0023, acting as the classical β-filter of x-ray diffraction [52].</w:t>
+        <w:t xml:space="preserve">According to SpekPy, characteristic photons make up 68.5 % of the photon fluence (Table 3.3), so the unfiltered beam is essentially a source of Cu K radiation. The Kβ/Kα fluence ratio of SpekPy, 0.1431, slightly exceeds the ratio of the radiative rates of xraylib (0.134) [60], because the more energetic Kβ photons are attenuated less on their way out. A 20 µm Ni filter, whose K-edge (8.333 keV, Table 2.2) lies between the Kα and Kβ energies, reduces this ratio to 0.0023, acting as the classical β-filter of x-ray diffraction [52].</w:t>
       </w:r>
     </w:p>
     <w:p>
@@ -28834,7 +28569,7 @@
         <w:pStyle w:val="BodyText"/>
       </w:pPr>
       <w:r>
-        <w:t xml:space="preserve">The beam quality is very low: with a mean energy (2.19) of 10.38 keV, a first HVL below 50 µm Al and an effective energy below the Kα energy, the dose to soft tissue is delivered mainly by the Cu K lines and the soft continuum. Only 4.64 % of the photons, carrying 14.1 % of the energy fluence, lie above the Ag K-edge, and their share in the kerma is smaller still because</w:t>
+        <w:t xml:space="preserve">The beam quality is very low: the mean energy (2.19) is 10.38 keV, the first HVL below 50 µm Al and the effective energy below that of Kα, so the dose to soft tissue comes mainly from the Cu K lines and the soft continuum. Only 4.64 % of the photons, carrying 14.1 % of the energy fluence, lie above the Ag K-edge, and their share in the kerma is smaller still because</w:t>
       </w:r>
       <w:r>
         <w:t xml:space="preserve"> </w:t>
@@ -28869,30 +28604,7 @@
         <w:t xml:space="preserve"> </w:t>
       </w:r>
       <w:r>
-        <w:t xml:space="preserve">decreases steeply with energy. The output is very high: 383 mGy/mAs at 10 cm, i.e. 15.3 Gy/s at 40 mA. Combined with the dominance of 8 keV photons, for which</w:t>
-      </w:r>
-      <w:r>
-        <w:t xml:space="preserve"> </w:t>
-      </w:r>
-      <m:oMath>
-        <m:r>
-          <m:t>R</m:t>
-        </m:r>
-        <m:r>
-          <m:t>(</m:t>
-        </m:r>
-        <m:r>
-          <m:t>E</m:t>
-        </m:r>
-        <m:r>
-          <m:t>)</m:t>
-        </m:r>
-      </m:oMath>
-      <w:r>
-        <w:t xml:space="preserve"> </w:t>
-      </w:r>
-      <w:r>
-        <w:t xml:space="preserve">is only 21.0, this predicts a modest DEF for the bare beam.</w:t>
+        <w:t xml:space="preserve">decreases steeply with energy. The output is very high: 383 mGy/mAs at 10 cm, i.e. 15.3 Gy/s at 40 mA.</w:t>
       </w:r>
     </w:p>
     <w:p>
@@ -29688,7 +29400,7 @@
         <w:pStyle w:val="FirstParagraph"/>
       </w:pPr>
       <w:r>
-        <w:t xml:space="preserve">The anode angle, the tube voltage and the Be window thickness were varied one at a time around the baseline (Table 3.4). Increasing the anode angle from 6° to 30° raises the air kerma by a factor of 1.56 because of weaker self-filtration in the anode: the exit path</w:t>
+        <w:t xml:space="preserve">The anode angle, tube voltage and Be window thickness were varied one at a time around the baseline (Table 3.4). Increasing the anode angle from 6° to 30° raises the air kerma by a factor of 1.56 through weaker self-filtration in the anode: the exit path</w:t>
       </w:r>
       <w:r>
         <w:t xml:space="preserve"> </w:t>
@@ -29731,7 +29443,7 @@
         <w:t xml:space="preserve"> </w:t>
       </w:r>
       <w:r>
-        <w:t xml:space="preserve">is about 4.8 times longer at 6° than at 30°. The effect is strongest where copper is most opaque, at the soft end and just above the Cu K-edge, whereas above about 25 keV the curves nearly merge (Fig. 3.4). The same mechanism causes the heel effect [16], not treated here since the calculations refer to the central ray. A small anode angle thus gives a smaller effective focal spot but a lower output and a slightly harder beam, while the DEF hardly changes.</w:t>
+        <w:t xml:space="preserve">is about 4.8 times longer at 6° than at 30°. The effect is strongest where copper is most opaque, at the soft end and just above the Cu K-edge, whereas above about 25 keV the curves nearly merge (Fig. 3.4). The same mechanism causes the heel effect [16], not treated here since the calculations refer to the central ray. A small anode angle thus gives a smaller effective focal spot but a lower output and a slightly harder beam.</w:t>
       </w:r>
     </w:p>
     <w:p>
@@ -29794,7 +29506,7 @@
         <w:pStyle w:val="BodyText"/>
       </w:pPr>
       <w:r>
-        <w:t xml:space="preserve">The tube voltage has the strongest influence on the output: from 25 to 50 kV the air kerma increases from 163 to 430 mGy/mAs, largely through the Cu K lines, since the electrons travel a longer path at energies where the K-shell ionisation cross-section is near its maximum (at about 35 keV). The continuum grows strongly at high energies (Fig. 3.5) but hardly changes just above the Cu K-edge, because such photons escape only from a thin surface layer of the anode. The DEF increases only from 1.1932 at 25 kV to 1.2027 at 50 kV; at 25 kV no photon reaches the Ag K-edge, yet the DEF is already 1.19, so the enhancement of the unfiltered beam is caused almost entirely by photoabsorption in the L and M shells of Ag, where</w:t>
+        <w:t xml:space="preserve">The tube voltage has the strongest influence on the output, which grows largely through the Cu K lines, since the electrons travel a longer path at energies where the K-shell ionisation cross-section is near its maximum (at about 35 keV). The continuum grows strongly at high energies (Fig. 3.5) but hardly changes just above the Cu K-edge, because such photons escape only from a thin surface layer of the anode. The DEF increases only from 1.1932 at 25 kV, where no photon reaches the Ag K-edge, to 1.2027 at 50 kV, so the enhancement of the unfiltered beam is caused almost entirely by photoabsorption in the L and M shells of Ag, where</w:t>
       </w:r>
       <w:r>
         <w:t xml:space="preserve"> </w:t>
@@ -29817,7 +29529,7 @@
         <w:t xml:space="preserve"> </w:t>
       </w:r>
       <w:r>
-        <w:t xml:space="preserve">is 21–32.</w:t>
+        <w:t xml:space="preserve">does not exceed 32 (21–32 at 8–25 keV).</w:t>
       </w:r>
     </w:p>
     <w:p>
@@ -29880,7 +29592,7 @@
         <w:pStyle w:val="BodyText"/>
       </w:pPr>
       <w:r>
-        <w:t xml:space="preserve">The Be window affects only the soft end of the spectrum (Fig. 3.6). Because beryllium (Z = 4) absorbs weakly, increasing the window thickness from 0.15 to 2.0 mm removes mainly photons below about 6 keV and lowers the air kerma from 423 to 271 mGy/mAs, while the DEF rises only slightly. The thickness is fixed by the tube design but must be known accurately, since it changes the output by more than one third.</w:t>
+        <w:t xml:space="preserve">The Be window acts mainly on the soft end of the spectrum (Fig. 3.6). Because beryllium (Z = 4) absorbs weakly, increasing the window thickness from 0.15 to 2.0 mm removes about three quarters of the photons below 6 keV but also about 30 % of the Cu K-line photons, which account for most of the decrease in air kerma from 423 to 271 mGy/mAs. The thickness, fixed by the tube design, must be known accurately, since it changes the output by more than one third.</w:t>
       </w:r>
     </w:p>
     <w:p>
@@ -29943,7 +29655,7 @@
         <w:pStyle w:val="BodyText"/>
       </w:pPr>
       <w:r>
-        <w:t xml:space="preserve">The DM spectra give DEF values within 0.003 of SpekPy for all design variants. While the design parameters change the output by factors of up to 1.6 (anode angle, window) and 2.6 (voltage), the DEF for 1 % Ag remains between 1.19 and 1.21, because in every unfiltered beam the tissue dose is dominated by the Cu K lines and photons of 3–15 keV. The tube design is therefore a lever for the dose rate rather than for the DEF; a substantial increase in the DEF requires added filters.</w:t>
+        <w:t xml:space="preserve">The DM spectra give DEF values within 0.004 of SpekPy for all design variants. While the design parameters change the output by factors of up to 1.6 (anode angle, window) and 2.6 (voltage), the DEF for 1 % Ag remains between 1.19 and 1.21, because in every unfiltered beam the tissue dose is dominated by the Cu K lines and photons of 3–15 keV. The tube design is therefore a lever for the dose rate rather than the DEF; a substantial increase in the DEF requires added filters.</w:t>
       </w:r>
     </w:p>
     <w:p>
@@ -31457,131 +31169,25 @@
         <w:pStyle w:val="FirstParagraph"/>
       </w:pPr>
       <w:r>
-        <w:t xml:space="preserve">Added filters reshape the spectrum through the transmission</w:t>
+        <w:t xml:space="preserve">The added filters, described by the Beer–Lambert transmission of (2.15), form three groups (Table 3.5): aluminium, with its K-edge (1.56 keV) below the spectrum; nickel and copper, with K-edges near the Cu K lines; and Mo, Ag and Sn, with K-edges at 20.0, 25.514 and 29.2 keV (Table 2.2). Aluminium acts as a classical hardening filter (Fig. 3.7): its photoelectric cross-section falls roughly as</w:t>
       </w:r>
       <w:r>
         <w:t xml:space="preserve"> </w:t>
       </w:r>
       <m:oMath>
-        <m:r>
-          <m:rPr>
-            <m:sty m:val="p"/>
-          </m:rPr>
-          <m:t>exp</m:t>
-        </m:r>
-        <m:d>
-          <m:dPr>
-            <m:begChr m:val="["/>
-            <m:endChr m:val="]"/>
-            <m:sepChr m:val=""/>
-            <m:grow/>
-          </m:dPr>
+        <m:sSup>
           <m:e>
+            <m:r>
+              <m:t>E</m:t>
+            </m:r>
+          </m:e>
+          <m:sup>
             <m:r>
               <m:rPr>
                 <m:sty m:val="p"/>
               </m:rPr>
               <m:t>−</m:t>
             </m:r>
-            <m:sSub>
-              <m:e>
-                <m:r>
-                  <m:t>μ</m:t>
-                </m:r>
-              </m:e>
-              <m:sub>
-                <m:r>
-                  <m:t>f</m:t>
-                </m:r>
-              </m:sub>
-            </m:sSub>
-            <m:r>
-              <m:t>(</m:t>
-            </m:r>
-            <m:r>
-              <m:t>E</m:t>
-            </m:r>
-            <m:r>
-              <m:t>)</m:t>
-            </m:r>
-            <m:r>
-              <m:t> </m:t>
-            </m:r>
-            <m:r>
-              <m:t>t</m:t>
-            </m:r>
-          </m:e>
-        </m:d>
-      </m:oMath>
-      <w:r>
-        <w:t xml:space="preserve"> </w:t>
-      </w:r>
-      <w:r>
-        <w:t xml:space="preserve">of (2.15), where</w:t>
-      </w:r>
-      <w:r>
-        <w:t xml:space="preserve"> </w:t>
-      </w:r>
-      <m:oMath>
-        <m:sSub>
-          <m:e>
-            <m:r>
-              <m:t>μ</m:t>
-            </m:r>
-          </m:e>
-          <m:sub>
-            <m:r>
-              <m:t>f</m:t>
-            </m:r>
-          </m:sub>
-        </m:sSub>
-        <m:r>
-          <m:t>(</m:t>
-        </m:r>
-        <m:r>
-          <m:t>E</m:t>
-        </m:r>
-        <m:r>
-          <m:t>)</m:t>
-        </m:r>
-      </m:oMath>
-      <w:r>
-        <w:t xml:space="preserve"> </w:t>
-      </w:r>
-      <w:r>
-        <w:t xml:space="preserve">and</w:t>
-      </w:r>
-      <w:r>
-        <w:t xml:space="preserve"> </w:t>
-      </w:r>
-      <m:oMath>
-        <m:r>
-          <m:t>t</m:t>
-        </m:r>
-      </m:oMath>
-      <w:r>
-        <w:t xml:space="preserve"> </w:t>
-      </w:r>
-      <w:r>
-        <w:t xml:space="preserve">are the linear attenuation coefficient and the thickness of the filter. Three groups were studied (Table 3.5): aluminium, with its K-edge (1.56 keV) below the spectrum; nickel and copper, with K-edges near the Cu K lines; and Mo, Ag and Sn, with K-edges at 20.0, 25.514 and 29.2 keV (Table 2.2). Aluminium acts as a classical hardening filter (Fig. 3.7): its photoelectric cross-section falls roughly as</w:t>
-      </w:r>
-      <w:r>
-        <w:t xml:space="preserve"> </w:t>
-      </w:r>
-      <m:oMath>
-        <m:sSup>
-          <m:e>
-            <m:r>
-              <m:t>E</m:t>
-            </m:r>
-          </m:e>
-          <m:sup>
-            <m:r>
-              <m:rPr>
-                <m:sty m:val="p"/>
-              </m:rPr>
-              <m:t>−</m:t>
-            </m:r>
             <m:r>
               <m:t>3</m:t>
             </m:r>
@@ -31589,7 +31195,7 @@
         </m:sSup>
       </m:oMath>
       <w:r>
-        <w:t xml:space="preserve">, so the soft continuum and the Cu K lines are removed far more efficiently than the photons above the Ag K-edge. With 1–2 mm Al the Kα line practically disappears and 49.8–65.0 % of the photons lie above the Ag K-edge. The HVL jumps from 0.104 to 0.454 mm Al between the 0.25 and 0.5 mm filters, because behind the thinner filter the residual Cu K lines still carry a large part of the air kerma. The price is the output: 1 mm Al reduces the dose rate about 120-fold and 2 mm Al about 270-fold.</w:t>
+        <w:t xml:space="preserve">, so the soft continuum and the Cu K lines are removed far more efficiently than the photons above the Ag K-edge. With 1–2 mm Al the Kα line practically disappears. The HVL jumps from 0.104 to 0.454 mm Al between the 0.25 and 0.5 mm filters, because behind the thinner filter the residual Cu K lines still carry a large part of the air kerma. The price is the output: 1 mm Al reduces the dose rate about 120-fold and 2 mm Al about 270-fold.</w:t>
       </w:r>
     </w:p>
     <w:p>
@@ -31652,7 +31258,7 @@
         <w:pStyle w:val="BodyText"/>
       </w:pPr>
       <w:r>
-        <w:t xml:space="preserve">Copper filters behave differently (Fig. 3.8). The Cu K-edge (8.979 keV) lies just above the Cu Kα and Kβ energies, so copper is relatively transparent to its own K radiation while absorbing the 9–20 keV continuum very strongly. With 0.1 mm Cu the mean energy is close to that with 0.5 mm Al, yet the HVL is 6.5 times smaller: the mean energy is weighted by fluence and reflects the hard continuum, whereas the HVL is weighted by air kerma and is controlled by the transmitted Kα line, for which</w:t>
+        <w:t xml:space="preserve">Copper filters behave differently (Fig. 3.8): with the K-edge (8.979 keV) just above the Kα and Kβ energies, copper is relatively transparent to its own K radiation but absorbs the 9–20 keV continuum very strongly. With 0.1 mm Cu the mean energy is close to that with 0.5 mm Al, yet the HVL is 6.5 times smaller: the mean energy is weighted by fluence and reflects the hard continuum, whereas the HVL is weighted by air kerma and controlled by the transmitted Kα line, for which</w:t>
       </w:r>
       <w:r>
         <w:t xml:space="preserve"> </w:t>
@@ -31687,7 +31293,7 @@
         <w:t xml:space="preserve"> </w:t>
       </w:r>
       <w:r>
-        <w:t xml:space="preserve">of air is much larger. Only 0.2 mm Cu suppresses the lines sufficiently, at a relative air kerma of only</w:t>
+        <w:t xml:space="preserve">of air is much larger. Only 0.2 mm Cu suppresses the lines sufficiently, at a relative air kerma of</w:t>
       </w:r>
       <w:r>
         <w:t xml:space="preserve"> </w:t>
@@ -31722,7 +31328,7 @@
         </m:sSup>
       </m:oMath>
       <w:r>
-        <w:t xml:space="preserve">. A 0.02 mm Ni filter, with its K-edge between Kα and Kβ, removes Kβ and the continuum just above 8.33 keV while transmitting Kα; the resulting quasi-monochromatic 8 keV beam suits x-ray diffraction but not dose enhancement by Ag.</w:t>
+        <w:t xml:space="preserve">. The 0.02 mm Ni filter, which removes Kβ and the continuum just above 8.33 keV, leaves a quasi-monochromatic 8 keV beam that suits x-ray diffraction but not dose enhancement by Ag.</w:t>
       </w:r>
     </w:p>
     <w:p>
@@ -31785,7 +31391,7 @@
         <w:pStyle w:val="BodyText"/>
       </w:pPr>
       <w:r>
-        <w:t xml:space="preserve">Each K-edge filter transmits a band below its edge and cuts the fluence above it several-fold or more (Fig. 3.9). The 0.05 mm Mo filter thus leaves only 31.5 % of its photons above the Ag K-edge, and the 0.05 mm Ag filter removes precisely the photons above 25.5 keV that are most useful for enhancement by Ag: although its HVL exceeds that of 0.5 mm Al, only 20.1 % of its photons lie above the Ag K-edge, against 38.2 %. Tin preserves the 25.5–29.2 keV window but removes the photons above 29.2 keV, where</w:t>
+        <w:t xml:space="preserve">Each K-edge filter transmits a band below its edge and cuts the fluence above it several-fold or more (Fig. 3.9). The 0.05 mm Ag filter thus removes precisely the photons above 25.5 keV that are most useful for enhancement by Ag: although its HVL exceeds that of 0.5 mm Al, only 20.1 % of its photons lie above the Ag K-edge, against 38.2 %. Tin preserves the 25.5–29.2 keV window but removes the photons above 29.2 keV, where</w:t>
       </w:r>
       <w:r>
         <w:t xml:space="preserve"> </w:t>
@@ -31808,7 +31414,7 @@
         <w:t xml:space="preserve"> </w:t>
       </w:r>
       <w:r>
-        <w:t xml:space="preserve">is highest, so 0.1 mm Sn gives a slightly larger HVL than 1 mm Al but fewer photons above the Ag K-edge (40.4 % against 49.8 %). Neither the mean energy nor the HVL alone therefore characterises the part of the spectrum that matters for Ag. The DEF follows the fraction of photons above the Ag K-edge only while the kerma is not dominated by the Cu K lines: with 55.1 % of its photons above the edge, 0.1 mm Cu gives a DEF of only 1.288, because the transmitted Kα line delivers most of the tissue dose.</w:t>
+        <w:t xml:space="preserve">is highest, so 0.1 mm Sn gives a slightly larger HVL than 1 mm Al but fewer photons above the Ag K-edge (40.4 % against 49.8 %). Neither the mean energy nor the HVL alone therefore characterises the spectral region that matters for Ag. The DEF follows the fraction of photons above the Ag K-edge only while the kerma is not dominated by the Cu K lines: with 55.1 % of its photons above the edge, 0.1 mm Cu gives a DEF of only 1.288, because the transmitted Kα line delivers most of the tissue dose.</w:t>
       </w:r>
     </w:p>
     <w:p>
@@ -33740,7 +33346,7 @@
         <w:pStyle w:val="FirstParagraph"/>
       </w:pPr>
       <w:r>
-        <w:t xml:space="preserve">In the kerma approximation the DEF is a ratio of two spectrum-weighted integrals (2.23), determined by the energy distribution of the dose integrand</w:t>
+        <w:t xml:space="preserve">The DEF is a ratio of two spectrum-weighted integrals (2.23), determined by the energy distribution of the dose integrand</w:t>
       </w:r>
       <w:r>
         <w:t xml:space="preserve"> </w:t>
@@ -33883,7 +33489,7 @@
         <w:t xml:space="preserve"> </w:t>
       </w:r>
       <w:r>
-        <w:t xml:space="preserve">is only 21.0 at 8 keV and 26.9 at 15 keV, so 1 % Ag raises the integrand almost uniformly by about 20 %. With 1 mm Al the integrand is concentrated between 15 and 45 keV, and above the Ag K-edge, where the integrand of the loaded tissue jumps,</w:t>
+        <w:t xml:space="preserve">is only 21.1 at 8 keV and 27.0 at 15 keV, so 1 % Ag raises the integrand almost uniformly by about 20 %. With 1 mm Al the integrand is concentrated between 15 and 45 keV, and above the Ag K-edge, where the integrand of the loaded tissue jumps,</w:t>
       </w:r>
       <w:r>
         <w:t xml:space="preserve"> </w:t>
@@ -33906,7 +33512,7 @@
         <w:t xml:space="preserve"> </w:t>
       </w:r>
       <w:r>
-        <w:t xml:space="preserve">increases from 76.2 at 25.6 keV to 138.8 at 45 keV. Since about half of the photons of this beam lie above the edge, this region provides the larger part of the enhancement.</w:t>
+        <w:t xml:space="preserve">increases from 76.8 at 25.6 keV to 138.5 at 45 keV. Since about half of the photons of this beam lie above the edge, this region provides the larger part of the enhancement.</w:t>
       </w:r>
     </w:p>
     <w:p>
@@ -34185,7 +33791,7 @@
         <w:t xml:space="preserve"> </w:t>
       </w:r>
       <w:r>
-        <w:t xml:space="preserve">from about 21 to 81. For 1 % Ag the DEF is 1.20 without a filter, 1.48 with 1 mm Al, 1.62 with 2 mm Al and 1.80 with 0.2 mm Cu, whereas at 0.1 % Ag (1 mg of Ag per gram of tissue) the enhancement is only 2–8 %. The ranking of the filters (Table 3.5) confirms that the DEF is governed by the share of the dose integrand above the Ag K-edge rather than by the mean energy: the nearly pure Cu Kα beam behind the Ni filter gives practically the same DEF as the unfiltered beam (1.208 against 1.202), and at a similar HVL 0.1 mm Sn yields less than 1 mm Al (1.444 against 1.482) because it removes the hardest photons. Strict linearity holds at the surface; inside an extended Ag-loaded region the attenuation by Ag itself makes the dependence non-linear (Section 3.7).</w:t>
+        <w:t xml:space="preserve">from about 21 to 81. For 1 % Ag the DEF is 1.20 without a filter, 1.48 with 1 mm Al, 1.62 with 2 mm Al and 1.80 with 0.2 mm Cu, whereas at 0.1 % Ag (1 mg of Ag per gram of tissue) the enhancement is only 2–8 %. The ranking of the filters (Table 3.5) confirms that the DEF follows the share of the dose integrand above the Ag K-edge rather than the mean energy: the nearly pure Kα beam behind the Ni filter gives practically the same DEF as the unfiltered beam (1.208 against 1.202), and at a similar HVL 0.1 mm Sn yields less than 1 mm Al (1.444 against 1.482). Strict linearity holds at the surface; inside an extended Ag-loaded region the attenuation by Ag itself makes the dependence non-linear (Section 3.7).</w:t>
       </w:r>
     </w:p>
     <w:p>
@@ -34248,7 +33854,7 @@
         <w:pStyle w:val="BodyText"/>
       </w:pPr>
       <w:r>
-        <w:t xml:space="preserve">Compared with SpekPy, the DM gives a DEF lower by 0.6–1.3 % with 0.5–2 mm Al and by less than 1 % with the Sn, Ag and Mo filters, consistent with its weaker high-energy tail. Where residual Cu K lines carry much of the kerma, it is higher, by 0.5 % for 0.25 mm Al and about 2 % for 0.1 and 0.2 mm Cu, because the underestimated lines shift the dose towards the hard continuum. Such differences are small compared with those between filters, so the DEF is robust to the choice of spectrum model. With water instead of ICRU-44 tissue as the reference medium, the DEF for 1 % Ag is up to 1.3 % higher for filtered beams (1.4965 with 1 mm Al and 1.8274 with 0.2 mm Cu). Although ICRU-44 tissue contains less oxygen than water, its 1.3 % by mass of Na, P, S, Cl and K raises its</w:t>
+        <w:t xml:space="preserve">Compared with SpekPy, the DM gives a DEF lower by 0.6–1.3 % with 0.5–2 mm Al and by less than 1 % with the Sn, Ag and Mo filters, consistent with its weaker high-energy tail. Where residual Cu K lines carry much of the kerma, it is higher, by 0.5 % for 0.25 mm Al and about 2 % for 0.1 and 0.2 mm Cu, because the underestimated lines shift the dose towards the hard continuum. These differences are small compared with those between filters, so the DEF is robust to the spectrum model. With water instead of ICRU-44 tissue as the reference medium, the DEF for 1 % Ag is up to 1.3 % higher for filtered beams (1.4965 with 1 mm Al and 1.8274 with 0.2 mm Cu). Although ICRU-44 tissue contains less oxygen than water, its 1.3 % by mass of Na, P, S, Cl and K raises its</w:t>
       </w:r>
       <w:r>
         <w:t xml:space="preserve"> </w:t>
@@ -34283,7 +33889,7 @@
         <w:t xml:space="preserve"> </w:t>
       </w:r>
       <w:r>
-        <w:t xml:space="preserve">above that of water at 15–40 keV and so lowers the DEF; this must be considered when DEF values for water and tissue are compared.</w:t>
+        <w:t xml:space="preserve">above that of water at 15–40 keV and so lowers the DEF.</w:t>
       </w:r>
     </w:p>
     <w:p>
@@ -36186,7 +35792,7 @@
         </m:sSup>
       </m:oMath>
       <w:r>
-        <w:t xml:space="preserve">, whereas Ni and Cu stay low while the Cu Kα line is transmitted. The K-edge filters fall behind: Sn lies below Al and Ti at all transmissions, Mo levels off near 1.4, and Ag passes through a maximum of about 1.35.</w:t>
+        <w:t xml:space="preserve">, whereas Ni and Cu stay low while the Cu Kα line is transmitted. The K-edge filters fall behind: Sn practically coincides with Ti down to about 10 % transmission and falls below Al and Ti at lower transmissions, Mo levels off near 1.4, and Ag passes through a maximum of about 1.35.</w:t>
       </w:r>
     </w:p>
     <w:p>
@@ -36263,7 +35869,7 @@
         <w:t xml:space="preserve"> </w:t>
       </w:r>
       <w:r>
-        <w:t xml:space="preserve">of each filter was found from the condition of equal air-kerma transmission</w:t>
+        <w:t xml:space="preserve">of each filter was set by the condition of equal air-kerma transmission</w:t>
       </w:r>
     </w:p>
     <w:tbl>
@@ -36890,7 +36496,7 @@
         <w:pStyle w:val="BodyText"/>
       </w:pPr>
       <w:r>
-        <w:t xml:space="preserve">The dependence on Z reflects the positions of the absorption edges relative to the Cu lines and the Ag K-edge; at 10 % transmission all elements still give 1.220–1.241. Elements from Al to Co (Z = 13–27), with K-edges below the Cu Kα energy, absorb the Cu lines strongly and give 1.88–1.91 at 0.1 %, whereas for Ni to As (Z = 28–33) the K-edge lies above Kα, the transmitted line dominates the kerma, and these are the worst filters at 10 % and 1 %. Elements from Sr to Ag (Z = 38–47) absorb the photons above the Ag K-edge and form a deep minimum at 0.1 %, lowest for Ag, Pd and Rh (1.335–1.346); for Cd to Ba (Z = 48–56), with K-edges above the Ag K-edge, the DEF grows with Z. Heavier elements act through L-shell absorption: Gd, with its L3 edge (7.243 keV) below Kα, behaves like the light absorbers, whereas for Hf to Bi the L3 edges lie above Kα (11.919 keV for Au, Table 2.2) and W, Au and Pb give only 1.350–1.351 at 1 %.</w:t>
+        <w:t xml:space="preserve">The dependence on Z reflects the positions of the absorption edges relative to the Cu lines and the Ag K-edge; at 10 % transmission all elements still give 1.220–1.241. Al to Co (Z = 13–27), with K-edges below the Cu Kα energy, absorb the Cu lines strongly, whereas for Ni to As (Z = 28–33) the K-edge lies above Kα, the transmitted line dominates the kerma, and these are the worst filters at 10 % and 1 %. Sr to Ag (Z = 38–47) absorb the photons above the Ag K-edge and form a deep minimum at 0.1 %, lowest for Ag, Pd and Rh (1.335–1.346); for Cd to Ba (Z = 48–56), with K-edges above the Ag K-edge, the DEF grows with Z. Heavier elements act through L-shell absorption: Gd, with its L3 edge (7.243 keV) below Kα, behaves like the light absorbers, whereas for Hf to Bi the L3 edges lie above Kα (11.919 keV for Au, Table 2.2) and W, Au and Pb give only 1.350–1.351 at 1 %.</w:t>
       </w:r>
     </w:p>
     <w:p>
@@ -39786,7 +39392,7 @@
         <w:pStyle w:val="BodyText"/>
       </w:pPr>
       <w:r>
-        <w:t xml:space="preserve">Filtration is thus the decisive design lever for dose enhancement by Ag with a copper-anode tube. Aluminium of 1–2 mm, which raises the DEF for 1 % Ag from 1.20 to 1.48–1.62 at convenient exposure times, or titanium of 0.1–0.3 mm is the optimal choice. K-edge filters with edges at 20–30 keV (Mo, Ag, Sn) and filters that transmit the Cu Kα line (Ni, thin Cu) should be avoided.</w:t>
+        <w:t xml:space="preserve">Filtration is thus the decisive design lever for dose enhancement by Ag with a copper-anode tube. Aluminium of 1–2 mm, which allows convenient exposure times, or titanium of 0.1–0.3 mm is the optimal choice. K-edge filters with edges at 20–30 keV (Mo, Ag, Sn) and filters that transmit the Cu Kα line (Ni, thin Cu) should be avoided.</w:t>
       </w:r>
     </w:p>
     <w:p>
@@ -39802,7 +39408,7 @@
         <w:pStyle w:val="FirstParagraph"/>
       </w:pPr>
       <w:r>
-        <w:t xml:space="preserve">In samples, phantoms or animals the Ag-loaded target lies beneath tissue that modifies the beam. Two cases were calculated with SpekPy spectra in the primary-beam kerma approximation (scatter is assessed in Section 3.9): a small loaded region at depth</w:t>
+        <w:t xml:space="preserve">As the Ag-loaded target in samples, phantoms or animals lies beneath tissue, two cases were calculated with SpekPy spectra in the primary-beam kerma approximation (scatter is assessed in Section 3.9): a small loaded region at depth</w:t>
       </w:r>
       <w:r>
         <w:t xml:space="preserve"> </w:t>
@@ -39882,7 +39488,7 @@
         </m:sSub>
       </m:oMath>
       <w:r>
-        <w:t xml:space="preserve">), because tissue preferentially absorbs low-energy photons, shifting the fluence to where the Ag/tissue ratio of</w:t>
+        <w:t xml:space="preserve">), because tissue preferentially absorbs low-energy photons, shifting the fluence to where the Ag/tissue</w:t>
       </w:r>
       <w:r>
         <w:t xml:space="preserve"> </w:t>
@@ -39917,7 +39523,7 @@
         <w:t xml:space="preserve"> </w:t>
       </w:r>
       <w:r>
-        <w:t xml:space="preserve">is larger. Without a filter the DEF for 1 % Ag rises from 1.20 to 1.56 at 20 mm, but the dose falls to 0.0090 at 10 mm as the Cu K lines and soft bremsstrahlung are absorbed: tissue acts as an added filter (Section 3.4). With Al 1 mm, which has already hardened the beam, the DEF rises only to 1.69 at 20 mm and the dose falls only to 0.439 at 10 mm.</w:t>
+        <w:t xml:space="preserve">ratio is larger. Without a filter the DEF for 1 % Ag rises from 1.20 to 1.56 at 20 mm, but the dose falls to 0.0090 at 10 mm as the Cu K lines and soft bremsstrahlung are absorbed: tissue acts as an added filter (Section 3.4). With Al 1 mm, which has already hardened the beam, the DEF rises only to 1.69 at 20 mm and the dose falls only to 0.439 at 10 mm.</w:t>
       </w:r>
     </w:p>
     <w:p>
@@ -41357,7 +40963,7 @@
         <w:pStyle w:val="BodyText"/>
       </w:pPr>
       <w:r>
-        <w:t xml:space="preserve">Cu and Sn are the extremes. The 0.1 mm Cu beam comprises the Cu Kα line and a hard tail (Section 3.4); once tissue absorbs the Kα line, the DEF rises steeply from 1.29 to 1.77 at 5 mm, near the surface value with 0.2 mm Cu (1.80), and beyond about 2 mm exceeds all others. With Sn 0.1 mm it changes least (1.44 to 1.57 at 20 mm), since photons above the Sn K-edge (29.2 keV) are already strongly attenuated and tissue barely hardens the remaining narrow band. Surface rankings of filters thus fail for deep-seated targets.</w:t>
+        <w:t xml:space="preserve">The 0.1 mm Cu beam comprises the Cu Kα line and a hard tail (Section 3.4); once tissue absorbs the Kα line, the DEF rises steeply from 1.29 to 1.77 at 5 mm, near the surface value with 0.2 mm Cu (1.80), and beyond about 2 mm exceeds all others. With Sn 0.1 mm it changes least (1.44 to 1.57 at 20 mm), since photons above the Sn K-edge (29.2 keV) are already strongly attenuated and tissue barely hardens the remaining narrow band. Surface rankings of filters thus fail for deep-seated targets.</w:t>
       </w:r>
     </w:p>
     <w:p>
@@ -41365,7 +40971,7 @@
         <w:pStyle w:val="BodyText"/>
       </w:pPr>
       <w:r>
-        <w:t xml:space="preserve">Inside a region loaded from the surface the trend reverses (Fig. 3.15): Ag strongly attenuates the photons above its K-edge that produce the enhancement (its mass attenuation coefficient rises 5.8-fold at 25.514 keV, from 9.53 to 55.4 cm²/g). With Al 1 mm the DEF falls from 1.48 to 1.21 at 10 mm for 1 % Ag and from 1.96 to 1.27 for 2 % Ag; self-shielding grows with concentration, and the linear relation of equation (2.24) holds only for thin layers. The Sn-filtered beam, concentrated just above the Ag K-edge, loses more (1.44 to 1.15 at 10 mm, 1 % Ag). Enhancement in a loaded region several millimetres thick is thus non-uniform and on average much lower than at the surface.</w:t>
+        <w:t xml:space="preserve">Inside a region loaded from the surface the trend reverses (Fig. 3.15): Ag strongly attenuates the photons above its K-edge that produce the enhancement (its mass attenuation coefficient rises 5.8-fold at 25.514 keV, from 9.53 to 55.4 cm²/g). With Al 1 mm the DEF falls from 1.48 to 1.21 at 10 mm for 1 % Ag and from 1.96 to 1.27 for 2 % Ag; self-shielding grows with concentration, and the linear relation of equation (2.24) holds only for thin layers. The Sn-filtered beam, concentrated just above the Ag K-edge, loses more (1.44 to 1.15 at 10 mm, 1 % Ag).</w:t>
       </w:r>
     </w:p>
     <w:p>
@@ -41450,42 +41056,7 @@
         <w:t xml:space="preserve"> </w:t>
       </w:r>
       <w:r>
-        <w:t xml:space="preserve">(Fig. 3.16, Table 3.10) was calculated with SpekPy for 20–50 kV, where it supports the Cu anode, and with the DM for 60–80 kV. Photons above the Ag K-edge exist only above 25.5 kV, since the maximum photon energy is</w:t>
-      </w:r>
-      <w:r>
-        <w:t xml:space="preserve"> </w:t>
-      </w:r>
-      <m:oMath>
-        <m:sSub>
-          <m:e>
-            <m:r>
-              <m:t>T</m:t>
-            </m:r>
-          </m:e>
-          <m:sub>
-            <m:r>
-              <m:t>0</m:t>
-            </m:r>
-          </m:sub>
-        </m:sSub>
-        <m:r>
-          <m:rPr>
-            <m:sty m:val="p"/>
-          </m:rPr>
-          <m:t>=</m:t>
-        </m:r>
-        <m:r>
-          <m:t>e</m:t>
-        </m:r>
-        <m:r>
-          <m:t>U</m:t>
-        </m:r>
-      </m:oMath>
-      <w:r>
-        <w:t xml:space="preserve"> </w:t>
-      </w:r>
-      <w:r>
-        <w:t xml:space="preserve">(Section 2.1), and below this voltage the DEF changes little. The slope increases from 26–27 kV; between 30 and 50 kV the DEF with Al 1 mm rises from 1.31 to 1.52 ever more slowly (±0.009 per ±1 kV at 45 kV, Section 3.10), and above 50 kV the growth slows further as the spectrum extends beyond the maximum of the Ag/tissue ratio near 40–45 keV. As the DM gives slightly lower DEFs than SpekPy at 45 kV (1.464 versus 1.482), the 60–80 kV values are, if anything, underestimated, and part of the flattening between 50 and 60 kV reflects the change of model.</w:t>
+        <w:t xml:space="preserve">(Fig. 3.16, Table 3.10) was calculated with SpekPy for 20–50 kV, where it supports the Cu anode, and with the DM for 60–80 kV. Photons above the Ag K-edge exist only above 25.5 kV, and below this voltage the DEF changes little. The slope increases from 26–27 kV; between 30 and 50 kV the DEF with Al 1 mm rises from 1.31 to 1.52 ever more slowly (±0.009 per ±1 kV at 45 kV, Section 3.10), and above 50 kV the growth slows further as the spectrum extends beyond the maximum of the Ag/tissue ratio near 40–45 keV. As the DM gives slightly lower DEFs than SpekPy at 45 kV (1.464 versus 1.482), the 60–80 kV values are, if anything, underestimated, and part of the flattening between 50 and 60 kV reflects the change of model.</w:t>
       </w:r>
     </w:p>
     <w:p>
@@ -42434,7 +42005,7 @@
         <w:pStyle w:val="BodyText"/>
       </w:pPr>
       <w:r>
-        <w:t xml:space="preserve">For tissue with 1 % by mass of I, Gd, Pt, Au or Bi (Fig. 3.17, Table 3.11) the unfiltered beam gives 1.20–1.33, as the dose comes from the Cu K lines and photons below 15 keV, where Pt, Au and Bi (L-edges at about 12–16 keV) absorb about as much energy per unit mass as Ag (Fig. 1.2); only Gd (1.33), whose L-edges at 7.2–8.4 keV absorb the Cu K lines, stands out. With Al 1 mm the DEF becomes 2.13–2.23 for Pt, Au and Bi and 1.71 for Gd, against 1.48 for Ag and 1.46 for I. Above their L-edges Pt, Au and Bi absorb more than Ag over the whole filtered spectrum, including 15–25 keV, where Ag absorbs only through its L and outer shells; Gd (K-edge 50.2 keV, beyond the spectrum) exceeds Ag only below the Ag K-edge, which still contributes much of the dose, and iodine resembles Ag with a higher K-edge (33.2 keV). Sn 0.1 mm lowers the DEF for Ag and I (1.44 for both) by attenuating photons above 29.2 keV, where the Ag/tissue ratio reaches 100–139 and the iodine K-edge lies, but slightly raises it for the heavier elements, whose ratio varies less, through stronger suppression of soft photons (HVL 0.90 versus 0.83 mm Al).</w:t>
+        <w:t xml:space="preserve">For tissue with 1 % by mass of I, Gd, Pt, Au or Bi (Fig. 3.17, Table 3.11) the unfiltered beam gives 1.20–1.33, as the dose comes from the Cu K lines and photons below 15 keV, where Pt, Au and Bi (L-edges at about 12–16 keV) absorb about as much energy per unit mass as Ag (Fig. 1.2); only Gd (1.33), whose L-edges at 7.2–8.4 keV absorb the Cu K lines, stands out. With Al 1 mm the differences grow: above their L-edges Pt, Au and Bi absorb more than Ag over the whole filtered spectrum, including 15–25 keV, where Ag absorbs only through its L and outer shells; Gd (K-edge 50.2 keV, beyond the spectrum) exceeds Ag only below the Ag K-edge, which still contributes much of the dose, and iodine resembles Ag with a higher K-edge (33.2 keV).</w:t>
       </w:r>
     </w:p>
     <w:p>
@@ -43027,45 +42598,7 @@
         <w:pStyle w:val="BodyText"/>
       </w:pPr>
       <w:r>
-        <w:t xml:space="preserve">Per unit mass, Ag is thus a weaker physical sensitizer at 45 kV than Gd, Pt, Au and Bi and comparable to iodine. With Al 1 mm its</w:t>
-      </w:r>
-      <w:r>
-        <w:t xml:space="preserve"> </w:t>
-      </w:r>
-      <m:oMath>
-        <m:r>
-          <m:rPr>
-            <m:sty m:val="p"/>
-          </m:rPr>
-          <m:t>D</m:t>
-        </m:r>
-        <m:r>
-          <m:rPr>
-            <m:sty m:val="p"/>
-          </m:rPr>
-          <m:t>E</m:t>
-        </m:r>
-        <m:r>
-          <m:rPr>
-            <m:sty m:val="p"/>
-          </m:rPr>
-          <m:t>F</m:t>
-        </m:r>
-        <m:r>
-          <m:rPr>
-            <m:sty m:val="p"/>
-          </m:rPr>
-          <m:t>−</m:t>
-        </m:r>
-        <m:r>
-          <m:t>1</m:t>
-        </m:r>
-      </m:oMath>
-      <w:r>
-        <w:t xml:space="preserve"> </w:t>
-      </w:r>
-      <w:r>
-        <w:t xml:space="preserve">(0.48) is less than half that of Au. Its advantages lie elsewhere: a K-edge inside the spectrum, allowing tuning by filtration; biologically active silver nanoparticles (AgNPs) that generate reactive oxygen species (ROS) [37]; and a lower cost than gold or platinum.</w:t>
+        <w:t xml:space="preserve">Sn 0.1 mm lowers the DEF for Ag and I (1.44 for both) by attenuating photons above 29.2 keV, where the Ag/tissue ratio reaches 100–139 and the iodine K-edge lies, but slightly raises it for the heavier elements, whose ratio varies less, through stronger suppression of soft photons (HVL 0.90 versus 0.83 mm Al). Per unit mass, Ag is thus a weaker physical sensitizer at 45 kV than Gd, Pt, Au and Bi and comparable to iodine. Its advantages lie elsewhere: a K-edge inside the spectrum, allowing tuning by filtration; biologically active silver nanoparticles (AgNPs) that generate reactive oxygen species (ROS) [37]; and a lower cost than gold or platinum.</w:t>
       </w:r>
     </w:p>
     <w:p>
@@ -43081,7 +42614,7 @@
         <w:pStyle w:val="FirstParagraph"/>
       </w:pPr>
       <w:r>
-        <w:t xml:space="preserve">The analytical DEFs neglect scatter and assume that the energy of Ag K-fluorescence, excluded from</w:t>
+        <w:t xml:space="preserve">The analytical DEFs neglect scatter and assume that the Ag K-fluorescence energy, excluded from</w:t>
       </w:r>
       <w:r>
         <w:t xml:space="preserve"> </w:t>
@@ -43113,10 +42646,7 @@
         </m:r>
       </m:oMath>
       <w:r>
-        <w:t xml:space="preserve"> </w:t>
-      </w:r>
-      <w:r>
-        <w:t xml:space="preserve">of Ag, escapes. Both assumptions were tested with the Monte Carlo (MC) code and slab geometry of Section 2.7 (1 % Ag in a 10 mm layer at 2–12 mm depth; unfiltered and Al 1 mm-filtered SpekPy spectra;</w:t>
+        <w:t xml:space="preserve">, escapes. Both assumptions were tested with the Monte Carlo (MC) code and slab geometry of Section 2.7 (1 % Ag in a 10 mm layer at 2–12 mm depth; unfiltered and Al 1 mm-filtered SpekPy spectra;</w:t>
       </w:r>
       <w:r>
         <w:t xml:space="preserve"> </w:t>
@@ -43148,15 +42678,7 @@
         <w:t xml:space="preserve"> </w:t>
       </w:r>
       <w:r>
-        <w:t xml:space="preserve">histories in five batches). The reference is the primary-beam kerma model for the same geometry, including attenuation by Ag.</w:t>
-      </w:r>
-    </w:p>
-    <w:p>
-      <w:pPr>
-        <w:pStyle w:val="BodyText"/>
-      </w:pPr>
-      <w:r>
-        <w:t xml:space="preserve">Both methods give the same profile shape (Fig. 3.18; regional averages in Table 3.12). With Al 1 mm the DEF rises sharply at the layer entrance and falls towards the exit through self-shielding. For the unfiltered beam an entrance peak is followed by a minimum at about 3–4 mm and a rise: near the entrance Ag attenuates mainly the soft components that still dominate the dose, whereas deeper, after their absorption, beam hardening prevails. The agreement is within 1.2 % (unfiltered) and 3.0 % (Al 1 mm) at the entrance and 6.5 % and 10.1 % at the exit, MC being higher everywhere.</w:t>
+        <w:t xml:space="preserve">histories in five batches) against the primary-beam kerma model for the same geometry, including attenuation by Ag. The two methods give the same profile shape, MC being higher everywhere (Fig. 3.18; regional averages in Table 3.12). With Al 1 mm the DEF rises sharply at the layer entrance and falls towards the exit through self-shielding. For the unfiltered beam an entrance peak is followed by a minimum at about 3–4 mm and a rise: near the entrance Ag attenuates mainly the soft components that still dominate the dose, whereas deeper, after their absorption, beam hardening prevails.</w:t>
       </w:r>
     </w:p>
     <w:p>
@@ -44044,7 +43566,7 @@
         <w:pStyle w:val="BodyText"/>
       </w:pPr>
       <w:r>
-        <w:t xml:space="preserve">Two effects explain the excess: part of the Ag K-fluorescence (about 22 keV) is reabsorbed, its mean free path in tissue (about 1.5 cm) being comparable to the layer thickness and oblique photons travelling long paths in the laterally infinite layer, and scattered photons add dose. Both build up with depth, hence the growing difference; backward fluorescence also lifts the MC DEF slightly above unity in front of the layer for the filtered beam. Behind the layer the dose drops to 0.80 of the Ag-free value (0.76 analytically), which protects normal tissue behind a loaded tumour but also lowers the dose in tumour regions behind a heavily loaded region. The analytical model thus conservatively underestimates the DEF in a thick loaded region, by up to 10 %.</w:t>
+        <w:t xml:space="preserve">Two effects explain the excess: part of the Ag K-fluorescence (about 22 keV) is reabsorbed, its mean free path in tissue (about 1.5 cm) being comparable to the layer thickness and oblique photons travelling long paths in the laterally infinite layer, and scattered photons add dose. Both build up with depth, hence the growing difference; backward fluorescence also lifts the MC DEF slightly above unity in front of the layer for the filtered beam. Behind the layer the dose drops to 0.80 of the Ag-free value (0.76 analytically), protecting normal tissue behind a loaded tumour but also lowering the dose in tumour regions behind a heavily loaded region. The analytical model thus conservatively underestimates the DEF in a thick loaded region, by up to 10 %.</w:t>
       </w:r>
     </w:p>
     <w:p>
@@ -44060,7 +43582,7 @@
         <w:pStyle w:val="FirstParagraph"/>
       </w:pPr>
       <w:r>
-        <w:t xml:space="preserve">The central result, DEF = 1.482 for 1 % Ag with Al 1 mm, was tested by varying each parameter in turn within its plausible uncertainty (Fig. 3.19, Table 3.13). The tissue coefficient was varied in the loaded and reference media together, so that it acts only through</w:t>
+        <w:t xml:space="preserve">The central result, DEF = 1.482 for 1 % Ag with Al 1 mm, was tested by varying each parameter in turn within its plausible uncertainty (Fig. 3.19, Table 3.13). The tissue coefficient was varied jointly in the loaded and reference media, acting only through</w:t>
       </w:r>
       <w:r>
         <w:t xml:space="preserve"> </w:t>
@@ -44112,7 +43634,7 @@
           <wp:inline>
             <wp:extent cx="4859999" cy="2105620"/>
             <wp:effectExtent b="0" l="0" r="0" t="0"/>
-            <wp:docPr descr="Fig. 3.19. Sensitivity of the dose enhancement factor (1 % Ag, Al 1.0 mm, DEF = 1.482) to the input parameters at the two limits of each variation. Spectrum model: DM versus SpekPy; reference medium: ICRU four-component tissue (larger change) and water; η: relative to the DM value." title="" id="87" name="Picture"/>
+            <wp:docPr descr="Fig. 3.19. Sensitivity of the dose enhancement factor (1 % Ag, Al 1.0 mm, DEF = 1.482) to the input parameters at the two limits of each variation." title="" id="87" name="Picture"/>
             <a:graphic>
               <a:graphicData uri="http://schemas.openxmlformats.org/drawingml/2006/picture">
                 <pic:pic>
@@ -44155,7 +43677,7 @@
         <w:pStyle w:val="ImageCaption"/>
       </w:pPr>
       <w:r>
-        <w:t xml:space="preserve">Fig. 3.19. Sensitivity of the dose enhancement factor (1 % Ag, Al 1.0 mm, DEF = 1.482) to the input parameters at the two limits of each variation. Spectrum model: DM versus SpekPy; reference medium: ICRU four-component tissue (larger change) and water; η: relative to the DM value.</w:t>
+        <w:t xml:space="preserve">Fig. 3.19. Sensitivity of the dose enhancement factor (1 % Ag, Al 1.0 mm, DEF = 1.482) to the input parameters at the two limits of each variation.</w:t>
       </w:r>
     </w:p>
     <w:p>
@@ -44980,7 +44502,7 @@
         <w:t xml:space="preserve"> </w:t>
       </w:r>
       <w:r>
-        <w:t xml:space="preserve">and the DEF increase. Being a matter of definition, this is excluded from the uncertainty, but the reference medium must always be stated. Otherwise the spectrum model dominates (0.018), followed by the Ag coefficient, anode angle and tube voltage (0.009–0.010 each). A smaller anode angle raises the DEF through stronger self-filtration, whereas the Be window is irrelevant (0.0002), as the Al filter removes the photons it would attenuate. Treating each maximum change as the half-width of a rectangular distribution, with uncorrelated parameters, the combined standard uncertainty is</w:t>
+        <w:t xml:space="preserve">and the DEF increase. This choice, a matter of definition, is excluded from the uncertainty but must always be stated. Otherwise the spectrum model dominates (0.018), followed by the Ag coefficient, anode angle and tube voltage (0.009–0.010 each). A smaller anode angle raises the DEF through stronger self-filtration, whereas the Be window is irrelevant (0.0002), as the Al filter removes the photons it would attenuate. Treating each maximum change as the half-width of a rectangular distribution, with uncorrelated parameters, the combined standard uncertainty is</w:t>
       </w:r>
     </w:p>
     <w:tbl>
@@ -45320,7 +44842,7 @@
         </m:r>
       </m:oMath>
       <w:r>
-        <w:t xml:space="preserve">) and the differences between the main filters, so the filtration conclusions are robust. Incorrect interaction data would matter far more: the xraylib 4.3.0 function CS_Energy would give 1.72 instead of 1.48 (Section 2.8).</w:t>
+        <w:t xml:space="preserve">) and about an order of magnitude below the differences between the main filters (0.14–0.32 between 1 mm Al, 2 mm Al and 0.2 mm Cu), so the filtration conclusions are robust. Incorrect interaction data would matter far more: the xraylib 4.3.0 function CS_Energy would give 1.62 instead of 1.48 (Section 2.8).</w:t>
       </w:r>
     </w:p>
     <w:p>
@@ -45336,7 +44858,7 @@
         <w:pStyle w:val="FirstParagraph"/>
       </w:pPr>
       <w:r>
-        <w:t xml:space="preserve">The results agree with earlier work. Enhancement in iodine-loaded tumours under kilovoltage x-rays was calculated in early studies [19, 20]; MC estimates for gold nanoparticles (AuNPs) showed a much larger macroscopic enhancement for kilovoltage than megavoltage beams [10]; and the enhancement by nanoparticles of various elements was characterised versus photon energy with a kerma-based approach like the present one [13]. The depth dependence in orthovoltage beams was studied by MC in phantoms [42]; for Ag, a single surface value cannot characterise a thick target (Section 3.7). This work adds a low-voltage Cu-anode tube, whose spectrum is dominated by lines below the Ag K-edge and whose attainable DEF is set by filtration rather than tube design.</w:t>
+        <w:t xml:space="preserve">Early studies calculated the enhancement in iodine-loaded tumours under kilovoltage x-rays [19, 20]; MC showed a much larger macroscopic enhancement by gold nanoparticles (AuNPs) for kilovoltage than megavoltage beams [10]; and nanoparticle enhancement for various elements was characterised versus photon energy with a similar kerma-based approach [13]. The depth dependence in orthovoltage beams was studied by MC in phantoms [42]; for Ag, a single surface value cannot characterise a thick target (Section 3.7). This work adds a low-voltage Cu-anode tube, whose spectrum is dominated by lines below the Ag K-edge and whose attainable DEF is set by filtration rather than tube design. The MC studies of silver (Section 1.4) used brain-tumour brachytherapy [38], tumour–healthy-tissue [39] and layered-skin [40] geometries, allowing only a qualitative comparison: the dose reduction to about 0.80 behind the loaded layer bears on the healthy-tissue doses of [39], and the per-mass DEFs of Au and Ag (2.16 versus 1.48 with Al 1 mm) on the comparison in [40]. Measurements in AgNP-enriched dose gels [41] could test the calculated DEF if the beam spectrum is specified.</w:t>
       </w:r>
     </w:p>
     <w:p>
@@ -45344,7 +44866,7 @@
         <w:pStyle w:val="BodyText"/>
       </w:pPr>
       <w:r>
-        <w:t xml:space="preserve">The MC studies of silver reviewed in Section 1.4 used brain-tumour brachytherapy [38], tumour–healthy-tissue [39] and layered-skin [40] geometries, allowing only a qualitative comparison: the dose reduction to about 0.80 behind the loaded layer bears on the healthy-tissue doses of [39], and the per-mass DEFs of Au and Ag (2.16 versus 1.48 with Al 1 mm) on the comparison in [40]. Measurements in AgNP-enriched dose gels [41] could test the calculated DEF if the beam spectrum is specified.</w:t>
+        <w:t xml:space="preserve">A discrepancy arises with radiobiology. AgNPs reportedly sensitize cancer cells to ionising radiation [32], act as radiosensitizers for glioma [11] and outperformed AuNPs in U251 glioma cells in vitro and in an intracranial mouse model [12]. Such effects are quantified by the sensitizer enhancement ratio (SER), which, unlike the DEF, reflects all mechanisms [3]. Macroscopic physics predicts the opposite Ag–Au ranking at equal mass fraction and little enhancement at low loading (DEF 1.048 for 0.1 % Ag with Al 1 mm). Although biological effects also depend on radiation quality, concentration and cellular localisation, the reported radiosensitization by AgNPs, especially their advantage over AuNPs, is unlikely to result from macroscopic dose enhancement alone. Two mechanisms may explain it: AgNPs cause ROS formation, damage to deoxyribonucleic acid (DNA), cell-cycle arrest and impaired mitochondrial function in human cells [37], and the dose enhancement around gold nanoparticles is highly localised [30], nanoscale energy deposition explaining effects beyond the macroscopic enhancement [31]. The macroscopic DEF is thus only the physical baseline of a radio-enhancement with chemical and biological stages [7].</w:t>
       </w:r>
     </w:p>
     <w:p>
@@ -45352,7 +44874,7 @@
         <w:pStyle w:val="BodyText"/>
       </w:pPr>
       <w:r>
-        <w:t xml:space="preserve">A larger discrepancy arises with radiobiology. AgNPs reportedly sensitize cancer cells to ionising radiation [32], act as radiosensitizers for glioma [11] and outperformed AuNPs in U251 glioma cells in vitro and in an intracranial mouse model [12]. Such effects are quantified by the sensitizer enhancement ratio (SER), the ratio of doses giving equal effect without and with the sensitizer, which, unlike the DEF, reflects all mechanisms [3]. Macroscopic physics predicts the opposite Ag–Au ranking at equal mass fraction and little enhancement at low loading (DEF 1.048 for 0.1 % Ag with Al 1 mm). Although the biological effect also depends on radiation quality, concentration and cellular localisation, the reported radiosensitization by AgNPs, especially their advantage over AuNPs, is unlikely to result from macroscopic dose enhancement alone. Two mechanisms may explain it: AgNPs cause ROS formation, damage to deoxyribonucleic acid (DNA), cell-cycle arrest and impaired mitochondrial function in human cells [37], and the dose enhancement around gold nanoparticles is highly localised [30], nanoscale energy deposition explaining effects beyond the macroscopic enhancement [31]. The macroscopic DEF is thus only the physical baseline of a radio-enhancement with chemical and biological stages [7].</w:t>
+        <w:t xml:space="preserve">The work has several limitations. The kerma approximation ignores nanoscale dose heterogeneity, and Ag was assumed homogeneous, whereas radiosensitization by nanoparticles depends on their size, concentration and location [97]. The DM assumes isotropic bremsstrahlung and neglects electron backscattering from the anode, which with the approximate Born cross-section overestimates the output (DM/SpekPy air-kerma ratio 1.08–1.42) but not the DEF; its 26–43 % Cu K-line deficit is why the main results use SpekPy spectra. The heel effect was not modelled, the analytical depth calculations neglect scatter and fluorescence reabsorption (Section 3.9), and the MC geometry is a simple slab. No actual tube spectrum was measured, although SpekPy has been validated against measured spectra and HVLs [51], and no biological response was modelled.</w:t>
       </w:r>
     </w:p>
     <w:p>
@@ -45360,15 +44882,7 @@
         <w:pStyle w:val="BodyText"/>
       </w:pPr>
       <w:r>
-        <w:t xml:space="preserve">The work has several limitations. The kerma approximation ignores nanoscale dose heterogeneity, and Ag was assumed homogeneous, whereas radiosensitization by nanoparticles depends on their size, concentration and location [97]. The DM assumes isotropic bremsstrahlung and neglects electron backscattering from the anode, which with the approximate Born cross-section overestimates the output (DM/SpekPy air-kerma ratio 1.08–1.42) but not the DEF; its 25–43 % Cu K-line deficit is why the main results use SpekPy spectra. The heel effect was not modelled, the analytical depth calculations neglect scatter and fluorescence reabsorption (Section 3.9), and the MC geometry is a simple slab. No actual tube spectrum was measured, although SpekPy has been validated against measured spectra and HVLs [51], and no biological response was modelled.</w:t>
-      </w:r>
-    </w:p>
-    <w:p>
-      <w:pPr>
-        <w:pStyle w:val="BodyText"/>
-      </w:pPr>
-      <w:r>
-        <w:t xml:space="preserve">For an experiment with a 45 kV Cu-anode tube, a 1–2 mm Al (or 0.1–0.3 mm Ti) filter is recommended; with Al it gives a DEF of 1.48–1.62 for 1 % Ag and 2 Gy in 14.6–32.5 s at 10 cm and 40 mA (Table 3.8). Thin Cu filters (0.05–0.1 mm) and K-edge filters at 20–30 keV (Mo, Ag, Sn) should be avoided, and 0.2 mm Cu, despite the largest DEF (1.80), needs 158 s for 2 Gy. The beam quality should be verified by an HVL measurement [14] against the calculated first HVL (0.83 mm Al with 1 mm Al, 1.27 mm Al with 2 mm Al). The Ag mass fraction should be at least 0.5 % (DEF 1.24 with 1 mm Al), since at 0.1 % the enhancement is below 5 %. For samples thicker than a few millimetres the DEF should be calculated for the actual depth and loading, with NIST rather than xraylib CS_Energy coefficients, and always reported with the spectrum (or tube voltage, filtration and HVL), reference medium and depth.</w:t>
+        <w:t xml:space="preserve">For an experiment with a 45 kV Cu-anode tube, a 1–2 mm Al (or 0.1–0.3 mm Ti) filter is recommended; with Al it gives a DEF of 1.48–1.62 for 1 % Ag and 2 Gy in 14.6–32.5 s at 10 cm and 40 mA (Table 3.8). Thin Cu filters (0.05–0.1 mm) and K-edge filters at 20–30 keV (Mo, Ag, Sn) should be avoided, and 0.2 mm Cu, despite the largest DEF (1.80), needs 158 s for 2 Gy. The beam quality should be verified by an HVL measurement [14] against the calculated first HVL (0.83 mm Al with 1 mm Al, 1.27 mm Al with 2 mm Al). The Ag mass fraction should be at least 0.5 % (DEF 1.24 with 1 mm Al), since at 0.1 % the enhancement is below 5 %. For samples thicker than a few millimetres the DEF should be calculated for the actual depth and loading with NIST (not xraylib CS_Energy) coefficients and reported with the spectrum (or tube voltage, filtration and HVL), reference medium and depth.</w:t>
       </w:r>
     </w:p>
     <w:p>
@@ -45408,7 +44922,7 @@
         </m:r>
       </m:oMath>
       <w:r>
-        <w:t xml:space="preserve">) agrees with SpekPy for Al-filtered beams within −3.5 to −4.6 % in HVL and 2 % in DEF but underestimates the Cu K lines by 25–43 %.</w:t>
+        <w:t xml:space="preserve">) agrees with SpekPy within −3.5 to −4.6 % in HVL for 1 mm Al and within 2 % in DEF for Al filters but underestimates the Cu K lines by 26–43 %.</w:t>
       </w:r>
     </w:p>
     <w:p>
@@ -45516,7 +45030,7 @@
         </w:numPr>
       </w:pPr>
       <w:r>
-        <w:t xml:space="preserve">High-Z dose enhancement is much larger for kilovoltage than megavoltage photons, and silver nanoparticles were reported to radiosensitize glioma, breast and colorectal cancer models. The Ag/tissue ratio of mass energy-absorption coefficients rises from 21–32 below the Ag K-edge (25.514 keV) to 100–139 at 30–45 keV, but the dependence of the dose enhancement factor (DEF) on copper-anode tube design and filtration had not been quantified.</w:t>
+        <w:t xml:space="preserve">High-Z dose enhancement is much larger for kilovoltage than megavoltage photons, and silver nanoparticles were reported to radiosensitize glioma, breast and colorectal cancer models. The Ag/tissue ratio of mass energy-absorption coefficients rises from 21–32 below the Ag K-edge (25.514 keV) to 103–139 at 30–45 keV, but the dependence of the dose enhancement factor (DEF) on copper-anode tube design and filtration had not been quantified.</w:t>
       </w:r>
     </w:p>
     <w:p>
@@ -45558,7 +45072,7 @@
         </m:r>
       </m:oMath>
       <w:r>
-        <w:t xml:space="preserve">, was fitted to the SpekPy v2 bremsstrahlung shape at 45 kV (root-mean-square deviation 2.46 %). Without refitting, the DM reproduces the half-value layer (HVL) of 1 mm Al-filtered beams at 25–50 kV and 6–30° anode angles within −3.5 to −4.6 %; it underestimates the Cu K lines by 25–43 % and overestimates the air kerma by 8–42 %, yet its DEFs with Al filters agree with SpekPy within 2 %.</w:t>
+        <w:t xml:space="preserve">, was fitted to the SpekPy v2 bremsstrahlung shape at 45 kV (root-mean-square deviation 2.46 %). Without refitting, the DM reproduces the half-value layer (HVL) of 1 mm Al-filtered beams at 25–50 kV and 6–30° anode angles within −3.5 to −4.6 %; it underestimates the Cu K lines by 26–43 % and overestimates the air kerma by 8–42 %, yet its DEFs with Al filters agree with SpekPy within 2 %.</w:t>
       </w:r>
     </w:p>
     <w:p>
@@ -45580,7 +45094,7 @@
         </w:numPr>
       </w:pPr>
       <w:r>
-        <w:t xml:space="preserve">Anode angle (6–30°), voltage (25–50 kV) and Be window (0.15–2 mm) change the air kerma within 163–463 mGy/mAs but the DEF for 1 % Ag only within 1.19–1.21, because the dose comes mainly from Cu K lines and 3–15 keV photons, where the Ag/tissue ratio is only 21–27.</w:t>
+        <w:t xml:space="preserve">Anode angle (6–30°), voltage (25–50 kV) and Be window (0.15–2 mm) change the air kerma within 163–463 mGy/mAs but the DEF for 1 % Ag only within 1.19–1.21, because the dose comes mainly from the Cu K lines and photons below 15 keV, where the Ag/tissue ratio does not exceed 27 (21–22 at the Cu K lines).</w:t>
       </w:r>
     </w:p>
     <w:p>
@@ -45652,7 +45166,7 @@
         </m:r>
       </m:oMath>
       <w:r>
-        <w:t xml:space="preserve">); the reference medium changes it by up to 0.057. The xraylib 4.3.0 function CS_Energy underestimates the oxygen mass energy-absorption coefficient at 30 keV by 37 %, which would raise this DEF to 1.72, so NIST tables must be used.</w:t>
+        <w:t xml:space="preserve">); the reference medium changes it by up to 0.057. The xraylib 4.3.0 function CS_Energy underestimates the oxygen mass energy-absorption coefficient at 30 keV by 37 %, which would raise this DEF to 1.62, so NIST tables must be used.</w:t>
       </w:r>
     </w:p>
     <w:p>
@@ -50827,6 +50341,7 @@
     <w:pPr>
       <w:keepNext w:val="0"/>
       <w:widowControl/>
+      <w:suppressAutoHyphens/>
       <w:spacing w:after="0" w:before="0" w:line="360" w:lineRule="auto"/>
       <w:ind w:firstLine="0" w:left="0"/>
       <w:jc w:val="both"/>
@@ -50847,6 +50362,7 @@
     <w:pPr>
       <w:keepNext/>
       <w:keepLines/>
+      <w:suppressAutoHyphens/>
       <w:spacing w:after="240" w:before="480"/>
       <w:jc w:val="center"/>
     </w:pPr>
@@ -50960,6 +50476,7 @@
       <w:keepLines/>
       <w:pageBreakBefore/>
       <w:widowControl/>
+      <w:suppressAutoHyphens/>
       <w:spacing w:after="240" w:before="0" w:line="360" w:lineRule="auto"/>
       <w:ind w:firstLine="0" w:left="0"/>
       <w:jc w:val="center"/>
@@ -50987,6 +50504,7 @@
       <w:keepNext/>
       <w:keepLines/>
       <w:widowControl/>
+      <w:suppressAutoHyphens/>
       <w:spacing w:after="120" w:before="240" w:line="360" w:lineRule="auto"/>
       <w:ind w:firstLine="709" w:left="0"/>
       <w:jc w:val="left"/>
@@ -51014,6 +50532,7 @@
       <w:keepNext/>
       <w:keepLines/>
       <w:widowControl/>
+      <w:suppressAutoHyphens/>
       <w:spacing w:after="60" w:before="120" w:line="360" w:lineRule="auto"/>
       <w:ind w:firstLine="709" w:left="0"/>
       <w:jc w:val="left"/>
@@ -51040,6 +50559,7 @@
     <w:pPr>
       <w:keepNext/>
       <w:keepLines/>
+      <w:suppressAutoHyphens/>
       <w:spacing w:after="0" w:before="200"/>
       <w:outlineLvl w:val="3"/>
     </w:pPr>
@@ -51063,6 +50583,7 @@
     <w:pPr>
       <w:keepNext/>
       <w:keepLines/>
+      <w:suppressAutoHyphens/>
       <w:spacing w:after="0" w:before="200"/>
       <w:outlineLvl w:val="4"/>
     </w:pPr>
@@ -51085,6 +50606,7 @@
     <w:pPr>
       <w:keepNext/>
       <w:keepLines/>
+      <w:suppressAutoHyphens/>
       <w:spacing w:after="0" w:before="200"/>
       <w:outlineLvl w:val="5"/>
     </w:pPr>
@@ -51106,6 +50628,7 @@
     <w:pPr>
       <w:keepNext/>
       <w:keepLines/>
+      <w:suppressAutoHyphens/>
       <w:spacing w:after="0" w:before="200"/>
       <w:outlineLvl w:val="6"/>
     </w:pPr>
@@ -51127,6 +50650,7 @@
     <w:pPr>
       <w:keepNext/>
       <w:keepLines/>
+      <w:suppressAutoHyphens/>
       <w:spacing w:after="0" w:before="200"/>
       <w:outlineLvl w:val="7"/>
     </w:pPr>
@@ -51148,6 +50672,7 @@
     <w:pPr>
       <w:keepNext/>
       <w:keepLines/>
+      <w:suppressAutoHyphens/>
       <w:spacing w:after="0" w:before="200"/>
       <w:outlineLvl w:val="8"/>
     </w:pPr>
@@ -51255,6 +50780,7 @@
     <w:pPr>
       <w:keepNext w:val="0"/>
       <w:widowControl/>
+      <w:suppressAutoHyphens/>
       <w:spacing w:after="200" w:before="40" w:line="240" w:lineRule="auto"/>
       <w:ind w:firstLine="0" w:left="0"/>
       <w:jc w:val="center"/>
@@ -51273,6 +50799,7 @@
     <w:pPr>
       <w:keepNext/>
       <w:widowControl/>
+      <w:suppressAutoHyphens/>
       <w:spacing w:after="80" w:before="160" w:line="240" w:lineRule="auto"/>
       <w:ind w:firstLine="0" w:left="0"/>
       <w:jc w:val="left"/>
@@ -51291,6 +50818,7 @@
     <w:pPr>
       <w:keepNext w:val="0"/>
       <w:widowControl/>
+      <w:suppressAutoHyphens/>
       <w:spacing w:after="200" w:before="40" w:line="240" w:lineRule="auto"/>
       <w:ind w:firstLine="0" w:left="0"/>
       <w:jc w:val="center"/>
@@ -51323,6 +50851,7 @@
     <w:pPr>
       <w:keepNext/>
       <w:widowControl/>
+      <w:suppressAutoHyphens/>
       <w:spacing w:after="0" w:before="120" w:line="240" w:lineRule="auto"/>
       <w:ind w:firstLine="0" w:left="0"/>
       <w:jc w:val="center"/>
@@ -51379,6 +50908,7 @@
     <w:unhideWhenUsed/>
     <w:qFormat/>
     <w:pPr>
+      <w:suppressAutoHyphens/>
       <w:spacing w:before="240" w:line="259" w:lineRule="auto"/>
       <w:outlineLvl w:val="9"/>
     </w:pPr>
@@ -51396,6 +50926,7 @@
     <w:pPr>
       <w:keepNext w:val="0"/>
       <w:widowControl/>
+      <w:suppressAutoHyphens/>
       <w:spacing w:after="0" w:before="0" w:line="240" w:lineRule="auto"/>
       <w:ind w:firstLine="0" w:left="0"/>
       <w:jc w:val="left"/>
@@ -51414,6 +50945,7 @@
     <w:pPr>
       <w:keepNext w:val="0"/>
       <w:widowControl/>
+      <w:suppressAutoHyphens/>
       <w:spacing w:after="40" w:before="0" w:line="240" w:lineRule="auto"/>
       <w:ind w:hanging="425" w:left="425"/>
       <w:jc w:val="both"/>
@@ -51432,6 +50964,7 @@
     <w:pPr>
       <w:keepNext w:val="0"/>
       <w:widowControl/>
+      <w:suppressAutoHyphens/>
       <w:spacing w:after="0" w:before="0" w:line="276" w:lineRule="auto"/>
       <w:ind w:firstLine="0" w:left="0"/>
       <w:jc w:val="center"/>
@@ -51450,6 +50983,7 @@
     <w:pPr>
       <w:keepNext w:val="0"/>
       <w:widowControl/>
+      <w:suppressAutoHyphens/>
       <w:spacing w:after="0" w:before="0" w:line="276" w:lineRule="auto"/>
       <w:ind w:firstLine="0" w:left="0"/>
       <w:jc w:val="right"/>
@@ -51468,6 +51002,7 @@
     <w:pPr>
       <w:keepNext w:val="0"/>
       <w:widowControl/>
+      <w:suppressAutoHyphens/>
       <w:spacing w:after="0" w:before="0" w:line="276" w:lineRule="auto"/>
       <w:ind w:firstLine="0" w:left="0"/>
       <w:jc w:val="left"/>
@@ -51486,6 +51021,7 @@
     <w:pPr>
       <w:keepNext w:val="0"/>
       <w:widowControl/>
+      <w:suppressAutoHyphens/>
       <w:spacing w:after="0" w:before="0" w:line="276" w:lineRule="auto"/>
       <w:ind w:firstLine="0" w:left="0"/>
       <w:jc w:val="center"/>
@@ -51541,6 +51077,7 @@
     <w:pPr>
       <w:keepNext w:val="0"/>
       <w:widowControl/>
+      <w:suppressAutoHyphens/>
       <w:spacing w:after="40" w:before="0" w:line="276" w:lineRule="auto"/>
       <w:ind w:firstLine="0" w:left="0"/>
       <w:jc w:val="left"/>
@@ -51559,6 +51096,7 @@
     <w:pPr>
       <w:keepNext w:val="0"/>
       <w:widowControl/>
+      <w:suppressAutoHyphens/>
       <w:spacing w:after="40" w:before="0" w:line="276" w:lineRule="auto"/>
       <w:ind w:firstLine="0" w:left="425"/>
       <w:jc w:val="left"/>

</xml_diff>

<commit_message>
Build: upright text in math (DEF, Ag, function names) for LibreOffice; rebuild all volumes
Co-Authored-By: Claude Opus 5.5 <noreply@anthropic.com>
Claude-Session: https://claude.ai/code/session_01WcXt6iEQKTpJkT13ui6H64
</commit_message>
<xml_diff>
--- a/dissertation/build/en/Dissertation_en.docx
+++ b/dissertation/build/en/Dissertation_en.docx
@@ -337,6 +337,7 @@
       </w:r>
       <w:r>
         <w:tab/>
+        <w:t>7</w:t>
       </w:r>
     </w:p>
     <w:p>
@@ -355,6 +356,7 @@
       </w:r>
       <w:r>
         <w:tab/>
+        <w:t>9</w:t>
       </w:r>
     </w:p>
     <w:p>
@@ -373,6 +375,7 @@
       </w:r>
       <w:r>
         <w:tab/>
+        <w:t>14</w:t>
       </w:r>
     </w:p>
     <w:p>
@@ -388,6 +391,7 @@
       </w:r>
       <w:r>
         <w:tab/>
+        <w:t>14</w:t>
       </w:r>
     </w:p>
     <w:p>
@@ -403,6 +407,7 @@
       </w:r>
       <w:r>
         <w:tab/>
+        <w:t>15</w:t>
       </w:r>
     </w:p>
     <w:p>
@@ -418,6 +423,7 @@
       </w:r>
       <w:r>
         <w:tab/>
+        <w:t>18</w:t>
       </w:r>
     </w:p>
     <w:p>
@@ -433,6 +439,7 @@
       </w:r>
       <w:r>
         <w:tab/>
+        <w:t>21</w:t>
       </w:r>
     </w:p>
     <w:p>
@@ -448,6 +455,7 @@
       </w:r>
       <w:r>
         <w:tab/>
+        <w:t>23</w:t>
       </w:r>
     </w:p>
     <w:p>
@@ -463,6 +471,7 @@
       </w:r>
       <w:r>
         <w:tab/>
+        <w:t>25</w:t>
       </w:r>
     </w:p>
     <w:p>
@@ -481,6 +490,7 @@
       </w:r>
       <w:r>
         <w:tab/>
+        <w:t>26</w:t>
       </w:r>
     </w:p>
     <w:p>
@@ -496,6 +506,7 @@
       </w:r>
       <w:r>
         <w:tab/>
+        <w:t>26</w:t>
       </w:r>
     </w:p>
     <w:p>
@@ -511,6 +522,7 @@
       </w:r>
       <w:r>
         <w:tab/>
+        <w:t>28</w:t>
       </w:r>
     </w:p>
     <w:p>
@@ -526,6 +538,7 @@
       </w:r>
       <w:r>
         <w:tab/>
+        <w:t>29</w:t>
       </w:r>
     </w:p>
     <w:p>
@@ -541,6 +554,7 @@
       </w:r>
       <w:r>
         <w:tab/>
+        <w:t>31</w:t>
       </w:r>
     </w:p>
     <w:p>
@@ -556,6 +570,7 @@
       </w:r>
       <w:r>
         <w:tab/>
+        <w:t>34</w:t>
       </w:r>
     </w:p>
     <w:p>
@@ -571,6 +586,7 @@
       </w:r>
       <w:r>
         <w:tab/>
+        <w:t>35</w:t>
       </w:r>
     </w:p>
     <w:p>
@@ -586,6 +602,7 @@
       </w:r>
       <w:r>
         <w:tab/>
+        <w:t>38</w:t>
       </w:r>
     </w:p>
     <w:p>
@@ -601,6 +618,7 @@
       </w:r>
       <w:r>
         <w:tab/>
+        <w:t>40</w:t>
       </w:r>
     </w:p>
     <w:p>
@@ -616,6 +634,7 @@
       </w:r>
       <w:r>
         <w:tab/>
+        <w:t>41</w:t>
       </w:r>
     </w:p>
     <w:p>
@@ -631,6 +650,7 @@
       </w:r>
       <w:r>
         <w:tab/>
+        <w:t>41</w:t>
       </w:r>
     </w:p>
     <w:p>
@@ -649,6 +669,7 @@
       </w:r>
       <w:r>
         <w:tab/>
+        <w:t>43</w:t>
       </w:r>
     </w:p>
     <w:p>
@@ -664,6 +685,7 @@
       </w:r>
       <w:r>
         <w:tab/>
+        <w:t>43</w:t>
       </w:r>
     </w:p>
     <w:p>
@@ -679,6 +701,7 @@
       </w:r>
       <w:r>
         <w:tab/>
+        <w:t>47</w:t>
       </w:r>
     </w:p>
     <w:p>
@@ -694,6 +717,7 @@
       </w:r>
       <w:r>
         <w:tab/>
+        <w:t>48</w:t>
       </w:r>
     </w:p>
     <w:p>
@@ -709,6 +733,7 @@
       </w:r>
       <w:r>
         <w:tab/>
+        <w:t>51</w:t>
       </w:r>
     </w:p>
     <w:p>
@@ -724,6 +749,7 @@
       </w:r>
       <w:r>
         <w:tab/>
+        <w:t>54</w:t>
       </w:r>
     </w:p>
     <w:p>
@@ -739,6 +765,7 @@
       </w:r>
       <w:r>
         <w:tab/>
+        <w:t>57</w:t>
       </w:r>
     </w:p>
     <w:p>
@@ -754,6 +781,7 @@
       </w:r>
       <w:r>
         <w:tab/>
+        <w:t>60</w:t>
       </w:r>
     </w:p>
     <w:p>
@@ -769,6 +797,7 @@
       </w:r>
       <w:r>
         <w:tab/>
+        <w:t>63</w:t>
       </w:r>
     </w:p>
     <w:p>
@@ -784,6 +813,7 @@
       </w:r>
       <w:r>
         <w:tab/>
+        <w:t>65</w:t>
       </w:r>
     </w:p>
     <w:p>
@@ -799,6 +829,7 @@
       </w:r>
       <w:r>
         <w:tab/>
+        <w:t>66</w:t>
       </w:r>
     </w:p>
     <w:p>
@@ -814,6 +845,7 @@
       </w:r>
       <w:r>
         <w:tab/>
+        <w:t>68</w:t>
       </w:r>
     </w:p>
     <w:p>
@@ -829,6 +861,7 @@
       </w:r>
       <w:r>
         <w:tab/>
+        <w:t>70</w:t>
       </w:r>
     </w:p>
     <w:p>
@@ -847,6 +880,7 @@
       </w:r>
       <w:r>
         <w:tab/>
+        <w:t>70</w:t>
       </w:r>
     </w:p>
     <w:p>
@@ -862,6 +896,7 @@
       </w:r>
       <w:r>
         <w:tab/>
+        <w:t>72</w:t>
       </w:r>
     </w:p>
     <w:p>
@@ -877,6 +912,7 @@
       </w:r>
       <w:r>
         <w:tab/>
+        <w:t>73</w:t>
       </w:r>
     </w:p>
     <w:p>
@@ -895,6 +931,7 @@
       </w:r>
       <w:r>
         <w:tab/>
+        <w:t>74</w:t>
       </w:r>
     </w:p>
     <w:p>
@@ -913,6 +950,7 @@
       </w:r>
       <w:r>
         <w:tab/>
+        <w:t>82</w:t>
       </w:r>
     </w:p>
     <w:p>
@@ -928,6 +966,7 @@
       </w:r>
       <w:r>
         <w:tab/>
+        <w:t>82</w:t>
       </w:r>
     </w:p>
     <w:p>
@@ -943,6 +982,7 @@
       </w:r>
       <w:r>
         <w:tab/>
+        <w:t>84</w:t>
       </w:r>
     </w:p>
     <w:p>
@@ -2011,21 +2051,9 @@
                 <m:sub>
                   <m:r>
                     <m:rPr>
-                      <m:sty m:val="p"/>
+                      <m:nor/>
                     </m:rPr>
-                    <m:t>a</m:t>
-                  </m:r>
-                  <m:r>
-                    <m:rPr>
-                      <m:sty m:val="p"/>
-                    </m:rPr>
-                    <m:t>i</m:t>
-                  </m:r>
-                  <m:r>
-                    <m:rPr>
-                      <m:sty m:val="p"/>
-                    </m:rPr>
-                    <m:t>r</m:t>
+                    <m:t>air</m:t>
                   </m:r>
                 </m:sub>
               </m:sSub>
@@ -3517,7 +3545,7 @@
         <w:t xml:space="preserve"> </w:t>
       </w:r>
       <w:r>
-        <w:t xml:space="preserve">The dissertation comprises annotations, a list of abbreviations, an introduction, three chapters, conclusions, references and appendices: 90 pages, 0 figures, 0 tables and 121 references. Chapter 1 reviews the literature, Chapter 2 presents the methods and Chapter 3 the results and discussion.</w:t>
+        <w:t xml:space="preserve">The dissertation comprises annotations, a list of abbreviations, an introduction, three chapters, conclusions, references and appendices: 84 pages, 23 figures, 17 tables and 121 references. Chapter 1 reviews the literature, Chapter 2 presents the methods and Chapter 3 the results and discussion.</w:t>
       </w:r>
     </w:p>
     <w:p>
@@ -3728,21 +3756,9 @@
                       <m:sub>
                         <m:r>
                           <m:rPr>
-                            <m:sty m:val="p"/>
+                            <m:nor/>
                           </m:rPr>
-                          <m:t>c</m:t>
-                        </m:r>
-                        <m:r>
-                          <m:rPr>
-                            <m:sty m:val="p"/>
-                          </m:rPr>
-                          <m:t>o</m:t>
-                        </m:r>
-                        <m:r>
-                          <m:rPr>
-                            <m:sty m:val="p"/>
-                          </m:rPr>
-                          <m:t>h</m:t>
+                          <m:t>coh</m:t>
                         </m:r>
                       </m:sub>
                     </m:sSub>
@@ -3773,21 +3789,9 @@
                       <m:sub>
                         <m:r>
                           <m:rPr>
-                            <m:sty m:val="p"/>
+                            <m:nor/>
                           </m:rPr>
-                          <m:t>i</m:t>
-                        </m:r>
-                        <m:r>
-                          <m:rPr>
-                            <m:sty m:val="p"/>
-                          </m:rPr>
-                          <m:t>n</m:t>
-                        </m:r>
-                        <m:r>
-                          <m:rPr>
-                            <m:sty m:val="p"/>
-                          </m:rPr>
-                          <m:t>c</m:t>
+                          <m:t>inc</m:t>
                         </m:r>
                       </m:sub>
                     </m:sSub>
@@ -3891,21 +3895,9 @@
           <m:sub>
             <m:r>
               <m:rPr>
-                <m:sty m:val="p"/>
+                <m:nor/>
               </m:rPr>
-              <m:t>c</m:t>
-            </m:r>
-            <m:r>
-              <m:rPr>
-                <m:sty m:val="p"/>
-              </m:rPr>
-              <m:t>o</m:t>
-            </m:r>
-            <m:r>
-              <m:rPr>
-                <m:sty m:val="p"/>
-              </m:rPr>
-              <m:t>h</m:t>
+              <m:t>coh</m:t>
             </m:r>
           </m:sub>
         </m:sSub>
@@ -3938,21 +3930,9 @@
           <m:sub>
             <m:r>
               <m:rPr>
-                <m:sty m:val="p"/>
+                <m:nor/>
               </m:rPr>
-              <m:t>i</m:t>
-            </m:r>
-            <m:r>
-              <m:rPr>
-                <m:sty m:val="p"/>
-              </m:rPr>
-              <m:t>n</m:t>
-            </m:r>
-            <m:r>
-              <m:rPr>
-                <m:sty m:val="p"/>
-              </m:rPr>
-              <m:t>c</m:t>
+              <m:t>inc</m:t>
             </m:r>
           </m:sub>
         </m:sSub>
@@ -4457,21 +4437,9 @@
                           <m:sub>
                             <m:r>
                               <m:rPr>
-                                <m:sty m:val="p"/>
+                                <m:nor/>
                               </m:rPr>
-                              <m:t>i</m:t>
-                            </m:r>
-                            <m:r>
-                              <m:rPr>
-                                <m:sty m:val="p"/>
-                              </m:rPr>
-                              <m:t>n</m:t>
-                            </m:r>
-                            <m:r>
-                              <m:rPr>
-                                <m:sty m:val="p"/>
-                              </m:rPr>
-                              <m:t>c</m:t>
+                              <m:t>inc</m:t>
                             </m:r>
                           </m:sub>
                         </m:sSub>
@@ -4506,21 +4474,9 @@
                           <m:sub>
                             <m:r>
                               <m:rPr>
-                                <m:sty m:val="p"/>
+                                <m:nor/>
                               </m:rPr>
-                              <m:t>i</m:t>
-                            </m:r>
-                            <m:r>
-                              <m:rPr>
-                                <m:sty m:val="p"/>
-                              </m:rPr>
-                              <m:t>n</m:t>
-                            </m:r>
-                            <m:r>
-                              <m:rPr>
-                                <m:sty m:val="p"/>
-                              </m:rPr>
-                              <m:t>c</m:t>
+                              <m:t>inc</m:t>
                             </m:r>
                           </m:sub>
                         </m:sSub>
@@ -4624,21 +4580,9 @@
           <m:sub>
             <m:r>
               <m:rPr>
-                <m:sty m:val="p"/>
+                <m:nor/>
               </m:rPr>
-              <m:t>i</m:t>
-            </m:r>
-            <m:r>
-              <m:rPr>
-                <m:sty m:val="p"/>
-              </m:rPr>
-              <m:t>n</m:t>
-            </m:r>
-            <m:r>
-              <m:rPr>
-                <m:sty m:val="p"/>
-              </m:rPr>
-              <m:t>c</m:t>
+              <m:t>inc</m:t>
             </m:r>
           </m:sub>
         </m:sSub>
@@ -4705,21 +4649,9 @@
           <m:sub>
             <m:r>
               <m:rPr>
-                <m:sty m:val="p"/>
+                <m:nor/>
               </m:rPr>
-              <m:t>c</m:t>
-            </m:r>
-            <m:r>
-              <m:rPr>
-                <m:sty m:val="p"/>
-              </m:rPr>
-              <m:t>o</m:t>
-            </m:r>
-            <m:r>
-              <m:rPr>
-                <m:sty m:val="p"/>
-              </m:rPr>
-              <m:t>l</m:t>
+              <m:t>col</m:t>
             </m:r>
           </m:sub>
         </m:sSub>
@@ -4798,21 +4730,9 @@
                   <m:sub>
                     <m:r>
                       <m:rPr>
-                        <m:sty m:val="p"/>
+                        <m:nor/>
                       </m:rPr>
-                      <m:t>c</m:t>
-                    </m:r>
-                    <m:r>
-                      <m:rPr>
-                        <m:sty m:val="p"/>
-                      </m:rPr>
-                      <m:t>o</m:t>
-                    </m:r>
-                    <m:r>
-                      <m:rPr>
-                        <m:sty m:val="p"/>
-                      </m:rPr>
-                      <m:t>l</m:t>
+                      <m:t>col</m:t>
                     </m:r>
                   </m:sub>
                 </m:sSub>
@@ -7607,7 +7527,7 @@
                   <m:e>
                     <m:r>
                       <m:rPr>
-                        <m:sty m:val="p"/>
+                        <m:nor/>
                       </m:rPr>
                       <m:t>ln</m:t>
                     </m:r>
@@ -8342,7 +8262,7 @@
                     </m:r>
                     <m:r>
                       <m:rPr>
-                        <m:sty m:val="p"/>
+                        <m:nor/>
                       </m:rPr>
                       <m:t>ln</m:t>
                     </m:r>
@@ -8551,7 +8471,7 @@
                       <m:num>
                         <m:r>
                           <m:rPr>
-                            <m:sty m:val="p"/>
+                            <m:nor/>
                           </m:rPr>
                           <m:t>d</m:t>
                         </m:r>
@@ -8653,7 +8573,7 @@
           <m:sub>
             <m:r>
               <m:rPr>
-                <m:sty m:val="p"/>
+                <m:nor/>
               </m:rPr>
               <m:t>min</m:t>
             </m:r>
@@ -8886,7 +8806,7 @@
                 </m:r>
                 <m:r>
                   <m:rPr>
-                    <m:sty m:val="p"/>
+                    <m:nor/>
                   </m:rPr>
                   <m:t>cos</m:t>
                 </m:r>
@@ -9195,7 +9115,7 @@
                   <m:num>
                     <m:r>
                       <m:rPr>
-                        <m:sty m:val="p"/>
+                        <m:nor/>
                       </m:rPr>
                       <m:t>d</m:t>
                     </m:r>
@@ -9208,15 +9128,9 @@
                       <m:sub>
                         <m:r>
                           <m:rPr>
-                            <m:sty m:val="p"/>
+                            <m:nor/>
                           </m:rPr>
-                          <m:t>K</m:t>
-                        </m:r>
-                        <m:r>
-                          <m:rPr>
-                            <m:sty m:val="p"/>
-                          </m:rPr>
-                          <m:t>r</m:t>
+                          <m:t>Kr</m:t>
                         </m:r>
                       </m:sub>
                     </m:sSub>
@@ -9224,7 +9138,7 @@
                   <m:den>
                     <m:r>
                       <m:rPr>
-                        <m:sty m:val="p"/>
+                        <m:nor/>
                       </m:rPr>
                       <m:t>d</m:t>
                     </m:r>
@@ -9373,7 +9287,7 @@
       <m:oMath>
         <m:r>
           <m:rPr>
-            <m:sty m:val="p"/>
+            <m:nor/>
           </m:rPr>
           <m:t>d</m:t>
         </m:r>
@@ -9386,15 +9300,9 @@
           <m:sub>
             <m:r>
               <m:rPr>
-                <m:sty m:val="p"/>
+                <m:nor/>
               </m:rPr>
-              <m:t>K</m:t>
-            </m:r>
-            <m:r>
-              <m:rPr>
-                <m:sty m:val="p"/>
-              </m:rPr>
-              <m:t>r</m:t>
+              <m:t>Kr</m:t>
             </m:r>
           </m:sub>
         </m:sSub>
@@ -9406,7 +9314,7 @@
         </m:r>
         <m:r>
           <m:rPr>
-            <m:sty m:val="p"/>
+            <m:nor/>
           </m:rPr>
           <m:t>d</m:t>
         </m:r>
@@ -9641,7 +9549,7 @@
                   <m:num>
                     <m:r>
                       <m:rPr>
-                        <m:sty m:val="p"/>
+                        <m:nor/>
                       </m:rPr>
                       <m:t>d</m:t>
                     </m:r>
@@ -9654,7 +9562,7 @@
                       <m:sub>
                         <m:r>
                           <m:rPr>
-                            <m:sty m:val="p"/>
+                            <m:nor/>
                           </m:rPr>
                           <m:t>B</m:t>
                         </m:r>
@@ -9664,7 +9572,7 @@
                   <m:den>
                     <m:r>
                       <m:rPr>
-                        <m:sty m:val="p"/>
+                        <m:nor/>
                       </m:rPr>
                       <m:t>d</m:t>
                     </m:r>
@@ -9766,7 +9674,7 @@
                 </m:r>
                 <m:r>
                   <m:rPr>
-                    <m:sty m:val="p"/>
+                    <m:nor/>
                   </m:rPr>
                   <m:t>ln</m:t>
                 </m:r>
@@ -10312,7 +10220,7 @@
                     </m:r>
                     <m:r>
                       <m:rPr>
-                        <m:sty m:val="p"/>
+                        <m:nor/>
                       </m:rPr>
                       <m:t>exp</m:t>
                     </m:r>
@@ -10371,7 +10279,7 @@
                     </m:r>
                     <m:r>
                       <m:rPr>
-                        <m:sty m:val="p"/>
+                        <m:nor/>
                       </m:rPr>
                       <m:t>exp</m:t>
                     </m:r>
@@ -10448,7 +10356,7 @@
       <m:oMath>
         <m:r>
           <m:rPr>
-            <m:sty m:val="p"/>
+            <m:nor/>
           </m:rPr>
           <m:t>d</m:t>
         </m:r>
@@ -10463,7 +10371,7 @@
         </m:r>
         <m:r>
           <m:rPr>
-            <m:sty m:val="p"/>
+            <m:nor/>
           </m:rPr>
           <m:t>d</m:t>
         </m:r>
@@ -10493,7 +10401,7 @@
         </m:r>
         <m:r>
           <m:rPr>
-            <m:sty m:val="p"/>
+            <m:nor/>
           </m:rPr>
           <m:t>d</m:t>
         </m:r>
@@ -10506,7 +10414,7 @@
           <m:sub>
             <m:r>
               <m:rPr>
-                <m:sty m:val="p"/>
+                <m:nor/>
               </m:rPr>
               <m:t>B</m:t>
             </m:r>
@@ -10520,7 +10428,7 @@
         </m:r>
         <m:r>
           <m:rPr>
-            <m:sty m:val="p"/>
+            <m:nor/>
           </m:rPr>
           <m:t>d</m:t>
         </m:r>
@@ -10640,7 +10548,7 @@
         </m:r>
         <m:r>
           <m:rPr>
-            <m:sty m:val="p"/>
+            <m:nor/>
           </m:rPr>
           <m:t>d</m:t>
         </m:r>
@@ -10678,7 +10586,7 @@
       <m:oMath>
         <m:r>
           <m:rPr>
-            <m:sty m:val="p"/>
+            <m:nor/>
           </m:rPr>
           <m:t>d</m:t>
         </m:r>
@@ -10736,7 +10644,7 @@
         </m:r>
         <m:r>
           <m:rPr>
-            <m:sty m:val="p"/>
+            <m:nor/>
           </m:rPr>
           <m:t>sin</m:t>
         </m:r>
@@ -10900,7 +10808,7 @@
                   <m:num>
                     <m:r>
                       <m:rPr>
-                        <m:sty m:val="p"/>
+                        <m:nor/>
                       </m:rPr>
                       <m:t>d</m:t>
                     </m:r>
@@ -10911,7 +10819,7 @@
                   <m:den>
                     <m:r>
                       <m:rPr>
-                        <m:sty m:val="p"/>
+                        <m:nor/>
                       </m:rPr>
                       <m:t>d</m:t>
                     </m:r>
@@ -10943,7 +10851,7 @@
                 </m:r>
                 <m:r>
                   <m:rPr>
-                    <m:sty m:val="p"/>
+                    <m:nor/>
                   </m:rPr>
                   <m:t>exp</m:t>
                 </m:r>
@@ -10997,7 +10905,7 @@
                       <m:den>
                         <m:r>
                           <m:rPr>
-                            <m:sty m:val="p"/>
+                            <m:nor/>
                           </m:rPr>
                           <m:t>sin</m:t>
                         </m:r>
@@ -11010,7 +10918,7 @@
                 </m:d>
                 <m:r>
                   <m:rPr>
-                    <m:sty m:val="p"/>
+                    <m:nor/>
                   </m:rPr>
                   <m:t>d</m:t>
                 </m:r>
@@ -11108,7 +11016,7 @@
       <m:oMath>
         <m:r>
           <m:rPr>
-            <m:sty m:val="p"/>
+            <m:nor/>
           </m:rPr>
           <m:t>d</m:t>
         </m:r>
@@ -11123,7 +11031,7 @@
         </m:r>
         <m:r>
           <m:rPr>
-            <m:sty m:val="p"/>
+            <m:nor/>
           </m:rPr>
           <m:t>d</m:t>
         </m:r>
@@ -11749,7 +11657,7 @@
                     </m:d>
                     <m:r>
                       <m:rPr>
-                        <m:sty m:val="p"/>
+                        <m:nor/>
                       </m:rPr>
                       <m:t>ln</m:t>
                     </m:r>
@@ -13527,21 +13435,9 @@
                   <m:sup>
                     <m:r>
                       <m:rPr>
-                        <m:sty m:val="p"/>
+                        <m:nor/>
                       </m:rPr>
-                      <m:t>d</m:t>
-                    </m:r>
-                    <m:r>
-                      <m:rPr>
-                        <m:sty m:val="p"/>
-                      </m:rPr>
-                      <m:t>i</m:t>
-                    </m:r>
-                    <m:r>
-                      <m:rPr>
-                        <m:sty m:val="p"/>
-                      </m:rPr>
-                      <m:t>r</m:t>
+                      <m:t>dir</m:t>
                     </m:r>
                   </m:sup>
                 </m:sSubSup>
@@ -13693,7 +13589,7 @@
                 </m:r>
                 <m:r>
                   <m:rPr>
-                    <m:sty m:val="p"/>
+                    <m:nor/>
                   </m:rPr>
                   <m:t>exp</m:t>
                 </m:r>
@@ -13747,7 +13643,7 @@
                       <m:den>
                         <m:r>
                           <m:rPr>
-                            <m:sty m:val="p"/>
+                            <m:nor/>
                           </m:rPr>
                           <m:t>sin</m:t>
                         </m:r>
@@ -13760,7 +13656,7 @@
                 </m:d>
                 <m:r>
                   <m:rPr>
-                    <m:sty m:val="p"/>
+                    <m:nor/>
                   </m:rPr>
                   <m:t>d</m:t>
                 </m:r>
@@ -13887,7 +13783,7 @@
         </m:r>
         <m:r>
           <m:rPr>
-            <m:sty m:val="p"/>
+            <m:nor/>
           </m:rPr>
           <m:t>cos</m:t>
         </m:r>
@@ -13999,7 +13895,7 @@
         </m:r>
         <m:r>
           <m:rPr>
-            <m:sty m:val="p"/>
+            <m:nor/>
           </m:rPr>
           <m:t>d</m:t>
         </m:r>
@@ -14037,7 +13933,7 @@
         </m:r>
         <m:r>
           <m:rPr>
-            <m:sty m:val="p"/>
+            <m:nor/>
           </m:rPr>
           <m:t>exp</m:t>
         </m:r>
@@ -14073,7 +13969,7 @@
         </m:r>
         <m:r>
           <m:rPr>
-            <m:sty m:val="p"/>
+            <m:nor/>
           </m:rPr>
           <m:t>d</m:t>
         </m:r>
@@ -14224,7 +14120,7 @@
                   <m:e>
                     <m:r>
                       <m:rPr>
-                        <m:sty m:val="p"/>
+                        <m:nor/>
                       </m:rPr>
                       <m:t>e</m:t>
                     </m:r>
@@ -14258,7 +14154,7 @@
                 </m:r>
                 <m:r>
                   <m:rPr>
-                    <m:sty m:val="p"/>
+                    <m:nor/>
                   </m:rPr>
                   <m:t>d</m:t>
                 </m:r>
@@ -14293,7 +14189,7 @@
                   <m:e>
                     <m:r>
                       <m:rPr>
-                        <m:sty m:val="p"/>
+                        <m:nor/>
                       </m:rPr>
                       <m:t>E</m:t>
                     </m:r>
@@ -14388,7 +14284,7 @@
           <m:e>
             <m:r>
               <m:rPr>
-                <m:sty m:val="p"/>
+                <m:nor/>
               </m:rPr>
               <m:t>E</m:t>
             </m:r>
@@ -14459,7 +14355,7 @@
           <m:e>
             <m:r>
               <m:rPr>
-                <m:sty m:val="p"/>
+                <m:nor/>
               </m:rPr>
               <m:t>e</m:t>
             </m:r>
@@ -14484,7 +14380,7 @@
         </m:r>
         <m:r>
           <m:rPr>
-            <m:sty m:val="p"/>
+            <m:nor/>
           </m:rPr>
           <m:t>d</m:t>
         </m:r>
@@ -14629,7 +14525,7 @@
       <m:oMath>
         <m:r>
           <m:rPr>
-            <m:sty m:val="p"/>
+            <m:nor/>
           </m:rPr>
           <m:t>exp</m:t>
         </m:r>
@@ -14706,7 +14602,7 @@
         </m:r>
         <m:r>
           <m:rPr>
-            <m:sty m:val="p"/>
+            <m:nor/>
           </m:rPr>
           <m:t>sin</m:t>
         </m:r>
@@ -14934,7 +14830,7 @@
                   <m:e>
                     <m:r>
                       <m:rPr>
-                        <m:sty m:val="p"/>
+                        <m:nor/>
                       </m:rPr>
                       <m:t>e</m:t>
                     </m:r>
@@ -14968,7 +14864,7 @@
                 </m:r>
                 <m:r>
                   <m:rPr>
-                    <m:sty m:val="p"/>
+                    <m:nor/>
                   </m:rPr>
                   <m:t>d</m:t>
                 </m:r>
@@ -15084,7 +14980,7 @@
                       <m:e>
                         <m:r>
                           <m:rPr>
-                            <m:sty m:val="p"/>
+                            <m:nor/>
                           </m:rPr>
                           <m:t>E</m:t>
                         </m:r>
@@ -15116,7 +15012,7 @@
                   <m:e>
                     <m:r>
                       <m:rPr>
-                        <m:sty m:val="p"/>
+                        <m:nor/>
                       </m:rPr>
                       <m:t>e</m:t>
                     </m:r>
@@ -15150,7 +15046,7 @@
                 </m:r>
                 <m:r>
                   <m:rPr>
-                    <m:sty m:val="p"/>
+                    <m:nor/>
                   </m:rPr>
                   <m:t>d</m:t>
                 </m:r>
@@ -15218,7 +15114,7 @@
               <m:e>
                 <m:r>
                   <m:rPr>
-                    <m:sty m:val="p"/>
+                    <m:nor/>
                   </m:rPr>
                   <m:t>E</m:t>
                 </m:r>
@@ -15247,7 +15143,7 @@
           <m:e>
             <m:r>
               <m:rPr>
-                <m:sty m:val="p"/>
+                <m:nor/>
               </m:rPr>
               <m:t>e</m:t>
             </m:r>
@@ -15272,7 +15168,7 @@
         </m:r>
         <m:r>
           <m:rPr>
-            <m:sty m:val="p"/>
+            <m:nor/>
           </m:rPr>
           <m:t>d</m:t>
         </m:r>
@@ -15308,7 +15204,7 @@
           <m:e>
             <m:r>
               <m:rPr>
-                <m:sty m:val="p"/>
+                <m:nor/>
               </m:rPr>
               <m:t>d</m:t>
             </m:r>
@@ -15362,7 +15258,7 @@
         </m:r>
         <m:r>
           <m:rPr>
-            <m:sty m:val="p"/>
+            <m:nor/>
           </m:rPr>
           <m:t>ln</m:t>
         </m:r>
@@ -15522,7 +15418,7 @@
                       <m:e>
                         <m:r>
                           <m:rPr>
-                            <m:sty m:val="p"/>
+                            <m:nor/>
                           </m:rPr>
                           <m:t>E</m:t>
                         </m:r>
@@ -15554,7 +15450,7 @@
                   <m:e>
                     <m:r>
                       <m:rPr>
-                        <m:sty m:val="p"/>
+                        <m:nor/>
                       </m:rPr>
                       <m:t>e</m:t>
                     </m:r>
@@ -15588,7 +15484,7 @@
                 </m:r>
                 <m:r>
                   <m:rPr>
-                    <m:sty m:val="p"/>
+                    <m:nor/>
                   </m:rPr>
                   <m:t>d</m:t>
                 </m:r>
@@ -15627,7 +15523,7 @@
                 </m:f>
                 <m:r>
                   <m:rPr>
-                    <m:sty m:val="p"/>
+                    <m:nor/>
                   </m:rPr>
                   <m:t>ln</m:t>
                 </m:r>
@@ -15820,21 +15716,9 @@
                   <m:sup>
                     <m:r>
                       <m:rPr>
-                        <m:sty m:val="p"/>
+                        <m:nor/>
                       </m:rPr>
-                      <m:t>i</m:t>
-                    </m:r>
-                    <m:r>
-                      <m:rPr>
-                        <m:sty m:val="p"/>
-                      </m:rPr>
-                      <m:t>n</m:t>
-                    </m:r>
-                    <m:r>
-                      <m:rPr>
-                        <m:sty m:val="p"/>
-                      </m:rPr>
-                      <m:t>d</m:t>
+                      <m:t>ind</m:t>
                     </m:r>
                   </m:sup>
                 </m:sSubSup>
@@ -16001,7 +15885,7 @@
                 </m:r>
                 <m:r>
                   <m:rPr>
-                    <m:sty m:val="p"/>
+                    <m:nor/>
                   </m:rPr>
                   <m:t>ln</m:t>
                 </m:r>
@@ -16059,7 +15943,7 @@
                 </m:d>
                 <m:r>
                   <m:rPr>
-                    <m:sty m:val="p"/>
+                    <m:nor/>
                   </m:rPr>
                   <m:t>d</m:t>
                 </m:r>
@@ -16148,21 +16032,9 @@
           <m:sup>
             <m:r>
               <m:rPr>
-                <m:sty m:val="p"/>
+                <m:nor/>
               </m:rPr>
-              <m:t>d</m:t>
-            </m:r>
-            <m:r>
-              <m:rPr>
-                <m:sty m:val="p"/>
-              </m:rPr>
-              <m:t>i</m:t>
-            </m:r>
-            <m:r>
-              <m:rPr>
-                <m:sty m:val="p"/>
-              </m:rPr>
-              <m:t>r</m:t>
+              <m:t>dir</m:t>
             </m:r>
           </m:sup>
         </m:sSubSup>
@@ -16186,21 +16058,9 @@
           <m:sup>
             <m:r>
               <m:rPr>
-                <m:sty m:val="p"/>
+                <m:nor/>
               </m:rPr>
-              <m:t>i</m:t>
-            </m:r>
-            <m:r>
-              <m:rPr>
-                <m:sty m:val="p"/>
-              </m:rPr>
-              <m:t>n</m:t>
-            </m:r>
-            <m:r>
-              <m:rPr>
-                <m:sty m:val="p"/>
-              </m:rPr>
-              <m:t>d</m:t>
+              <m:t>ind</m:t>
             </m:r>
           </m:sup>
         </m:sSubSup>
@@ -16262,7 +16122,7 @@
               <m:oMath>
                 <m:r>
                   <m:rPr>
-                    <m:sty m:val="p"/>
+                    <m:nor/>
                     <m:scr m:val="script"/>
                   </m:rPr>
                   <m:t>T</m:t>
@@ -16284,7 +16144,7 @@
                 </m:r>
                 <m:r>
                   <m:rPr>
-                    <m:sty m:val="p"/>
+                    <m:nor/>
                   </m:rPr>
                   <m:t>exp</m:t>
                 </m:r>
@@ -16311,15 +16171,9 @@
                       <m:sub>
                         <m:r>
                           <m:rPr>
-                            <m:sty m:val="p"/>
+                            <m:nor/>
                           </m:rPr>
-                          <m:t>B</m:t>
-                        </m:r>
-                        <m:r>
-                          <m:rPr>
-                            <m:sty m:val="p"/>
-                          </m:rPr>
-                          <m:t>e</m:t>
+                          <m:t>Be</m:t>
                         </m:r>
                       </m:sub>
                     </m:sSub>
@@ -16344,15 +16198,9 @@
                       <m:sub>
                         <m:r>
                           <m:rPr>
-                            <m:sty m:val="p"/>
+                            <m:nor/>
                           </m:rPr>
-                          <m:t>B</m:t>
-                        </m:r>
-                        <m:r>
-                          <m:rPr>
-                            <m:sty m:val="p"/>
-                          </m:rPr>
-                          <m:t>e</m:t>
+                          <m:t>Be</m:t>
                         </m:r>
                       </m:sub>
                     </m:sSub>
@@ -16433,21 +16281,9 @@
                       <m:sub>
                         <m:r>
                           <m:rPr>
-                            <m:sty m:val="p"/>
+                            <m:nor/>
                           </m:rPr>
-                          <m:t>a</m:t>
-                        </m:r>
-                        <m:r>
-                          <m:rPr>
-                            <m:sty m:val="p"/>
-                          </m:rPr>
-                          <m:t>i</m:t>
-                        </m:r>
-                        <m:r>
-                          <m:rPr>
-                            <m:sty m:val="p"/>
-                          </m:rPr>
-                          <m:t>r</m:t>
+                          <m:t>air</m:t>
                         </m:r>
                       </m:sub>
                     </m:sSub>
@@ -16506,7 +16342,7 @@
       <m:oMath>
         <m:r>
           <m:rPr>
-            <m:sty m:val="p"/>
+            <m:nor/>
             <m:scr m:val="script"/>
           </m:rPr>
           <m:t>T</m:t>
@@ -16540,15 +16376,9 @@
           <m:sub>
             <m:r>
               <m:rPr>
-                <m:sty m:val="p"/>
+                <m:nor/>
               </m:rPr>
-              <m:t>B</m:t>
-            </m:r>
-            <m:r>
-              <m:rPr>
-                <m:sty m:val="p"/>
-              </m:rPr>
-              <m:t>e</m:t>
+              <m:t>Be</m:t>
             </m:r>
           </m:sub>
         </m:sSub>
@@ -16592,21 +16422,9 @@
           <m:sub>
             <m:r>
               <m:rPr>
-                <m:sty m:val="p"/>
+                <m:nor/>
               </m:rPr>
-              <m:t>a</m:t>
-            </m:r>
-            <m:r>
-              <m:rPr>
-                <m:sty m:val="p"/>
-              </m:rPr>
-              <m:t>i</m:t>
-            </m:r>
-            <m:r>
-              <m:rPr>
-                <m:sty m:val="p"/>
-              </m:rPr>
-              <m:t>r</m:t>
+              <m:t>air</m:t>
             </m:r>
           </m:sub>
         </m:sSub>
@@ -16641,15 +16459,9 @@
           <m:sub>
             <m:r>
               <m:rPr>
-                <m:sty m:val="p"/>
+                <m:nor/>
               </m:rPr>
-              <m:t>B</m:t>
-            </m:r>
-            <m:r>
-              <m:rPr>
-                <m:sty m:val="p"/>
-              </m:rPr>
-              <m:t>e</m:t>
+              <m:t>Be</m:t>
             </m:r>
           </m:sub>
         </m:sSub>
@@ -16833,7 +16645,7 @@
                 </m:r>
                 <m:r>
                   <m:rPr>
-                    <m:sty m:val="p"/>
+                    <m:nor/>
                     <m:scr m:val="script"/>
                   </m:rPr>
                   <m:t>T</m:t>
@@ -17298,21 +17110,9 @@
                   <m:sub>
                     <m:r>
                       <m:rPr>
-                        <m:sty m:val="p"/>
+                        <m:nor/>
                       </m:rPr>
-                      <m:t>a</m:t>
-                    </m:r>
-                    <m:r>
-                      <m:rPr>
-                        <m:sty m:val="p"/>
-                      </m:rPr>
-                      <m:t>i</m:t>
-                    </m:r>
-                    <m:r>
-                      <m:rPr>
-                        <m:sty m:val="p"/>
-                      </m:rPr>
-                      <m:t>r</m:t>
+                      <m:t>air</m:t>
                     </m:r>
                   </m:sub>
                 </m:sSub>
@@ -17412,27 +17212,15 @@
                   <m:sub>
                     <m:r>
                       <m:rPr>
-                        <m:sty m:val="p"/>
+                        <m:nor/>
                       </m:rPr>
-                      <m:t>a</m:t>
-                    </m:r>
-                    <m:r>
-                      <m:rPr>
-                        <m:sty m:val="p"/>
-                      </m:rPr>
-                      <m:t>i</m:t>
-                    </m:r>
-                    <m:r>
-                      <m:rPr>
-                        <m:sty m:val="p"/>
-                      </m:rPr>
-                      <m:t>r</m:t>
+                      <m:t>air</m:t>
                     </m:r>
                   </m:sub>
                 </m:sSub>
                 <m:r>
                   <m:rPr>
-                    <m:sty m:val="p"/>
+                    <m:nor/>
                   </m:rPr>
                   <m:t>d</m:t>
                 </m:r>
@@ -17511,21 +17299,9 @@
           <m:sub>
             <m:r>
               <m:rPr>
-                <m:sty m:val="p"/>
+                <m:nor/>
               </m:rPr>
-              <m:t>a</m:t>
-            </m:r>
-            <m:r>
-              <m:rPr>
-                <m:sty m:val="p"/>
-              </m:rPr>
-              <m:t>i</m:t>
-            </m:r>
-            <m:r>
-              <m:rPr>
-                <m:sty m:val="p"/>
-              </m:rPr>
-              <m:t>r</m:t>
+              <m:t>air</m:t>
             </m:r>
           </m:sub>
         </m:sSub>
@@ -17731,27 +17507,15 @@
                   <m:sub>
                     <m:r>
                       <m:rPr>
-                        <m:sty m:val="p"/>
+                        <m:nor/>
                       </m:rPr>
-                      <m:t>a</m:t>
-                    </m:r>
-                    <m:r>
-                      <m:rPr>
-                        <m:sty m:val="p"/>
-                      </m:rPr>
-                      <m:t>i</m:t>
-                    </m:r>
-                    <m:r>
-                      <m:rPr>
-                        <m:sty m:val="p"/>
-                      </m:rPr>
-                      <m:t>r</m:t>
+                      <m:t>air</m:t>
                     </m:r>
                   </m:sub>
                 </m:sSub>
                 <m:r>
                   <m:rPr>
-                    <m:sty m:val="p"/>
+                    <m:nor/>
                   </m:rPr>
                   <m:t>exp</m:t>
                 </m:r>
@@ -17778,15 +17542,9 @@
                       <m:sub>
                         <m:r>
                           <m:rPr>
-                            <m:sty m:val="p"/>
+                            <m:nor/>
                           </m:rPr>
-                          <m:t>A</m:t>
-                        </m:r>
-                        <m:r>
-                          <m:rPr>
-                            <m:sty m:val="p"/>
-                          </m:rPr>
-                          <m:t>l</m:t>
+                          <m:t>Al</m:t>
                         </m:r>
                       </m:sub>
                     </m:sSub>
@@ -17818,7 +17576,7 @@
                 </m:d>
                 <m:r>
                   <m:rPr>
-                    <m:sty m:val="p"/>
+                    <m:nor/>
                   </m:rPr>
                   <m:t>d</m:t>
                 </m:r>
@@ -17858,21 +17616,9 @@
                   <m:sub>
                     <m:r>
                       <m:rPr>
-                        <m:sty m:val="p"/>
+                        <m:nor/>
                       </m:rPr>
-                      <m:t>a</m:t>
-                    </m:r>
-                    <m:r>
-                      <m:rPr>
-                        <m:sty m:val="p"/>
-                      </m:rPr>
-                      <m:t>i</m:t>
-                    </m:r>
-                    <m:r>
-                      <m:rPr>
-                        <m:sty m:val="p"/>
-                      </m:rPr>
-                      <m:t>r</m:t>
+                      <m:t>air</m:t>
                     </m:r>
                   </m:sub>
                 </m:sSub>
@@ -17921,15 +17667,9 @@
           <m:sub>
             <m:r>
               <m:rPr>
-                <m:sty m:val="p"/>
+                <m:nor/>
               </m:rPr>
-              <m:t>A</m:t>
-            </m:r>
-            <m:r>
-              <m:rPr>
-                <m:sty m:val="p"/>
-              </m:rPr>
-              <m:t>l</m:t>
+              <m:t>Al</m:t>
             </m:r>
           </m:sub>
         </m:sSub>
@@ -18040,21 +17780,9 @@
           <m:sub>
             <m:r>
               <m:rPr>
-                <m:sty m:val="p"/>
+                <m:nor/>
               </m:rPr>
-              <m:t>e</m:t>
-            </m:r>
-            <m:r>
-              <m:rPr>
-                <m:sty m:val="p"/>
-              </m:rPr>
-              <m:t>f</m:t>
-            </m:r>
-            <m:r>
-              <m:rPr>
-                <m:sty m:val="p"/>
-              </m:rPr>
-              <m:t>f</m:t>
+              <m:t>eff</m:t>
             </m:r>
           </m:sub>
         </m:sSub>
@@ -18075,15 +17803,9 @@
           <m:sub>
             <m:r>
               <m:rPr>
-                <m:sty m:val="p"/>
+                <m:nor/>
               </m:rPr>
-              <m:t>A</m:t>
-            </m:r>
-            <m:r>
-              <m:rPr>
-                <m:sty m:val="p"/>
-              </m:rPr>
-              <m:t>l</m:t>
+              <m:t>Al</m:t>
             </m:r>
           </m:sub>
         </m:sSub>
@@ -18099,21 +17821,9 @@
           <m:sub>
             <m:r>
               <m:rPr>
-                <m:sty m:val="p"/>
+                <m:nor/>
               </m:rPr>
-              <m:t>e</m:t>
-            </m:r>
-            <m:r>
-              <m:rPr>
-                <m:sty m:val="p"/>
-              </m:rPr>
-              <m:t>f</m:t>
-            </m:r>
-            <m:r>
-              <m:rPr>
-                <m:sty m:val="p"/>
-              </m:rPr>
-              <m:t>f</m:t>
+              <m:t>eff</m:t>
             </m:r>
           </m:sub>
         </m:sSub>
@@ -18128,7 +17838,7 @@
         </m:r>
         <m:r>
           <m:rPr>
-            <m:sty m:val="p"/>
+            <m:nor/>
           </m:rPr>
           <m:t>ln</m:t>
         </m:r>
@@ -18143,21 +17853,9 @@
         </m:r>
         <m:r>
           <m:rPr>
-            <m:sty m:val="p"/>
+            <m:nor/>
           </m:rPr>
-          <m:t>H</m:t>
-        </m:r>
-        <m:r>
-          <m:rPr>
-            <m:sty m:val="p"/>
-          </m:rPr>
-          <m:t>V</m:t>
-        </m:r>
-        <m:r>
-          <m:rPr>
-            <m:sty m:val="p"/>
-          </m:rPr>
-          <m:t>L</m:t>
+          <m:t>HVL</m:t>
         </m:r>
         <m:r>
           <m:rPr>
@@ -18281,7 +17979,7 @@
                     </m:r>
                     <m:r>
                       <m:rPr>
-                        <m:sty m:val="p"/>
+                        <m:nor/>
                       </m:rPr>
                       <m:t>d</m:t>
                     </m:r>
@@ -18336,7 +18034,7 @@
                     </m:r>
                     <m:r>
                       <m:rPr>
-                        <m:sty m:val="p"/>
+                        <m:nor/>
                       </m:rPr>
                       <m:t>d</m:t>
                     </m:r>
@@ -18390,15 +18088,9 @@
           <m:sub>
             <m:r>
               <m:rPr>
-                <m:sty m:val="p"/>
+                <m:nor/>
               </m:rPr>
-              <m:t>A</m:t>
-            </m:r>
-            <m:r>
-              <m:rPr>
-                <m:sty m:val="p"/>
-              </m:rPr>
-              <m:t>g</m:t>
+              <m:t>Ag</m:t>
             </m:r>
           </m:sub>
         </m:sSub>
@@ -18434,15 +18126,9 @@
                 </m:r>
                 <m:r>
                   <m:rPr>
-                    <m:sty m:val="p"/>
+                    <m:nor/>
                   </m:rPr>
-                  <m:t>A</m:t>
-                </m:r>
-                <m:r>
-                  <m:rPr>
-                    <m:sty m:val="p"/>
-                  </m:rPr>
-                  <m:t>g</m:t>
+                  <m:t>Ag</m:t>
                 </m:r>
               </m:sub>
             </m:sSub>
@@ -18481,7 +18167,7 @@
         </m:r>
         <m:r>
           <m:rPr>
-            <m:sty m:val="p"/>
+            <m:nor/>
           </m:rPr>
           <m:t>d</m:t>
         </m:r>
@@ -18540,7 +18226,7 @@
         </m:r>
         <m:r>
           <m:rPr>
-            <m:sty m:val="p"/>
+            <m:nor/>
           </m:rPr>
           <m:t>d</m:t>
         </m:r>
@@ -18576,15 +18262,9 @@
             </m:r>
             <m:r>
               <m:rPr>
-                <m:sty m:val="p"/>
+                <m:nor/>
               </m:rPr>
-              <m:t>A</m:t>
-            </m:r>
-            <m:r>
-              <m:rPr>
-                <m:sty m:val="p"/>
-              </m:rPr>
-              <m:t>g</m:t>
+              <m:t>Ag</m:t>
             </m:r>
           </m:sub>
         </m:sSub>
@@ -18649,21 +18329,9 @@
               <m:oMath>
                 <m:r>
                   <m:rPr>
-                    <m:sty m:val="p"/>
+                    <m:nor/>
                   </m:rPr>
-                  <m:t>D</m:t>
-                </m:r>
-                <m:r>
-                  <m:rPr>
-                    <m:sty m:val="p"/>
-                  </m:rPr>
-                  <m:t>E</m:t>
-                </m:r>
-                <m:r>
-                  <m:rPr>
-                    <m:sty m:val="p"/>
-                  </m:rPr>
-                  <m:t>F</m:t>
+                  <m:t>DEF</m:t>
                 </m:r>
                 <m:r>
                   <m:rPr>
@@ -18694,15 +18362,9 @@
                         </m:r>
                         <m:r>
                           <m:rPr>
-                            <m:sty m:val="p"/>
+                            <m:nor/>
                           </m:rPr>
-                          <m:t>A</m:t>
-                        </m:r>
-                        <m:r>
-                          <m:rPr>
-                            <m:sty m:val="p"/>
-                          </m:rPr>
-                          <m:t>g</m:t>
+                          <m:t>Ag</m:t>
                         </m:r>
                       </m:sub>
                     </m:sSub>
@@ -18776,15 +18438,9 @@
             </m:r>
             <m:r>
               <m:rPr>
-                <m:sty m:val="p"/>
+                <m:nor/>
               </m:rPr>
-              <m:t>A</m:t>
-            </m:r>
-            <m:r>
-              <m:rPr>
-                <m:sty m:val="p"/>
-              </m:rPr>
-              <m:t>g</m:t>
+              <m:t>Ag</m:t>
             </m:r>
           </m:sub>
         </m:sSub>
@@ -18956,7 +18612,7 @@
                 </m:r>
                 <m:r>
                   <m:rPr>
-                    <m:sty m:val="p"/>
+                    <m:nor/>
                   </m:rPr>
                   <m:t>d</m:t>
                 </m:r>
@@ -19286,15 +18942,9 @@
                     </m:r>
                     <m:r>
                       <m:rPr>
-                        <m:sty m:val="p"/>
+                        <m:nor/>
                       </m:rPr>
-                      <m:t>A</m:t>
-                    </m:r>
-                    <m:r>
-                      <m:rPr>
-                        <m:sty m:val="p"/>
-                      </m:rPr>
-                      <m:t>g</m:t>
+                      <m:t>Ag</m:t>
                     </m:r>
                   </m:sub>
                 </m:sSub>
@@ -19420,15 +19070,9 @@
                   <m:sub>
                     <m:r>
                       <m:rPr>
-                        <m:sty m:val="p"/>
+                        <m:nor/>
                       </m:rPr>
-                      <m:t>A</m:t>
-                    </m:r>
-                    <m:r>
-                      <m:rPr>
-                        <m:sty m:val="p"/>
-                      </m:rPr>
-                      <m:t>g</m:t>
+                      <m:t>Ag</m:t>
                     </m:r>
                   </m:sub>
                 </m:sSub>
@@ -19516,21 +19160,9 @@
               <m:oMath>
                 <m:r>
                   <m:rPr>
-                    <m:sty m:val="p"/>
+                    <m:nor/>
                   </m:rPr>
-                  <m:t>D</m:t>
-                </m:r>
-                <m:r>
-                  <m:rPr>
-                    <m:sty m:val="p"/>
-                  </m:rPr>
-                  <m:t>E</m:t>
-                </m:r>
-                <m:r>
-                  <m:rPr>
-                    <m:sty m:val="p"/>
-                  </m:rPr>
-                  <m:t>F</m:t>
+                  <m:t>DEF</m:t>
                 </m:r>
                 <m:r>
                   <m:rPr>
@@ -19685,15 +19317,9 @@
                           <m:sub>
                             <m:r>
                               <m:rPr>
-                                <m:sty m:val="p"/>
+                                <m:nor/>
                               </m:rPr>
-                              <m:t>A</m:t>
-                            </m:r>
-                            <m:r>
-                              <m:rPr>
-                                <m:sty m:val="p"/>
-                              </m:rPr>
-                              <m:t>g</m:t>
+                              <m:t>Ag</m:t>
                             </m:r>
                           </m:sub>
                         </m:sSub>
@@ -19701,7 +19327,7 @@
                     </m:d>
                     <m:r>
                       <m:rPr>
-                        <m:sty m:val="p"/>
+                        <m:nor/>
                       </m:rPr>
                       <m:t>d</m:t>
                     </m:r>
@@ -19776,7 +19402,7 @@
                     </m:sSub>
                     <m:r>
                       <m:rPr>
-                        <m:sty m:val="p"/>
+                        <m:nor/>
                       </m:rPr>
                       <m:t>d</m:t>
                     </m:r>
@@ -19866,21 +19492,9 @@
               <m:oMath>
                 <m:r>
                   <m:rPr>
-                    <m:sty m:val="p"/>
+                    <m:nor/>
                   </m:rPr>
-                  <m:t>D</m:t>
-                </m:r>
-                <m:r>
-                  <m:rPr>
-                    <m:sty m:val="p"/>
-                  </m:rPr>
-                  <m:t>E</m:t>
-                </m:r>
-                <m:r>
-                  <m:rPr>
-                    <m:sty m:val="p"/>
-                  </m:rPr>
-                  <m:t>F</m:t>
+                  <m:t>DEF</m:t>
                 </m:r>
                 <m:r>
                   <m:rPr>
@@ -20085,21 +19699,15 @@
                       <m:sub>
                         <m:r>
                           <m:rPr>
-                            <m:sty m:val="p"/>
+                            <m:nor/>
                           </m:rPr>
-                          <m:t>A</m:t>
-                        </m:r>
-                        <m:r>
-                          <m:rPr>
-                            <m:sty m:val="p"/>
-                          </m:rPr>
-                          <m:t>g</m:t>
+                          <m:t>Ag</m:t>
                         </m:r>
                       </m:sub>
                     </m:sSub>
                     <m:r>
                       <m:rPr>
-                        <m:sty m:val="p"/>
+                        <m:nor/>
                       </m:rPr>
                       <m:t>d</m:t>
                     </m:r>
@@ -20174,7 +19782,7 @@
                     </m:sSub>
                     <m:r>
                       <m:rPr>
-                        <m:sty m:val="p"/>
+                        <m:nor/>
                       </m:rPr>
                       <m:t>d</m:t>
                     </m:r>
@@ -20241,7 +19849,7 @@
                     </m:r>
                     <m:r>
                       <m:rPr>
-                        <m:sty m:val="p"/>
+                        <m:nor/>
                       </m:rPr>
                       <m:t>d</m:t>
                     </m:r>
@@ -20282,7 +19890,7 @@
                     </m:r>
                     <m:r>
                       <m:rPr>
-                        <m:sty m:val="p"/>
+                        <m:nor/>
                       </m:rPr>
                       <m:t>d</m:t>
                     </m:r>
@@ -20381,15 +19989,9 @@
           <m:sub>
             <m:r>
               <m:rPr>
-                <m:sty m:val="p"/>
+                <m:nor/>
               </m:rPr>
-              <m:t>A</m:t>
-            </m:r>
-            <m:r>
-              <m:rPr>
-                <m:sty m:val="p"/>
-              </m:rPr>
-              <m:t>g</m:t>
+              <m:t>Ag</m:t>
             </m:r>
           </m:sub>
         </m:sSub>
@@ -20686,21 +20288,9 @@
               <m:oMath>
                 <m:r>
                   <m:rPr>
-                    <m:sty m:val="p"/>
+                    <m:nor/>
                   </m:rPr>
-                  <m:t>D</m:t>
-                </m:r>
-                <m:r>
-                  <m:rPr>
-                    <m:sty m:val="p"/>
-                  </m:rPr>
-                  <m:t>E</m:t>
-                </m:r>
-                <m:r>
-                  <m:rPr>
-                    <m:sty m:val="p"/>
-                  </m:rPr>
-                  <m:t>F</m:t>
+                  <m:t>DEF</m:t>
                 </m:r>
                 <m:r>
                   <m:t>(</m:t>
@@ -20909,15 +20499,9 @@
                           <m:sub>
                             <m:r>
                               <m:rPr>
-                                <m:sty m:val="p"/>
+                                <m:nor/>
                               </m:rPr>
-                              <m:t>A</m:t>
-                            </m:r>
-                            <m:r>
-                              <m:rPr>
-                                <m:sty m:val="p"/>
-                              </m:rPr>
-                              <m:t>g</m:t>
+                              <m:t>Ag</m:t>
                             </m:r>
                           </m:sub>
                         </m:sSub>
@@ -20925,7 +20509,7 @@
                     </m:d>
                     <m:r>
                       <m:rPr>
-                        <m:sty m:val="p"/>
+                        <m:nor/>
                       </m:rPr>
                       <m:t>d</m:t>
                     </m:r>
@@ -21045,7 +20629,7 @@
                     </m:sSub>
                     <m:r>
                       <m:rPr>
-                        <m:sty m:val="p"/>
+                        <m:nor/>
                       </m:rPr>
                       <m:t>d</m:t>
                     </m:r>
@@ -21341,47 +20925,17 @@
                   <m:e>
                     <m:r>
                       <m:rPr>
-                        <m:sty m:val="p"/>
+                        <m:nor/>
                       </m:rPr>
-                      <m:t>D</m:t>
-                    </m:r>
-                    <m:r>
-                      <m:rPr>
-                        <m:sty m:val="p"/>
-                      </m:rPr>
-                      <m:t>E</m:t>
-                    </m:r>
-                    <m:r>
-                      <m:rPr>
-                        <m:sty m:val="p"/>
-                      </m:rPr>
-                      <m:t>F</m:t>
+                      <m:t>DEF</m:t>
                     </m:r>
                   </m:e>
                   <m:sub>
                     <m:r>
                       <m:rPr>
-                        <m:sty m:val="p"/>
+                        <m:nor/>
                       </m:rPr>
-                      <m:t>s</m:t>
-                    </m:r>
-                    <m:r>
-                      <m:rPr>
-                        <m:sty m:val="p"/>
-                      </m:rPr>
-                      <m:t>l</m:t>
-                    </m:r>
-                    <m:r>
-                      <m:rPr>
-                        <m:sty m:val="p"/>
-                      </m:rPr>
-                      <m:t>a</m:t>
-                    </m:r>
-                    <m:r>
-                      <m:rPr>
-                        <m:sty m:val="p"/>
-                      </m:rPr>
-                      <m:t>b</m:t>
+                      <m:t>slab</m:t>
                     </m:r>
                   </m:sub>
                 </m:sSub>
@@ -21457,15 +21011,9 @@
                             </m:r>
                             <m:r>
                               <m:rPr>
-                                <m:sty m:val="p"/>
+                                <m:nor/>
                               </m:rPr>
-                              <m:t>A</m:t>
-                            </m:r>
-                            <m:r>
-                              <m:rPr>
-                                <m:sty m:val="p"/>
-                              </m:rPr>
-                              <m:t>g</m:t>
+                              <m:t>Ag</m:t>
                             </m:r>
                           </m:sub>
                         </m:sSub>
@@ -21610,15 +21158,9 @@
                           <m:sub>
                             <m:r>
                               <m:rPr>
-                                <m:sty m:val="p"/>
+                                <m:nor/>
                               </m:rPr>
-                              <m:t>A</m:t>
-                            </m:r>
-                            <m:r>
-                              <m:rPr>
-                                <m:sty m:val="p"/>
-                              </m:rPr>
-                              <m:t>g</m:t>
+                              <m:t>Ag</m:t>
                             </m:r>
                           </m:sub>
                         </m:sSub>
@@ -21626,7 +21168,7 @@
                     </m:d>
                     <m:r>
                       <m:rPr>
-                        <m:sty m:val="p"/>
+                        <m:nor/>
                       </m:rPr>
                       <m:t>d</m:t>
                     </m:r>
@@ -21746,7 +21288,7 @@
                     </m:sSub>
                     <m:r>
                       <m:rPr>
-                        <m:sty m:val="p"/>
+                        <m:nor/>
                       </m:rPr>
                       <m:t>d</m:t>
                     </m:r>
@@ -21809,15 +21351,9 @@
             </m:r>
             <m:r>
               <m:rPr>
-                <m:sty m:val="p"/>
+                <m:nor/>
               </m:rPr>
-              <m:t>A</m:t>
-            </m:r>
-            <m:r>
-              <m:rPr>
-                <m:sty m:val="p"/>
-              </m:rPr>
-              <m:t>g</m:t>
+              <m:t>Ag</m:t>
             </m:r>
           </m:sub>
         </m:sSub>
@@ -21937,15 +21473,9 @@
               <m:sub>
                 <m:r>
                   <m:rPr>
-                    <m:sty m:val="p"/>
+                    <m:nor/>
                   </m:rPr>
-                  <m:t>A</m:t>
-                </m:r>
-                <m:r>
-                  <m:rPr>
-                    <m:sty m:val="p"/>
-                  </m:rPr>
-                  <m:t>g</m:t>
+                  <m:t>Ag</m:t>
                 </m:r>
               </m:sub>
             </m:sSub>
@@ -21986,47 +21516,17 @@
           <m:e>
             <m:r>
               <m:rPr>
-                <m:sty m:val="p"/>
+                <m:nor/>
               </m:rPr>
-              <m:t>D</m:t>
-            </m:r>
-            <m:r>
-              <m:rPr>
-                <m:sty m:val="p"/>
-              </m:rPr>
-              <m:t>E</m:t>
-            </m:r>
-            <m:r>
-              <m:rPr>
-                <m:sty m:val="p"/>
-              </m:rPr>
-              <m:t>F</m:t>
+              <m:t>DEF</m:t>
             </m:r>
           </m:e>
           <m:sub>
             <m:r>
               <m:rPr>
-                <m:sty m:val="p"/>
+                <m:nor/>
               </m:rPr>
-              <m:t>s</m:t>
-            </m:r>
-            <m:r>
-              <m:rPr>
-                <m:sty m:val="p"/>
-              </m:rPr>
-              <m:t>l</m:t>
-            </m:r>
-            <m:r>
-              <m:rPr>
-                <m:sty m:val="p"/>
-              </m:rPr>
-              <m:t>a</m:t>
-            </m:r>
-            <m:r>
-              <m:rPr>
-                <m:sty m:val="p"/>
-              </m:rPr>
-              <m:t>b</m:t>
+              <m:t>slab</m:t>
             </m:r>
           </m:sub>
         </m:sSub>
@@ -22122,15 +21622,9 @@
           <m:sub>
             <m:r>
               <m:rPr>
-                <m:sty m:val="p"/>
+                <m:nor/>
               </m:rPr>
-              <m:t>A</m:t>
-            </m:r>
-            <m:r>
-              <m:rPr>
-                <m:sty m:val="p"/>
-              </m:rPr>
-              <m:t>g</m:t>
+              <m:t>Ag</m:t>
             </m:r>
           </m:sub>
         </m:sSub>
@@ -22235,7 +21729,7 @@
           <m:sub>
             <m:r>
               <m:rPr>
-                <m:sty m:val="p"/>
+                <m:nor/>
               </m:rPr>
               <m:t>max</m:t>
             </m:r>
@@ -22292,15 +21786,9 @@
           <m:sub>
             <m:r>
               <m:rPr>
-                <m:sty m:val="p"/>
+                <m:nor/>
               </m:rPr>
-              <m:t>A</m:t>
-            </m:r>
-            <m:r>
-              <m:rPr>
-                <m:sty m:val="p"/>
-              </m:rPr>
-              <m:t>g</m:t>
+              <m:t>Ag</m:t>
             </m:r>
           </m:sub>
         </m:sSub>
@@ -22330,15 +21818,9 @@
           <m:sub>
             <m:r>
               <m:rPr>
-                <m:sty m:val="p"/>
+                <m:nor/>
               </m:rPr>
-              <m:t>A</m:t>
-            </m:r>
-            <m:r>
-              <m:rPr>
-                <m:sty m:val="p"/>
-              </m:rPr>
-              <m:t>g</m:t>
+              <m:t>Ag</m:t>
             </m:r>
           </m:sub>
         </m:sSub>
@@ -22357,15 +21839,9 @@
           <m:sub>
             <m:r>
               <m:rPr>
-                <m:sty m:val="p"/>
+                <m:nor/>
               </m:rPr>
-              <m:t>A</m:t>
-            </m:r>
-            <m:r>
-              <m:rPr>
-                <m:sty m:val="p"/>
-              </m:rPr>
-              <m:t>g</m:t>
+              <m:t>Ag</m:t>
             </m:r>
           </m:sub>
         </m:sSub>
@@ -22393,15 +21869,9 @@
           <m:sub>
             <m:r>
               <m:rPr>
-                <m:sty m:val="p"/>
+                <m:nor/>
               </m:rPr>
-              <m:t>A</m:t>
-            </m:r>
-            <m:r>
-              <m:rPr>
-                <m:sty m:val="p"/>
-              </m:rPr>
-              <m:t>g</m:t>
+              <m:t>Ag</m:t>
             </m:r>
           </m:sub>
         </m:sSub>
@@ -22467,7 +21937,7 @@
                   <m:num>
                     <m:r>
                       <m:rPr>
-                        <m:sty m:val="p"/>
+                        <m:nor/>
                       </m:rPr>
                       <m:t>ln</m:t>
                     </m:r>
@@ -22494,7 +21964,7 @@
                       <m:sub>
                         <m:r>
                           <m:rPr>
-                            <m:sty m:val="p"/>
+                            <m:nor/>
                           </m:rPr>
                           <m:t>max</m:t>
                         </m:r>
@@ -22654,27 +22124,9 @@
                   <m:sub>
                     <m:r>
                       <m:rPr>
-                        <m:sty m:val="p"/>
+                        <m:nor/>
                       </m:rPr>
-                      <m:t>r</m:t>
-                    </m:r>
-                    <m:r>
-                      <m:rPr>
-                        <m:sty m:val="p"/>
-                      </m:rPr>
-                      <m:t>e</m:t>
-                    </m:r>
-                    <m:r>
-                      <m:rPr>
-                        <m:sty m:val="p"/>
-                      </m:rPr>
-                      <m:t>a</m:t>
-                    </m:r>
-                    <m:r>
-                      <m:rPr>
-                        <m:sty m:val="p"/>
-                      </m:rPr>
-                      <m:t>l</m:t>
+                      <m:t>real</m:t>
                     </m:r>
                   </m:sub>
                 </m:sSub>
@@ -22721,7 +22173,7 @@
                       <m:sub>
                         <m:r>
                           <m:rPr>
-                            <m:sty m:val="p"/>
+                            <m:nor/>
                           </m:rPr>
                           <m:t>max</m:t>
                         </m:r>
@@ -22853,15 +22305,9 @@
           <m:sub>
             <m:r>
               <m:rPr>
-                <m:sty m:val="p"/>
+                <m:nor/>
               </m:rPr>
-              <m:t>A</m:t>
-            </m:r>
-            <m:r>
-              <m:rPr>
-                <m:sty m:val="p"/>
-              </m:rPr>
-              <m:t>g</m:t>
+              <m:t>Ag</m:t>
             </m:r>
           </m:sub>
         </m:sSub>
@@ -23066,7 +22512,7 @@
                     </m:r>
                     <m:r>
                       <m:rPr>
-                        <m:sty m:val="p"/>
+                        <m:nor/>
                       </m:rPr>
                       <m:t>cos</m:t>
                     </m:r>
@@ -23203,7 +22649,7 @@
         </m:r>
         <m:r>
           <m:rPr>
-            <m:sty m:val="p"/>
+            <m:nor/>
           </m:rPr>
           <m:t>cos</m:t>
         </m:r>
@@ -23250,7 +22696,7 @@
         </m:r>
         <m:r>
           <m:rPr>
-            <m:sty m:val="p"/>
+            <m:nor/>
           </m:rPr>
           <m:t>sin</m:t>
         </m:r>
@@ -23259,7 +22705,7 @@
         </m:r>
         <m:r>
           <m:rPr>
-            <m:sty m:val="p"/>
+            <m:nor/>
           </m:rPr>
           <m:t>cos</m:t>
         </m:r>
@@ -23622,15 +23068,9 @@
           <m:sub>
             <m:r>
               <m:rPr>
-                <m:sty m:val="p"/>
+                <m:nor/>
               </m:rPr>
-              <m:t>A</m:t>
-            </m:r>
-            <m:r>
-              <m:rPr>
-                <m:sty m:val="p"/>
-              </m:rPr>
-              <m:t>g</m:t>
+              <m:t>Ag</m:t>
             </m:r>
           </m:sub>
         </m:sSub>
@@ -24160,21 +23600,9 @@
       <m:oMath>
         <m:r>
           <m:rPr>
-            <m:sty m:val="p"/>
+            <m:nor/>
           </m:rPr>
-          <m:t>D</m:t>
-        </m:r>
-        <m:r>
-          <m:rPr>
-            <m:sty m:val="p"/>
-          </m:rPr>
-          <m:t>E</m:t>
-        </m:r>
-        <m:r>
-          <m:rPr>
-            <m:sty m:val="p"/>
-          </m:rPr>
-          <m:t>F</m:t>
+          <m:t>DEF</m:t>
         </m:r>
         <m:r>
           <m:rPr>
@@ -24426,7 +23854,7 @@
                       <m:e>
                         <m:r>
                           <m:rPr>
-                            <m:sty m:val="p"/>
+                            <m:nor/>
                           </m:rPr>
                           <m:t>max</m:t>
                         </m:r>
@@ -24742,7 +24170,7 @@
           <m:e>
             <m:r>
               <m:rPr>
-                <m:sty m:val="p"/>
+                <m:nor/>
               </m:rPr>
               <m:t>max</m:t>
             </m:r>
@@ -29417,7 +28845,7 @@
         </m:r>
         <m:r>
           <m:rPr>
-            <m:sty m:val="p"/>
+            <m:nor/>
           </m:rPr>
           <m:t>sin</m:t>
         </m:r>
@@ -33653,21 +33081,9 @@
       <m:oMath>
         <m:r>
           <m:rPr>
-            <m:sty m:val="p"/>
+            <m:nor/>
           </m:rPr>
-          <m:t>D</m:t>
-        </m:r>
-        <m:r>
-          <m:rPr>
-            <m:sty m:val="p"/>
-          </m:rPr>
-          <m:t>E</m:t>
-        </m:r>
-        <m:r>
-          <m:rPr>
-            <m:sty m:val="p"/>
-          </m:rPr>
-          <m:t>F</m:t>
+          <m:t>DEF</m:t>
         </m:r>
         <m:r>
           <m:rPr>
@@ -35911,7 +35327,7 @@
                   <m:e>
                     <m:r>
                       <m:rPr>
-                        <m:sty m:val="p"/>
+                        <m:nor/>
                         <m:scr m:val="script"/>
                       </m:rPr>
                       <m:t>T</m:t>
@@ -36038,27 +35454,15 @@
                       <m:sub>
                         <m:r>
                           <m:rPr>
-                            <m:sty m:val="p"/>
+                            <m:nor/>
                           </m:rPr>
-                          <m:t>a</m:t>
-                        </m:r>
-                        <m:r>
-                          <m:rPr>
-                            <m:sty m:val="p"/>
-                          </m:rPr>
-                          <m:t>i</m:t>
-                        </m:r>
-                        <m:r>
-                          <m:rPr>
-                            <m:sty m:val="p"/>
-                          </m:rPr>
-                          <m:t>r</m:t>
+                          <m:t>air</m:t>
                         </m:r>
                       </m:sub>
                     </m:sSub>
                     <m:r>
                       <m:rPr>
-                        <m:sty m:val="p"/>
+                        <m:nor/>
                       </m:rPr>
                       <m:t>exp</m:t>
                     </m:r>
@@ -36107,7 +35511,7 @@
                     </m:d>
                     <m:r>
                       <m:rPr>
-                        <m:sty m:val="p"/>
+                        <m:nor/>
                       </m:rPr>
                       <m:t>d</m:t>
                     </m:r>
@@ -36211,21 +35615,9 @@
                       <m:sub>
                         <m:r>
                           <m:rPr>
-                            <m:sty m:val="p"/>
+                            <m:nor/>
                           </m:rPr>
-                          <m:t>a</m:t>
-                        </m:r>
-                        <m:r>
-                          <m:rPr>
-                            <m:sty m:val="p"/>
-                          </m:rPr>
-                          <m:t>i</m:t>
-                        </m:r>
-                        <m:r>
-                          <m:rPr>
-                            <m:sty m:val="p"/>
-                          </m:rPr>
-                          <m:t>r</m:t>
+                          <m:t>air</m:t>
                         </m:r>
                       </m:sub>
                     </m:sSub>
@@ -36234,7 +35626,7 @@
                     </m:r>
                     <m:r>
                       <m:rPr>
-                        <m:sty m:val="p"/>
+                        <m:nor/>
                       </m:rPr>
                       <m:t>d</m:t>
                     </m:r>
@@ -36283,7 +35675,7 @@
           <m:e>
             <m:r>
               <m:rPr>
-                <m:sty m:val="p"/>
+                <m:nor/>
                 <m:scr m:val="script"/>
               </m:rPr>
               <m:t>T</m:t>
@@ -36383,21 +35775,9 @@
           <m:sub>
             <m:r>
               <m:rPr>
-                <m:sty m:val="p"/>
+                <m:nor/>
               </m:rPr>
-              <m:t>a</m:t>
-            </m:r>
-            <m:r>
-              <m:rPr>
-                <m:sty m:val="p"/>
-              </m:rPr>
-              <m:t>i</m:t>
-            </m:r>
-            <m:r>
-              <m:rPr>
-                <m:sty m:val="p"/>
-              </m:rPr>
-              <m:t>r</m:t>
+              <m:t>air</m:t>
             </m:r>
           </m:sub>
         </m:sSub>
@@ -36471,7 +35851,7 @@
           <m:e>
             <m:r>
               <m:rPr>
-                <m:sty m:val="p"/>
+                <m:nor/>
                 <m:scr m:val="script"/>
               </m:rPr>
               <m:t>T</m:t>
@@ -38327,7 +37707,7 @@
                     </m:r>
                     <m:r>
                       <m:rPr>
-                        <m:sty m:val="p"/>
+                        <m:nor/>
                       </m:rPr>
                       <m:t>d</m:t>
                     </m:r>
@@ -44557,21 +43937,9 @@
                 </m:r>
                 <m:r>
                   <m:rPr>
-                    <m:sty m:val="p"/>
+                    <m:nor/>
                   </m:rPr>
-                  <m:t>D</m:t>
-                </m:r>
-                <m:r>
-                  <m:rPr>
-                    <m:sty m:val="p"/>
-                  </m:rPr>
-                  <m:t>E</m:t>
-                </m:r>
-                <m:r>
-                  <m:rPr>
-                    <m:sty m:val="p"/>
-                  </m:rPr>
-                  <m:t>F</m:t>
+                  <m:t>DEF</m:t>
                 </m:r>
                 <m:r>
                   <m:t>)</m:t>
@@ -44806,21 +44174,9 @@
       <m:oMath>
         <m:r>
           <m:rPr>
-            <m:sty m:val="p"/>
+            <m:nor/>
           </m:rPr>
-          <m:t>D</m:t>
-        </m:r>
-        <m:r>
-          <m:rPr>
-            <m:sty m:val="p"/>
-          </m:rPr>
-          <m:t>E</m:t>
-        </m:r>
-        <m:r>
-          <m:rPr>
-            <m:sty m:val="p"/>
-          </m:rPr>
-          <m:t>F</m:t>
+          <m:t>DEF</m:t>
         </m:r>
         <m:r>
           <m:rPr>
@@ -48337,7 +47693,7 @@
         </m:r>
         <m:r>
           <m:rPr>
-            <m:sty m:val="p"/>
+            <m:nor/>
           </m:rPr>
           <m:t>sin</m:t>
         </m:r>

</xml_diff>

<commit_message>
Title page: university, faculty, specialty, author and supervisor; Uzbek term radiokuchaytirish as in the official title
Co-Authored-By: Claude Opus 5.5 <noreply@anthropic.com>
Claude-Session: https://claude.ai/code/session_01WcXt6iEQKTpJkT13ui6H64
</commit_message>
<xml_diff>
--- a/dissertation/build/en/Dissertation_en.docx
+++ b/dissertation/build/en/Dissertation_en.docx
@@ -23,7 +23,50 @@
         <w:rPr>
           <w:b/>
         </w:rPr>
-        <w:t>[NAME OF THE UNIVERSITY]</w:t>
+        <w:t>NATIONAL UNIVERSITY OF UZBEKISTAN NAMED AFTER MIRZO ULUGBEK</w:t>
+      </w:r>
+    </w:p>
+    <w:p>
+      <w:pPr>
+        <w:pStyle w:val="TitleCenter"/>
+        <w:spacing w:after="800"/>
+      </w:pPr>
+      <w:r>
+        <w:rPr>
+          <w:b/>
+        </w:rPr>
+        <w:t>FACULTY OF PHYSICS</w:t>
+      </w:r>
+    </w:p>
+    <w:p>
+      <w:pPr>
+        <w:pStyle w:val="TitleRight"/>
+        <w:spacing w:after="800"/>
+      </w:pPr>
+      <w:r>
+        <w:rPr>
+          <w:b w:val="0"/>
+        </w:rPr>
+        <w:t>As a manuscript</w:t>
+        <w:br/>
+      </w:r>
+      <w:r>
+        <w:rPr>
+          <w:b w:val="0"/>
+        </w:rPr>
+        <w:t>UDC 539.12:531.51</w:t>
+      </w:r>
+    </w:p>
+    <w:p>
+      <w:pPr>
+        <w:pStyle w:val="TitleCenter"/>
+        <w:spacing w:after="480"/>
+      </w:pPr>
+      <w:r>
+        <w:rPr>
+          <w:b w:val="0"/>
+        </w:rPr>
+        <w:t>70531201 – Medical Physics</w:t>
       </w:r>
     </w:p>
     <w:p>
@@ -33,52 +76,9 @@
       </w:pPr>
       <w:r>
         <w:rPr>
-          <w:b w:val="0"/>
-        </w:rPr>
-        <w:t>Faculty: [name of the faculty]</w:t>
-        <w:br/>
-      </w:r>
-      <w:r>
-        <w:rPr>
-          <w:b w:val="0"/>
-        </w:rPr>
-        <w:t>Department: [name of the department]</w:t>
-      </w:r>
-    </w:p>
-    <w:p>
-      <w:pPr>
-        <w:pStyle w:val="TitleLeft"/>
-        <w:spacing w:after="0"/>
-      </w:pPr>
-      <w:r>
-        <w:rPr>
-          <w:b w:val="0"/>
-        </w:rPr>
-        <w:t>UDC 539.12.04:615.849</w:t>
-      </w:r>
-    </w:p>
-    <w:p>
-      <w:pPr>
-        <w:pStyle w:val="TitleRight"/>
-        <w:spacing w:after="800"/>
-      </w:pPr>
-      <w:r>
-        <w:rPr>
-          <w:b w:val="0"/>
-        </w:rPr>
-        <w:t>As a manuscript</w:t>
-      </w:r>
-    </w:p>
-    <w:p>
-      <w:pPr>
-        <w:pStyle w:val="TitleCenter"/>
-        <w:spacing w:after="600"/>
-      </w:pPr>
-      <w:r>
-        <w:rPr>
           <w:b/>
         </w:rPr>
-        <w:t>[FULL NAME OF THE STUDENT]</w:t>
+        <w:t>RAYIMOVA MUXLISA BAXROH QIZI</w:t>
       </w:r>
     </w:p>
     <w:p>
@@ -96,80 +96,51 @@
     <w:p>
       <w:pPr>
         <w:pStyle w:val="TitleCenter"/>
-        <w:spacing w:after="480"/>
+        <w:spacing w:after="1200"/>
       </w:pPr>
       <w:r>
         <w:rPr>
           <w:b w:val="0"/>
         </w:rPr>
-        <w:t>Specialty: [code] – [name of the master’s specialty]</w:t>
-      </w:r>
-    </w:p>
-    <w:p>
-      <w:pPr>
-        <w:pStyle w:val="TitleCenter"/>
-        <w:spacing w:after="1000"/>
-      </w:pPr>
-      <w:r>
-        <w:rPr>
-          <w:b/>
+        <w:t>Dissertation for the academic degree of Master</w:t>
+        <w:br/>
+      </w:r>
+      <w:r>
+        <w:rPr>
+          <w:b w:val="0"/>
         </w:rPr>
         <w:t>MASTER’S DISSERTATION</w:t>
-        <w:br/>
-      </w:r>
-      <w:r>
-        <w:rPr>
-          <w:b/>
-        </w:rPr>
-        <w:t>for the academic degree of Master</w:t>
-      </w:r>
-    </w:p>
-    <w:p>
-      <w:pPr>
-        <w:pStyle w:val="TitleLeft"/>
-        <w:spacing w:after="480"/>
-      </w:pPr>
-      <w:r>
-        <w:rPr>
-          <w:b w:val="0"/>
-          <w:sz w:val="26"/>
-        </w:rPr>
-        <w:t>“Admitted to defence”</w:t>
-        <w:br/>
-      </w:r>
-      <w:r>
-        <w:rPr>
-          <w:b w:val="0"/>
-          <w:sz w:val="26"/>
-        </w:rPr>
-        <w:t>Head of the department ____________ [full name]</w:t>
-        <w:br/>
-      </w:r>
-      <w:r>
-        <w:rPr>
-          <w:b w:val="0"/>
-          <w:sz w:val="26"/>
-        </w:rPr>
-        <w:t>“___” ____________ 2026</w:t>
       </w:r>
     </w:p>
     <w:p>
       <w:pPr>
         <w:pStyle w:val="TitleRight"/>
-        <w:spacing w:after="1200"/>
+        <w:spacing w:after="0"/>
       </w:pPr>
       <w:r>
         <w:rPr>
+          <w:b/>
+        </w:rPr>
+        <w:t>Scientific supervisor:</w:t>
+      </w:r>
+    </w:p>
+    <w:p>
+      <w:pPr>
+        <w:pStyle w:val="TitleRight"/>
+        <w:spacing w:after="1800"/>
+      </w:pPr>
+      <w:r>
+        <w:rPr>
           <w:b w:val="0"/>
         </w:rPr>
-        <w:t>Scientific supervisor:</w:t>
+        <w:t>Candidate of Physical and Mathematical Sciences,</w:t>
         <w:br/>
       </w:r>
       <w:r>
         <w:rPr>
           <w:b w:val="0"/>
         </w:rPr>
-        <w:t>[academic degree, title, full name]</w:t>
+        <w:t>Associate Professor G.A. Abdullayeva</w:t>
       </w:r>
     </w:p>
     <w:p>
@@ -179,9 +150,9 @@
       </w:pPr>
       <w:r>
         <w:rPr>
-          <w:b/>
-        </w:rPr>
-        <w:t>[City] – 2026</w:t>
+          <w:b w:val="0"/>
+        </w:rPr>
+        <w:t>Tashkent – 2026</w:t>
       </w:r>
       <w:r>
         <w:br w:type="page"/>
@@ -242,7 +213,7 @@
         <w:pStyle w:val="Annotation"/>
       </w:pPr>
       <w:r>
-        <w:t xml:space="preserve">Saratonga qarshi nur terapiyasining samaradorligi hanuzgacha sog‘lom to‘qimalarning chidamliligi bilan cheklanib qolmoqda, masofaviy nur terapiyasida beriladigan dozani optimallashtirish strategiyalaridan biri esa radiosensibilizatorlardan foydalanishdir. Ushbu ishda kilovoltli rentgen nurlari bilan nurlantirilgan biologik muhitda kumushning (Ag) radiokuchayish effekti tadqiq qilinadi va u dozani kuchaytirish koeffitsiyenti (DEF) orqali miqdoriy baholanadi. DEFni hisoblash uchun zarur bo‘lgan 45 kV li mis anodli rentgen trubkasining spektri trubka konstruksiyasi, texnik parametrlari va filtrlariga bog‘liq holda modellashtiriladi. Shu maqsadda bitta moslashtirilgan parametrga ega bo‘lgan qalin nishon uchun yarim analitik model — ishlab chiqilgan model (IM) yaratildi va SpekPy v2 bilan solishtirish orqali validatsiya qilindi. DEF kerma yaqinlashuvida NIST massaviy energiya yutilish koeffitsiyentlari yordamida hisoblandi va fotonlar ko‘chishini Monte-Karlo usulida modellashtirish orqali verifikatsiya qilindi.</w:t>
+        <w:t xml:space="preserve">Saratonga qarshi nur terapiyasining samaradorligi hanuzgacha sog‘lom to‘qimalarning chidamliligi bilan cheklanib qolmoqda, masofaviy nur terapiyasida beriladigan dozani optimallashtirish strategiyalaridan biri esa radiosensibilizatorlardan foydalanishdir. Ushbu ishda kilovoltli rentgen nurlari bilan nurlantirilgan biologik muhitda kumushning (Ag) radiokuchaytirish effekti tadqiq qilinadi va u dozani kuchaytirish koeffitsiyenti (DEF) orqali miqdoriy baholanadi. DEFni hisoblash uchun zarur bo‘lgan 45 kV li mis anodli rentgen trubkasining spektri trubka konstruksiyasi, texnik parametrlari va filtrlariga bog‘liq holda modellashtiriladi. Shu maqsadda bitta moslashtirilgan parametrga ega bo‘lgan qalin nishon uchun yarim analitik model — ishlab chiqilgan model (IM) yaratildi va SpekPy v2 bilan solishtirish orqali validatsiya qilindi. DEF kerma yaqinlashuvida NIST massaviy energiya yutilish koeffitsiyentlari yordamida hisoblandi va fotonlar ko‘chishini Monte-Karlo usulida modellashtirish orqali verifikatsiya qilindi.</w:t>
       </w:r>
     </w:p>
     <w:p>

</xml_diff>